<commit_message>
Report: expand references to 50 (forensics literature, datasets, backbones, evidence) and cite each in the text
Co-Authored-By: Claude Sonnet 5.5 <noreply@anthropic.com>
</commit_message>
<xml_diff>
--- a/docs/report/TrustSphere_AI_Project_Report.docx
+++ b/docs/report/TrustSphere_AI_Project_Report.docx
@@ -3559,7 +3559,7 @@
               </w:rPr>
             </w:pPr>
             <w:r>
-              <w:t>3</w:t>
+              <w:t>4</w:t>
             </w:r>
           </w:p>
         </w:tc>
@@ -3619,7 +3619,7 @@
               </w:rPr>
             </w:pPr>
             <w:r>
-              <w:t>3</w:t>
+              <w:t>4</w:t>
             </w:r>
           </w:p>
         </w:tc>
@@ -3693,7 +3693,7 @@
               </w:rPr>
             </w:pPr>
             <w:r>
-              <w:t>3</w:t>
+              <w:t>4</w:t>
             </w:r>
           </w:p>
         </w:tc>
@@ -3753,7 +3753,7 @@
               </w:rPr>
             </w:pPr>
             <w:r>
-              <w:t>3</w:t>
+              <w:t>4</w:t>
             </w:r>
           </w:p>
         </w:tc>
@@ -3824,7 +3824,7 @@
               </w:rPr>
             </w:pPr>
             <w:r>
-              <w:t>5</w:t>
+              <w:t>6</w:t>
             </w:r>
           </w:p>
         </w:tc>
@@ -3884,7 +3884,7 @@
               </w:rPr>
             </w:pPr>
             <w:r>
-              <w:t>5</w:t>
+              <w:t>6</w:t>
             </w:r>
           </w:p>
         </w:tc>
@@ -3944,7 +3944,7 @@
               </w:rPr>
             </w:pPr>
             <w:r>
-              <w:t>5</w:t>
+              <w:t>6</w:t>
             </w:r>
           </w:p>
         </w:tc>
@@ -4004,7 +4004,7 @@
               </w:rPr>
             </w:pPr>
             <w:r>
-              <w:t>5</w:t>
+              <w:t>6</w:t>
             </w:r>
           </w:p>
         </w:tc>
@@ -4064,7 +4064,7 @@
               </w:rPr>
             </w:pPr>
             <w:r>
-              <w:t>5</w:t>
+              <w:t>6</w:t>
             </w:r>
           </w:p>
         </w:tc>
@@ -4139,7 +4139,7 @@
               </w:rPr>
             </w:pPr>
             <w:r>
-              <w:t>5</w:t>
+              <w:t>6</w:t>
             </w:r>
           </w:p>
         </w:tc>
@@ -4214,7 +4214,7 @@
               </w:rPr>
             </w:pPr>
             <w:r>
-              <w:t>5</w:t>
+              <w:t>6</w:t>
             </w:r>
           </w:p>
         </w:tc>
@@ -4287,7 +4287,7 @@
               </w:rPr>
             </w:pPr>
             <w:r>
-              <w:t>6</w:t>
+              <w:t>7</w:t>
             </w:r>
           </w:p>
         </w:tc>
@@ -4347,7 +4347,7 @@
               </w:rPr>
             </w:pPr>
             <w:r>
-              <w:t>6</w:t>
+              <w:t>7</w:t>
             </w:r>
           </w:p>
         </w:tc>
@@ -4407,7 +4407,7 @@
               </w:rPr>
             </w:pPr>
             <w:r>
-              <w:t>6</w:t>
+              <w:t>7</w:t>
             </w:r>
           </w:p>
         </w:tc>
@@ -4467,7 +4467,7 @@
               </w:rPr>
             </w:pPr>
             <w:r>
-              <w:t>6</w:t>
+              <w:t>7</w:t>
             </w:r>
           </w:p>
         </w:tc>
@@ -4588,7 +4588,7 @@
               </w:rPr>
             </w:pPr>
             <w:r>
-              <w:t>7</w:t>
+              <w:t>8</w:t>
             </w:r>
           </w:p>
         </w:tc>
@@ -4651,7 +4651,7 @@
               </w:rPr>
             </w:pPr>
             <w:r>
-              <w:t>7</w:t>
+              <w:t>8</w:t>
             </w:r>
           </w:p>
         </w:tc>
@@ -4711,7 +4711,7 @@
               </w:rPr>
             </w:pPr>
             <w:r>
-              <w:t>7</w:t>
+              <w:t>8</w:t>
             </w:r>
           </w:p>
         </w:tc>
@@ -4771,7 +4771,7 @@
               </w:rPr>
             </w:pPr>
             <w:r>
-              <w:t>7</w:t>
+              <w:t>8</w:t>
             </w:r>
           </w:p>
         </w:tc>
@@ -4831,7 +4831,7 @@
               </w:rPr>
             </w:pPr>
             <w:r>
-              <w:t>8</w:t>
+              <w:t>9</w:t>
             </w:r>
           </w:p>
         </w:tc>
@@ -4891,7 +4891,7 @@
               </w:rPr>
             </w:pPr>
             <w:r>
-              <w:t>8</w:t>
+              <w:t>9</w:t>
             </w:r>
           </w:p>
         </w:tc>
@@ -4961,7 +4961,7 @@
               </w:rPr>
             </w:pPr>
             <w:r>
-              <w:t>9</w:t>
+              <w:t>10</w:t>
             </w:r>
           </w:p>
         </w:tc>
@@ -5041,7 +5041,7 @@
               </w:rPr>
             </w:pPr>
             <w:r>
-              <w:t>11</w:t>
+              <w:t>12</w:t>
             </w:r>
           </w:p>
         </w:tc>
@@ -5117,7 +5117,7 @@
               </w:rPr>
             </w:pPr>
             <w:r>
-              <w:t>11</w:t>
+              <w:t>12</w:t>
             </w:r>
           </w:p>
         </w:tc>
@@ -5180,7 +5180,7 @@
               </w:rPr>
             </w:pPr>
             <w:r>
-              <w:t>13</w:t>
+              <w:t>14</w:t>
             </w:r>
           </w:p>
         </w:tc>
@@ -5252,7 +5252,7 @@
               </w:rPr>
             </w:pPr>
             <w:r>
-              <w:t>14</w:t>
+              <w:t>15</w:t>
             </w:r>
           </w:p>
         </w:tc>
@@ -5419,7 +5419,7 @@
               </w:rPr>
             </w:pPr>
             <w:r>
-              <w:t>26</w:t>
+              <w:t>27</w:t>
             </w:r>
           </w:p>
         </w:tc>
@@ -5497,7 +5497,7 @@
               </w:rPr>
             </w:pPr>
             <w:r>
-              <w:t>27</w:t>
+              <w:t>28</w:t>
             </w:r>
           </w:p>
         </w:tc>
@@ -5559,7 +5559,7 @@
               </w:rPr>
             </w:pPr>
             <w:r>
-              <w:t>28</w:t>
+              <w:t>32</w:t>
             </w:r>
           </w:p>
         </w:tc>
@@ -5858,7 +5858,7 @@
               <w:rPr>
                 <w:sz w:val="21"/>
               </w:rPr>
-              <w:t>7</w:t>
+              <w:t>8</w:t>
             </w:r>
           </w:p>
         </w:tc>
@@ -5931,7 +5931,7 @@
               <w:rPr>
                 <w:sz w:val="21"/>
               </w:rPr>
-              <w:t>7</w:t>
+              <w:t>8</w:t>
             </w:r>
           </w:p>
         </w:tc>
@@ -6004,7 +6004,7 @@
               <w:rPr>
                 <w:sz w:val="21"/>
               </w:rPr>
-              <w:t>8</w:t>
+              <w:t>9</w:t>
             </w:r>
           </w:p>
         </w:tc>
@@ -6077,7 +6077,7 @@
               <w:rPr>
                 <w:sz w:val="21"/>
               </w:rPr>
-              <w:t>9</w:t>
+              <w:t>10</w:t>
             </w:r>
           </w:p>
         </w:tc>
@@ -6150,7 +6150,7 @@
               <w:rPr>
                 <w:sz w:val="21"/>
               </w:rPr>
-              <w:t>9</w:t>
+              <w:t>10</w:t>
             </w:r>
           </w:p>
         </w:tc>
@@ -6223,7 +6223,7 @@
               <w:rPr>
                 <w:sz w:val="21"/>
               </w:rPr>
-              <w:t>10</w:t>
+              <w:t>11</w:t>
             </w:r>
           </w:p>
         </w:tc>
@@ -6296,7 +6296,7 @@
               <w:rPr>
                 <w:sz w:val="21"/>
               </w:rPr>
-              <w:t>11</w:t>
+              <w:t>12</w:t>
             </w:r>
           </w:p>
         </w:tc>
@@ -6369,7 +6369,7 @@
               <w:rPr>
                 <w:sz w:val="21"/>
               </w:rPr>
-              <w:t>14</w:t>
+              <w:t>15</w:t>
             </w:r>
           </w:p>
         </w:tc>
@@ -6442,7 +6442,7 @@
               <w:rPr>
                 <w:sz w:val="21"/>
               </w:rPr>
-              <w:t>14</w:t>
+              <w:t>15</w:t>
             </w:r>
           </w:p>
         </w:tc>
@@ -6515,7 +6515,7 @@
               <w:rPr>
                 <w:sz w:val="21"/>
               </w:rPr>
-              <w:t>15</w:t>
+              <w:t>16</w:t>
             </w:r>
           </w:p>
         </w:tc>
@@ -6588,7 +6588,7 @@
               <w:rPr>
                 <w:sz w:val="21"/>
               </w:rPr>
-              <w:t>16</w:t>
+              <w:t>17</w:t>
             </w:r>
           </w:p>
         </w:tc>
@@ -6661,7 +6661,7 @@
               <w:rPr>
                 <w:sz w:val="21"/>
               </w:rPr>
-              <w:t>17</w:t>
+              <w:t>18</w:t>
             </w:r>
           </w:p>
         </w:tc>
@@ -6734,7 +6734,7 @@
               <w:rPr>
                 <w:sz w:val="21"/>
               </w:rPr>
-              <w:t>17</w:t>
+              <w:t>18</w:t>
             </w:r>
           </w:p>
         </w:tc>
@@ -6807,7 +6807,7 @@
               <w:rPr>
                 <w:sz w:val="21"/>
               </w:rPr>
-              <w:t>18</w:t>
+              <w:t>19</w:t>
             </w:r>
           </w:p>
         </w:tc>
@@ -6880,7 +6880,7 @@
               <w:rPr>
                 <w:sz w:val="21"/>
               </w:rPr>
-              <w:t>19</w:t>
+              <w:t>20</w:t>
             </w:r>
           </w:p>
         </w:tc>
@@ -6953,7 +6953,7 @@
               <w:rPr>
                 <w:sz w:val="21"/>
               </w:rPr>
-              <w:t>20</w:t>
+              <w:t>21</w:t>
             </w:r>
           </w:p>
         </w:tc>
@@ -7026,7 +7026,7 @@
               <w:rPr>
                 <w:sz w:val="21"/>
               </w:rPr>
-              <w:t>21</w:t>
+              <w:t>22</w:t>
             </w:r>
           </w:p>
         </w:tc>
@@ -7099,7 +7099,7 @@
               <w:rPr>
                 <w:sz w:val="21"/>
               </w:rPr>
-              <w:t>21</w:t>
+              <w:t>22</w:t>
             </w:r>
           </w:p>
         </w:tc>
@@ -7172,7 +7172,7 @@
               <w:rPr>
                 <w:sz w:val="21"/>
               </w:rPr>
-              <w:t>22</w:t>
+              <w:t>23</w:t>
             </w:r>
           </w:p>
         </w:tc>
@@ -7245,7 +7245,7 @@
               <w:rPr>
                 <w:sz w:val="21"/>
               </w:rPr>
-              <w:t>22</w:t>
+              <w:t>23</w:t>
             </w:r>
           </w:p>
         </w:tc>
@@ -7318,7 +7318,7 @@
               <w:rPr>
                 <w:sz w:val="21"/>
               </w:rPr>
-              <w:t>23</w:t>
+              <w:t>24</w:t>
             </w:r>
           </w:p>
         </w:tc>
@@ -7391,7 +7391,7 @@
               <w:rPr>
                 <w:sz w:val="21"/>
               </w:rPr>
-              <w:t>24</w:t>
+              <w:t>25</w:t>
             </w:r>
           </w:p>
         </w:tc>
@@ -7464,7 +7464,7 @@
               <w:rPr>
                 <w:sz w:val="21"/>
               </w:rPr>
-              <w:t>24</w:t>
+              <w:t>25</w:t>
             </w:r>
           </w:p>
         </w:tc>
@@ -7537,7 +7537,7 @@
               <w:rPr>
                 <w:sz w:val="21"/>
               </w:rPr>
-              <w:t>24</w:t>
+              <w:t>25</w:t>
             </w:r>
           </w:p>
         </w:tc>
@@ -7707,7 +7707,7 @@
         <w:tab/>
         <w:t>Hardware used for development, training and testing</w:t>
         <w:tab/>
-        <w:t>6</w:t>
+        <w:t>7</w:t>
       </w:r>
     </w:p>
     <w:p>
@@ -7725,7 +7725,7 @@
         <w:tab/>
         <w:t>Software stack</w:t>
         <w:tab/>
-        <w:t>6</w:t>
+        <w:t>7</w:t>
       </w:r>
     </w:p>
     <w:p>
@@ -7743,7 +7743,7 @@
         <w:tab/>
         <w:t>End-to-end test results</w:t>
         <w:tab/>
-        <w:t>13</w:t>
+        <w:t>14</w:t>
       </w:r>
     </w:p>
     <w:p>
@@ -7761,7 +7761,7 @@
         <w:tab/>
         <w:t>Detector results on CASIA v2.0</w:t>
         <w:tab/>
-        <w:t>21</w:t>
+        <w:t>22</w:t>
       </w:r>
     </w:p>
     <w:p>
@@ -7779,7 +7779,7 @@
         <w:tab/>
         <w:t>Decision-engine verdicts on the held-out images</w:t>
         <w:tab/>
-        <w:t>22</w:t>
+        <w:t>23</w:t>
       </w:r>
     </w:p>
     <w:p>
@@ -7797,7 +7797,7 @@
         <w:tab/>
         <w:t>Columbia, 5-fold cross-validation (all variants tried are listed)</w:t>
         <w:tab/>
-        <w:t>23</w:t>
+        <w:t>24</w:t>
       </w:r>
     </w:p>
     <w:p>
@@ -7815,7 +7815,7 @@
         <w:tab/>
         <w:t>Localiser trained on CASIA v2.0</w:t>
         <w:tab/>
-        <w:t>24</w:t>
+        <w:t>25</w:t>
       </w:r>
     </w:p>
     <w:p>
@@ -7833,7 +7833,7 @@
         <w:tab/>
         <w:t>CASIA v2.0 results of the base papers that the trained detector exceeds</w:t>
         <w:tab/>
-        <w:t>25</w:t>
+        <w:t>26</w:t>
       </w:r>
     </w:p>
     <w:p>
@@ -7851,7 +7851,7 @@
         <w:tab/>
         <w:t>Columbia results of earlier methods listed in [1] that the patch-based detector exceeds</w:t>
         <w:tab/>
-        <w:t>25</w:t>
+        <w:t>26</w:t>
       </w:r>
     </w:p>
     <w:p>
@@ -7869,7 +7869,7 @@
         <w:tab/>
         <w:t>Cost of building and running the system</w:t>
         <w:tab/>
-        <w:t>25</w:t>
+        <w:t>26</w:t>
       </w:r>
     </w:p>
     <w:p>
@@ -9163,7 +9163,75 @@
           <w:i w:val="0"/>
           <w:sz w:val="24"/>
         </w:rPr>
-        <w:t>Deep learning replaced hand-crafted features in most recent work. Salloum et al. [6] trained a multi-task fully convolutional network on CASIA v2.0 to predict both the spliced region and its boundary, and tested it on CASIA v1.0, Columbia and other sets; this train-on-CASIA, test-elsewhere protocol is the one later adopted by [5]. The five base papers of this project are summarised below.</w:t>
+        <w:t>Deep learning replaced hand-crafted features in most recent work. Salloum et al. [6] trained a multi-task fully convolutional network on CASIA v2.0 to predict both the spliced region and its boundary, and tested it on CASIA v1.0, Columbia and other sets; this train-on-CASIA, test-elsewhere protocol is the one later adopted by [5].</w:t>
+      </w:r>
+    </w:p>
+    <w:p>
+      <w:pPr>
+        <w:keepNext w:val="0"/>
+        <w:pageBreakBefore w:val="0"/>
+        <w:spacing w:before="0" w:after="120" w:line="276" w:lineRule="auto"/>
+        <w:jc w:val="both"/>
+      </w:pPr>
+      <w:r>
+        <w:rPr>
+          <w:rFonts w:ascii="Times New Roman" w:hAnsi="Times New Roman" w:eastAsia="Times New Roman"/>
+          <w:b w:val="0"/>
+          <w:i w:val="0"/>
+          <w:sz w:val="24"/>
+        </w:rPr>
+        <w:t>Early passive methods rely on physical traces of the imaging pipeline. Resampling after scaling or rotation leaves periodic correlations between neighbouring pixels [15]. The colour-filter-array interpolation of a camera leaves correlations that a pasted region tends to lack [16], and sensor pattern noise works as a camera fingerprint whose absence from a region points to tampering [17]. Mahdian and Saic look for regions whose noise level differs from the rest of the image [18]. For JPEG images, JPEG ghosts reveal a region that was first compressed at another quality [19], and Bianchi and Piva estimate a tampering probability for each 8 × 8 block under double compression [20]. Copy-move forgery was first attacked by matching overlapping blocks [21]; keypoint methods based on SIFT also recover the geometric transformation of the copied region [22], and Christlein et al. compared fifteen feature sets inside one common pipeline [23]. Splicebuster models co-occurrences of noise residuals and segments the image without training on forged examples [24]. The residual filters of the rich models of Fridrich and Kodovský, designed for steganalysis [25], are the basis of the SRM input used for Columbia in this work.</w:t>
+      </w:r>
+    </w:p>
+    <w:p>
+      <w:pPr>
+        <w:keepNext w:val="0"/>
+        <w:pageBreakBefore w:val="0"/>
+        <w:spacing w:before="0" w:after="120" w:line="276" w:lineRule="auto"/>
+        <w:jc w:val="both"/>
+      </w:pPr>
+      <w:r>
+        <w:rPr>
+          <w:rFonts w:ascii="Times New Roman" w:hAnsi="Times New Roman" w:eastAsia="Times New Roman"/>
+          <w:b w:val="0"/>
+          <w:i w:val="0"/>
+          <w:sz w:val="24"/>
+        </w:rPr>
+        <w:t>Deep networks learn such traces from data. Bayar and Stamm constrain the first convolutional layer so that it suppresses image content and learns prediction-error filters [26]. Zhou et al. combine an RGB stream and a noise stream in a Faster R-CNN [27], and Huh et al. train on real photographs with EXIF metadata to predict whether two patches come from the same image, with no forged examples [28]. BusterNet separates the source and target regions of a copy-move forgery [29]; ManTra-Net learns from many manipulation types and treats localisation as anomaly detection [30]; RRU-Net adds residual propagation and feedback to a U-Net [31]; and PSCC-Net predicts masks progressively at several scales [32]. MVSS-Net supervises edge, noise and image-level outputs together [33], CAT-Net learns from JPEG DCT coefficients as well as pixels [34], ObjectFormer pairs RGB and high-frequency features in a transformer [35], and TruFor adds a learned noise fingerprint and a map of how reliable the result is [36]. Most of these works are judged on pixel-level localisation. The detector in this project answers the image-level question, authentic or tampered, which is also the question the base papers [1] to [4] answer.</w:t>
+      </w:r>
+    </w:p>
+    <w:p>
+      <w:pPr>
+        <w:keepNext w:val="0"/>
+        <w:pageBreakBefore w:val="0"/>
+        <w:spacing w:before="0" w:after="120" w:line="276" w:lineRule="auto"/>
+        <w:jc w:val="both"/>
+      </w:pPr>
+      <w:r>
+        <w:rPr>
+          <w:rFonts w:ascii="Times New Roman" w:hAnsi="Times New Roman" w:eastAsia="Times New Roman"/>
+          <w:b w:val="0"/>
+          <w:i w:val="0"/>
+          <w:sz w:val="24"/>
+        </w:rPr>
+        <w:t>Surveys of the field are given in [37] to [40]: Verdoliva covers media forensics including deepfakes [37], Qureshi and Deriche catalogue pixel-based blind methods [38], Stamm et al. summarise the first decade of information forensics [39], and Warif et al. review copy-move detection [40]. Muhammad et al. separate authentic from tampered images by applying a steerable pyramid transform and local binary patterns to the chrominance channels [41]. Besides CASIA [7] and the Columbia splicing set [8], the benchmark datasets in this literature include the Columbia set of authentic and spliced image blocks [42], CoMoFoD [43], COVERAGE [44] and the Dresden image database [45]. The building blocks of this project are standard: residual networks [46] and vision transformers [47] are the usual alternatives to the EfficientNet backbone [9], the localiser follows the U-Net encoder-decoder layout [48], and training uses AdamW [49]. On the evidence side, Hasan and Salah proposed Ethereum smart contracts that track where a piece of media came from through the hashes of the stored files [50]; this project anchors a SHA-256 hash of the analysed image in a similar way, and adds the signature and chain of custody around it.</w:t>
+      </w:r>
+    </w:p>
+    <w:p>
+      <w:pPr>
+        <w:keepNext w:val="0"/>
+        <w:pageBreakBefore w:val="0"/>
+        <w:spacing w:before="0" w:after="120" w:line="276" w:lineRule="auto"/>
+        <w:jc w:val="both"/>
+      </w:pPr>
+      <w:r>
+        <w:rPr>
+          <w:rFonts w:ascii="Times New Roman" w:hAnsi="Times New Roman" w:eastAsia="Times New Roman"/>
+          <w:b w:val="0"/>
+          <w:i w:val="0"/>
+          <w:sz w:val="24"/>
+        </w:rPr>
+        <w:t>The five base papers of this project are summarised next.</w:t>
       </w:r>
     </w:p>
     <w:p>
@@ -13111,7 +13179,7 @@
           <w:i w:val="0"/>
           <w:sz w:val="24"/>
         </w:rPr>
-        <w:t>Grad-CAM:</w:t>
+        <w:t>Grad-CAM [11]:</w:t>
       </w:r>
       <w:r>
         <w:rPr>
@@ -13326,7 +13394,7 @@
           <w:i w:val="0"/>
           <w:sz w:val="24"/>
         </w:rPr>
-        <w:t>The provenance agent checks for embedded C2PA content credentials and for invisible watermarks written by AI image generators. A valid manifest fast-tracks an image to Authentic; a failed manifest or a generator watermark is reported as suspicious and appears in the reasoning. Most images carry neither, in which case the agent reports no signal and is left out of the weighted average.</w:t>
+        <w:t>The provenance agent checks for embedded C2PA content credentials [14] and for invisible watermarks written by AI image generators. A valid manifest fast-tracks an image to Authentic; a failed manifest or a generator watermark is reported as suspicious and appears in the reasoning. Most images carry neither, in which case the agent reports no signal and is left out of the weighted average.</w:t>
       </w:r>
     </w:p>
     <w:p>
@@ -13394,7 +13462,7 @@
           <w:i w:val="0"/>
           <w:sz w:val="24"/>
         </w:rPr>
-        <w:t>The analysed file is hashed with SHA-256. A canonical record (file hash, verdict, score, agent scores, time) is signed with an Ed25519 key; the public key fingerprint is stored with the record. The chain of custody lists upload, analysis, signing and anchoring events. If a wallet is configured, the file hash and verdict are written to a smart contract on Polygon Amoy and can be read back for verification. The evidence PDF contains the identification, the verdict and reasoning, every agent's findings, the explainability exhibits, the chain of custody and the signature.</w:t>
+        <w:t>The analysed file is hashed with SHA-256. A canonical record (file hash, verdict, score, agent scores, time) is signed with an Ed25519 key [13]; the public key fingerprint is stored with the record. The chain of custody lists upload, analysis, signing and anchoring events. If a wallet is configured, the file hash and verdict are written to a smart contract on Polygon Amoy and can be read back for verification. The evidence PDF contains the identification, the verdict and reasoning, every agent's findings, the explainability exhibits, the chain of custody and the signature.</w:t>
       </w:r>
     </w:p>
     <w:p>
@@ -19977,6 +20045,1014 @@
           <w:shd w:val="clear" w:color="auto" w:fill="FFFFFF"/>
         </w:rPr>
         <w:t>Coalition for Content Provenance and Authenticity, "C2PA technical specification," https://c2pa.org.</w:t>
+      </w:r>
+    </w:p>
+    <w:p>
+      <w:pPr>
+        <w:pStyle w:val="ListParagraph"/>
+        <w:numPr>
+          <w:ilvl w:val="0"/>
+          <w:numId w:val="22"/>
+        </w:numPr>
+        <w:tabs>
+          <w:tab w:val="left" w:pos="884"/>
+        </w:tabs>
+        <w:spacing w:before="49" w:line="276" w:lineRule="auto"/>
+        <w:ind w:left="426" w:right="107"/>
+        <w:jc w:val="both"/>
+        <w:rPr>
+          <w:sz w:val="24"/>
+          <w:szCs w:val="24"/>
+        </w:rPr>
+      </w:pPr>
+      <w:r>
+        <w:rPr>
+          <w:i w:val="0"/>
+          <w:sz w:val="24"/>
+          <w:szCs w:val="24"/>
+          <w:shd w:val="clear" w:color="auto" w:fill="FFFFFF"/>
+        </w:rPr>
+        <w:t>A. C. Popescu and H. Farid, "Exposing digital forgeries by detecting traces of resampling," IEEE Transactions on Signal Processing, vol. 53, no. 2, pp. 758-767, 2005.</w:t>
+      </w:r>
+    </w:p>
+    <w:p>
+      <w:pPr>
+        <w:pStyle w:val="ListParagraph"/>
+        <w:numPr>
+          <w:ilvl w:val="0"/>
+          <w:numId w:val="22"/>
+        </w:numPr>
+        <w:tabs>
+          <w:tab w:val="left" w:pos="884"/>
+        </w:tabs>
+        <w:spacing w:before="49" w:line="276" w:lineRule="auto"/>
+        <w:ind w:left="426" w:right="107"/>
+        <w:jc w:val="both"/>
+        <w:rPr>
+          <w:sz w:val="24"/>
+          <w:szCs w:val="24"/>
+        </w:rPr>
+      </w:pPr>
+      <w:r>
+        <w:rPr>
+          <w:i w:val="0"/>
+          <w:sz w:val="24"/>
+          <w:szCs w:val="24"/>
+          <w:shd w:val="clear" w:color="auto" w:fill="FFFFFF"/>
+        </w:rPr>
+        <w:t>A. C. Popescu and H. Farid, "Exposing digital forgeries in color filter array interpolated images," IEEE Transactions on Signal Processing, vol. 53, no. 10, pp. 3948-3959, 2005.</w:t>
+      </w:r>
+    </w:p>
+    <w:p>
+      <w:pPr>
+        <w:pStyle w:val="ListParagraph"/>
+        <w:numPr>
+          <w:ilvl w:val="0"/>
+          <w:numId w:val="22"/>
+        </w:numPr>
+        <w:tabs>
+          <w:tab w:val="left" w:pos="884"/>
+        </w:tabs>
+        <w:spacing w:before="49" w:line="276" w:lineRule="auto"/>
+        <w:ind w:left="426" w:right="107"/>
+        <w:jc w:val="both"/>
+        <w:rPr>
+          <w:sz w:val="24"/>
+          <w:szCs w:val="24"/>
+        </w:rPr>
+      </w:pPr>
+      <w:r>
+        <w:rPr>
+          <w:i w:val="0"/>
+          <w:sz w:val="24"/>
+          <w:szCs w:val="24"/>
+          <w:shd w:val="clear" w:color="auto" w:fill="FFFFFF"/>
+        </w:rPr>
+        <w:t>J. Lukáš, J. Fridrich and M. Goljan, "Digital camera identification from sensor pattern noise," IEEE Transactions on Information Forensics and Security, vol. 1, no. 2, pp. 205-214, 2006, doi: 10.1109/TIFS.2006.873602.</w:t>
+      </w:r>
+    </w:p>
+    <w:p>
+      <w:pPr>
+        <w:pStyle w:val="ListParagraph"/>
+        <w:numPr>
+          <w:ilvl w:val="0"/>
+          <w:numId w:val="22"/>
+        </w:numPr>
+        <w:tabs>
+          <w:tab w:val="left" w:pos="884"/>
+        </w:tabs>
+        <w:spacing w:before="49" w:line="276" w:lineRule="auto"/>
+        <w:ind w:left="426" w:right="107"/>
+        <w:jc w:val="both"/>
+        <w:rPr>
+          <w:sz w:val="24"/>
+          <w:szCs w:val="24"/>
+        </w:rPr>
+      </w:pPr>
+      <w:r>
+        <w:rPr>
+          <w:i w:val="0"/>
+          <w:sz w:val="24"/>
+          <w:szCs w:val="24"/>
+          <w:shd w:val="clear" w:color="auto" w:fill="FFFFFF"/>
+        </w:rPr>
+        <w:t>B. Mahdian and S. Saic, "Using noise inconsistencies for blind image forensics," Image and Vision Computing, vol. 27, no. 10, pp. 1497-1503, 2009, doi: 10.1016/j.imavis.2009.02.001.</w:t>
+      </w:r>
+    </w:p>
+    <w:p>
+      <w:pPr>
+        <w:pStyle w:val="ListParagraph"/>
+        <w:numPr>
+          <w:ilvl w:val="0"/>
+          <w:numId w:val="22"/>
+        </w:numPr>
+        <w:tabs>
+          <w:tab w:val="left" w:pos="884"/>
+        </w:tabs>
+        <w:spacing w:before="49" w:line="276" w:lineRule="auto"/>
+        <w:ind w:left="426" w:right="107"/>
+        <w:jc w:val="both"/>
+        <w:rPr>
+          <w:sz w:val="24"/>
+          <w:szCs w:val="24"/>
+        </w:rPr>
+      </w:pPr>
+      <w:r>
+        <w:rPr>
+          <w:i w:val="0"/>
+          <w:sz w:val="24"/>
+          <w:szCs w:val="24"/>
+          <w:shd w:val="clear" w:color="auto" w:fill="FFFFFF"/>
+        </w:rPr>
+        <w:t>H. Farid, "Exposing digital forgeries from JPEG ghosts," IEEE Transactions on Information Forensics and Security, vol. 4, no. 1, pp. 154-160, 2009, doi: 10.1109/TIFS.2008.2012215.</w:t>
+      </w:r>
+    </w:p>
+    <w:p>
+      <w:pPr>
+        <w:pStyle w:val="ListParagraph"/>
+        <w:numPr>
+          <w:ilvl w:val="0"/>
+          <w:numId w:val="22"/>
+        </w:numPr>
+        <w:tabs>
+          <w:tab w:val="left" w:pos="884"/>
+        </w:tabs>
+        <w:spacing w:before="49" w:line="276" w:lineRule="auto"/>
+        <w:ind w:left="426" w:right="107"/>
+        <w:jc w:val="both"/>
+        <w:rPr>
+          <w:sz w:val="24"/>
+          <w:szCs w:val="24"/>
+        </w:rPr>
+      </w:pPr>
+      <w:r>
+        <w:rPr>
+          <w:i w:val="0"/>
+          <w:sz w:val="24"/>
+          <w:szCs w:val="24"/>
+          <w:shd w:val="clear" w:color="auto" w:fill="FFFFFF"/>
+        </w:rPr>
+        <w:t>T. Bianchi and A. Piva, "Image forgery localization via block-grained analysis of JPEG artifacts," IEEE Transactions on Information Forensics and Security, vol. 7, no. 3, pp. 1003-1017, 2012, doi: 10.1109/TIFS.2012.2187516.</w:t>
+      </w:r>
+    </w:p>
+    <w:p>
+      <w:pPr>
+        <w:pStyle w:val="ListParagraph"/>
+        <w:numPr>
+          <w:ilvl w:val="0"/>
+          <w:numId w:val="22"/>
+        </w:numPr>
+        <w:tabs>
+          <w:tab w:val="left" w:pos="884"/>
+        </w:tabs>
+        <w:spacing w:before="49" w:line="276" w:lineRule="auto"/>
+        <w:ind w:left="426" w:right="107"/>
+        <w:jc w:val="both"/>
+        <w:rPr>
+          <w:sz w:val="24"/>
+          <w:szCs w:val="24"/>
+        </w:rPr>
+      </w:pPr>
+      <w:r>
+        <w:rPr>
+          <w:i w:val="0"/>
+          <w:sz w:val="24"/>
+          <w:szCs w:val="24"/>
+          <w:shd w:val="clear" w:color="auto" w:fill="FFFFFF"/>
+        </w:rPr>
+        <w:t>J. Fridrich, D. Soukal and J. Lukáš, "Detection of copy-move forgery in digital images," in Proc. Digital Forensic Research Workshop, Cleveland, OH, USA, 2003.</w:t>
+      </w:r>
+    </w:p>
+    <w:p>
+      <w:pPr>
+        <w:pStyle w:val="ListParagraph"/>
+        <w:numPr>
+          <w:ilvl w:val="0"/>
+          <w:numId w:val="22"/>
+        </w:numPr>
+        <w:tabs>
+          <w:tab w:val="left" w:pos="884"/>
+        </w:tabs>
+        <w:spacing w:before="49" w:line="276" w:lineRule="auto"/>
+        <w:ind w:left="426" w:right="107"/>
+        <w:jc w:val="both"/>
+        <w:rPr>
+          <w:sz w:val="24"/>
+          <w:szCs w:val="24"/>
+        </w:rPr>
+      </w:pPr>
+      <w:r>
+        <w:rPr>
+          <w:i w:val="0"/>
+          <w:sz w:val="24"/>
+          <w:szCs w:val="24"/>
+          <w:shd w:val="clear" w:color="auto" w:fill="FFFFFF"/>
+        </w:rPr>
+        <w:t>I. Amerini, L. Ballan, R. Caldelli, A. Del Bimbo and G. Serra, "A SIFT-based forensic method for copy-move attack detection and transformation recovery," IEEE Transactions on Information Forensics and Security, vol. 6, no. 3, pp. 1099-1110, 2011, doi: 10.1109/TIFS.2011.2129512.</w:t>
+      </w:r>
+    </w:p>
+    <w:p>
+      <w:pPr>
+        <w:pStyle w:val="ListParagraph"/>
+        <w:numPr>
+          <w:ilvl w:val="0"/>
+          <w:numId w:val="22"/>
+        </w:numPr>
+        <w:tabs>
+          <w:tab w:val="left" w:pos="884"/>
+        </w:tabs>
+        <w:spacing w:before="49" w:line="276" w:lineRule="auto"/>
+        <w:ind w:left="426" w:right="107"/>
+        <w:jc w:val="both"/>
+        <w:rPr>
+          <w:sz w:val="24"/>
+          <w:szCs w:val="24"/>
+        </w:rPr>
+      </w:pPr>
+      <w:r>
+        <w:rPr>
+          <w:i w:val="0"/>
+          <w:sz w:val="24"/>
+          <w:szCs w:val="24"/>
+          <w:shd w:val="clear" w:color="auto" w:fill="FFFFFF"/>
+        </w:rPr>
+        <w:t>V. Christlein, C. Riess, J. Jordan, C. Riess and E. Angelopoulou, "An evaluation of popular copy-move forgery detection approaches," IEEE Transactions on Information Forensics and Security, vol. 7, no. 6, pp. 1841-1854, 2012, doi: 10.1109/TIFS.2012.2218597.</w:t>
+      </w:r>
+    </w:p>
+    <w:p>
+      <w:pPr>
+        <w:pStyle w:val="ListParagraph"/>
+        <w:numPr>
+          <w:ilvl w:val="0"/>
+          <w:numId w:val="22"/>
+        </w:numPr>
+        <w:tabs>
+          <w:tab w:val="left" w:pos="884"/>
+        </w:tabs>
+        <w:spacing w:before="49" w:line="276" w:lineRule="auto"/>
+        <w:ind w:left="426" w:right="107"/>
+        <w:jc w:val="both"/>
+        <w:rPr>
+          <w:sz w:val="24"/>
+          <w:szCs w:val="24"/>
+        </w:rPr>
+      </w:pPr>
+      <w:r>
+        <w:rPr>
+          <w:i w:val="0"/>
+          <w:sz w:val="24"/>
+          <w:szCs w:val="24"/>
+          <w:shd w:val="clear" w:color="auto" w:fill="FFFFFF"/>
+        </w:rPr>
+        <w:t>D. Cozzolino, G. Poggi and L. Verdoliva, "Splicebuster: A new blind image splicing detector," in Proc. IEEE International Workshop on Information Forensics and Security (WIFS), 2015, pp. 1-6, doi: 10.1109/WIFS.2015.7368565.</w:t>
+      </w:r>
+    </w:p>
+    <w:p>
+      <w:pPr>
+        <w:pStyle w:val="ListParagraph"/>
+        <w:numPr>
+          <w:ilvl w:val="0"/>
+          <w:numId w:val="22"/>
+        </w:numPr>
+        <w:tabs>
+          <w:tab w:val="left" w:pos="884"/>
+        </w:tabs>
+        <w:spacing w:before="49" w:line="276" w:lineRule="auto"/>
+        <w:ind w:left="426" w:right="107"/>
+        <w:jc w:val="both"/>
+        <w:rPr>
+          <w:sz w:val="24"/>
+          <w:szCs w:val="24"/>
+        </w:rPr>
+      </w:pPr>
+      <w:r>
+        <w:rPr>
+          <w:i w:val="0"/>
+          <w:sz w:val="24"/>
+          <w:szCs w:val="24"/>
+          <w:shd w:val="clear" w:color="auto" w:fill="FFFFFF"/>
+        </w:rPr>
+        <w:t>J. Fridrich and J. Kodovský, "Rich models for steganalysis of digital images," IEEE Transactions on Information Forensics and Security, vol. 7, no. 3, pp. 868-882, 2012, doi: 10.1109/TIFS.2012.2190402.</w:t>
+      </w:r>
+    </w:p>
+    <w:p>
+      <w:pPr>
+        <w:pStyle w:val="ListParagraph"/>
+        <w:numPr>
+          <w:ilvl w:val="0"/>
+          <w:numId w:val="22"/>
+        </w:numPr>
+        <w:tabs>
+          <w:tab w:val="left" w:pos="884"/>
+        </w:tabs>
+        <w:spacing w:before="49" w:line="276" w:lineRule="auto"/>
+        <w:ind w:left="426" w:right="107"/>
+        <w:jc w:val="both"/>
+        <w:rPr>
+          <w:sz w:val="24"/>
+          <w:szCs w:val="24"/>
+        </w:rPr>
+      </w:pPr>
+      <w:r>
+        <w:rPr>
+          <w:i w:val="0"/>
+          <w:sz w:val="24"/>
+          <w:szCs w:val="24"/>
+          <w:shd w:val="clear" w:color="auto" w:fill="FFFFFF"/>
+        </w:rPr>
+        <w:t>B. Bayar and M. C. Stamm, "Constrained convolutional neural networks: A new approach towards general purpose image manipulation detection," IEEE Transactions on Information Forensics and Security, vol. 13, no. 11, pp. 2691-2706, 2018.</w:t>
+      </w:r>
+    </w:p>
+    <w:p>
+      <w:pPr>
+        <w:pStyle w:val="ListParagraph"/>
+        <w:numPr>
+          <w:ilvl w:val="0"/>
+          <w:numId w:val="22"/>
+        </w:numPr>
+        <w:tabs>
+          <w:tab w:val="left" w:pos="884"/>
+        </w:tabs>
+        <w:spacing w:before="49" w:line="276" w:lineRule="auto"/>
+        <w:ind w:left="426" w:right="107"/>
+        <w:jc w:val="both"/>
+        <w:rPr>
+          <w:sz w:val="24"/>
+          <w:szCs w:val="24"/>
+        </w:rPr>
+      </w:pPr>
+      <w:r>
+        <w:rPr>
+          <w:i w:val="0"/>
+          <w:sz w:val="24"/>
+          <w:szCs w:val="24"/>
+          <w:shd w:val="clear" w:color="auto" w:fill="FFFFFF"/>
+        </w:rPr>
+        <w:t>P. Zhou, X. Han, V. I. Morariu and L. S. Davis, "Learning rich features for image manipulation detection," in Proc. IEEE/CVF Conference on Computer Vision and Pattern Recognition (CVPR), 2018, pp. 1053-1061, doi: 10.1109/CVPR.2018.00116.</w:t>
+      </w:r>
+    </w:p>
+    <w:p>
+      <w:pPr>
+        <w:pStyle w:val="ListParagraph"/>
+        <w:numPr>
+          <w:ilvl w:val="0"/>
+          <w:numId w:val="22"/>
+        </w:numPr>
+        <w:tabs>
+          <w:tab w:val="left" w:pos="884"/>
+        </w:tabs>
+        <w:spacing w:before="49" w:line="276" w:lineRule="auto"/>
+        <w:ind w:left="426" w:right="107"/>
+        <w:jc w:val="both"/>
+        <w:rPr>
+          <w:sz w:val="24"/>
+          <w:szCs w:val="24"/>
+        </w:rPr>
+      </w:pPr>
+      <w:r>
+        <w:rPr>
+          <w:i w:val="0"/>
+          <w:sz w:val="24"/>
+          <w:szCs w:val="24"/>
+          <w:shd w:val="clear" w:color="auto" w:fill="FFFFFF"/>
+        </w:rPr>
+        <w:t>M. Huh, A. Liu, A. Owens and A. A. Efros, "Fighting fake news: Image splice detection via learned self-consistency," in Proc. European Conference on Computer Vision (ECCV), 2018, pp. 101-117.</w:t>
+      </w:r>
+    </w:p>
+    <w:p>
+      <w:pPr>
+        <w:pStyle w:val="ListParagraph"/>
+        <w:numPr>
+          <w:ilvl w:val="0"/>
+          <w:numId w:val="22"/>
+        </w:numPr>
+        <w:tabs>
+          <w:tab w:val="left" w:pos="884"/>
+        </w:tabs>
+        <w:spacing w:before="49" w:line="276" w:lineRule="auto"/>
+        <w:ind w:left="426" w:right="107"/>
+        <w:jc w:val="both"/>
+        <w:rPr>
+          <w:sz w:val="24"/>
+          <w:szCs w:val="24"/>
+        </w:rPr>
+      </w:pPr>
+      <w:r>
+        <w:rPr>
+          <w:i w:val="0"/>
+          <w:sz w:val="24"/>
+          <w:szCs w:val="24"/>
+          <w:shd w:val="clear" w:color="auto" w:fill="FFFFFF"/>
+        </w:rPr>
+        <w:t>Y. Wu, W. Abd-Almageed and P. Natarajan, "BusterNet: Detecting copy-move image forgery with source/target localization," in Proc. European Conference on Computer Vision (ECCV), 2018, pp. 168-184.</w:t>
+      </w:r>
+    </w:p>
+    <w:p>
+      <w:pPr>
+        <w:pStyle w:val="ListParagraph"/>
+        <w:numPr>
+          <w:ilvl w:val="0"/>
+          <w:numId w:val="22"/>
+        </w:numPr>
+        <w:tabs>
+          <w:tab w:val="left" w:pos="884"/>
+        </w:tabs>
+        <w:spacing w:before="49" w:line="276" w:lineRule="auto"/>
+        <w:ind w:left="426" w:right="107"/>
+        <w:jc w:val="both"/>
+        <w:rPr>
+          <w:sz w:val="24"/>
+          <w:szCs w:val="24"/>
+        </w:rPr>
+      </w:pPr>
+      <w:r>
+        <w:rPr>
+          <w:i w:val="0"/>
+          <w:sz w:val="24"/>
+          <w:szCs w:val="24"/>
+          <w:shd w:val="clear" w:color="auto" w:fill="FFFFFF"/>
+        </w:rPr>
+        <w:t>Y. Wu, W. AbdAlmageed and P. Natarajan, "ManTra-Net: Manipulation tracing network for detection and localization of image forgeries with anomalous features," in Proc. IEEE/CVF Conference on Computer Vision and Pattern Recognition (CVPR), 2019, pp. 9543-9552, doi: 10.1109/CVPR.2019.00977.</w:t>
+      </w:r>
+    </w:p>
+    <w:p>
+      <w:pPr>
+        <w:pStyle w:val="ListParagraph"/>
+        <w:numPr>
+          <w:ilvl w:val="0"/>
+          <w:numId w:val="22"/>
+        </w:numPr>
+        <w:tabs>
+          <w:tab w:val="left" w:pos="884"/>
+        </w:tabs>
+        <w:spacing w:before="49" w:line="276" w:lineRule="auto"/>
+        <w:ind w:left="426" w:right="107"/>
+        <w:jc w:val="both"/>
+        <w:rPr>
+          <w:sz w:val="24"/>
+          <w:szCs w:val="24"/>
+        </w:rPr>
+      </w:pPr>
+      <w:r>
+        <w:rPr>
+          <w:i w:val="0"/>
+          <w:sz w:val="24"/>
+          <w:szCs w:val="24"/>
+          <w:shd w:val="clear" w:color="auto" w:fill="FFFFFF"/>
+        </w:rPr>
+        <w:t>X. Bi, Y. Wei, B. Xiao and W. Li, "RRU-Net: The ringed residual U-Net for image splicing forgery detection," in Proc. IEEE/CVF Conference on Computer Vision and Pattern Recognition Workshops (CVPRW), 2019, doi: 10.1109/CVPRW.2019.00010.</w:t>
+      </w:r>
+    </w:p>
+    <w:p>
+      <w:pPr>
+        <w:pStyle w:val="ListParagraph"/>
+        <w:numPr>
+          <w:ilvl w:val="0"/>
+          <w:numId w:val="22"/>
+        </w:numPr>
+        <w:tabs>
+          <w:tab w:val="left" w:pos="884"/>
+        </w:tabs>
+        <w:spacing w:before="49" w:line="276" w:lineRule="auto"/>
+        <w:ind w:left="426" w:right="107"/>
+        <w:jc w:val="both"/>
+        <w:rPr>
+          <w:sz w:val="24"/>
+          <w:szCs w:val="24"/>
+        </w:rPr>
+      </w:pPr>
+      <w:r>
+        <w:rPr>
+          <w:i w:val="0"/>
+          <w:sz w:val="24"/>
+          <w:szCs w:val="24"/>
+          <w:shd w:val="clear" w:color="auto" w:fill="FFFFFF"/>
+        </w:rPr>
+        <w:t>X. Liu, Y. Liu, J. Chen and X. Liu, "PSCC-Net: Progressive spatio-channel correlation network for image manipulation detection and localization," IEEE Transactions on Circuits and Systems for Video Technology, vol. 32, no. 11, pp. 7505-7517, 2022, doi: 10.1109/TCSVT.2022.3189545.</w:t>
+      </w:r>
+    </w:p>
+    <w:p>
+      <w:pPr>
+        <w:pStyle w:val="ListParagraph"/>
+        <w:numPr>
+          <w:ilvl w:val="0"/>
+          <w:numId w:val="22"/>
+        </w:numPr>
+        <w:tabs>
+          <w:tab w:val="left" w:pos="884"/>
+        </w:tabs>
+        <w:spacing w:before="49" w:line="276" w:lineRule="auto"/>
+        <w:ind w:left="426" w:right="107"/>
+        <w:jc w:val="both"/>
+        <w:rPr>
+          <w:sz w:val="24"/>
+          <w:szCs w:val="24"/>
+        </w:rPr>
+      </w:pPr>
+      <w:r>
+        <w:rPr>
+          <w:i w:val="0"/>
+          <w:sz w:val="24"/>
+          <w:szCs w:val="24"/>
+          <w:shd w:val="clear" w:color="auto" w:fill="FFFFFF"/>
+        </w:rPr>
+        <w:t>X. Chen, C. Dong, J. Ji, J. Cao and X. Li, "Image manipulation detection by multi-view multi-scale supervision," in Proc. IEEE/CVF International Conference on Computer Vision (ICCV), 2021, pp. 14185-14193.</w:t>
+      </w:r>
+    </w:p>
+    <w:p>
+      <w:pPr>
+        <w:pStyle w:val="ListParagraph"/>
+        <w:numPr>
+          <w:ilvl w:val="0"/>
+          <w:numId w:val="22"/>
+        </w:numPr>
+        <w:tabs>
+          <w:tab w:val="left" w:pos="884"/>
+        </w:tabs>
+        <w:spacing w:before="49" w:line="276" w:lineRule="auto"/>
+        <w:ind w:left="426" w:right="107"/>
+        <w:jc w:val="both"/>
+        <w:rPr>
+          <w:sz w:val="24"/>
+          <w:szCs w:val="24"/>
+        </w:rPr>
+      </w:pPr>
+      <w:r>
+        <w:rPr>
+          <w:i w:val="0"/>
+          <w:sz w:val="24"/>
+          <w:szCs w:val="24"/>
+          <w:shd w:val="clear" w:color="auto" w:fill="FFFFFF"/>
+        </w:rPr>
+        <w:t>M.-J. Kwon, S.-H. Nam, I.-J. Yu, H.-K. Lee and C. Kim, "Learning JPEG compression artifacts for image manipulation detection and localization," International Journal of Computer Vision, vol. 130, 2022, doi: 10.1007/s11263-022-01617-5.</w:t>
+      </w:r>
+    </w:p>
+    <w:p>
+      <w:pPr>
+        <w:pStyle w:val="ListParagraph"/>
+        <w:numPr>
+          <w:ilvl w:val="0"/>
+          <w:numId w:val="22"/>
+        </w:numPr>
+        <w:tabs>
+          <w:tab w:val="left" w:pos="884"/>
+        </w:tabs>
+        <w:spacing w:before="49" w:line="276" w:lineRule="auto"/>
+        <w:ind w:left="426" w:right="107"/>
+        <w:jc w:val="both"/>
+        <w:rPr>
+          <w:sz w:val="24"/>
+          <w:szCs w:val="24"/>
+        </w:rPr>
+      </w:pPr>
+      <w:r>
+        <w:rPr>
+          <w:i w:val="0"/>
+          <w:sz w:val="24"/>
+          <w:szCs w:val="24"/>
+          <w:shd w:val="clear" w:color="auto" w:fill="FFFFFF"/>
+        </w:rPr>
+        <w:t>J. Wang, Z. Wu, J. Chen, X. Han, A. Shrivastava, S.-N. Lim and Y.-G. Jiang, "ObjectFormer for image manipulation detection and localization," in Proc. IEEE/CVF Conference on Computer Vision and Pattern Recognition (CVPR), 2022, pp. 2364-2373, doi: 10.1109/CVPR52688.2022.00240.</w:t>
+      </w:r>
+    </w:p>
+    <w:p>
+      <w:pPr>
+        <w:pStyle w:val="ListParagraph"/>
+        <w:numPr>
+          <w:ilvl w:val="0"/>
+          <w:numId w:val="22"/>
+        </w:numPr>
+        <w:tabs>
+          <w:tab w:val="left" w:pos="884"/>
+        </w:tabs>
+        <w:spacing w:before="49" w:line="276" w:lineRule="auto"/>
+        <w:ind w:left="426" w:right="107"/>
+        <w:jc w:val="both"/>
+        <w:rPr>
+          <w:sz w:val="24"/>
+          <w:szCs w:val="24"/>
+        </w:rPr>
+      </w:pPr>
+      <w:r>
+        <w:rPr>
+          <w:i w:val="0"/>
+          <w:sz w:val="24"/>
+          <w:szCs w:val="24"/>
+          <w:shd w:val="clear" w:color="auto" w:fill="FFFFFF"/>
+        </w:rPr>
+        <w:t>F. Guillaro, D. Cozzolino, A. Sud, N. Dufour and L. Verdoliva, "TruFor: Leveraging all-round clues for trustworthy image forgery detection and localization," in Proc. IEEE/CVF Conference on Computer Vision and Pattern Recognition (CVPR), 2023, pp. 20606-20615, doi: 10.1109/CVPR52729.2023.01974.</w:t>
+      </w:r>
+    </w:p>
+    <w:p>
+      <w:pPr>
+        <w:pStyle w:val="ListParagraph"/>
+        <w:numPr>
+          <w:ilvl w:val="0"/>
+          <w:numId w:val="22"/>
+        </w:numPr>
+        <w:tabs>
+          <w:tab w:val="left" w:pos="884"/>
+        </w:tabs>
+        <w:spacing w:before="49" w:line="276" w:lineRule="auto"/>
+        <w:ind w:left="426" w:right="107"/>
+        <w:jc w:val="both"/>
+        <w:rPr>
+          <w:sz w:val="24"/>
+          <w:szCs w:val="24"/>
+        </w:rPr>
+      </w:pPr>
+      <w:r>
+        <w:rPr>
+          <w:i w:val="0"/>
+          <w:sz w:val="24"/>
+          <w:szCs w:val="24"/>
+          <w:shd w:val="clear" w:color="auto" w:fill="FFFFFF"/>
+        </w:rPr>
+        <w:t>L. Verdoliva, "Media forensics and deepfakes: An overview," IEEE Journal of Selected Topics in Signal Processing, vol. 14, no. 5, pp. 910-932, 2020, doi: 10.1109/JSTSP.2020.3002101.</w:t>
+      </w:r>
+    </w:p>
+    <w:p>
+      <w:pPr>
+        <w:pStyle w:val="ListParagraph"/>
+        <w:numPr>
+          <w:ilvl w:val="0"/>
+          <w:numId w:val="22"/>
+        </w:numPr>
+        <w:tabs>
+          <w:tab w:val="left" w:pos="884"/>
+        </w:tabs>
+        <w:spacing w:before="49" w:line="276" w:lineRule="auto"/>
+        <w:ind w:left="426" w:right="107"/>
+        <w:jc w:val="both"/>
+        <w:rPr>
+          <w:sz w:val="24"/>
+          <w:szCs w:val="24"/>
+        </w:rPr>
+      </w:pPr>
+      <w:r>
+        <w:rPr>
+          <w:i w:val="0"/>
+          <w:sz w:val="24"/>
+          <w:szCs w:val="24"/>
+          <w:shd w:val="clear" w:color="auto" w:fill="FFFFFF"/>
+        </w:rPr>
+        <w:t>M. A. Qureshi and M. Deriche, "A bibliography of pixel-based blind image forgery detection techniques," Signal Processing: Image Communication, vol. 39, pp. 46-74, 2015.</w:t>
+      </w:r>
+    </w:p>
+    <w:p>
+      <w:pPr>
+        <w:pStyle w:val="ListParagraph"/>
+        <w:numPr>
+          <w:ilvl w:val="0"/>
+          <w:numId w:val="22"/>
+        </w:numPr>
+        <w:tabs>
+          <w:tab w:val="left" w:pos="884"/>
+        </w:tabs>
+        <w:spacing w:before="49" w:line="276" w:lineRule="auto"/>
+        <w:ind w:left="426" w:right="107"/>
+        <w:jc w:val="both"/>
+        <w:rPr>
+          <w:sz w:val="24"/>
+          <w:szCs w:val="24"/>
+        </w:rPr>
+      </w:pPr>
+      <w:r>
+        <w:rPr>
+          <w:i w:val="0"/>
+          <w:sz w:val="24"/>
+          <w:szCs w:val="24"/>
+          <w:shd w:val="clear" w:color="auto" w:fill="FFFFFF"/>
+        </w:rPr>
+        <w:t>M. C. Stamm, M. Wu and K. J. R. Liu, "Information forensics: An overview of the first decade," IEEE Access, vol. 1, pp. 167-200, 2013, doi: 10.1109/ACCESS.2013.2260814.</w:t>
+      </w:r>
+    </w:p>
+    <w:p>
+      <w:pPr>
+        <w:pStyle w:val="ListParagraph"/>
+        <w:numPr>
+          <w:ilvl w:val="0"/>
+          <w:numId w:val="22"/>
+        </w:numPr>
+        <w:tabs>
+          <w:tab w:val="left" w:pos="884"/>
+        </w:tabs>
+        <w:spacing w:before="49" w:line="276" w:lineRule="auto"/>
+        <w:ind w:left="426" w:right="107"/>
+        <w:jc w:val="both"/>
+        <w:rPr>
+          <w:sz w:val="24"/>
+          <w:szCs w:val="24"/>
+        </w:rPr>
+      </w:pPr>
+      <w:r>
+        <w:rPr>
+          <w:i w:val="0"/>
+          <w:sz w:val="24"/>
+          <w:szCs w:val="24"/>
+          <w:shd w:val="clear" w:color="auto" w:fill="FFFFFF"/>
+        </w:rPr>
+        <w:t>N. B. A. Warif, A. W. A. Wahab, M. Y. I. Idris, R. Ramli, R. Salleh, S. Shamshirband and K.-K. R. Choo, "Copy-move forgery detection: Survey, challenges and future directions," Journal of Network and Computer Applications, vol. 75, pp. 259-278, 2016, doi: 10.1016/j.jnca.2016.09.008.</w:t>
+      </w:r>
+    </w:p>
+    <w:p>
+      <w:pPr>
+        <w:pStyle w:val="ListParagraph"/>
+        <w:numPr>
+          <w:ilvl w:val="0"/>
+          <w:numId w:val="22"/>
+        </w:numPr>
+        <w:tabs>
+          <w:tab w:val="left" w:pos="884"/>
+        </w:tabs>
+        <w:spacing w:before="49" w:line="276" w:lineRule="auto"/>
+        <w:ind w:left="426" w:right="107"/>
+        <w:jc w:val="both"/>
+        <w:rPr>
+          <w:sz w:val="24"/>
+          <w:szCs w:val="24"/>
+        </w:rPr>
+      </w:pPr>
+      <w:r>
+        <w:rPr>
+          <w:i w:val="0"/>
+          <w:sz w:val="24"/>
+          <w:szCs w:val="24"/>
+          <w:shd w:val="clear" w:color="auto" w:fill="FFFFFF"/>
+        </w:rPr>
+        <w:t>G. Muhammad, M. H. Al-Hammadi, M. Hussain and G. Bebis, "Image forgery detection using steerable pyramid transform and local binary pattern," Machine Vision and Applications, vol. 25, no. 4, pp. 985-995, 2014, doi: 10.1007/s00138-013-0547-4.</w:t>
+      </w:r>
+    </w:p>
+    <w:p>
+      <w:pPr>
+        <w:pStyle w:val="ListParagraph"/>
+        <w:numPr>
+          <w:ilvl w:val="0"/>
+          <w:numId w:val="22"/>
+        </w:numPr>
+        <w:tabs>
+          <w:tab w:val="left" w:pos="884"/>
+        </w:tabs>
+        <w:spacing w:before="49" w:line="276" w:lineRule="auto"/>
+        <w:ind w:left="426" w:right="107"/>
+        <w:jc w:val="both"/>
+        <w:rPr>
+          <w:sz w:val="24"/>
+          <w:szCs w:val="24"/>
+        </w:rPr>
+      </w:pPr>
+      <w:r>
+        <w:rPr>
+          <w:i w:val="0"/>
+          <w:sz w:val="24"/>
+          <w:szCs w:val="24"/>
+          <w:shd w:val="clear" w:color="auto" w:fill="FFFFFF"/>
+        </w:rPr>
+        <w:t>T.-T. Ng and S.-F. Chang, "A data set of authentic and spliced image blocks," Columbia University, ADVENT Technical Report 203-2004-3, June 2004.</w:t>
+      </w:r>
+    </w:p>
+    <w:p>
+      <w:pPr>
+        <w:pStyle w:val="ListParagraph"/>
+        <w:numPr>
+          <w:ilvl w:val="0"/>
+          <w:numId w:val="22"/>
+        </w:numPr>
+        <w:tabs>
+          <w:tab w:val="left" w:pos="884"/>
+        </w:tabs>
+        <w:spacing w:before="49" w:line="276" w:lineRule="auto"/>
+        <w:ind w:left="426" w:right="107"/>
+        <w:jc w:val="both"/>
+        <w:rPr>
+          <w:sz w:val="24"/>
+          <w:szCs w:val="24"/>
+        </w:rPr>
+      </w:pPr>
+      <w:r>
+        <w:rPr>
+          <w:i w:val="0"/>
+          <w:sz w:val="24"/>
+          <w:szCs w:val="24"/>
+          <w:shd w:val="clear" w:color="auto" w:fill="FFFFFF"/>
+        </w:rPr>
+        <w:t>D. Tralić, I. Župančić, S. Grgić and M. Grgić, "CoMoFoD - New database for copy-move forgery detection," in Proc. 55th International Symposium ELMAR, Zadar, Croatia, 2013, pp. 49-54.</w:t>
+      </w:r>
+    </w:p>
+    <w:p>
+      <w:pPr>
+        <w:pStyle w:val="ListParagraph"/>
+        <w:numPr>
+          <w:ilvl w:val="0"/>
+          <w:numId w:val="22"/>
+        </w:numPr>
+        <w:tabs>
+          <w:tab w:val="left" w:pos="884"/>
+        </w:tabs>
+        <w:spacing w:before="49" w:line="276" w:lineRule="auto"/>
+        <w:ind w:left="426" w:right="107"/>
+        <w:jc w:val="both"/>
+        <w:rPr>
+          <w:sz w:val="24"/>
+          <w:szCs w:val="24"/>
+        </w:rPr>
+      </w:pPr>
+      <w:r>
+        <w:rPr>
+          <w:i w:val="0"/>
+          <w:sz w:val="24"/>
+          <w:szCs w:val="24"/>
+          <w:shd w:val="clear" w:color="auto" w:fill="FFFFFF"/>
+        </w:rPr>
+        <w:t>B. Wen, Y. Zhu, R. Subramanian, T.-T. Ng, X. Shen and S. Winkler, "COVERAGE - A novel database for copy-move forgery detection," in Proc. IEEE International Conference on Image Processing (ICIP), 2016, pp. 161-165.</w:t>
+      </w:r>
+    </w:p>
+    <w:p>
+      <w:pPr>
+        <w:pStyle w:val="ListParagraph"/>
+        <w:numPr>
+          <w:ilvl w:val="0"/>
+          <w:numId w:val="22"/>
+        </w:numPr>
+        <w:tabs>
+          <w:tab w:val="left" w:pos="884"/>
+        </w:tabs>
+        <w:spacing w:before="49" w:line="276" w:lineRule="auto"/>
+        <w:ind w:left="426" w:right="107"/>
+        <w:jc w:val="both"/>
+        <w:rPr>
+          <w:sz w:val="24"/>
+          <w:szCs w:val="24"/>
+        </w:rPr>
+      </w:pPr>
+      <w:r>
+        <w:rPr>
+          <w:i w:val="0"/>
+          <w:sz w:val="24"/>
+          <w:szCs w:val="24"/>
+          <w:shd w:val="clear" w:color="auto" w:fill="FFFFFF"/>
+        </w:rPr>
+        <w:t>T. Gloe and R. Böhme, "The 'Dresden Image Database' for benchmarking digital image forensics," in Proc. ACM Symposium on Applied Computing (SAC), 2010, pp. 1584-1590.</w:t>
+      </w:r>
+    </w:p>
+    <w:p>
+      <w:pPr>
+        <w:pStyle w:val="ListParagraph"/>
+        <w:numPr>
+          <w:ilvl w:val="0"/>
+          <w:numId w:val="22"/>
+        </w:numPr>
+        <w:tabs>
+          <w:tab w:val="left" w:pos="884"/>
+        </w:tabs>
+        <w:spacing w:before="49" w:line="276" w:lineRule="auto"/>
+        <w:ind w:left="426" w:right="107"/>
+        <w:jc w:val="both"/>
+        <w:rPr>
+          <w:sz w:val="24"/>
+          <w:szCs w:val="24"/>
+        </w:rPr>
+      </w:pPr>
+      <w:r>
+        <w:rPr>
+          <w:i w:val="0"/>
+          <w:sz w:val="24"/>
+          <w:szCs w:val="24"/>
+          <w:shd w:val="clear" w:color="auto" w:fill="FFFFFF"/>
+        </w:rPr>
+        <w:t>K. He, X. Zhang, S. Ren and J. Sun, "Deep residual learning for image recognition," in Proc. IEEE Conference on Computer Vision and Pattern Recognition (CVPR), 2016, pp. 770-778.</w:t>
+      </w:r>
+    </w:p>
+    <w:p>
+      <w:pPr>
+        <w:pStyle w:val="ListParagraph"/>
+        <w:numPr>
+          <w:ilvl w:val="0"/>
+          <w:numId w:val="22"/>
+        </w:numPr>
+        <w:tabs>
+          <w:tab w:val="left" w:pos="884"/>
+        </w:tabs>
+        <w:spacing w:before="49" w:line="276" w:lineRule="auto"/>
+        <w:ind w:left="426" w:right="107"/>
+        <w:jc w:val="both"/>
+        <w:rPr>
+          <w:sz w:val="24"/>
+          <w:szCs w:val="24"/>
+        </w:rPr>
+      </w:pPr>
+      <w:r>
+        <w:rPr>
+          <w:i w:val="0"/>
+          <w:sz w:val="24"/>
+          <w:szCs w:val="24"/>
+          <w:shd w:val="clear" w:color="auto" w:fill="FFFFFF"/>
+        </w:rPr>
+        <w:t>A. Dosovitskiy et al., "An image is worth 16x16 words: Transformers for image recognition at scale," in Proc. International Conference on Learning Representations (ICLR), 2021.</w:t>
+      </w:r>
+    </w:p>
+    <w:p>
+      <w:pPr>
+        <w:pStyle w:val="ListParagraph"/>
+        <w:numPr>
+          <w:ilvl w:val="0"/>
+          <w:numId w:val="22"/>
+        </w:numPr>
+        <w:tabs>
+          <w:tab w:val="left" w:pos="884"/>
+        </w:tabs>
+        <w:spacing w:before="49" w:line="276" w:lineRule="auto"/>
+        <w:ind w:left="426" w:right="107"/>
+        <w:jc w:val="both"/>
+        <w:rPr>
+          <w:sz w:val="24"/>
+          <w:szCs w:val="24"/>
+        </w:rPr>
+      </w:pPr>
+      <w:r>
+        <w:rPr>
+          <w:i w:val="0"/>
+          <w:sz w:val="24"/>
+          <w:szCs w:val="24"/>
+          <w:shd w:val="clear" w:color="auto" w:fill="FFFFFF"/>
+        </w:rPr>
+        <w:t>O. Ronneberger, P. Fischer and T. Brox, "U-Net: Convolutional networks for biomedical image segmentation," in Proc. Medical Image Computing and Computer-Assisted Intervention (MICCAI), 2015, pp. 234-241.</w:t>
+      </w:r>
+    </w:p>
+    <w:p>
+      <w:pPr>
+        <w:pStyle w:val="ListParagraph"/>
+        <w:numPr>
+          <w:ilvl w:val="0"/>
+          <w:numId w:val="22"/>
+        </w:numPr>
+        <w:tabs>
+          <w:tab w:val="left" w:pos="884"/>
+        </w:tabs>
+        <w:spacing w:before="49" w:line="276" w:lineRule="auto"/>
+        <w:ind w:left="426" w:right="107"/>
+        <w:jc w:val="both"/>
+        <w:rPr>
+          <w:sz w:val="24"/>
+          <w:szCs w:val="24"/>
+        </w:rPr>
+      </w:pPr>
+      <w:r>
+        <w:rPr>
+          <w:i w:val="0"/>
+          <w:sz w:val="24"/>
+          <w:szCs w:val="24"/>
+          <w:shd w:val="clear" w:color="auto" w:fill="FFFFFF"/>
+        </w:rPr>
+        <w:t>I. Loshchilov and F. Hutter, "Decoupled weight decay regularization," in Proc. International Conference on Learning Representations (ICLR), 2019.</w:t>
+      </w:r>
+    </w:p>
+    <w:p>
+      <w:pPr>
+        <w:pStyle w:val="ListParagraph"/>
+        <w:numPr>
+          <w:ilvl w:val="0"/>
+          <w:numId w:val="22"/>
+        </w:numPr>
+        <w:tabs>
+          <w:tab w:val="left" w:pos="884"/>
+        </w:tabs>
+        <w:spacing w:before="49" w:line="276" w:lineRule="auto"/>
+        <w:ind w:left="426" w:right="107"/>
+        <w:jc w:val="both"/>
+        <w:rPr>
+          <w:sz w:val="24"/>
+          <w:szCs w:val="24"/>
+        </w:rPr>
+      </w:pPr>
+      <w:r>
+        <w:rPr>
+          <w:i w:val="0"/>
+          <w:sz w:val="24"/>
+          <w:szCs w:val="24"/>
+          <w:shd w:val="clear" w:color="auto" w:fill="FFFFFF"/>
+        </w:rPr>
+        <w:t>H. R. Hasan and K. Salah, "Combating deepfake videos using blockchain and smart contracts," IEEE Access, vol. 7, pp. 41596-41606, 2019.</w:t>
       </w:r>
     </w:p>
     <w:p>

</xml_diff>

<commit_message>
Report: team, guide, HOD, programme and semester filled in; plain wording with fewer punctuation marks
Co-Authored-By: Claude Sonnet 5.5 <noreply@anthropic.com>
</commit_message>
<xml_diff>
--- a/docs/report/TrustSphere_AI_Project_Report.docx
+++ b/docs/report/TrustSphere_AI_Project_Report.docx
@@ -428,9 +428,8 @@
                 <w:b/>
                 <w:sz w:val="32"/>
                 <w:szCs w:val="32"/>
-                <w:highlight w:val="yellow"/>
-              </w:rPr>
-              <w:t>Reg. No. 1</w:t>
+              </w:rPr>
+              <w:t>23BCI0065</w:t>
             </w:r>
           </w:p>
         </w:tc>
@@ -452,9 +451,8 @@
                 <w:b/>
                 <w:sz w:val="32"/>
                 <w:szCs w:val="32"/>
-                <w:highlight w:val="yellow"/>
-              </w:rPr>
-              <w:t>Student Name 1</w:t>
+              </w:rPr>
+              <w:t>Divyansh Gupta</w:t>
             </w:r>
           </w:p>
         </w:tc>
@@ -485,9 +483,8 @@
                 <w:b/>
                 <w:sz w:val="32"/>
                 <w:szCs w:val="32"/>
-                <w:highlight w:val="yellow"/>
-              </w:rPr>
-              <w:t>Reg. No. 2</w:t>
+              </w:rPr>
+              <w:t>23BCI0160</w:t>
             </w:r>
           </w:p>
         </w:tc>
@@ -509,9 +506,8 @@
                 <w:b/>
                 <w:sz w:val="32"/>
                 <w:szCs w:val="32"/>
-                <w:highlight w:val="yellow"/>
-              </w:rPr>
-              <w:t>Student Name 2</w:t>
+              </w:rPr>
+              <w:t>Shubham Raj</w:t>
             </w:r>
           </w:p>
         </w:tc>
@@ -539,9 +535,8 @@
                 <w:b/>
                 <w:sz w:val="32"/>
                 <w:szCs w:val="32"/>
-                <w:highlight w:val="yellow"/>
-              </w:rPr>
-              <w:t>Reg. No. 3</w:t>
+              </w:rPr>
+              <w:t>23BCI0053</w:t>
             </w:r>
           </w:p>
         </w:tc>
@@ -563,9 +558,8 @@
                 <w:b/>
                 <w:sz w:val="32"/>
                 <w:szCs w:val="32"/>
-                <w:highlight w:val="yellow"/>
-              </w:rPr>
-              <w:t>Student Name 3</w:t>
+              </w:rPr>
+              <w:t>Rudrarka Nath</w:t>
             </w:r>
           </w:p>
         </w:tc>
@@ -665,25 +659,11 @@
             </w:pPr>
             <w:r>
               <w:rPr>
+                <w:b/>
                 <w:sz w:val="32"/>
                 <w:szCs w:val="32"/>
-                <w:highlight w:val="yellow"/>
-              </w:rPr>
-              <w:t>&lt;Project Guide Name&gt;</w:t>
-            </w:r>
-            <w:r>
-              <w:rPr>
-                <w:sz w:val="32"/>
-                <w:szCs w:val="32"/>
-                <w:highlight w:val="yellow"/>
-              </w:rPr>
-            </w:r>
-            <w:r>
-              <w:rPr>
-                <w:sz w:val="32"/>
-                <w:szCs w:val="32"/>
-                <w:highlight w:val="yellow"/>
-              </w:rPr>
+              </w:rPr>
+              <w:t>MANIKANDAN G</w:t>
             </w:r>
           </w:p>
         </w:tc>
@@ -709,24 +689,8 @@
               <w:rPr>
                 <w:sz w:val="32"/>
                 <w:szCs w:val="32"/>
-                <w:highlight w:val="yellow"/>
-              </w:rPr>
-              <w:t>&lt;</w:t>
-            </w:r>
-            <w:r>
-              <w:rPr>
-                <w:sz w:val="32"/>
-                <w:szCs w:val="32"/>
-                <w:highlight w:val="yellow"/>
-              </w:rPr>
-              <w:t>Designation</w:t>
-            </w:r>
-            <w:r>
-              <w:rPr>
-                <w:sz w:val="32"/>
-                <w:szCs w:val="32"/>
-              </w:rPr>
-              <w:t>&gt;</w:t>
+              </w:rPr>
+              <w:t>Assistant Professor Sr. Grade 2</w:t>
             </w:r>
           </w:p>
         </w:tc>
@@ -939,64 +903,60 @@
         <w:jc w:val="both"/>
       </w:pPr>
       <w:r>
-        <w:t xml:space="preserve">I   </w:t>
+        <w:rPr/>
+        <w:t>We hereby declare that the project entitled</w:t>
       </w:r>
       <w:r>
         <w:rPr>
           <w:spacing w:val="1"/>
         </w:rPr>
+      </w:r>
+      <w:r>
+        <w:rPr/>
+      </w:r>
+      <w:r>
+        <w:rPr>
+          <w:spacing w:val="1"/>
+        </w:rPr>
+      </w:r>
+      <w:r>
+        <w:rPr/>
+      </w:r>
+      <w:r>
+        <w:rPr>
+          <w:spacing w:val="1"/>
+        </w:rPr>
+      </w:r>
+      <w:r>
+        <w:rPr/>
+      </w:r>
+      <w:r>
+        <w:rPr>
+          <w:spacing w:val="1"/>
+        </w:rPr>
+      </w:r>
+      <w:r>
+        <w:rPr/>
+      </w:r>
+      <w:r>
+        <w:rPr>
+          <w:spacing w:val="1"/>
+        </w:rPr>
+      </w:r>
+      <w:r>
+        <w:rPr/>
+      </w:r>
+      <w:r>
+        <w:rPr/>
+      </w:r>
+      <w:r>
+        <w:rPr>
+          <w:spacing w:val="1"/>
+        </w:rPr>
+      </w:r>
+      <w:r>
+        <w:rPr/>
         <w:t xml:space="preserve"> </w:t>
-      </w:r>
-      <w:r>
-        <w:t xml:space="preserve">hereby   </w:t>
-      </w:r>
-      <w:r>
-        <w:rPr>
-          <w:spacing w:val="1"/>
-        </w:rPr>
-        <w:t xml:space="preserve"> </w:t>
-      </w:r>
-      <w:r>
-        <w:t xml:space="preserve">declare   </w:t>
-      </w:r>
-      <w:r>
-        <w:rPr>
-          <w:spacing w:val="1"/>
-        </w:rPr>
-        <w:t xml:space="preserve"> </w:t>
-      </w:r>
-      <w:r>
-        <w:t xml:space="preserve">that   </w:t>
-      </w:r>
-      <w:r>
-        <w:rPr>
-          <w:spacing w:val="1"/>
-        </w:rPr>
-        <w:t xml:space="preserve"> </w:t>
-      </w:r>
-      <w:r>
-        <w:t xml:space="preserve">the   </w:t>
-      </w:r>
-      <w:r>
-        <w:rPr>
-          <w:spacing w:val="1"/>
-        </w:rPr>
-        <w:t xml:space="preserve"> </w:t>
-      </w:r>
-      <w:r>
-        <w:t>project</w:t>
-      </w:r>
-      <w:r>
-        <w:t xml:space="preserve">    </w:t>
-      </w:r>
-      <w:r>
-        <w:rPr>
-          <w:spacing w:val="1"/>
-        </w:rPr>
-        <w:t xml:space="preserve"> </w:t>
-      </w:r>
-      <w:r>
-        <w:t xml:space="preserve">entitled </w:t>
       </w:r>
       <w:r>
         <w:rPr>
@@ -1012,16 +972,35 @@
         <w:t xml:space="preserve"> </w:t>
       </w:r>
       <w:r>
-        <w:t>submitted</w:t>
+        <w:rPr/>
+        <w:t>submitted by us</w:t>
       </w:r>
       <w:r>
         <w:rPr>
           <w:spacing w:val="1"/>
         </w:rPr>
+      </w:r>
+      <w:r>
+        <w:rPr/>
+      </w:r>
+      <w:r>
+        <w:rPr>
+          <w:spacing w:val="1"/>
+        </w:rPr>
+      </w:r>
+      <w:r>
+        <w:rPr/>
+        <w:t>,</w:t>
+      </w:r>
+      <w:r>
+        <w:rPr>
+          <w:spacing w:val="1"/>
+        </w:rPr>
         <w:t xml:space="preserve"> </w:t>
       </w:r>
       <w:r>
-        <w:t>by</w:t>
+        <w:rPr/>
+        <w:t>for</w:t>
       </w:r>
       <w:r>
         <w:rPr>
@@ -1030,7 +1009,8 @@
         <w:t xml:space="preserve"> </w:t>
       </w:r>
       <w:r>
-        <w:t>me,</w:t>
+        <w:rPr/>
+        <w:t>the</w:t>
       </w:r>
       <w:r>
         <w:rPr>
@@ -1039,7 +1019,8 @@
         <w:t xml:space="preserve"> </w:t>
       </w:r>
       <w:r>
-        <w:t>for</w:t>
+        <w:rPr/>
+        <w:t>award</w:t>
       </w:r>
       <w:r>
         <w:rPr>
@@ -1048,6 +1029,17 @@
         <w:t xml:space="preserve"> </w:t>
       </w:r>
       <w:r>
+        <w:rPr/>
+        <w:t>of</w:t>
+      </w:r>
+      <w:r>
+        <w:rPr>
+          <w:spacing w:val="1"/>
+        </w:rPr>
+        <w:t xml:space="preserve"> </w:t>
+      </w:r>
+      <w:r>
+        <w:rPr/>
         <w:t>the</w:t>
       </w:r>
       <w:r>
@@ -1057,7 +1049,8 @@
         <w:t xml:space="preserve"> </w:t>
       </w:r>
       <w:r>
-        <w:t>award</w:t>
+        <w:rPr/>
+        <w:t>degree</w:t>
       </w:r>
       <w:r>
         <w:rPr>
@@ -1066,33 +1059,7 @@
         <w:t xml:space="preserve"> </w:t>
       </w:r>
       <w:r>
-        <w:t>of</w:t>
-      </w:r>
-      <w:r>
-        <w:rPr>
-          <w:spacing w:val="1"/>
-        </w:rPr>
-        <w:t xml:space="preserve"> </w:t>
-      </w:r>
-      <w:r>
-        <w:t>the</w:t>
-      </w:r>
-      <w:r>
-        <w:rPr>
-          <w:spacing w:val="1"/>
-        </w:rPr>
-        <w:t xml:space="preserve"> </w:t>
-      </w:r>
-      <w:r>
-        <w:t>degree</w:t>
-      </w:r>
-      <w:r>
-        <w:rPr>
-          <w:spacing w:val="1"/>
-        </w:rPr>
-        <w:t xml:space="preserve"> </w:t>
-      </w:r>
-      <w:r>
+        <w:rPr/>
         <w:t>of</w:t>
       </w:r>
       <w:r>
@@ -1115,6 +1082,7 @@
         <w:t xml:space="preserve"> </w:t>
       </w:r>
       <w:r>
+        <w:rPr/>
         <w:t>to</w:t>
       </w:r>
       <w:r>
@@ -1124,6 +1092,7 @@
         <w:t xml:space="preserve"> </w:t>
       </w:r>
       <w:r>
+        <w:rPr/>
         <w:t>VIT</w:t>
       </w:r>
       <w:r>
@@ -1133,7 +1102,8 @@
         <w:t xml:space="preserve"> </w:t>
       </w:r>
       <w:r>
-        <w:t>is a record of bonafide work carried out by me under the</w:t>
+        <w:rPr/>
+        <w:t>is a record of bonafide work carried out by us under the</w:t>
       </w:r>
       <w:r>
         <w:rPr>
@@ -1142,6 +1112,7 @@
         <w:t xml:space="preserve"> </w:t>
       </w:r>
       <w:r>
+        <w:rPr/>
         <w:t>supervision</w:t>
       </w:r>
       <w:r>
@@ -1151,50 +1122,41 @@
         <w:t xml:space="preserve"> </w:t>
       </w:r>
       <w:r>
+        <w:rPr/>
         <w:t>of</w:t>
       </w:r>
       <w:r>
         <w:rPr>
           <w:spacing w:val="-7"/>
         </w:rPr>
-        <w:t xml:space="preserve"> Prof. / Dr. </w:t>
+        <w:t xml:space="preserve"> Prof. Manikandan G.</w:t>
       </w:r>
       <w:r>
         <w:rPr>
           <w:color w:val="FF0000"/>
           <w:spacing w:val="-7"/>
-          <w:highlight w:val="yellow"/>
-        </w:rPr>
-        <w:t xml:space="preserve">&lt;&lt; </w:t>
+        </w:rPr>
       </w:r>
       <w:r>
         <w:rPr>
           <w:color w:val="FF0000"/>
-          <w:highlight w:val="yellow"/>
-        </w:rPr>
-        <w:t>Guide</w:t>
+        </w:rPr>
       </w:r>
       <w:r>
         <w:rPr>
           <w:color w:val="FF0000"/>
           <w:spacing w:val="1"/>
-          <w:highlight w:val="yellow"/>
-        </w:rPr>
-        <w:t xml:space="preserve"> </w:t>
+        </w:rPr>
       </w:r>
       <w:r>
         <w:rPr>
           <w:color w:val="FF0000"/>
-          <w:highlight w:val="yellow"/>
-        </w:rPr>
-        <w:t>Name</w:t>
+        </w:rPr>
       </w:r>
       <w:r>
         <w:rPr>
           <w:color w:val="FF0000"/>
-          <w:highlight w:val="yellow"/>
-        </w:rPr>
-        <w:t xml:space="preserve"> &gt;&gt;</w:t>
+        </w:rPr>
       </w:r>
     </w:p>
     <w:p>
@@ -1205,7 +1167,8 @@
         <w:jc w:val="both"/>
       </w:pPr>
       <w:r>
-        <w:t>I further declare that the work reported in this project has not been submitted</w:t>
+        <w:rPr/>
+        <w:t>We further declare that the work reported in this project has not been submitted</w:t>
       </w:r>
       <w:r>
         <w:rPr>
@@ -1214,6 +1177,7 @@
         <w:t xml:space="preserve"> </w:t>
       </w:r>
       <w:r>
+        <w:rPr/>
         <w:t>and will not be submitted, either in part or in full, for the award of any other degree or</w:t>
       </w:r>
       <w:r>
@@ -1223,6 +1187,7 @@
         <w:t xml:space="preserve"> </w:t>
       </w:r>
       <w:r>
+        <w:rPr/>
         <w:t>diploma</w:t>
       </w:r>
       <w:r>
@@ -1232,6 +1197,7 @@
         <w:t xml:space="preserve"> </w:t>
       </w:r>
       <w:r>
+        <w:rPr/>
         <w:t>in</w:t>
       </w:r>
       <w:r>
@@ -1241,6 +1207,7 @@
         <w:t xml:space="preserve"> </w:t>
       </w:r>
       <w:r>
+        <w:rPr/>
         <w:t>this</w:t>
       </w:r>
       <w:r>
@@ -1250,6 +1217,7 @@
         <w:t xml:space="preserve"> </w:t>
       </w:r>
       <w:r>
+        <w:rPr/>
         <w:t>institute</w:t>
       </w:r>
       <w:r>
@@ -1259,6 +1227,7 @@
         <w:t xml:space="preserve"> </w:t>
       </w:r>
       <w:r>
+        <w:rPr/>
         <w:t>or</w:t>
       </w:r>
       <w:r>
@@ -1268,6 +1237,7 @@
         <w:t xml:space="preserve"> </w:t>
       </w:r>
       <w:r>
+        <w:rPr/>
         <w:t>any</w:t>
       </w:r>
       <w:r>
@@ -1277,6 +1247,7 @@
         <w:t xml:space="preserve"> </w:t>
       </w:r>
       <w:r>
+        <w:rPr/>
         <w:t>other</w:t>
       </w:r>
       <w:r>
@@ -1286,6 +1257,7 @@
         <w:t xml:space="preserve"> </w:t>
       </w:r>
       <w:r>
+        <w:rPr/>
         <w:t>institute</w:t>
       </w:r>
       <w:r>
@@ -1295,6 +1267,7 @@
         <w:t xml:space="preserve"> </w:t>
       </w:r>
       <w:r>
+        <w:rPr/>
         <w:t>or</w:t>
       </w:r>
       <w:r>
@@ -1304,6 +1277,7 @@
         <w:t xml:space="preserve"> </w:t>
       </w:r>
       <w:r>
+        <w:rPr/>
         <w:t>university.</w:t>
       </w:r>
     </w:p>
@@ -1453,7 +1427,7 @@
           <w:b/>
           <w:sz w:val="24"/>
         </w:rPr>
-        <w:t>Candidate</w:t>
+        <w:t>Candidates</w:t>
       </w:r>
     </w:p>
     <w:p>
@@ -1547,6 +1521,7 @@
         <w:jc w:val="both"/>
       </w:pPr>
       <w:r>
+        <w:rPr/>
         <w:t>This</w:t>
       </w:r>
       <w:r>
@@ -1556,6 +1531,7 @@
         <w:t xml:space="preserve"> </w:t>
       </w:r>
       <w:r>
+        <w:rPr/>
         <w:t>is</w:t>
       </w:r>
       <w:r>
@@ -1565,6 +1541,7 @@
         <w:t xml:space="preserve"> </w:t>
       </w:r>
       <w:r>
+        <w:rPr/>
         <w:t>to</w:t>
       </w:r>
       <w:r>
@@ -1574,6 +1551,7 @@
         <w:t xml:space="preserve"> </w:t>
       </w:r>
       <w:r>
+        <w:rPr/>
         <w:t>certify</w:t>
       </w:r>
       <w:r>
@@ -1583,6 +1561,7 @@
         <w:t xml:space="preserve"> </w:t>
       </w:r>
       <w:r>
+        <w:rPr/>
         <w:t>that</w:t>
       </w:r>
       <w:r>
@@ -1592,6 +1571,7 @@
         <w:t xml:space="preserve"> </w:t>
       </w:r>
       <w:r>
+        <w:rPr/>
         <w:t>the</w:t>
       </w:r>
       <w:r>
@@ -1601,6 +1581,7 @@
         <w:t xml:space="preserve"> </w:t>
       </w:r>
       <w:r>
+        <w:rPr/>
         <w:t>project</w:t>
       </w:r>
       <w:r>
@@ -1610,6 +1591,7 @@
         <w:t xml:space="preserve"> </w:t>
       </w:r>
       <w:r>
+        <w:rPr/>
         <w:t>entitled</w:t>
       </w:r>
       <w:r>
@@ -1631,6 +1613,7 @@
         <w:t xml:space="preserve"> </w:t>
       </w:r>
       <w:r>
+        <w:rPr/>
         <w:t>submitted</w:t>
       </w:r>
       <w:r>
@@ -1640,6 +1623,7 @@
         <w:t xml:space="preserve"> </w:t>
       </w:r>
       <w:r>
+        <w:rPr/>
         <w:t>by</w:t>
       </w:r>
       <w:r>
@@ -1651,35 +1635,29 @@
       <w:r>
         <w:rPr>
           <w:spacing w:val="1"/>
-          <w:highlight w:val="yellow"/>
-        </w:rPr>
-        <w:t xml:space="preserve">&lt;&lt; </w:t>
+        </w:rPr>
+        <w:t>Divyansh Gupta (23BCI0065), Shubham Raj (23BCI0160) and Rudrarka Nath (23BCI0053)</w:t>
       </w:r>
       <w:r>
         <w:rPr>
           <w:b/>
           <w:color w:val="FF0000"/>
-          <w:highlight w:val="yellow"/>
-        </w:rPr>
-        <w:t>Student Name (</w:t>
+        </w:rPr>
       </w:r>
       <w:r>
         <w:rPr>
           <w:b/>
           <w:color w:val="FF0000"/>
-          <w:highlight w:val="yellow"/>
-        </w:rPr>
-        <w:t>Reg. No</w:t>
+        </w:rPr>
       </w:r>
       <w:r>
         <w:rPr>
           <w:b/>
           <w:color w:val="FF0000"/>
-          <w:highlight w:val="yellow"/>
-        </w:rPr>
-        <w:t>) &gt;&gt;</w:t>
-      </w:r>
-      <w:r>
+        </w:rPr>
+      </w:r>
+      <w:r>
+        <w:rPr/>
         <w:t xml:space="preserve">, </w:t>
       </w:r>
       <w:r>
@@ -1689,6 +1667,7 @@
         <w:t>School of Computer Science and Engineering</w:t>
       </w:r>
       <w:r>
+        <w:rPr/>
         <w:t>, VIT, for the award of the degree of</w:t>
       </w:r>
       <w:r>
@@ -1705,6 +1684,7 @@
         <w:t>Bachelor of Technology in Computer Science and Engineering</w:t>
       </w:r>
       <w:r>
+        <w:rPr/>
         <w:t>, is a record of bonafide work carried out by</w:t>
       </w:r>
       <w:r>
@@ -1714,12 +1694,15 @@
         <w:t xml:space="preserve"> </w:t>
       </w:r>
       <w:r>
-        <w:t xml:space="preserve">him / her under my supervision during </w:t>
-      </w:r>
-      <w:r>
-        <w:t>Fall Semester 2024-2025</w:t>
-      </w:r>
-      <w:r>
+        <w:rPr/>
+        <w:t xml:space="preserve">them under my supervision during </w:t>
+      </w:r>
+      <w:r>
+        <w:rPr/>
+        <w:t>Fall Semester 2026-2027</w:t>
+      </w:r>
+      <w:r>
+        <w:rPr/>
         <w:t>, as per</w:t>
       </w:r>
       <w:r>
@@ -1729,6 +1712,7 @@
         <w:t xml:space="preserve"> </w:t>
       </w:r>
       <w:r>
+        <w:rPr/>
         <w:t>the VIT code</w:t>
       </w:r>
       <w:r>
@@ -1738,6 +1722,7 @@
         <w:t xml:space="preserve"> </w:t>
       </w:r>
       <w:r>
+        <w:rPr/>
         <w:t>of</w:t>
       </w:r>
       <w:r>
@@ -1747,6 +1732,7 @@
         <w:t xml:space="preserve"> </w:t>
       </w:r>
       <w:r>
+        <w:rPr/>
         <w:t>academic</w:t>
       </w:r>
       <w:r>
@@ -1756,6 +1742,7 @@
         <w:t xml:space="preserve"> </w:t>
       </w:r>
       <w:r>
+        <w:rPr/>
         <w:t>and</w:t>
       </w:r>
       <w:r>
@@ -1765,6 +1752,7 @@
         <w:t xml:space="preserve"> </w:t>
       </w:r>
       <w:r>
+        <w:rPr/>
         <w:t>research</w:t>
       </w:r>
       <w:r>
@@ -1774,6 +1762,7 @@
         <w:t xml:space="preserve"> </w:t>
       </w:r>
       <w:r>
+        <w:rPr/>
         <w:t>ethics.</w:t>
       </w:r>
     </w:p>
@@ -2257,16 +2246,6 @@
     </w:p>
     <w:p>
       <w:pPr>
-        <w:jc w:val="right"/>
-        <w:rPr>
-          <w:b/>
-          <w:sz w:val="24"/>
-          <w:szCs w:val="24"/>
-        </w:rPr>
-      </w:pPr>
-    </w:p>
-    <w:p>
-      <w:pPr>
         <w:pStyle w:val="BodyText"/>
         <w:spacing w:before="100" w:line="441" w:lineRule="auto"/>
         <w:ind w:right="2781"/>
@@ -2277,36 +2256,6 @@
     </w:p>
     <w:p>
       <w:pPr>
-        <w:pStyle w:val="BodyText"/>
-        <w:spacing w:before="100" w:line="441" w:lineRule="auto"/>
-        <w:ind w:right="2781"/>
-        <w:rPr>
-          <w:shd w:val="clear" w:color="auto" w:fill="FFFF00"/>
-        </w:rPr>
-      </w:pPr>
-    </w:p>
-    <w:p>
-      <w:pPr>
-        <w:pStyle w:val="BodyText"/>
-        <w:spacing w:before="100" w:line="441" w:lineRule="auto"/>
-        <w:ind w:right="2781"/>
-        <w:rPr>
-          <w:shd w:val="clear" w:color="auto" w:fill="FFFF00"/>
-        </w:rPr>
-      </w:pPr>
-    </w:p>
-    <w:p>
-      <w:pPr>
-        <w:pStyle w:val="BodyText"/>
-        <w:spacing w:before="100" w:line="441" w:lineRule="auto"/>
-        <w:ind w:right="2781"/>
-        <w:rPr>
-          <w:shd w:val="clear" w:color="auto" w:fill="FFFF00"/>
-        </w:rPr>
-      </w:pPr>
-    </w:p>
-    <w:p>
-      <w:pPr>
         <w:spacing w:line="360" w:lineRule="auto"/>
         <w:jc w:val="center"/>
         <w:rPr>
@@ -2321,27 +2270,22 @@
           <w:b/>
           <w:sz w:val="24"/>
           <w:szCs w:val="24"/>
-          <w:highlight w:val="yellow"/>
-        </w:rPr>
-        <w:t xml:space="preserve">&lt;&lt; </w:t>
+        </w:rPr>
+        <w:t>Dr. RAJESHKANNAN R, Head of the Department</w:t>
       </w:r>
       <w:r>
         <w:rPr>
           <w:b/>
           <w:sz w:val="24"/>
           <w:szCs w:val="24"/>
-          <w:highlight w:val="yellow"/>
-        </w:rPr>
-        <w:t xml:space="preserve">Head of the </w:t>
+        </w:rPr>
       </w:r>
       <w:r>
         <w:rPr>
           <w:b/>
           <w:sz w:val="24"/>
           <w:szCs w:val="24"/>
-          <w:highlight w:val="yellow"/>
-        </w:rPr>
-        <w:t>Department &gt;&gt;</w:t>
+        </w:rPr>
       </w:r>
     </w:p>
     <w:p>
@@ -2357,27 +2301,22 @@
           <w:b/>
           <w:sz w:val="24"/>
           <w:szCs w:val="24"/>
-          <w:highlight w:val="yellow"/>
-        </w:rPr>
-        <w:t xml:space="preserve">&lt;&lt; </w:t>
+        </w:rPr>
+        <w:t>B.Tech</w:t>
       </w:r>
       <w:r>
         <w:rPr>
           <w:b/>
           <w:sz w:val="24"/>
           <w:szCs w:val="24"/>
-          <w:highlight w:val="yellow"/>
-        </w:rPr>
-        <w:t>Programme</w:t>
+        </w:rPr>
       </w:r>
       <w:r>
         <w:rPr>
           <w:b/>
           <w:sz w:val="24"/>
           <w:szCs w:val="24"/>
-          <w:highlight w:val="yellow"/>
-        </w:rPr>
-        <w:t xml:space="preserve"> &gt;&gt;</w:t>
+        </w:rPr>
       </w:r>
       <w:r>
         <w:rPr>
@@ -2462,7 +2401,7 @@
           <w:szCs w:val="24"/>
           <w:lang w:val="en-IN" w:eastAsia="en-IN"/>
         </w:rPr>
-        <w:t>I am deeply grateful to the management of Vellore Institute of Technology (VIT) for providing me with the opportunity and resources to undertake this project. Their commitment to fostering a conducive learning environment has been instrumental in my academic journey. The support and infrastructure provided by VIT have enabled me to explore and develop my ideas to their fullest potential.</w:t>
+        <w:t>We thank Vellore Institute of Technology (VIT) for giving us the chance and the resources to carry out this project. The facilities and support at VIT helped us build and test our ideas.</w:t>
       </w:r>
     </w:p>
     <w:p>
@@ -2500,23 +2439,7 @@
           <w:szCs w:val="24"/>
           <w:lang w:val="en-IN" w:eastAsia="en-IN"/>
         </w:rPr>
-        <w:t xml:space="preserve">My sincere thanks to Dr. </w:t>
-      </w:r>
-      <w:r>
-        <w:rPr>
-          <w:sz w:val="24"/>
-          <w:szCs w:val="24"/>
-          <w:lang w:val="en-IN" w:eastAsia="en-IN"/>
-        </w:rPr>
-        <w:t>Jaisankar N</w:t>
-      </w:r>
-      <w:r>
-        <w:rPr>
-          <w:sz w:val="24"/>
-          <w:szCs w:val="24"/>
-          <w:lang w:val="en-IN" w:eastAsia="en-IN"/>
-        </w:rPr>
-        <w:t>, the Dean of the School of Computer Science and Engineering (SCOPE), for his unwavering support and encouragement. His leadership and vision have greatly inspired me to strive for excellence. The Dean’s dedication to academic excellence and innovation has been a constant source of motivation for me. I appreciate his efforts in creating an environment that nurtures creativity and critical thinking.</w:t>
+        <w:t>We sincerely thank Dr. Jaisankar N, Dean of the School of Computer Science and Engineering (SCOPE), for the support and encouragement given to the students of the school. It motivated us to do our best work.</w:t>
       </w:r>
     </w:p>
     <w:p>
@@ -2554,77 +2477,7 @@
           <w:szCs w:val="24"/>
           <w:lang w:val="en-IN" w:eastAsia="en-IN"/>
         </w:rPr>
-        <w:t xml:space="preserve">I express my profound appreciation to </w:t>
-      </w:r>
-      <w:r>
-        <w:rPr>
-          <w:sz w:val="24"/>
-          <w:szCs w:val="24"/>
-          <w:highlight w:val="yellow"/>
-          <w:lang w:val="en-IN" w:eastAsia="en-IN"/>
-        </w:rPr>
-        <w:t>&lt;</w:t>
-      </w:r>
-      <w:r>
-        <w:rPr>
-          <w:sz w:val="24"/>
-          <w:szCs w:val="24"/>
-          <w:highlight w:val="yellow"/>
-          <w:lang w:val="en-IN" w:eastAsia="en-IN"/>
-        </w:rPr>
-        <w:t>Head of Department’s Name</w:t>
-      </w:r>
-      <w:r>
-        <w:rPr>
-          <w:sz w:val="24"/>
-          <w:szCs w:val="24"/>
-          <w:highlight w:val="yellow"/>
-          <w:lang w:val="en-IN" w:eastAsia="en-IN"/>
-        </w:rPr>
-        <w:t>&gt;</w:t>
-      </w:r>
-      <w:r>
-        <w:rPr>
-          <w:sz w:val="24"/>
-          <w:szCs w:val="24"/>
-          <w:lang w:val="en-IN" w:eastAsia="en-IN"/>
-        </w:rPr>
-        <w:t xml:space="preserve">, the Head of the </w:t>
-      </w:r>
-      <w:r>
-        <w:rPr>
-          <w:sz w:val="24"/>
-          <w:szCs w:val="24"/>
-          <w:highlight w:val="yellow"/>
-          <w:lang w:val="en-IN" w:eastAsia="en-IN"/>
-        </w:rPr>
-        <w:t>&lt;</w:t>
-      </w:r>
-      <w:r>
-        <w:rPr>
-          <w:sz w:val="24"/>
-          <w:szCs w:val="24"/>
-          <w:highlight w:val="yellow"/>
-          <w:lang w:val="en-IN" w:eastAsia="en-IN"/>
-        </w:rPr>
-        <w:t>Department Name</w:t>
-      </w:r>
-      <w:r>
-        <w:rPr>
-          <w:sz w:val="24"/>
-          <w:szCs w:val="24"/>
-          <w:highlight w:val="yellow"/>
-          <w:lang w:val="en-IN" w:eastAsia="en-IN"/>
-        </w:rPr>
-        <w:t>&gt;</w:t>
-      </w:r>
-      <w:r>
-        <w:rPr>
-          <w:sz w:val="24"/>
-          <w:szCs w:val="24"/>
-          <w:lang w:val="en-IN" w:eastAsia="en-IN"/>
-        </w:rPr>
-        <w:t>, for his/her insightful guidance and continuous support. His/her expertise and advice have been crucial in shaping the direction of my project. The Head of Department’s commitment to fostering a collaborative and supportive atmosphere has greatly enhanced my learning experience. His/her constructive feedback and encouragement have been invaluable in overcoming challenges and achieving my project goals.</w:t>
+        <w:t>We thank Dr. Rajeshkannan R, Head of the Department, for guidance and support during this project. The advice and feedback we received helped us shape the work and solve problems along the way.</w:t>
       </w:r>
     </w:p>
     <w:p>
@@ -2662,67 +2515,7 @@
           <w:szCs w:val="24"/>
           <w:lang w:val="en-IN" w:eastAsia="en-IN"/>
         </w:rPr>
-        <w:t xml:space="preserve">I am immensely thankful to my project </w:t>
-      </w:r>
-      <w:r>
-        <w:rPr>
-          <w:sz w:val="24"/>
-          <w:szCs w:val="24"/>
-          <w:lang w:val="en-IN" w:eastAsia="en-IN"/>
-        </w:rPr>
-        <w:t>guide</w:t>
-      </w:r>
-      <w:r>
-        <w:rPr>
-          <w:sz w:val="24"/>
-          <w:szCs w:val="24"/>
-          <w:lang w:val="en-IN" w:eastAsia="en-IN"/>
-        </w:rPr>
-        <w:t xml:space="preserve">, </w:t>
-      </w:r>
-      <w:r>
-        <w:rPr>
-          <w:sz w:val="24"/>
-          <w:szCs w:val="24"/>
-          <w:highlight w:val="yellow"/>
-          <w:lang w:val="en-IN" w:eastAsia="en-IN"/>
-        </w:rPr>
-        <w:t>&lt;</w:t>
-      </w:r>
-      <w:r>
-        <w:rPr>
-          <w:sz w:val="24"/>
-          <w:szCs w:val="24"/>
-          <w:highlight w:val="yellow"/>
-          <w:lang w:val="en-IN" w:eastAsia="en-IN"/>
-        </w:rPr>
-        <w:t>Guide’s</w:t>
-      </w:r>
-      <w:r>
-        <w:rPr>
-          <w:sz w:val="24"/>
-          <w:szCs w:val="24"/>
-          <w:highlight w:val="yellow"/>
-          <w:lang w:val="en-IN" w:eastAsia="en-IN"/>
-        </w:rPr>
-        <w:t xml:space="preserve"> Name</w:t>
-      </w:r>
-      <w:r>
-        <w:rPr>
-          <w:sz w:val="24"/>
-          <w:szCs w:val="24"/>
-          <w:highlight w:val="yellow"/>
-          <w:lang w:val="en-IN" w:eastAsia="en-IN"/>
-        </w:rPr>
-        <w:t>&gt;</w:t>
-      </w:r>
-      <w:r>
-        <w:rPr>
-          <w:sz w:val="24"/>
-          <w:szCs w:val="24"/>
-          <w:lang w:val="en-IN" w:eastAsia="en-IN"/>
-        </w:rPr>
-        <w:t>, for his/her dedicated mentorship and invaluable feedback. His/her patience, knowledge, and encouragement have been pivotal in the successful completion of this project. My supervisor’s willingness to share his/her expertise and provide thoughtful guidance has been instrumental in refining my ideas and methodologies. His/her support has not only contributed to the success of this project but has also enriched my overall academic experience.</w:t>
+        <w:t>We are very thankful to our project guide, Manikandan G, Assistant Professor Sr. Grade 2, for regular guidance and useful feedback. The time given in our reviews helped us improve our methods and finish this work.</w:t>
       </w:r>
     </w:p>
     <w:p>
@@ -2759,7 +2552,7 @@
           <w:szCs w:val="24"/>
           <w:lang w:val="en-IN" w:eastAsia="en-IN"/>
         </w:rPr>
-        <w:t>Thank you all for your contributions and support.</w:t>
+        <w:t>Thank you all for your support.</w:t>
       </w:r>
     </w:p>
     <w:p>
@@ -2806,7 +2599,7 @@
           <w:b/>
           <w:sz w:val="24"/>
         </w:rPr>
-        <w:t>Name</w:t>
+        <w:t>Divyansh Gupta, Shubham Raj and Rudrarka Nath</w:t>
       </w:r>
       <w:r>
         <w:rPr>
@@ -2814,14 +2607,12 @@
           <w:spacing w:val="-2"/>
           <w:sz w:val="24"/>
         </w:rPr>
-        <w:t xml:space="preserve"> </w:t>
       </w:r>
       <w:r>
         <w:rPr>
           <w:b/>
           <w:sz w:val="24"/>
         </w:rPr>
-        <w:t>of</w:t>
       </w:r>
       <w:r>
         <w:rPr>
@@ -2829,14 +2620,12 @@
           <w:spacing w:val="-3"/>
           <w:sz w:val="24"/>
         </w:rPr>
-        <w:t xml:space="preserve"> </w:t>
       </w:r>
       <w:r>
         <w:rPr>
           <w:b/>
           <w:sz w:val="24"/>
         </w:rPr>
-        <w:t>the</w:t>
       </w:r>
       <w:r>
         <w:rPr>
@@ -2844,14 +2633,12 @@
           <w:spacing w:val="-1"/>
           <w:sz w:val="24"/>
         </w:rPr>
-        <w:t xml:space="preserve"> </w:t>
       </w:r>
       <w:r>
         <w:rPr>
           <w:b/>
           <w:sz w:val="24"/>
         </w:rPr>
-        <w:t>Candidate</w:t>
       </w:r>
     </w:p>
     <w:p>
@@ -8645,7 +8432,7 @@
           <w:i w:val="0"/>
           <w:sz w:val="24"/>
         </w:rPr>
-        <w:t>Digital photographs are used as evidence in journalism, insurance, banking and legal proceedings, yet editing tools make it easy to splice content from one image into another. Deciding whether an image has been manipulated, and being able to prove later that the decision was not altered, are two separate problems. This project builds TrustSphere AI, an image-only forensic system that addresses both. A multi-agent pipeline analyses each uploaded image with three agents: a metadata agent (EXIF fields, editing software, timestamps), an image forensics agent, and a provenance agent (C2PA content credentials and invisible AI-generator watermarks). A decision engine fuses the agent scores into an authenticity score and a verdict of Authentic, Fake or Inconclusive. Every analysis is hashed with SHA-256, signed with Ed25519, recorded with a chain of custody, optionally anchored on the Polygon Amoy blockchain, and exported as an evidence PDF. A web application serves the whole flow: upload, a report with heatmaps, history and live verification.</w:t>
+        <w:t>Photographs are used as evidence in news, insurance, banking and courts. Editing tools make it easy to paste part of one image into another. Deciding whether an image was changed is one problem. Proving later that the decision was not altered is another. This project builds TrustSphere AI, a system for still images that handles both. Three agents look at each uploaded image. A metadata agent reads the EXIF data. An image forensics agent studies the pixels. A provenance agent checks content credentials and invisible watermarks. A decision engine combines their scores into a verdict of Authentic, Fake or Inconclusive. Each result is hashed with SHA-256, signed with Ed25519, stored with a chain of custody, anchored on a test blockchain if a wallet is set, and saved as an evidence PDF. A web application shows the whole process.</w:t>
       </w:r>
     </w:p>
     <w:p>
@@ -8662,7 +8449,7 @@
           <w:i w:val="0"/>
           <w:sz w:val="24"/>
         </w:rPr>
-        <w:t>The image forensics agent is built around a detector trained for this project: an EfficientNet-B0 that reads error-level-analysis maps computed at three JPEG qualities and is applied to native-resolution 224 × 224 crops. It was trained and evaluated on CASIA v2.0 (1,536 authentic and 1,283 tampered images) and Columbia (183 authentic and 180 spliced images), the datasets used by the base papers of this work. Under 5-fold cross-validation on CASIA v2.0 the detector reaches 95.53% ± 0.86 accuracy (ROC AUC 0.9917) with a random split and 95.32% ± 0.80 (AUC 0.9933) when every tampered image is kept in the same fold as its source image. On a held-out 20% (588 images) never seen in training it reaches 96.26% (AUC 0.9943); the complete pipeline decides 90.5% of those images with 97.9% accuracy and sends the rest to human review. Columbia is harder: its photographs are uncompressed, and a whole-image detector reaches only 87.60% ± 4.27%. A patch-based variant on noise-residual input reaches 97.25% with a random split and 96.97% (AUC 0.980) when every scene is kept in one fold. A pixel-level localiser trained on CASIA does not transfer to Columbia (pooled pixel F1 0.43). The results are compared with the base papers, and the localisation result, which is below the published one, is reported as a limit.</w:t>
+        <w:t>The image forensics agent uses a detector we trained. It is an EfficientNet-B0 network that reads error level analysis maps made at three JPEG qualities, using crops at the original resolution. We trained and tested it on CASIA v2.0 (1,536 authentic and 1,283 tampered images) and Columbia (183 authentic and 180 spliced images). With 5-fold cross-validation on CASIA v2.0 the accuracy is 95.53% with a random split and 95.32% when each tampered image stays in the same fold as its source. On 588 images that were never used in training it reaches 96.26% and the full pipeline gives a verdict on 90.5% of them with 97.9% accuracy. The rest go to a person. Columbia is harder because its photos are uncompressed. A whole image detector reaches only 87.60%, while a patch based detector on noise residuals reaches 97.25% with a random split and 96.97% when every scene stays in one fold. A model that outlines the tampered area, trained on CASIA, does not work well on Columbia (pixel F1 0.43). We compare the results with the five base papers and state this weakness.</w:t>
       </w:r>
     </w:p>
     <w:p>
@@ -8776,7 +8563,7 @@
           <w:i w:val="0"/>
           <w:sz w:val="24"/>
         </w:rPr>
-        <w:t>Photographs are accepted as evidence in newsrooms, insurance claims, banking and courtrooms. The same editing tools that retouch holiday pictures can also move an object into a scene, remove a person from it, or paste a face onto another body, and the result is often indistinguishable to the eye. Image forensics asks whether a given image is authentic. Passive methods use only the image itself and look for traces that the editing left behind, for example differences in noise, in colour-filter-array patterns or in JPEG compression history between the pasted region and the rest of the picture.</w:t>
+        <w:t>Photographs are accepted as evidence in newsrooms, insurance claims, banks and courts. The same tools that fix a holiday photo can move an object into a scene, remove a person or paste a face onto another body. The result often looks real to the eye. Image forensics asks whether an image is authentic. Passive methods use only the image. They look for traces that editing leaves behind, such as different noise, colour patterns or JPEG compression history between the pasted part and the rest of the picture.</w:t>
       </w:r>
     </w:p>
     <w:p>
@@ -8793,7 +8580,7 @@
           <w:i w:val="0"/>
           <w:sz w:val="24"/>
         </w:rPr>
-        <w:t>A second question is just as important in practice: once an image has been analysed, can anyone later prove which file was analysed, what the verdict was and that the record was not altered? A detector that only prints a score cannot answer that. We therefore built analysis and evidence integrity as one system: each run gives a verdict, the evidence behind it (scores, heatmaps, reasoning) and a record that can be checked cryptographically.</w:t>
+        <w:t>A second question matters just as much. After an image is analysed, can anyone prove which file was checked, what the verdict was and that the record was not changed? A detector that only prints a score cannot answer this. So we built the analysis and the evidence record as one system. Each run gives a verdict, the evidence behind it such as scores, heatmaps and reasons, and a record that anyone can check with cryptography.</w:t>
       </w:r>
     </w:p>
     <w:p>
@@ -8828,7 +8615,7 @@
           <w:i w:val="0"/>
           <w:sz w:val="24"/>
         </w:rPr>
-        <w:t>•  Published splicing detectors report accuracies above 90% on CASIA v2.0 and Columbia, but most are research code: they output a label for one dataset and stop there. An analyst needs a working application that accepts any image and explains its answer.</w:t>
+        <w:t>•  Published splicing detectors report accuracies above 90% on CASIA v2.0 and Columbia, but most are research code. They give a label for one dataset and stop. An analyst needs an application that takes any image and explains its answer.</w:t>
       </w:r>
     </w:p>
     <w:p>
@@ -8846,7 +8633,7 @@
           <w:i w:val="0"/>
           <w:sz w:val="24"/>
         </w:rPr>
-        <w:t>•  A wrong automatic verdict can accuse an innocent photographer or clear a forgery. The system should therefore be allowed to say Inconclusive and hand the image to a person.</w:t>
+        <w:t>•  A wrong automatic verdict can blame an innocent photographer or clear a fake. The system should be able to say Inconclusive and pass the image to a person.</w:t>
       </w:r>
     </w:p>
     <w:p>
@@ -8864,7 +8651,7 @@
           <w:i w:val="0"/>
           <w:sz w:val="24"/>
         </w:rPr>
-        <w:t>•  Evidence has to survive scrutiny. A SHA-256 hash of the exact file, a digital signature over the record and an optional public timestamp let a third party check that nothing changed after the analysis.</w:t>
+        <w:t>•  Evidence must hold up when it is questioned. A SHA-256 hash of the exact file, a digital signature on the record and an optional public timestamp let a third party check that nothing changed after the analysis.</w:t>
       </w:r>
     </w:p>
     <w:p>
@@ -8882,7 +8669,7 @@
           <w:i w:val="0"/>
           <w:sz w:val="24"/>
         </w:rPr>
-        <w:t>•  No single signal can be trusted alone. Metadata is easy to strip, re-compression hides ELA traces, and most images carry no provenance data. Several agents cover for each other's gaps.</w:t>
+        <w:t>•  No single signal can be trusted alone. Metadata is easy to remove, recompression hides ELA traces and most images carry no provenance data. Several agents cover for each other.</w:t>
       </w:r>
     </w:p>
     <w:p>
@@ -8916,25 +8703,7 @@
           <w:i w:val="0"/>
           <w:sz w:val="24"/>
         </w:rPr>
-        <w:t xml:space="preserve">TrustSphere AI analyses </w:t>
-      </w:r>
-      <w:r>
-        <w:rPr>
-          <w:rFonts w:ascii="Times New Roman" w:hAnsi="Times New Roman" w:eastAsia="Times New Roman"/>
-          <w:b/>
-          <w:i w:val="0"/>
-          <w:sz w:val="24"/>
-        </w:rPr>
-        <w:t>still images only</w:t>
-      </w:r>
-      <w:r>
-        <w:rPr>
-          <w:rFonts w:ascii="Times New Roman" w:hAnsi="Times New Roman" w:eastAsia="Times New Roman"/>
-          <w:b w:val="0"/>
-          <w:i w:val="0"/>
-          <w:sz w:val="24"/>
-        </w:rPr>
-        <w:t>. The earlier versions of the project also handled audio and documents; both were removed from scope and none of their code, data or results appear in this report.</w:t>
+        <w:t>TrustSphere AI analyses still images only. Earlier versions of the project also handled audio and documents. We removed both, and none of their code, data or results appear in this report.</w:t>
       </w:r>
     </w:p>
     <w:p>
@@ -8970,7 +8739,7 @@
           <w:i w:val="0"/>
           <w:sz w:val="24"/>
         </w:rPr>
-        <w:t xml:space="preserve"> image upload; a metadata agent, an image forensics agent with a trained manipulation detector, and a provenance agent; a decision engine; SHA-256 hashing, Ed25519 signing, a chain of custody and optional blockchain anchoring; an evidence PDF; a REST API; and a web application (analysis, report, history, how it works).</w:t>
+        <w:t xml:space="preserve"> image upload, a metadata agent, an image forensics agent with a trained detector, a provenance agent, a decision engine, SHA-256 hashing, Ed25519 signing, a chain of custody, optional blockchain anchoring, an evidence PDF, a REST API and a web application.</w:t>
       </w:r>
     </w:p>
     <w:p>
@@ -9042,7 +8811,7 @@
           <w:i w:val="0"/>
           <w:sz w:val="24"/>
         </w:rPr>
-        <w:t xml:space="preserve"> image-level detection accuracy by cross-validation, a held-out test of the complete pipeline, and a pixel-level localisation experiment.</w:t>
+        <w:t xml:space="preserve"> detection accuracy by cross-validation, a test of the full pipeline on held out images and a localisation experiment.</w:t>
       </w:r>
     </w:p>
     <w:p>
@@ -9078,7 +8847,7 @@
           <w:i w:val="0"/>
           <w:sz w:val="24"/>
         </w:rPr>
-        <w:t xml:space="preserve"> video, audio, document forensics, detection of fully AI-generated images as a trained task, and any legal determination. The score is decision support, not a finding.</w:t>
+        <w:t xml:space="preserve"> video, audio, document forensics, training on fully AI generated images and any legal judgement. The score is meant to support a decision, not replace it.</w:t>
       </w:r>
     </w:p>
     <w:p>
@@ -9146,7 +8915,7 @@
           <w:i w:val="0"/>
           <w:sz w:val="24"/>
         </w:rPr>
-        <w:t>Image forgery falls into three common kinds: splicing, where a region of one image is pasted into another; copy-move, where a region is duplicated within the same image; and removal, where an object is erased and the gap is filled [5]. Traditional detectors look for inconsistencies in local noise, in colour-filter-array patterns, in illumination, and in double JPEG compression, because a pasted region carries the statistics of its source image [5]. Error level analysis (ELA), introduced for practical image forensics by Krawetz [10], re-saves an image as JPEG at a known quality and displays the difference, so that regions with a different compression history stand out.</w:t>
+        <w:t>Image forgery has three common kinds. In splicing, a part of one image is pasted into another. In copy-move, a part is copied within the same image. In removal, an object is erased and the gap is filled [5]. Classic detectors look for mismatches in noise, in colour filter patterns, in lighting and in double JPEG compression, because a pasted part keeps the statistics of its source image [5]. Error level analysis (ELA) was described for forensic use by Krawetz [10]. It saves an image again as JPEG at a known quality and shows the difference, so parts with a different compression history stand out.</w:t>
       </w:r>
     </w:p>
     <w:p>
@@ -9163,7 +8932,7 @@
           <w:i w:val="0"/>
           <w:sz w:val="24"/>
         </w:rPr>
-        <w:t>Deep learning replaced hand-crafted features in most recent work. Salloum et al. [6] trained a multi-task fully convolutional network on CASIA v2.0 to predict both the spliced region and its boundary, and tested it on CASIA v1.0, Columbia and other sets; this train-on-CASIA, test-elsewhere protocol is the one later adopted by [5].</w:t>
+        <w:t>Deep learning has replaced hand made features in most recent work. Salloum et al. [6] trained a fully convolutional network on CASIA v2.0 to predict both the spliced region and its boundary. They tested it on CASIA v1.0, Columbia and other sets. Training on CASIA and testing elsewhere was later used by [5].</w:t>
       </w:r>
     </w:p>
     <w:p>
@@ -9180,7 +8949,7 @@
           <w:i w:val="0"/>
           <w:sz w:val="24"/>
         </w:rPr>
-        <w:t>Early passive methods rely on physical traces of the imaging pipeline. Resampling after scaling or rotation leaves periodic correlations between neighbouring pixels [15]. The colour-filter-array interpolation of a camera leaves correlations that a pasted region tends to lack [16], and sensor pattern noise works as a camera fingerprint whose absence from a region points to tampering [17]. Mahdian and Saic look for regions whose noise level differs from the rest of the image [18]. For JPEG images, JPEG ghosts reveal a region that was first compressed at another quality [19], and Bianchi and Piva estimate a tampering probability for each 8 × 8 block under double compression [20]. Copy-move forgery was first attacked by matching overlapping blocks [21]; keypoint methods based on SIFT also recover the geometric transformation of the copied region [22], and Christlein et al. compared fifteen feature sets inside one common pipeline [23]. Splicebuster models co-occurrences of noise residuals and segments the image without training on forged examples [24]. The residual filters of the rich models of Fridrich and Kodovský, designed for steganalysis [25], are the basis of the SRM input used for Columbia in this work.</w:t>
+        <w:t>Early passive methods use traces left by the camera and the editing steps. Scaling or rotating leaves repeating patterns between neighbouring pixels [15]. Camera colour interpolation leaves patterns that a pasted part tends to lack [16]. Sensor noise works like a fingerprint of the camera, and a region without it may be tampered [17]. Mahdian and Saic look for regions with a different noise level [18]. For JPEG images, JPEG ghosts show a region first saved at another quality [19], and Bianchi and Piva estimate the chance of tampering for each 8 × 8 block [20]. Copy-move forgery was first found by matching blocks [21]. SIFT keypoints can also give the transformation of the copied region [22], and Christlein et al. compared fifteen feature sets in one pipeline [23]. Splicebuster models noise residuals and splits the image into real and spliced parts without any forged training examples [24]. The filters of the rich models by Fridrich and Kodovský were made for steganalysis [25]. We use them as the SRM input for Columbia.</w:t>
       </w:r>
     </w:p>
     <w:p>
@@ -9197,7 +8966,7 @@
           <w:i w:val="0"/>
           <w:sz w:val="24"/>
         </w:rPr>
-        <w:t>Deep networks learn such traces from data. Bayar and Stamm constrain the first convolutional layer so that it suppresses image content and learns prediction-error filters [26]. Zhou et al. combine an RGB stream and a noise stream in a Faster R-CNN [27], and Huh et al. train on real photographs with EXIF metadata to predict whether two patches come from the same image, with no forged examples [28]. BusterNet separates the source and target regions of a copy-move forgery [29]; ManTra-Net learns from many manipulation types and treats localisation as anomaly detection [30]; RRU-Net adds residual propagation and feedback to a U-Net [31]; and PSCC-Net predicts masks progressively at several scales [32]. MVSS-Net supervises edge, noise and image-level outputs together [33], CAT-Net learns from JPEG DCT coefficients as well as pixels [34], ObjectFormer pairs RGB and high-frequency features in a transformer [35], and TruFor adds a learned noise fingerprint and a map of how reliable the result is [36]. Most of these works are judged on pixel-level localisation. The detector in this project answers the image-level question, authentic or tampered, which is also the question the base papers [1] to [4] answer.</w:t>
+        <w:t>Deep networks learn these traces from data. Bayar and Stamm constrain the first layer so it ignores image content and learns prediction error filters [26]. Zhou et al. use an RGB stream and a noise stream in a Faster R-CNN [27]. Huh et al. train on real photos with EXIF data to predict whether two patches come from the same image, without any forged examples [28]. BusterNet separates the source and target regions of copy-move forgery [29]. ManTra-Net learns many manipulation types and treats localisation as finding anomalies [30]. RRU-Net adds residual feedback to a U-Net [31]. PSCC-Net predicts masks step by step at several scales [32]. MVSS-Net supervises edge, noise and image level outputs together [33]. CAT-Net learns from JPEG DCT coefficients and pixels [34]. ObjectFormer uses RGB and high frequency features in a transformer [35]. TruFor adds a learned noise fingerprint and a reliability map [36]. Most of these papers are judged on how well they locate the tampered pixels. Our detector answers the image level question of authentic or tampered. The base papers [1] to [4] answer the same question.</w:t>
       </w:r>
     </w:p>
     <w:p>
@@ -9214,7 +8983,7 @@
           <w:i w:val="0"/>
           <w:sz w:val="24"/>
         </w:rPr>
-        <w:t>Surveys of the field are given in [37] to [40]: Verdoliva covers media forensics including deepfakes [37], Qureshi and Deriche catalogue pixel-based blind methods [38], Stamm et al. summarise the first decade of information forensics [39], and Warif et al. review copy-move detection [40]. Muhammad et al. separate authentic from tampered images by applying a steerable pyramid transform and local binary patterns to the chrominance channels [41]. Besides CASIA [7] and the Columbia splicing set [8], the benchmark datasets in this literature include the Columbia set of authentic and spliced image blocks [42], CoMoFoD [43], COVERAGE [44] and the Dresden image database [45]. The building blocks of this project are standard: residual networks [46] and vision transformers [47] are the usual alternatives to the EfficientNet backbone [9], the localiser follows the U-Net encoder-decoder layout [48], and training uses AdamW [49]. On the evidence side, Hasan and Salah proposed Ethereum smart contracts that track where a piece of media came from through the hashes of the stored files [50]; this project anchors a SHA-256 hash of the analysed image in a similar way, and adds the signature and chain of custody around it.</w:t>
+        <w:t>Surveys are given in [37] to [40]. Verdoliva covers media forensics and deepfakes [37]. Qureshi and Deriche list pixel based blind methods [38]. Stamm et al. describe the first ten years of information forensics [39]. Warif et al. review copy-move detection [40]. Muhammad et al. tell authentic from tampered images using a steerable pyramid transform and local binary patterns on the colour channels [41]. Besides CASIA [7] and the Columbia splicing set [8], other datasets in this field are the Columbia set of authentic and spliced blocks [42], CoMoFoD [43], COVERAGE [44] and the Dresden image database [45]. Our building blocks are standard. Residual networks [46] and vision transformers [47] are common alternatives to our EfficientNet backbone [9]. The localiser follows the U-Net layout [48] and training uses AdamW [49]. For evidence, Hasan and Salah used Ethereum smart contracts to track where a media file came from using file hashes [50]. We store a SHA-256 hash of the analysed image in a similar way and add a signature and a chain of custody.</w:t>
       </w:r>
     </w:p>
     <w:p>
@@ -9265,7 +9034,7 @@
           <w:i w:val="0"/>
           <w:sz w:val="24"/>
         </w:rPr>
-        <w:t>Ranjan et al. combine a local optimal oriented texture descriptor (a centre-symmetric local binary pattern variant) with ResNet-50 features and classify with an SVM. They evaluate on the Columbia splicing dataset, CASIA v2.0 and a subset of the Dresden image database with stratified 5-fold cross-validation and report an average accuracy of 95.20%. Their review table lists earlier Columbia results between about 91% and 93.4%.</w:t>
+        <w:t>Ranjan et al. combine a local texture pattern descriptor (a variant of the centre symmetric local binary pattern) with ResNet-50 features and classify with an SVM. They test on the Columbia splicing dataset, CASIA v2.0 and a part of the Dresden image database using stratified 5-fold cross-validation. Their average accuracy is 95.20%. Their review table lists older Columbia results between about 91% and 93.4%.</w:t>
       </w:r>
     </w:p>
     <w:p>
@@ -9299,7 +9068,7 @@
           <w:i w:val="0"/>
           <w:sz w:val="24"/>
         </w:rPr>
-        <w:t>Ravula and Singh detect and classify copy-move forgery with a framework that combines generative adversarial networks, a vision transformer and spectral clustering. They report accuracy on CoMoFoD (98.95%), MICC-F220 (95.2%) and CASIA v2 (94.4%).</w:t>
+        <w:t>Ravula and Singh detect and classify copy-move forgery using generative adversarial networks, a vision transformer and spectral clustering together. They report accuracy of 98.95% on CoMoFoD, 95.2% on MICC-F220 and 94.4% on CASIA v2.</w:t>
       </w:r>
     </w:p>
     <w:p>
@@ -9333,7 +9102,7 @@
           <w:i w:val="0"/>
           <w:sz w:val="24"/>
         </w:rPr>
-        <w:t>Rehman and Jain extract patch descriptors with a pre-trained CNN, fuse them and classify with an SVM. On CASIA v2.0 they report 93.57% accuracy without augmentation and 98.91% with augmentation; their results table also lists the mean and standard deviation over runs (93.39% ± 8.75 for the 98.91% setting).</w:t>
+        <w:t>Rehman and Jain take patch features from a pretrained CNN, fuse them and classify with an SVM. On CASIA v2.0 they report 93.57% accuracy without augmentation and 98.91% with augmentation. Their table also gives the mean and standard deviation over runs, which is 93.39% ± 8.75 for the 98.91% setting.</w:t>
       </w:r>
     </w:p>
     <w:p>
@@ -9367,7 +9136,7 @@
           <w:i w:val="0"/>
           <w:sz w:val="24"/>
         </w:rPr>
-        <w:t>Deb and Kar propose a CNN-based copy-move framework with pre-processing, feature extraction, segmentation and localisation stages, and analyse dataset heterogeneity. On CASIA v2.0 they report precision 87.31, recall 90.15 and F1 88.33.</w:t>
+        <w:t>Deb and Kar propose a CNN based copy-move method with preprocessing, feature extraction, segmentation and localisation steps. They also study how different the datasets are. On CASIA v2.0 they report precision 87.31, recall 90.15 and F1 88.33.</w:t>
       </w:r>
     </w:p>
     <w:p>
@@ -9401,7 +9170,7 @@
           <w:i w:val="0"/>
           <w:sz w:val="24"/>
         </w:rPr>
-        <w:t>Chen et al. extract features from a frozen EfficientNet-B4 and train multi-level XGBoost models for the splicing mask and, in the edge-enhanced variant, for the mask boundary, so no back-propagation is needed. Following [6] they train on CASIA v2.0 and test on CASIA v1.0 and Columbia, reporting pixel-level F1 of 0.5728 (0.6210 with edges) on CASIA v1.0 and 0.6497 (0.6558) on Columbia, with 18.4 million parameters.</w:t>
+        <w:t>Chen et al. take features from a frozen EfficientNet-B4 and train XGBoost models at several levels for the splicing mask. A second version also predicts the mask boundary. No backpropagation is needed. Following [6], they train on CASIA v2.0 and test on CASIA v1.0 and Columbia. They report pixel F1 of 0.5728 (0.6210 with edges) on CASIA v1.0 and 0.6497 (0.6558) on Columbia, with 18.4 million parameters.</w:t>
       </w:r>
     </w:p>
     <w:p>
@@ -10102,7 +9871,7 @@
           <w:i w:val="0"/>
           <w:sz w:val="24"/>
         </w:rPr>
-        <w:t>Evaluation that may reward memorisation.</w:t>
+        <w:t>Tests that may reward memory.</w:t>
       </w:r>
       <w:r>
         <w:rPr>
@@ -10111,7 +9880,7 @@
           <w:i w:val="0"/>
           <w:sz w:val="24"/>
         </w:rPr>
-        <w:t xml:space="preserve"> CASIA v2.0 contains tampered images that were made from authentic images in the same dataset. A random split can put a tampered image in the test set and its source in the training set. The base papers report random-split or cross-validation accuracy without stating whether sources are kept apart. This project reports both a random split and a source-disjoint split.</w:t>
+        <w:t xml:space="preserve"> CASIA v2.0 has tampered images made from authentic images in the same set. A random split can put a tampered image in the test set and its source in the training set. The base papers report random split or cross-validation accuracy and do not say if sources were kept apart. We report both a random split and a split that keeps sources together.</w:t>
       </w:r>
     </w:p>
     <w:p>
@@ -10147,7 +9916,7 @@
           <w:i w:val="0"/>
           <w:sz w:val="24"/>
         </w:rPr>
-        <w:t xml:space="preserve"> The base papers stop at a label or a mask. None of them hashes the analysed file, signs the result or produces a record a third party can verify.</w:t>
+        <w:t xml:space="preserve"> The base papers stop at a label or a mask. None of them hashes the file, signs the result or gives a record that a third party can check.</w:t>
       </w:r>
     </w:p>
     <w:p>
@@ -10174,7 +9943,7 @@
           <w:i w:val="0"/>
           <w:sz w:val="24"/>
         </w:rPr>
-        <w:t>Prototypes, not applications.</w:t>
+        <w:t>Prototypes instead of applications.</w:t>
       </w:r>
       <w:r>
         <w:rPr>
@@ -10183,7 +9952,7 @@
           <w:i w:val="0"/>
           <w:sz w:val="24"/>
         </w:rPr>
-        <w:t xml:space="preserve"> The reported methods are scripts for one benchmark. An analyst has no upload page, no explanation of the verdict and no way to review earlier cases.</w:t>
+        <w:t xml:space="preserve"> The published methods are scripts for one benchmark. An analyst gets no upload page, no explanation of the verdict and no way to review earlier cases.</w:t>
       </w:r>
     </w:p>
     <w:p>
@@ -10219,7 +9988,7 @@
           <w:i w:val="0"/>
           <w:sz w:val="24"/>
         </w:rPr>
-        <w:t xml:space="preserve"> The localisation protocol of [5] and [6] (train on CASIA v2.0, test on Columbia) gives pixel F1 of about 0.65 at best, so cross-dataset behaviour is still an open problem and a system should not hide it.</w:t>
+        <w:t xml:space="preserve"> The protocol of [5] and [6] trains on CASIA v2.0 and tests on Columbia. It gives pixel F1 of about 0.65 at best. Behaviour on a new dataset is still an open problem, and a system should say so.</w:t>
       </w:r>
     </w:p>
     <w:p>
@@ -10254,7 +10023,7 @@
           <w:i w:val="0"/>
           <w:sz w:val="24"/>
         </w:rPr>
-        <w:t>1.  Build a multi-agent pipeline (metadata, image forensics, provenance) with a decision engine that returns Authentic, Fake or Inconclusive with its reasoning.</w:t>
+        <w:t>1.  Build a multi-agent pipeline with metadata, image forensics and provenance agents and a decision engine that returns Authentic, Fake or Inconclusive with reasons.</w:t>
       </w:r>
     </w:p>
     <w:p>
@@ -10272,7 +10041,7 @@
           <w:i w:val="0"/>
           <w:sz w:val="24"/>
         </w:rPr>
-        <w:t>2.  Train an image manipulation detector on CASIA v2.0 and Columbia and measure it with cross-validation, including a source-disjoint protocol.</w:t>
+        <w:t>2.  Train an image manipulation detector on CASIA v2.0 and Columbia and measure it with cross-validation, including a split that keeps sources together.</w:t>
       </w:r>
     </w:p>
     <w:p>
@@ -10290,7 +10059,7 @@
           <w:i w:val="0"/>
           <w:sz w:val="24"/>
         </w:rPr>
-        <w:t>3.  Make every analysis tamper-evident: SHA-256 of the file, Ed25519 signature, chain of custody, optional blockchain anchor and an evidence PDF.</w:t>
+        <w:t>3.  Make every analysis tamper evident with a SHA-256 hash, an Ed25519 signature, a chain of custody, an optional blockchain anchor and an evidence PDF.</w:t>
       </w:r>
     </w:p>
     <w:p>
@@ -10308,7 +10077,7 @@
           <w:i w:val="0"/>
           <w:sz w:val="24"/>
         </w:rPr>
-        <w:t>4.  Deliver a web application and REST API that run on one machine.</w:t>
+        <w:t>4.  Build a web application and REST API that run on one machine.</w:t>
       </w:r>
     </w:p>
     <w:p>
@@ -10326,7 +10095,7 @@
           <w:i w:val="0"/>
           <w:sz w:val="24"/>
         </w:rPr>
-        <w:t>5.  Compare the results with the five base papers on the same datasets and state where the system falls short.</w:t>
+        <w:t>5.  Compare the results with the five base papers on the same datasets and say where the system falls short.</w:t>
       </w:r>
     </w:p>
     <w:p>
@@ -10360,7 +10129,7 @@
           <w:i w:val="0"/>
           <w:sz w:val="24"/>
         </w:rPr>
-        <w:t>Given a still image of unknown origin, decide whether it is authentic or manipulated, show which evidence supports the decision, abstain when the evidence is weak, and keep a record of the analysis that a third party can verify without trusting the operator.</w:t>
+        <w:t>Given a still image of unknown origin, decide whether it is authentic or manipulated and show the evidence for the decision. Say Inconclusive when the evidence is weak. Keep a record of the analysis that a third party can check without trusting the operator.</w:t>
       </w:r>
     </w:p>
     <w:p>
@@ -10394,7 +10163,7 @@
           <w:i w:val="0"/>
           <w:sz w:val="24"/>
         </w:rPr>
-        <w:t>The plan follows the history of the project repository. Dates are the commit dates of the corresponding work; the training and evaluation work of October 2026 was done in this semester.</w:t>
+        <w:t>The plan follows the history of the project repository. The dates are the dates of the work. The training and evaluation work of October 2026 was done in this semester.</w:t>
       </w:r>
     </w:p>
     <w:p>
@@ -10652,7 +10421,7 @@
                 <w:b w:val="0"/>
                 <w:sz w:val="20"/>
               </w:rPr>
-              <w:t>Explainability and the evidence PDF; optional local-LLM summary (disabled in this report)</w:t>
+              <w:t>Explainability and the evidence PDF, plus an optional local LLM summary that is off in this report</w:t>
             </w:r>
           </w:p>
         </w:tc>
@@ -11079,7 +10848,7 @@
           <w:i w:val="0"/>
           <w:sz w:val="24"/>
         </w:rPr>
-        <w:t>•  FR1. Accept an uploaded image (JPEG, PNG, WebP, GIF, BMP, TIFF) of up to 100 MB and reject every other file type with HTTP 415.</w:t>
+        <w:t>•  FR1. Accept an uploaded image (JPEG, PNG, WebP, GIF, BMP or TIFF) up to 100 MB and reject every other file type with HTTP 415.</w:t>
       </w:r>
     </w:p>
     <w:p>
@@ -11115,7 +10884,7 @@
           <w:i w:val="0"/>
           <w:sz w:val="24"/>
         </w:rPr>
-        <w:t>•  FR3. Run the metadata, image forensics and provenance agents and store each agent's findings.</w:t>
+        <w:t>•  FR3. Run the metadata, image forensics and provenance agents and store what each agent finds.</w:t>
       </w:r>
     </w:p>
     <w:p>
@@ -11133,7 +10902,7 @@
           <w:i w:val="0"/>
           <w:sz w:val="24"/>
         </w:rPr>
-        <w:t>•  FR4. Fuse the agent scores into an authenticity score between 0 and 1 and a verdict: Authentic at or above 0.75, Fake at or below 0.40, otherwise Inconclusive.</w:t>
+        <w:t>•  FR4. Combine the agent scores into an authenticity score between 0 and 1 and a verdict. Authentic is at or above 0.75, Fake is at or below 0.40 and anything between is Inconclusive.</w:t>
       </w:r>
     </w:p>
     <w:p>
@@ -11151,7 +10920,7 @@
           <w:i w:val="0"/>
           <w:sz w:val="24"/>
         </w:rPr>
-        <w:t>•  FR5. Show the reasoning, the heatmaps (error-level analysis and Grad-CAM) and the contribution of each metadata field.</w:t>
+        <w:t>•  FR5. Show the reasons, the heatmaps (error level analysis and Grad-CAM) and how much each metadata field contributed.</w:t>
       </w:r>
     </w:p>
     <w:p>
@@ -11169,7 +10938,7 @@
           <w:i w:val="0"/>
           <w:sz w:val="24"/>
         </w:rPr>
-        <w:t>•  FR6. Sign every record with Ed25519, keep a chain of custody and, when a wallet is configured, anchor the verdict on the Polygon Amoy blockchain.</w:t>
+        <w:t>•  FR6. Sign every record with Ed25519, keep a chain of custody and, if a wallet is set, anchor the verdict on the Polygon Amoy blockchain.</w:t>
       </w:r>
     </w:p>
     <w:p>
@@ -11187,7 +10956,7 @@
           <w:i w:val="0"/>
           <w:sz w:val="24"/>
         </w:rPr>
-        <w:t>•  FR7. Generate an evidence PDF and let anyone re-verify the file hash, the signature and the anchor.</w:t>
+        <w:t>•  FR7. Create an evidence PDF and let anyone check the file hash, the signature and the anchor again.</w:t>
       </w:r>
     </w:p>
     <w:p>
@@ -11205,7 +10974,7 @@
           <w:i w:val="0"/>
           <w:sz w:val="24"/>
         </w:rPr>
-        <w:t>•  FR8. Provide a web application (analysis, report, history, how it works) and a documented REST API.</w:t>
+        <w:t>•  FR8. Provide a web application and a documented REST API.</w:t>
       </w:r>
     </w:p>
     <w:p>
@@ -11249,7 +11018,7 @@
           <w:i w:val="0"/>
           <w:sz w:val="24"/>
         </w:rPr>
-        <w:t>Accuracy and honesty:</w:t>
+        <w:t>Accuracy:</w:t>
       </w:r>
       <w:r>
         <w:rPr>
@@ -11258,7 +11027,7 @@
           <w:i w:val="0"/>
           <w:sz w:val="24"/>
         </w:rPr>
-        <w:t xml:space="preserve"> report cross-validated and held-out figures only, with the protocol stated.</w:t>
+        <w:t xml:space="preserve"> only cross-validated and held out figures are reported, with the protocol stated.</w:t>
       </w:r>
     </w:p>
     <w:p>
@@ -11285,7 +11054,7 @@
           <w:i w:val="0"/>
           <w:sz w:val="24"/>
         </w:rPr>
-        <w:t>Performance:</w:t>
+        <w:t>Speed:</w:t>
       </w:r>
       <w:r>
         <w:rPr>
@@ -11294,7 +11063,7 @@
           <w:i w:val="0"/>
           <w:sz w:val="24"/>
         </w:rPr>
-        <w:t xml:space="preserve"> analyse one image in seconds on a single GPU. Measured on the 588 held-out images the whole pipeline took 0.24 s per image on average (about 142 s in total).</w:t>
+        <w:t xml:space="preserve"> analyse one image in seconds on one GPU. On the 588 held out images the whole pipeline took 0.24 s per image on average, about 142 s in total.</w:t>
       </w:r>
     </w:p>
     <w:p>
@@ -11438,7 +11207,7 @@
           <w:i w:val="0"/>
           <w:sz w:val="24"/>
         </w:rPr>
-        <w:t xml:space="preserve"> each agent is one module behind the same interface, so an agent can be replaced without touching the others.</w:t>
+        <w:t xml:space="preserve"> each agent is one module with the same interface, so one agent can be replaced without touching the others.</w:t>
       </w:r>
     </w:p>
     <w:p>
@@ -11489,7 +11258,7 @@
           <w:i w:val="0"/>
           <w:sz w:val="24"/>
         </w:rPr>
-        <w:t>Every component is available as open-source software (Python, PyTorch, timm, FastAPI, SQLAlchemy, ReportLab, web3). The detector is small (EfficientNet-B0, about 4 million parameters) and was trained and evaluated on a single laptop GPU with 8 GB of memory. Pre-trained ImageNet weights are used as the starting point, so no large dataset or cluster is needed.</w:t>
+        <w:t>Every part is available as open source software (Python, PyTorch, timm, FastAPI, SQLAlchemy, ReportLab and web3). The detector is small. EfficientNet-B0 has about 4 million parameters, and we trained and tested it on one laptop GPU with 8 GB of memory. We start from pretrained ImageNet weights, so no large dataset or cluster is needed.</w:t>
       </w:r>
     </w:p>
     <w:p>
@@ -11523,7 +11292,7 @@
           <w:i w:val="0"/>
           <w:sz w:val="24"/>
         </w:rPr>
-        <w:t>No paid service was used. Models and libraries are open-source; the datasets are public; the database is SQLite or a free-tier PostgreSQL; blockchain anchoring uses the Polygon Amoy test network, whose gas is free. The only hardware is the development laptop. Running costs are therefore limited to electricity.</w:t>
+        <w:t>No paid service was used. The models and libraries are open source and the datasets are public. The database is SQLite or a free PostgreSQL plan. Blockchain anchoring uses the Polygon Amoy test network, where gas is free. The only hardware is the development laptop, so the running cost is only electricity.</w:t>
       </w:r>
     </w:p>
     <w:p>
@@ -11557,7 +11326,7 @@
           <w:i w:val="0"/>
           <w:sz w:val="24"/>
         </w:rPr>
-        <w:t>The system supports journalists, insurers and investigators in triaging images. The main risk is over-trust in an automatic verdict. The design limits that risk with an explicit Inconclusive band, visible reasoning and heatmaps, and a footer stating that scores are not a legal finding. Images are processed on the operator's own machine and are not sent to third parties.</w:t>
+        <w:t>The system helps journalists, insurers and investigators sort images. The main risk is trusting an automatic verdict too much. The design reduces this with an Inconclusive band, visible reasons and heatmaps, and a note that scores are not a legal finding. Images are processed on the operator's own machine and are not sent to anyone else.</w:t>
       </w:r>
     </w:p>
     <w:p>
@@ -12426,7 +12195,7 @@
           <w:i w:val="0"/>
           <w:sz w:val="24"/>
         </w:rPr>
-        <w:t>The user uploads an image through the web application. The FastAPI backend stores the file, hashes it and runs three forensic agents. Each agent returns a score between 0 (fake) and 1 (authentic) and a list of findings. The decision engine takes the weighted average of the agent scores (image forensics 0.30, provenance 0.25, metadata 0.20; an agent with no signal is left out rather than counted as 0.5) and maps it to a verdict. The record is then signed, written to the database with a chain of custody, optionally anchored on the blockchain, and made available as JSON and as an evidence PDF.</w:t>
+        <w:t>The user uploads an image in the web application. The FastAPI backend stores the file, hashes it and runs three agents. Each agent returns a score from 0 (fake) to 1 (authentic) and a list of findings. The decision engine takes the weighted average of the scores. The weights are 0.30 for image forensics, 0.25 for provenance and 0.20 for metadata. An agent with no signal is left out instead of being counted as 0.5. The average becomes a verdict. The record is then signed, saved in the database with a chain of custody, anchored on the blockchain if set up, and made available as JSON and as an evidence PDF.</w:t>
       </w:r>
     </w:p>
     <w:p>
@@ -12535,7 +12304,7 @@
           <w:i w:val="0"/>
           <w:sz w:val="24"/>
         </w:rPr>
-        <w:t>Figure 4.2 shows the level-1 data flow. The original file and its hash go to the evidence store; the trained model weights are read by the forensic agents; the signed record is written back to the store and the report returns to the analyst.</w:t>
+        <w:t>Figure 4.2 shows the level 1 data flow. The original file and its hash go to the evidence store. The forensic agents read the trained model weights. The signed record goes back to the store and the report goes to the analyst.</w:t>
       </w:r>
     </w:p>
     <w:p>
@@ -12627,7 +12396,7 @@
           <w:i w:val="0"/>
           <w:sz w:val="24"/>
         </w:rPr>
-        <w:t>The analyst uploads images, reads verdicts and heatmaps, downloads the evidence PDF and browses history. A verifier or auditor does not need to trust the analyst: the verdict, the evidence PDF and the integrity verification are available to anyone with the file identifier.</w:t>
+        <w:t>The analyst uploads images, reads verdicts and heatmaps, downloads the evidence PDF and browses the history. A verifier or auditor does not have to trust the analyst, because the verdict, the evidence PDF and the integrity check are open to anyone who has the file identifier.</w:t>
       </w:r>
     </w:p>
     <w:p>
@@ -12719,7 +12488,7 @@
           <w:i w:val="0"/>
           <w:sz w:val="24"/>
         </w:rPr>
-        <w:t>The data model has four tables: Evidence (the uploaded file), AgentResult (one row per agent), FinalVerdict (one row per analysis) and AuditLog (signature, anchor and chain of custody). All agents implement the same run(path) interface, which is what lets the decision engine treat them uniformly.</w:t>
+        <w:t>The data model has four tables. Evidence holds the uploaded file, AgentResult has one row per agent, FinalVerdict has one row per analysis and AuditLog holds the signature, anchor and chain of custody. All agents use the same run(path) interface, so the decision engine treats them the same way.</w:t>
       </w:r>
     </w:p>
     <w:p>
@@ -12869,7 +12638,7 @@
           <w:i w:val="0"/>
           <w:sz w:val="24"/>
         </w:rPr>
-        <w:t>Figure 4.6 shows one analysis from upload to report. The report and verification calls are separate requests, so the verification can be repeated at any later time.</w:t>
+        <w:t>Figure 4.6 shows one analysis from upload to report. Report and verification are separate requests, so verification can be repeated at any later time.</w:t>
       </w:r>
     </w:p>
     <w:p>
@@ -13012,7 +12781,7 @@
           <w:i w:val="0"/>
           <w:sz w:val="24"/>
         </w:rPr>
-        <w:t>The upload endpoint accepts only image MIME types. The file is saved under its SHA-256 hash, a database row is created, and the analysis is queued as a Celery task. With Redis the task runs in a worker process; in local mode (no Redis) it runs inline and the upload call returns when the analysis has finished. The status endpoint reports pending, analyzing, done or failed, and the web application polls it either way.</w:t>
+        <w:t>The upload endpoint accepts only image MIME types. The file is saved under its SHA-256 hash, a database row is created and the analysis is queued as a Celery task. With Redis the task runs in a worker process. In local mode, without Redis, it runs inline and the upload call returns when the analysis is done. The status endpoint reports pending, analyzing, done or failed, and the web application polls it in both modes.</w:t>
       </w:r>
     </w:p>
     <w:p>
@@ -13046,7 +12815,7 @@
           <w:i w:val="0"/>
           <w:sz w:val="24"/>
         </w:rPr>
-        <w:t>The metadata agent reads EXIF and flags missing camera make and model, editing or generator software in the tags, missing or inconsistent timestamps, and the presence of GPS data. Each check gives a score; a closed-form Shapley value shows how much each check moved the agent's score towards authentic or fake. Images that carry no EXIF at all, such as the PNG files of the datasets, therefore score about 0.45 on this agent.</w:t>
+        <w:t>The metadata agent reads EXIF data and flags a missing camera make and model, editing or generator software in the tags, missing or inconsistent timestamps and GPS data. Each check gives a score. A closed form Shapley value shows how much each check moved the score towards authentic or fake. Images with no EXIF at all, such as the PNG files in the datasets, score about 0.45 on this agent.</w:t>
       </w:r>
     </w:p>
     <w:p>
@@ -13080,7 +12849,7 @@
           <w:i w:val="0"/>
           <w:sz w:val="24"/>
         </w:rPr>
-        <w:t>The agent combines supporting heuristics with a trained detector that governs the verdict.</w:t>
+        <w:t>The agent combines supporting heuristics with a trained detector that decides the verdict.</w:t>
       </w:r>
     </w:p>
     <w:p>
@@ -13116,7 +12885,7 @@
           <w:i w:val="0"/>
           <w:sz w:val="24"/>
         </w:rPr>
-        <w:t xml:space="preserve"> the image is re-saved at JPEG quality 90 and the amplified difference is saved as a heatmap.</w:t>
+        <w:t xml:space="preserve"> the image is saved again as JPEG at quality 90 and the amplified difference is saved as a heatmap.</w:t>
       </w:r>
     </w:p>
     <w:p>
@@ -13152,7 +12921,7 @@
           <w:i w:val="0"/>
           <w:sz w:val="24"/>
         </w:rPr>
-        <w:t xml:space="preserve"> the ratio of high-frequency energy in the Fourier spectrum.</w:t>
+        <w:t xml:space="preserve"> the share of high frequency energy in the Fourier spectrum.</w:t>
       </w:r>
     </w:p>
     <w:p>
@@ -13188,7 +12957,7 @@
           <w:i w:val="0"/>
           <w:sz w:val="24"/>
         </w:rPr>
-        <w:t xml:space="preserve"> model attention from a pre-trained deepfake classifier, shown next to the ELA map.</w:t>
+        <w:t xml:space="preserve"> the attention of a pretrained deepfake classifier, shown next to the ELA map.</w:t>
       </w:r>
     </w:p>
     <w:p>
@@ -13224,7 +12993,7 @@
           <w:i w:val="0"/>
           <w:sz w:val="24"/>
         </w:rPr>
-        <w:t xml:space="preserve"> described below. When it is installed, the three heuristics remain in the report as supporting evidence but are not scored.</w:t>
+        <w:t xml:space="preserve"> described below. When it is installed, the three heuristics stay in the report as supporting evidence but do not change the score.</w:t>
       </w:r>
     </w:p>
     <w:p>
@@ -13250,7 +13019,7 @@
           <w:i w:val="0"/>
           <w:sz w:val="24"/>
         </w:rPr>
-        <w:t xml:space="preserve"> The image is re-saved as JPEG at quality 70, 85 and 95. For each quality the absolute difference to the original is computed, converted to grey scale, amplified and stored as one channel, giving a three-channel error-level map at the image's native resolution (Figure 5.1). Resizing is avoided on purpose because it destroys the faint compression traces the detector depends on.</w:t>
+        <w:t xml:space="preserve"> The image is saved again as JPEG at quality 70, 85 and 95. For each quality we take the absolute difference from the original, turn it to grey scale, amplify it and keep it as one channel. This gives a three channel error level map at the native resolution of the image (Figure 5.1). We avoid resizing on purpose because it destroys the faint compression traces the detector needs.</w:t>
       </w:r>
     </w:p>
     <w:p>
@@ -13334,7 +13103,7 @@
           <w:i w:val="0"/>
           <w:sz w:val="24"/>
         </w:rPr>
-        <w:t xml:space="preserve"> The network is an EfficientNet-B0 [9] with ImageNet weights and a single-logit head. Training uses random 224 × 224 crops of the error-level maps with random flips, the AdamW optimiser (learning rate 4×10⁻⁴, one-cycle schedule, weight decay 10⁻⁴), batches of 32, mixed precision and 12 epochs. At test time up to six crops covering the image are scored and their logits are averaged. The authenticity score is one minus the predicted probability of manipulation.</w:t>
+        <w:t xml:space="preserve"> The network is an EfficientNet-B0 [9] with ImageNet weights and a single output. Training uses random 224 × 224 crops of the error level maps with random flips. We use the AdamW optimiser with learning rate 4×10⁻⁴, a one cycle schedule, weight decay 10⁻⁴, batches of 32, mixed precision and 12 epochs. At test time up to six crops that cover the image are scored and their outputs are averaged. The authenticity score is one minus the predicted probability of manipulation.</w:t>
       </w:r>
     </w:p>
     <w:p>
@@ -13360,7 +13129,7 @@
           <w:i w:val="0"/>
           <w:sz w:val="24"/>
         </w:rPr>
-        <w:t xml:space="preserve"> The input type (a single ELA at quality 90 or the three-quality map), the backbone (B0 or B3) and the learning rate were chosen on one development split of CASIA v2.0 (a validation part of the training data; the held-out test part was not used). Three-quality ELA with B0 gave the best validation accuracy and AUC and was fixed before any cross-validation. A six-channel variant that adds the RGB image to the error maps was tried on one fold and was clearly worse, so it was stopped and is not used.</w:t>
+        <w:t xml:space="preserve"> We chose the input type (one ELA at quality 90 or the three quality map), the backbone (B0 or B3) and the learning rate on one development split of CASIA v2.0. This was a validation part of the training data and the held out test part was not used. Three quality ELA with B0 gave the best validation accuracy and AUC, and we fixed it before any cross-validation. We also tried a six channel input that adds the RGB image to the error maps on one fold. It was clearly worse, so we stopped it and do not use it.</w:t>
       </w:r>
     </w:p>
     <w:p>
@@ -13394,7 +13163,7 @@
           <w:i w:val="0"/>
           <w:sz w:val="24"/>
         </w:rPr>
-        <w:t>The provenance agent checks for embedded C2PA content credentials [14] and for invisible watermarks written by AI image generators. A valid manifest fast-tracks an image to Authentic; a failed manifest or a generator watermark is reported as suspicious and appears in the reasoning. Most images carry neither, in which case the agent reports no signal and is left out of the weighted average.</w:t>
+        <w:t>The provenance agent checks for embedded C2PA content credentials [14] and for invisible watermarks written by AI image generators. A valid manifest moves an image straight to Authentic. A failed manifest or a generator watermark is reported as suspicious and appears in the reasons. Most images have neither. In that case the agent reports no signal and is left out of the weighted average.</w:t>
       </w:r>
     </w:p>
     <w:p>
@@ -13428,7 +13197,7 @@
           <w:i w:val="0"/>
           <w:sz w:val="24"/>
         </w:rPr>
-        <w:t>The engine computes the weighted mean of the agent scores, applies the verdict thresholds (Authentic at or above 0.75, Fake at or below 0.40, Inconclusive between), and writes a list of reasons. When the trained detector flags the image, the manipulation type is reported as Image Splicing / Tampering. The Inconclusive band is deliberate: it sends borderline images to a person.</w:t>
+        <w:t>The engine takes the weighted mean of the agent scores and applies the thresholds. Authentic is at or above 0.75, Fake is at or below 0.40 and anything between is Inconclusive. It also writes a list of reasons. When the trained detector flags the image, the manipulation type is shown as Image Splicing / Tampering. The Inconclusive band is deliberate. It sends borderline images to a person.</w:t>
       </w:r>
     </w:p>
     <w:p>
@@ -13462,7 +13231,7 @@
           <w:i w:val="0"/>
           <w:sz w:val="24"/>
         </w:rPr>
-        <w:t>The analysed file is hashed with SHA-256. A canonical record (file hash, verdict, score, agent scores, time) is signed with an Ed25519 key [13]; the public key fingerprint is stored with the record. The chain of custody lists upload, analysis, signing and anchoring events. If a wallet is configured, the file hash and verdict are written to a smart contract on Polygon Amoy and can be read back for verification. The evidence PDF contains the identification, the verdict and reasoning, every agent's findings, the explainability exhibits, the chain of custody and the signature.</w:t>
+        <w:t>The analysed file is hashed with SHA-256. A standard form of the record (file hash, verdict, score, agent scores and time) is signed with an Ed25519 key [13] and the fingerprint of the public key is stored with it. The chain of custody lists the upload, analysis, signing and anchoring events. If a wallet is set, the file hash and verdict are written to a smart contract on Polygon Amoy and can be read back for checking. The evidence PDF holds the identification, the verdict and reasons, the findings of each agent, the explanation exhibits, the chain of custody and the signature.</w:t>
       </w:r>
     </w:p>
     <w:p>
@@ -13496,7 +13265,7 @@
           <w:i w:val="0"/>
           <w:sz w:val="24"/>
         </w:rPr>
-        <w:t>A single-page application served by the backend. The Analyze page uploads an image and shows the stages; the Report page shows the verdict gauge, the reasoning, each agent's findings, the heatmaps, the Shapley chart, the evidence chain with live re-verification and the chain of custody; the History page lists past analyses; the How it works page explains the agents and the fusion weights.</w:t>
+        <w:t>The web application is a single page served by the backend. The Analyze page uploads an image and shows the stages. The Report page shows the verdict gauge, the reasons, the findings of each agent, the heatmaps, the Shapley chart, the evidence chain with live checking and the chain of custody. The History page lists past analyses. The How it works page explains the agents and the weights.</w:t>
       </w:r>
     </w:p>
     <w:p>
@@ -13530,7 +13299,7 @@
           <w:i w:val="0"/>
           <w:sz w:val="24"/>
         </w:rPr>
-        <w:t>To compare with [5], a U-Net-style network (EfficientNet-B0 encoder on the RGB image plus the three-quality ELA map, bilinear feature-pyramid decoder) was trained on the CASIA v2.0 masks with a binary cross-entropy plus Dice loss and tested on Columbia. Columbia was never used for training, threshold selection or early stopping; the threshold was chosen on a source-disjoint CASIA validation part.</w:t>
+        <w:t>To compare with [5], we trained a U-Net style network on the CASIA v2.0 masks. It uses an EfficientNet-B0 encoder on the RGB image plus the three quality ELA map, a bilinear feature pyramid decoder and a loss that adds binary cross-entropy and Dice. We tested it on Columbia. Columbia was never used for training, choosing the threshold or early stopping. The threshold came from a CASIA validation part that keeps sources apart.</w:t>
       </w:r>
     </w:p>
     <w:p>
@@ -13600,7 +13369,7 @@
           <w:i w:val="0"/>
           <w:sz w:val="24"/>
         </w:rPr>
-        <w:t xml:space="preserve"> (stratified, seed 42): the protocol closest to the base papers.</w:t>
+        <w:t xml:space="preserve"> (stratified, seed 42). This is closest to the base papers.</w:t>
       </w:r>
     </w:p>
     <w:p>
@@ -13636,7 +13405,7 @@
           <w:i w:val="0"/>
           <w:sz w:val="24"/>
         </w:rPr>
-        <w:t xml:space="preserve"> on CASIA v2.0: every tampered image is kept in the same fold as the authentic image it was made from, using the source named in the dataset's metadata files.</w:t>
+        <w:t xml:space="preserve"> on CASIA v2.0. Every tampered image stays in the same fold as the authentic image it was made from, using the source named in the metadata files of the dataset.</w:t>
       </w:r>
     </w:p>
     <w:p>
@@ -13663,7 +13432,7 @@
           <w:i w:val="0"/>
           <w:sz w:val="24"/>
         </w:rPr>
-        <w:t>Held-out test of the complete pipeline:</w:t>
+        <w:t>Held out test of the full pipeline.</w:t>
       </w:r>
       <w:r>
         <w:rPr>
@@ -13672,7 +13441,7 @@
           <w:i w:val="0"/>
           <w:sz w:val="24"/>
         </w:rPr>
-        <w:t xml:space="preserve"> an 80/20 source-disjoint split; a detector trained on the 80% was used by the real agents and decision engine on the 588 images of the 20%.</w:t>
+        <w:t xml:space="preserve"> An 80/20 split that keeps sources together. A detector trained on the 80% was used by the real agents and the decision engine on the 588 images of the other 20%.</w:t>
       </w:r>
     </w:p>
     <w:p>
@@ -13699,7 +13468,7 @@
           <w:i w:val="0"/>
           <w:sz w:val="24"/>
         </w:rPr>
-        <w:t>Columbia:</w:t>
+        <w:t>Columbia.</w:t>
       </w:r>
       <w:r>
         <w:rPr>
@@ -13708,7 +13477,7 @@
           <w:i w:val="0"/>
           <w:sz w:val="24"/>
         </w:rPr>
-        <w:t xml:space="preserve"> 5-fold cross-validation over its 363 images, with several inputs tried (reported in full in Chapter 7).</w:t>
+        <w:t xml:space="preserve"> 5-fold cross-validation over its 363 images with several inputs tried. All are reported in Chapter 7.</w:t>
       </w:r>
     </w:p>
     <w:p>
@@ -13726,7 +13495,7 @@
           <w:i w:val="0"/>
           <w:sz w:val="24"/>
         </w:rPr>
-        <w:t>•  All metrics come from out-of-fold or held-out predictions, so no image is scored by a model that trained on it.</w:t>
+        <w:t>•  All metrics come from out-of-fold or held out predictions, so no image is scored by a model that trained on it.</w:t>
       </w:r>
     </w:p>
     <w:p>
@@ -13760,7 +13529,7 @@
           <w:i w:val="0"/>
           <w:sz w:val="24"/>
         </w:rPr>
-        <w:t>A scripted test (scripts/e2e_test.py) drives a running server through its public API with six images (three authentic, three tampered). 19 of 19 checks passed, including the tamper-evidence check: changing one byte of a stored evidence file makes the verification endpoint report TAMPERED, and restoring the file makes it pass again.</w:t>
+        <w:t>A script (scripts/e2e_test.py) drives a running server through its public API with six images, three authentic and three tampered. All 19 checks passed. This includes the tamper check. Changing one byte of a stored evidence file makes the verification endpoint report TAMPERED, and restoring the file makes it pass again.</w:t>
       </w:r>
     </w:p>
     <w:p>
@@ -14118,7 +13887,7 @@
                 <w:b w:val="0"/>
                 <w:sz w:val="18"/>
               </w:rPr>
-              <w:t>analyse Au_ani_20070.jpg.png</w:t>
+              <w:t>analyse Au_ani_30064.jpg.png</w:t>
             </w:r>
           </w:p>
         </w:tc>
@@ -14158,7 +13927,7 @@
                 <w:b w:val="0"/>
                 <w:sz w:val="18"/>
               </w:rPr>
-              <w:t>verdict Authentic score 0.763, 21.0 s, pdf 312 KB</w:t>
+              <w:t>verdict Authentic score 0.780, 71.9 s, pdf 290 KB</w:t>
             </w:r>
           </w:p>
         </w:tc>
@@ -14180,7 +13949,7 @@
                 <w:b w:val="0"/>
                 <w:sz w:val="18"/>
               </w:rPr>
-              <w:t>analyse Au_arc_20035.jpg.png</w:t>
+              <w:t>analyse Au_ani_30509.jpg.png</w:t>
             </w:r>
           </w:p>
         </w:tc>
@@ -14220,7 +13989,7 @@
                 <w:b w:val="0"/>
                 <w:sz w:val="18"/>
               </w:rPr>
-              <w:t>verdict Inconclusive score 0.735, 1.1 s, pdf 737 KB</w:t>
+              <w:t>verdict Authentic score 0.780, 9.8 s, pdf 244 KB</w:t>
             </w:r>
           </w:p>
         </w:tc>
@@ -14242,7 +14011,7 @@
                 <w:b w:val="0"/>
                 <w:sz w:val="18"/>
               </w:rPr>
-              <w:t>analyse Au_arc_30003.jpg.png</w:t>
+              <w:t>analyse Au_ani_30704.jpg.png</w:t>
             </w:r>
           </w:p>
         </w:tc>
@@ -14282,7 +14051,7 @@
                 <w:b w:val="0"/>
                 <w:sz w:val="18"/>
               </w:rPr>
-              <w:t>verdict Authentic score 0.780, 0.6 s, pdf 279 KB</w:t>
+              <w:t>verdict Authentic score 0.780, 6.7 s, pdf 318 KB</w:t>
             </w:r>
           </w:p>
         </w:tc>
@@ -14304,7 +14073,7 @@
                 <w:b w:val="0"/>
                 <w:sz w:val="18"/>
               </w:rPr>
-              <w:t>analyse Tp_D_NNN_S_N_ani10191_ani10200_124</w:t>
+              <w:t>analyse Tp_D_CRN_M_N_ani10105_ani00100_100</w:t>
             </w:r>
           </w:p>
         </w:tc>
@@ -14344,7 +14113,7 @@
                 <w:b w:val="0"/>
                 <w:sz w:val="18"/>
               </w:rPr>
-              <w:t>verdict Fake score 0.180, 1.2 s, pdf 494 KB</w:t>
+              <w:t>verdict Fake score 0.368, 7.0 s, pdf 265 KB</w:t>
             </w:r>
           </w:p>
         </w:tc>
@@ -14366,7 +14135,7 @@
                 <w:b w:val="0"/>
                 <w:sz w:val="18"/>
               </w:rPr>
-              <w:t>analyse Tp_D_NRN_S_B_ind00007_cha00040_004</w:t>
+              <w:t>analyse Tp_D_CRN_M_N_art10112_cha00086_116</w:t>
             </w:r>
           </w:p>
         </w:tc>
@@ -14406,7 +14175,7 @@
                 <w:b w:val="0"/>
                 <w:sz w:val="18"/>
               </w:rPr>
-              <w:t>verdict Fake score 0.282, 0.6 s, pdf 260 KB</w:t>
+              <w:t>verdict Fake score 0.183, 8.1 s, pdf 335 KB</w:t>
             </w:r>
           </w:p>
         </w:tc>
@@ -14428,7 +14197,7 @@
                 <w:b w:val="0"/>
                 <w:sz w:val="18"/>
               </w:rPr>
-              <w:t>analyse Tp_D_NRN_S_N_ani00060_ani00059_111</w:t>
+              <w:t>analyse Tp_D_NRN_S_N_art00051_art00010_010</w:t>
             </w:r>
           </w:p>
         </w:tc>
@@ -14468,7 +14237,7 @@
                 <w:b w:val="0"/>
                 <w:sz w:val="18"/>
               </w:rPr>
-              <w:t>verdict Fake score 0.185, 0.7 s, pdf 376 KB</w:t>
+              <w:t>verdict Fake score 0.180, 8.8 s, pdf 243 KB</w:t>
             </w:r>
           </w:p>
         </w:tc>
@@ -15086,7 +14855,7 @@
           <w:i w:val="0"/>
           <w:sz w:val="24"/>
         </w:rPr>
-        <w:t>The screenshots below come from the running application. The images used were taken from the held-out part of CASIA v2.0 and analysed with the hold-out detector, so the detector had never seen them.</w:t>
+        <w:t>The screenshots below come from the running application. The images were taken from the held out part of CASIA v2.0 and analysed with the hold-out detector, so the detector had never seen them.</w:t>
       </w:r>
     </w:p>
     <w:p>
@@ -15219,7 +14988,7 @@
           <w:i w:val="0"/>
           <w:sz w:val="24"/>
         </w:rPr>
-        <w:t>For a tampered image the report opens with the verdict: a gauge of the authenticity score, the manipulation type, the reasoning and the file hash (Figure 6.3). The agent breakdown that follows shows each agent's findings. The image forensics card places the original, the error-level map and the Grad-CAM attention map side by side and lists the trained detector's probability (Figure 6.4). The evidence chain re-verifies the file hash and the signature on every visit and lists the chain of custody (Figure 6.5).</w:t>
+        <w:t>For a tampered image the report opens with the verdict. It shows a gauge of the authenticity score, the manipulation type, the reasons and the file hash (Figure 6.3). The agent breakdown comes next and shows what each agent found. The image forensics card puts the original, the error level map and the Grad-CAM attention map side by side and gives the probability from the trained detector (Figure 6.4). The evidence chain checks the file hash and the signature again on every visit and lists the chain of custody (Figure 6.5).</w:t>
       </w:r>
     </w:p>
     <w:p>
@@ -15584,7 +15353,7 @@
           <w:i w:val="0"/>
           <w:sz w:val="24"/>
         </w:rPr>
-        <w:t>Each analysis can be downloaded as an evidence PDF containing the identification, verdict, findings, heatmaps, chain of custody and signature.</w:t>
+        <w:t>Each analysis can be downloaded as an evidence PDF with the identification, verdict, findings, heatmaps, chain of custody and signature.</w:t>
       </w:r>
     </w:p>
     <w:p>
@@ -15710,7 +15479,7 @@
           <w:i w:val="0"/>
           <w:sz w:val="24"/>
         </w:rPr>
-        <w:t>The datasets are CASIA v2.0 (1,536 authentic and 1,283 tampered images; all PNG in the copy used) and Columbia (183 authentic and 180 spliced images), both from the Hugging Face compilation ductai199x/image-manipulation-dataset-compilation [12]. Label 1 means manipulated. Accuracy, precision, recall, F1, ROC AUC and the equal error rate (EER) are reported; the confusion matrix is shown for each experiment.</w:t>
+        <w:t>The datasets are CASIA v2.0 (1,536 authentic and 1,283 tampered images, all PNG in the copy we used) and Columbia (183 authentic and 180 spliced images). Both come from the Hugging Face collection ductai199x/image-manipulation-dataset-compilation [12]. Label 1 means manipulated. We report accuracy, precision, recall, F1, ROC AUC and the equal error rate (EER). A confusion matrix is shown for each experiment.</w:t>
       </w:r>
     </w:p>
     <w:p>
@@ -16361,7 +16130,7 @@
           <w:i w:val="0"/>
           <w:sz w:val="24"/>
         </w:rPr>
-        <w:t>The two cross-validation protocols give almost the same accuracy (95.53% and 95.32%), so keeping each tampered image with its source did not change the result noticeably. This only controls for the source image named in the dataset metadata, not for every near-duplicate. The fold accuracies were 95.9, 95.4, 96.8, 94.2, 95.4 (random) and 94.0, 96.3, 95.4, 95.9, 95.0 (source-disjoint) percent.</w:t>
+        <w:t>The two cross-validation protocols give almost the same accuracy, 95.53% and 95.32%. Keeping each tampered image with its source did not change the result much. This only controls for the source named in the dataset metadata and not for every near duplicate. The fold accuracies were 95.9, 95.4, 96.8, 94.2 and 95.4 percent for the random split, and 94.0, 96.3, 95.4, 95.9 and 95.0 percent when sources were kept together.</w:t>
       </w:r>
     </w:p>
     <w:p>
@@ -16511,7 +16280,7 @@
           <w:i w:val="0"/>
           <w:sz w:val="24"/>
         </w:rPr>
-        <w:t>The real agents and decision engine were run on the 588 held-out images (301 authentic, 287 tampered). The engine decided 90.5% of them; on those it was right 97.9% of the time. The rest were sent to review. Counting Inconclusive as a miss, strict accuracy is 88.6%. If the engine were forced to choose by the 0.5 mark of its score it would reach 96.43% (AUC 0.9943).</w:t>
+        <w:t>The real agents and the decision engine ran on the 588 held out images (301 authentic and 287 tampered). The engine gave a verdict on 90.5% of them and was right on 97.9% of those. The rest went to review. If Inconclusive counts as a miss, the strict accuracy is 88.6%. If the engine had to choose using the 0.5 mark of its score, it would reach 96.43% (AUC 0.9943).</w:t>
       </w:r>
     </w:p>
     <w:p>
@@ -16816,7 +16585,7 @@
           <w:i w:val="0"/>
           <w:sz w:val="24"/>
         </w:rPr>
-        <w:t>Authentic images were called Fake in 2.7% of cases and tampered images were called Authentic in 1.0%. Most of the cost of the Inconclusive band falls on authentic images, because the metadata agent gives a PNG with no EXIF about 0.45 and pulls the fused score towards the middle.</w:t>
+        <w:t>Authentic images were called Fake in 2.7% of cases and tampered images were called Authentic in 1.0%. Most of the cost of the Inconclusive band falls on authentic images. The metadata agent gives a PNG with no EXIF about 0.45, which pulls the combined score towards the middle.</w:t>
       </w:r>
     </w:p>
     <w:p>
@@ -17783,7 +17552,7 @@
           <w:i w:val="0"/>
           <w:sz w:val="24"/>
         </w:rPr>
-        <w:t>Columbia consists of uncompressed photographs, so error-level analysis, which relies on a JPEG history, has little to work with, and 363 images are few for training a network on whole images. Three variants were tried, and all are listed above. The whole-image variants are far less stable than on CASIA (their folds differ by more than ten points). The patch-based variant labels 128-pixel patches from the ground-truth masks, scores an image by the mean of its top 5% patch probabilities and takes the decision threshold from the other folds. Because Columbia photographs share scenes, the last row repeats the experiment with every scene kept inside one fold (5 folds); it is the stricter figure.</w:t>
+        <w:t>Columbia has uncompressed photographs, so error level analysis, which depends on JPEG history, has little to work with. Also, 363 images are few for training a network on whole images. We tried three variants and all are listed above. The whole image variants are much less stable than on CASIA, and their folds differ by more than ten points. The patch based variant cuts the image into 128 pixel patches and labels them using the ground truth masks. It scores an image by the mean of its top 5% patch probabilities and takes the decision threshold from the other folds. Columbia photographs share scenes, so the last row repeats the test with every scene kept inside one fold. It is the stricter figure.</w:t>
       </w:r>
     </w:p>
     <w:p>
@@ -18342,7 +18111,7 @@
           <w:i w:val="0"/>
           <w:sz w:val="24"/>
         </w:rPr>
-        <w:t>The localiser finds the tampered region well on images that resemble its training data (pooled F1 0.89) but does not transfer to Columbia (pooled F1 0.43, 0.48 at the best possible threshold). Localisation across datasets is therefore a limitation of this work, and it is not used by the verdict.</w:t>
+        <w:t>The localiser finds the tampered region well on images like its training data (pooled F1 0.89) but does not carry over to Columbia (pooled F1 0.43, and 0.48 at the best possible threshold). Localisation across datasets is a limit of this work. The verdict does not use it.</w:t>
       </w:r>
     </w:p>
     <w:p>
@@ -18376,7 +18145,7 @@
           <w:i w:val="0"/>
           <w:sz w:val="24"/>
         </w:rPr>
-        <w:t>Only the base-paper results that the detector exceeds under a comparable metric on the same dataset are listed. The protocols differ (their splits, subsets and training data), so the table gives context and is not a leaderboard. The full comparison, including results the detector does not reach, is in the repository file docs/evaluation/EVALUATION.md.</w:t>
+        <w:t>Only the base paper results that our detector exceeds are listed, using a comparable metric on the same dataset. The protocols differ in splits, subsets and training data, so the table gives context and is not a ranking. The full comparison, including results we do not reach, is in the file docs/evaluation/EVALUATION.md in the repository.</w:t>
       </w:r>
     </w:p>
     <w:p>
@@ -18989,7 +18758,7 @@
           <w:i w:val="0"/>
           <w:sz w:val="24"/>
         </w:rPr>
-        <w:t>•  The ELA-based detector works well on CASIA v2.0, where most images are JPEG-derived, and poorly on the uncompressed Columbia images. The patch-based detector on noise residuals fixes this on Columbia, but it is a separate model; the deployed application uses the CASIA detector, and a real system will meet both kinds of image.</w:t>
+        <w:t>•  The ELA based detector works well on CASIA v2.0, where most images come from JPEG files, and poorly on uncompressed Columbia images. The patch based detector on noise residuals fixes this on Columbia but it is a separate model. The deployed application uses the CASIA detector, and a real system will meet both kinds of image.</w:t>
       </w:r>
     </w:p>
     <w:p>
@@ -19007,7 +18776,7 @@
           <w:i w:val="0"/>
           <w:sz w:val="24"/>
         </w:rPr>
-        <w:t>•  Columbia has only 363 images and its photographs share scenes. Keeping each scene in one fold lowers accuracy only slightly, but with so few images the fold-to-fold spread is still several points. The decision threshold of the patch-based detector is set from the other folds' out-of-fold scores; those scores come from models that saw the test fold, so the threshold-free AUC is the safer figure.</w:t>
+        <w:t>•  Columbia has only 363 images and its photographs share scenes. Keeping each scene in one fold lowers accuracy only a little, but with so few images the spread between folds is still several points. The threshold of the patch based detector comes from the other folds' out-of-fold scores, and those scores come from models that saw the test fold. The AUC does not depend on a threshold, so it is the safer figure.</w:t>
       </w:r>
     </w:p>
     <w:p>
@@ -19025,7 +18794,7 @@
           <w:i w:val="0"/>
           <w:sz w:val="24"/>
         </w:rPr>
-        <w:t>•  CASIA v2.0 is a benchmark with known quirks: tampered images derive from authentic ones in the same set, so even the source-disjoint split is only partly strict. The held-out test uses the same dataset family and is not evidence about unrelated images.</w:t>
+        <w:t>•  CASIA v2.0 has known quirks. Tampered images are made from authentic images in the same set, so even the split that keeps sources together is only partly strict. The held out test uses the same family of data and says little about unrelated images.</w:t>
       </w:r>
     </w:p>
     <w:p>
@@ -19043,7 +18812,7 @@
           <w:i w:val="0"/>
           <w:sz w:val="24"/>
         </w:rPr>
-        <w:t>•  The Inconclusive band costs coverage: about one image in ten is sent to review. It is the price of keeping wrong verdicts below about 3% for authentic images and about 1% for tampered images.</w:t>
+        <w:t>•  The Inconclusive band costs coverage, since about one image in ten goes to review. This is the price for keeping wrong verdicts at about 3% for authentic images and about 1% for tampered images.</w:t>
       </w:r>
     </w:p>
     <w:p>
@@ -19061,7 +18830,7 @@
           <w:i w:val="0"/>
           <w:sz w:val="24"/>
         </w:rPr>
-        <w:t>•  The localiser does not transfer across datasets, so heatmaps are supporting evidence only. The verdict does not depend on them.</w:t>
+        <w:t>•  The localiser does not carry over to other datasets, so heatmaps are only supporting evidence. The verdict does not depend on them.</w:t>
       </w:r>
     </w:p>
     <w:p>
@@ -19079,7 +18848,7 @@
           <w:i w:val="0"/>
           <w:sz w:val="24"/>
         </w:rPr>
-        <w:t>•  All detector figures are for splicing-style tampering in CASIA and Columbia. Fully AI-generated images, heavy re-compression and screenshots were not evaluated.</w:t>
+        <w:t>•  All figures are for splicing type tampering in CASIA and Columbia. Fully AI generated images, heavy recompression and screenshots were not tested.</w:t>
       </w:r>
     </w:p>
     <w:p>
@@ -19480,7 +19249,7 @@
           <w:i w:val="0"/>
           <w:sz w:val="24"/>
         </w:rPr>
-        <w:t>TrustSphere AI shows that image forensics and evidence integrity can be built as one system. A multi-agent pipeline analyses an uploaded image, a decision engine returns Authentic, Fake or Inconclusive with its reasoning, and every result is hashed, signed, recorded with a chain of custody and exported as an evidence PDF, all behind a web application and a REST API.</w:t>
+        <w:t>TrustSphere AI shows that image forensics and evidence integrity can be built as one system. A multi-agent pipeline analyses an uploaded image and a decision engine returns Authentic, Fake or Inconclusive with its reasons. Every result is hashed, signed, stored with a chain of custody and exported as an evidence PDF. A web application and a REST API sit on top.</w:t>
       </w:r>
     </w:p>
     <w:p>
@@ -19497,7 +19266,7 @@
           <w:i w:val="0"/>
           <w:sz w:val="24"/>
         </w:rPr>
-        <w:t>The trained detector reaches 95.53% accuracy on CASIA v2.0 by random 5-fold cross-validation and 95.32% when tampered images are kept with their sources, and 96.26% on 588 held-out images; the complete pipeline decides about 90% of them with 97.9% accuracy. These results exceed those reported by the base papers listed in Section 7.6 for CASIA v2.0 under the stated protocols. The work also shows its limits: a whole-image detector is weak on uncompressed Columbia images (a patch-based one reaches about 97%, on a very small dataset), and a localiser trained on CASIA does not transfer to Columbia.</w:t>
+        <w:t>The trained detector reaches 95.53% accuracy on CASIA v2.0 with random 5-fold cross-validation and 95.32% when tampered images stay with their sources. On 588 held out images it reaches 96.26%, and the full pipeline gives a verdict on about 90% of them with 97.9% accuracy. These results are higher than those the base papers in Section 7.6 report for CASIA v2.0 under the protocols stated. The work has limits too. A whole image detector is weak on uncompressed Columbia images. A patch based one reaches about 97% on a very small dataset. A localiser trained on CASIA does not carry over to Columbia.</w:t>
       </w:r>
     </w:p>
     <w:p>
@@ -19532,7 +19301,7 @@
           <w:i w:val="0"/>
           <w:sz w:val="24"/>
         </w:rPr>
-        <w:t>•  Merge the CASIA and Columbia detectors into one model that handles both compressed and uncompressed images, and test it on larger uncompressed sets.</w:t>
+        <w:t>•  Merge the CASIA and Columbia detectors into one model that handles compressed and uncompressed images, and test it on larger uncompressed sets.</w:t>
       </w:r>
     </w:p>
     <w:p>
@@ -19550,7 +19319,7 @@
           <w:i w:val="0"/>
           <w:sz w:val="24"/>
         </w:rPr>
-        <w:t>•  Evaluate on JPEG-compressed web images and on other benchmarks to measure transfer, and add a calibrated out-of-distribution warning.</w:t>
+        <w:t>•  Test on JPEG compressed web images and other benchmarks to measure transfer, and add a warning for images that look unlike the training data.</w:t>
       </w:r>
     </w:p>
     <w:p>
@@ -19568,7 +19337,7 @@
           <w:i w:val="0"/>
           <w:sz w:val="24"/>
         </w:rPr>
-        <w:t>•  Improve localisation across datasets so that the heatmap can support the verdict.</w:t>
+        <w:t>•  Improve localisation across datasets so the heatmap can support the verdict.</w:t>
       </w:r>
     </w:p>
     <w:p>
@@ -19586,7 +19355,7 @@
           <w:i w:val="0"/>
           <w:sz w:val="24"/>
         </w:rPr>
-        <w:t>•  Re-balance the metadata agent so that EXIF-free images are not pushed towards Inconclusive, and calibrate the verdict thresholds on held-out data.</w:t>
+        <w:t>•  Rebalance the metadata agent so images without EXIF are not pushed to Inconclusive, and tune the verdict thresholds on held out data.</w:t>
       </w:r>
     </w:p>
     <w:p>

</xml_diff>

<commit_message>
Cross-check report claims against the reference papers; fix SD35 pairing, Huh and MVSS descriptions, state CASIA subset; add reference check record
Co-Authored-By: Claude Sonnet 5.5 <noreply@anthropic.com>
</commit_message>
<xml_diff>
--- a/docs/report/TrustSphere_AI_Project_Report.docx
+++ b/docs/report/TrustSphere_AI_Project_Report.docx
@@ -8449,7 +8449,7 @@
           <w:i w:val="0"/>
           <w:sz w:val="24"/>
         </w:rPr>
-        <w:t>The image forensics agent uses a detector we trained. It is an EfficientNet-B0 network that reads error level analysis maps made at three JPEG qualities, using crops at the original resolution. We trained and tested it on CASIA v2.0 (1,536 authentic and 1,283 tampered images) and Columbia (183 authentic and 180 spliced images). With 5-fold cross-validation on CASIA v2.0 the accuracy is 95.53% with a random split and 95.32% when each tampered image stays in the same fold as its source. On 588 images that were never used in training it reaches 96.26% and the full pipeline gives a verdict on 90.5% of them with 97.9% accuracy. The rest go to a person. Columbia is harder because its photos are uncompressed. A whole image detector reaches only 87.60%, while a patch based detector on noise residuals reaches 97.25% with a random split and 96.97% when every scene stays in one fold. A model that outlines the tampered area, trained on CASIA, does not work well on Columbia (pixel F1 0.43). We compare the results with the five base papers and state this weakness.</w:t>
+        <w:t>The image forensics agent uses a detector we trained. It is an EfficientNet-B0 network that reads error level analysis maps made at three JPEG qualities, using crops at the original resolution. We trained and tested it on a subset of CASIA v2.0 (1,536 authentic and 1,283 tampered images) and on Columbia (183 authentic and 180 spliced images). With 5-fold cross-validation on CASIA v2.0 the accuracy is 95.53% with a random split and 95.32% when each tampered image stays in the same fold as its source. On 588 images that were never used in training it reaches 96.26% and the full pipeline gives a verdict on 90.5% of them with 97.9% accuracy. The rest go to a person. Columbia is harder because its photos are uncompressed. A whole image detector reaches only 87.60%, while a patch based detector on noise residuals reaches 97.25% with a random split and 96.97% when every scene stays in one fold. A model that outlines the tampered area, trained on CASIA, does not work well on Columbia (pixel F1 0.43). We compare the results with the five base papers and state this weakness.</w:t>
       </w:r>
     </w:p>
     <w:p>
@@ -8966,7 +8966,7 @@
           <w:i w:val="0"/>
           <w:sz w:val="24"/>
         </w:rPr>
-        <w:t>Deep networks learn these traces from data. Bayar and Stamm constrain the first layer so it ignores image content and learns prediction error filters [26]. Zhou et al. use an RGB stream and a noise stream in a Faster R-CNN [27]. Huh et al. train on real photos with EXIF data to predict whether two patches come from the same image, without any forged examples [28]. BusterNet separates the source and target regions of copy-move forgery [29]. ManTra-Net learns many manipulation types and treats localisation as finding anomalies [30]. RRU-Net adds residual feedback to a U-Net [31]. PSCC-Net predicts masks step by step at several scales [32]. MVSS-Net supervises edge, noise and image level outputs together [33]. CAT-Net learns from JPEG DCT coefficients and pixels [34]. ObjectFormer uses RGB and high frequency features in a transformer [35]. TruFor adds a learned noise fingerprint and a reliability map [36]. Most of these papers are judged on how well they locate the tampered pixels. Our detector answers the image level question of authentic or tampered. The base papers [1] to [4] answer the same question.</w:t>
+        <w:t>Deep networks learn these traces from data. Bayar and Stamm add a constrained first layer that suppresses image content and learns features for manipulation detection [26]. Zhou et al. use an RGB stream and a noise stream in a Faster R-CNN [27]. Huh et al. train only on real photos and use their EXIF data to learn whether an image is self consistent, meaning that it could come from one imaging pipeline. They then use this to find splices without ever seeing forged examples [28]. BusterNet separates the source and target regions of copy-move forgery [29]. ManTra-Net learns many manipulation types and treats localisation as finding anomalies [30]. RRU-Net adds residual feedback to a U-Net [31]. PSCC-Net predicts masks step by step at several scales [32]. MVSS-Net learns from the noise view and from boundary artifacts, and is supervised at several scales [33]. CAT-Net learns from JPEG DCT coefficients and pixels [34]. ObjectFormer uses RGB and high frequency features in a transformer [35]. TruFor adds a learned noise fingerprint and a reliability map [36]. Most of these papers are judged on how well they locate the tampered pixels. Our detector answers the image level question of authentic or tampered. The base papers [1] to [4] answer the same question.</w:t>
       </w:r>
     </w:p>
     <w:p>
@@ -9034,7 +9034,7 @@
           <w:i w:val="0"/>
           <w:sz w:val="24"/>
         </w:rPr>
-        <w:t>Ranjan et al. combine a local texture pattern descriptor (a variant of the centre symmetric local binary pattern) with ResNet-50 features and classify with an SVM. They test on the Columbia splicing dataset, CASIA v2.0 and a part of the Dresden image database using stratified 5-fold cross-validation. Their average accuracy is 95.20%. Their review table lists older Columbia results between about 91% and 93.4%.</w:t>
+        <w:t>Ranjan et al. extract texture maps with the Local Optimal Oriented Pattern (LOOP), refine them with a pretrained ResNet-50 and classify with an SVM. They test on the Columbia splicing dataset, CASIA v2.0 and a part of the Dresden image database using stratified 5-fold cross-validation. Their average accuracy is 95.20%. Their review table lists earlier methods that use Columbia, with accuracies between about 91% and 93.4%.</w:t>
       </w:r>
     </w:p>
     <w:p>
@@ -9068,7 +9068,7 @@
           <w:i w:val="0"/>
           <w:sz w:val="24"/>
         </w:rPr>
-        <w:t>Ravula and Singh detect and classify copy-move forgery using generative adversarial networks, a vision transformer and spectral clustering together. They report accuracy of 98.95% on CoMoFoD, 95.2% on MICC-F220 and 94.4% on CASIA v2.</w:t>
+        <w:t>Ravula and Singh detect and classify copy-move forgery using generative adversarial networks, a vision transformer and spectral clustering together. In their Table 4 they report accuracy of 98.95% on CoMoFoD, 95.2% on MICC-F220 and 94.4% on CASIA v2. Their abstract gives 99.02% accuracy for CoMoFoD.</w:t>
       </w:r>
     </w:p>
     <w:p>
@@ -9102,7 +9102,7 @@
           <w:i w:val="0"/>
           <w:sz w:val="24"/>
         </w:rPr>
-        <w:t>Rehman and Jain take patch features from a pretrained CNN, fuse them and classify with an SVM. On CASIA v2.0 they report 93.57% accuracy without augmentation and 98.91% with augmentation. Their table also gives the mean and standard deviation over runs, which is 93.39% ± 8.75 for the 98.91% setting.</w:t>
+        <w:t>Rehman and Jain take patch features from a pretrained CNN, fuse them and classify with an SVM. On CASIA v2.0 they report 93.57% accuracy without augmentation and 98.91% with augmentation. Their Table 3 uses 10-fold cross-validation. For batch size 128 it gives accuracy 98.91%, mean 93.39% and standard deviation 8.75%. For batch size 200 it gives accuracy 93.57%, mean 90.25% and standard deviation 7.98%.</w:t>
       </w:r>
     </w:p>
     <w:p>
@@ -9170,7 +9170,7 @@
           <w:i w:val="0"/>
           <w:sz w:val="24"/>
         </w:rPr>
-        <w:t>Chen et al. take features from a frozen EfficientNet-B4 and train XGBoost models at several levels for the splicing mask. A second version also predicts the mask boundary. No backpropagation is needed. Following [6], they train on CASIA v2.0 and test on CASIA v1.0 and Columbia. They report pixel F1 of 0.5728 (0.6210 with edges) on CASIA v1.0 and 0.6497 (0.6558) on Columbia, with 18.4 million parameters.</w:t>
+        <w:t>Chen et al. take features from a pretrained EfficientNet-B4 and train XGBoost models at several levels for the splicing mask. A second version also predicts the mask boundary. No backpropagation is needed. Following [6], they train on CASIA v2.0 and test on CASIA v1.0 and Columbia. They report pixel F1 of 0.5728 (0.6210 with edges) on CASIA v1.0 and 0.6497 (0.6558) on Columbia, with 18.4 million parameters for GIFT.</w:t>
       </w:r>
     </w:p>
     <w:p>
@@ -9572,7 +9572,7 @@
                 <w:b w:val="0"/>
                 <w:sz w:val="18"/>
               </w:rPr>
-              <w:t>CASIA v2.0 (and others)</w:t>
+              <w:t>CASIA v2.0</w:t>
             </w:r>
           </w:p>
         </w:tc>
@@ -9674,7 +9674,7 @@
                 <w:b w:val="0"/>
                 <w:sz w:val="18"/>
               </w:rPr>
-              <w:t>CASIA v2.0, CoMoFoD, MICC-F220</w:t>
+              <w:t>CASIA v2.0, CoMoFoD, MICC-F220, CMFD</w:t>
             </w:r>
           </w:p>
         </w:tc>
@@ -10759,14 +10759,6 @@
     </w:tbl>
     <w:p>
       <w:pPr>
-        <w:keepNext w:val="0"/>
-        <w:pageBreakBefore w:val="0"/>
-        <w:spacing w:before="0" w:after="120" w:line="240" w:lineRule="auto"/>
-        <w:jc w:val="both"/>
-      </w:pPr>
-    </w:p>
-    <w:p>
-      <w:pPr>
         <w:keepNext/>
         <w:pageBreakBefore/>
         <w:spacing w:before="0" w:after="160" w:line="276" w:lineRule="auto"/>
@@ -12122,14 +12114,6 @@
         </w:tc>
       </w:tr>
     </w:tbl>
-    <w:p>
-      <w:pPr>
-        <w:keepNext w:val="0"/>
-        <w:pageBreakBefore w:val="0"/>
-        <w:spacing w:before="0" w:after="120" w:line="240" w:lineRule="auto"/>
-        <w:jc w:val="both"/>
-      </w:pPr>
-    </w:p>
     <w:p>
       <w:pPr>
         <w:keepNext/>
@@ -14801,14 +14785,6 @@
     </w:tbl>
     <w:p>
       <w:pPr>
-        <w:keepNext w:val="0"/>
-        <w:pageBreakBefore w:val="0"/>
-        <w:spacing w:before="0" w:after="120" w:line="240" w:lineRule="auto"/>
-        <w:jc w:val="both"/>
-      </w:pPr>
-    </w:p>
-    <w:p>
-      <w:pPr>
         <w:keepNext/>
         <w:pageBreakBefore/>
         <w:spacing w:before="0" w:after="160" w:line="276" w:lineRule="auto"/>
@@ -15479,7 +15455,7 @@
           <w:i w:val="0"/>
           <w:sz w:val="24"/>
         </w:rPr>
-        <w:t>The datasets are CASIA v2.0 (1,536 authentic and 1,283 tampered images, all PNG in the copy we used) and Columbia (183 authentic and 180 spliced images). Both come from the Hugging Face collection ductai199x/image-manipulation-dataset-compilation [12]. Label 1 means manipulated. We report accuracy, precision, recall, F1, ROC AUC and the equal error rate (EER). A confusion matrix is shown for each experiment.</w:t>
+        <w:t>The datasets are a subset of CASIA v2.0 and the Columbia set. Our copy of CASIA v2.0 has 1,536 authentic and 1,283 tampered images, all PNG. The full dataset has 7,491 authentic and 5,123 tampered images, so our results are not on the full set. Columbia has 183 authentic and 180 spliced images. Both come from the Hugging Face collection ductai199x/image-manipulation-dataset-compilation [12]. Label 1 means manipulated. We report accuracy, precision, recall, F1, ROC AUC and the equal error rate (EER). A confusion matrix is shown for each experiment.</w:t>
       </w:r>
     </w:p>
     <w:p>
@@ -18145,7 +18121,7 @@
           <w:i w:val="0"/>
           <w:sz w:val="24"/>
         </w:rPr>
-        <w:t>Only the base paper results that our detector exceeds are listed, using a comparable metric on the same dataset. The protocols differ in splits, subsets and training data, so the table gives context and is not a ranking. The full comparison, including results we do not reach, is in the file docs/evaluation/EVALUATION.md in the repository.</w:t>
+        <w:t>Only the base paper results that our detector exceeds are listed, using a comparable metric on the same dataset. The protocols differ in splits, subsets and training data. For example, some papers use the full CASIA v2.0 and we use a subset of it. So the table gives context and is not a ranking. The full comparison, including results we do not reach, is in the file docs/evaluation/EVALUATION.md in the repository.</w:t>
       </w:r>
     </w:p>
     <w:p>
@@ -18383,7 +18359,7 @@
                 <w:b w:val="0"/>
                 <w:sz w:val="18"/>
               </w:rPr>
-              <w:t>Accuracy</w:t>
+              <w:t>Mean accuracy over folds</w:t>
             </w:r>
           </w:p>
         </w:tc>
@@ -18403,7 +18379,7 @@
                 <w:b w:val="0"/>
                 <w:sz w:val="18"/>
               </w:rPr>
-              <w:t>93.57% (mean over runs 93.39%)</w:t>
+              <w:t>93.39% (best single figure 98.91%)</w:t>
             </w:r>
           </w:p>
         </w:tc>
@@ -19193,14 +19169,6 @@
         </w:tc>
       </w:tr>
     </w:tbl>
-    <w:p>
-      <w:pPr>
-        <w:keepNext w:val="0"/>
-        <w:pageBreakBefore w:val="0"/>
-        <w:spacing w:before="0" w:after="120" w:line="240" w:lineRule="auto"/>
-        <w:jc w:val="both"/>
-      </w:pPr>
-    </w:p>
     <w:p>
       <w:pPr>
         <w:keepNext/>

</xml_diff>

<commit_message>
Report: merge short sentences, fewer commas, references numbered by first citation with range style, citation checker
Co-Authored-By: Claude Sonnet 5.5 <noreply@anthropic.com>
</commit_message>
<xml_diff>
--- a/docs/report/TrustSphere_AI_Project_Report.docx
+++ b/docs/report/TrustSphere_AI_Project_Report.docx
@@ -2401,7 +2401,7 @@
           <w:szCs w:val="24"/>
           <w:lang w:val="en-IN" w:eastAsia="en-IN"/>
         </w:rPr>
-        <w:t>We thank Vellore Institute of Technology (VIT) for giving us the chance and the resources to carry out this project. The facilities and support at VIT helped us build and test our ideas.</w:t>
+        <w:t>We thank Vellore Institute of Technology (VIT) for giving us the chance and the resources to carry out this project and the facilities and support at VIT helped us build and test our ideas.</w:t>
       </w:r>
     </w:p>
     <w:p>
@@ -2439,7 +2439,7 @@
           <w:szCs w:val="24"/>
           <w:lang w:val="en-IN" w:eastAsia="en-IN"/>
         </w:rPr>
-        <w:t>We sincerely thank Dr. Jaisankar N, Dean of the School of Computer Science and Engineering (SCOPE), for the support and encouragement given to the students of the school. It motivated us to do our best work.</w:t>
+        <w:t>We sincerely thank Dr. Jaisankar N, Dean of the School of Computer Science and Engineering (SCOPE), for the support and encouragement given to the students of the school which motivated us to do our best work.</w:t>
       </w:r>
     </w:p>
     <w:p>
@@ -2477,7 +2477,7 @@
           <w:szCs w:val="24"/>
           <w:lang w:val="en-IN" w:eastAsia="en-IN"/>
         </w:rPr>
-        <w:t>We thank Dr. Rajeshkannan R, Head of the Department, for guidance and support during this project. The advice and feedback we received helped us shape the work and solve problems along the way.</w:t>
+        <w:t>We thank Dr. Rajeshkannan R, Head of the Department, for guidance and support during this project and the advice and feedback we received helped us shape the work and solve problems along the way.</w:t>
       </w:r>
     </w:p>
     <w:p>
@@ -2515,7 +2515,7 @@
           <w:szCs w:val="24"/>
           <w:lang w:val="en-IN" w:eastAsia="en-IN"/>
         </w:rPr>
-        <w:t>We are very thankful to our project guide, Manikandan G, Assistant Professor Sr. Grade 2, for regular guidance and useful feedback. The time given in our reviews helped us improve our methods and finish this work.</w:t>
+        <w:t>We are very thankful to our project guide, Manikandan G, Assistant Professor Sr. Grade 2, for regular guidance and useful feedback and the time given in our reviews helped us improve our methods and finish this work.</w:t>
       </w:r>
     </w:p>
     <w:p>
@@ -8432,7 +8432,7 @@
           <w:i w:val="0"/>
           <w:sz w:val="24"/>
         </w:rPr>
-        <w:t>Photographs are used as evidence in news, insurance, banking and courts. Editing tools make it easy to paste part of one image into another. Deciding whether an image was changed is one problem. Proving later that the decision was not altered is another. This project builds TrustSphere AI, a system for still images that handles both. Three agents look at each uploaded image. A metadata agent reads the EXIF data. An image forensics agent studies the pixels. A provenance agent checks content credentials and invisible watermarks. A decision engine combines their scores into a verdict of Authentic, Fake or Inconclusive. Each result is hashed with SHA-256, signed with Ed25519, stored with a chain of custody, anchored on a test blockchain if a wallet is set, and saved as an evidence PDF. A web application shows the whole process.</w:t>
+        <w:t>Photographs are used as evidence in news, insurance, banking and courts and editing tools make it easy to paste part of one image into another. Deciding whether an image was changed is one problem and proving later that the decision was not altered is another, so this project builds TrustSphere AI, a system for still images that handles both. Three agents look at each uploaded image, where a metadata agent reads the EXIF data and an image forensics agent studies the pixels and a provenance agent checks content credentials and invisible watermarks. A decision engine combines their scores into a verdict of Authentic, Fake or Inconclusive. Each result is hashed with SHA-256 and signed with Ed25519 and stored with a chain of custody, and it can be anchored on a test blockchain and saved as an evidence PDF while a web application shows the whole process.</w:t>
       </w:r>
     </w:p>
     <w:p>
@@ -8449,7 +8449,7 @@
           <w:i w:val="0"/>
           <w:sz w:val="24"/>
         </w:rPr>
-        <w:t>The image forensics agent uses a detector we trained. It is an EfficientNet-B0 network that reads error level analysis maps made at three JPEG qualities, using crops at the original resolution. We trained and tested it on a subset of CASIA v2.0 (1,536 authentic and 1,283 tampered images) and on Columbia (183 authentic and 180 spliced images). With 5-fold cross-validation on CASIA v2.0 the accuracy is 95.53% with a random split and 95.32% when each tampered image stays in the same fold as its source. On 588 images that were never used in training it reaches 96.26% and the full pipeline gives a verdict on 90.5% of them with 97.9% accuracy. The rest go to a person. Columbia is harder because its photos are uncompressed. A whole image detector reaches only 87.60%, while a patch based detector on noise residuals reaches 97.25% with a random split and 96.97% when every scene stays in one fold. A model that outlines the tampered area, trained on CASIA, does not work well on Columbia (pixel F1 0.43). We compare the results with the five base papers and state this weakness.</w:t>
+        <w:t>The image forensics agent uses a detector that we trained, which is an EfficientNet-B0 network that reads error level analysis maps made at three JPEG qualities from crops at the original resolution. We trained and tested it on a subset of CASIA v2.0 (1,536 authentic and 1,283 tampered images) and on Columbia (183 authentic and 180 spliced images). With 5-fold cross-validation on CASIA v2.0 the accuracy is 95.53% with a random split and 95.32% when each tampered image stays in the same fold as its source, and on 588 images that were never used in training it reaches 96.26% while the full pipeline gives a verdict on 90.5% of them with 97.9% accuracy and sends the rest to a person. Columbia is harder because its photos are uncompressed, so a whole image detector reaches only 87.60% while a patch based detector on noise residuals reaches 97.25% with a random split and 96.97% when every scene stays in one fold. A model that outlines the tampered area and was trained on CASIA does not work well on Columbia (pixel F1 0.43) and we compare all results with the five base papers and state this weakness.</w:t>
       </w:r>
     </w:p>
     <w:p>
@@ -8563,7 +8563,7 @@
           <w:i w:val="0"/>
           <w:sz w:val="24"/>
         </w:rPr>
-        <w:t>Photographs are accepted as evidence in newsrooms, insurance claims, banks and courts. The same tools that fix a holiday photo can move an object into a scene, remove a person or paste a face onto another body. The result often looks real to the eye. Image forensics asks whether an image is authentic. Passive methods use only the image. They look for traces that editing leaves behind, such as different noise, colour patterns or JPEG compression history between the pasted part and the rest of the picture.</w:t>
+        <w:t>Photographs are accepted as evidence in newsrooms, insurance claims, banks and courts, yet the same tools that fix a holiday photo can move an object into a scene or remove a person or paste a face onto another body and the result often looks real to the eye. Image forensics asks whether an image is authentic and passive methods answer this using only the image, by looking for traces that editing leaves behind such as different noise or colour patterns or JPEG compression history between the pasted part and the rest of the picture.</w:t>
       </w:r>
     </w:p>
     <w:p>
@@ -8580,7 +8580,7 @@
           <w:i w:val="0"/>
           <w:sz w:val="24"/>
         </w:rPr>
-        <w:t>A second question matters just as much. After an image is analysed, can anyone prove which file was checked, what the verdict was and that the record was not changed? A detector that only prints a score cannot answer this. So we built the analysis and the evidence record as one system. Each run gives a verdict, the evidence behind it such as scores, heatmaps and reasons, and a record that anyone can check with cryptography.</w:t>
+        <w:t>A second question matters just as much, which is whether anyone can prove after an analysis which file was checked and what the verdict was and that the record was not changed. A detector that only prints a score cannot answer this, so we built the analysis and the evidence record as one system where each run gives a verdict and the evidence behind it, such as scores and heatmaps and reasons, and a record that anyone can check with cryptography.</w:t>
       </w:r>
     </w:p>
     <w:p>
@@ -8615,7 +8615,7 @@
           <w:i w:val="0"/>
           <w:sz w:val="24"/>
         </w:rPr>
-        <w:t>•  Published splicing detectors report accuracies above 90% on CASIA v2.0 and Columbia, but most are research code. They give a label for one dataset and stop. An analyst needs an application that takes any image and explains its answer.</w:t>
+        <w:t>•  Published detectors report accuracies above 90% on CASIA v2.0 and Columbia [1-3] but most are research code that gives a label for one dataset and stops, while an analyst needs an application that takes any image and explains its answer.</w:t>
       </w:r>
     </w:p>
     <w:p>
@@ -8633,7 +8633,7 @@
           <w:i w:val="0"/>
           <w:sz w:val="24"/>
         </w:rPr>
-        <w:t>•  A wrong automatic verdict can blame an innocent photographer or clear a fake. The system should be able to say Inconclusive and pass the image to a person.</w:t>
+        <w:t>•  A wrong automatic verdict can blame an innocent photographer or clear a fake, so the system should be able to say Inconclusive and pass the image to a person.</w:t>
       </w:r>
     </w:p>
     <w:p>
@@ -8651,7 +8651,7 @@
           <w:i w:val="0"/>
           <w:sz w:val="24"/>
         </w:rPr>
-        <w:t>•  Evidence must hold up when it is questioned. A SHA-256 hash of the exact file, a digital signature on the record and an optional public timestamp let a third party check that nothing changed after the analysis.</w:t>
+        <w:t>•  Evidence must hold up when it is questioned, and a SHA-256 hash of the exact file together with a digital signature on the record and an optional public timestamp lets a third party check that nothing changed after the analysis.</w:t>
       </w:r>
     </w:p>
     <w:p>
@@ -8669,7 +8669,7 @@
           <w:i w:val="0"/>
           <w:sz w:val="24"/>
         </w:rPr>
-        <w:t>•  No single signal can be trusted alone. Metadata is easy to remove, recompression hides ELA traces and most images carry no provenance data. Several agents cover for each other.</w:t>
+        <w:t>•  No single signal can be trusted alone because metadata is easy to remove and recompression hides ELA traces and most images carry no provenance data, so several agents are used to cover for each other.</w:t>
       </w:r>
     </w:p>
     <w:p>
@@ -8703,7 +8703,7 @@
           <w:i w:val="0"/>
           <w:sz w:val="24"/>
         </w:rPr>
-        <w:t>TrustSphere AI analyses still images only. Earlier versions of the project also handled audio and documents. We removed both, and none of their code, data or results appear in this report.</w:t>
+        <w:t>TrustSphere AI analyses still images only, and earlier versions of the project also handled audio and documents but we removed both, so none of their code or data or results appear in this report.</w:t>
       </w:r>
     </w:p>
     <w:p>
@@ -8775,7 +8775,7 @@
           <w:i w:val="0"/>
           <w:sz w:val="24"/>
         </w:rPr>
-        <w:t xml:space="preserve"> CASIA v2.0 and Columbia, the two image datasets used by the base papers.</w:t>
+        <w:t xml:space="preserve"> CASIA v2.0 and Columbia, which are the two image datasets used by the base papers [1-5].</w:t>
       </w:r>
     </w:p>
     <w:p>
@@ -8811,7 +8811,7 @@
           <w:i w:val="0"/>
           <w:sz w:val="24"/>
         </w:rPr>
-        <w:t xml:space="preserve"> detection accuracy by cross-validation, a test of the full pipeline on held out images and a localisation experiment.</w:t>
+        <w:t xml:space="preserve"> detection accuracy by cross-validation and a test of the full pipeline on held out images and a localisation experiment.</w:t>
       </w:r>
     </w:p>
     <w:p>
@@ -8847,7 +8847,7 @@
           <w:i w:val="0"/>
           <w:sz w:val="24"/>
         </w:rPr>
-        <w:t xml:space="preserve"> video, audio, document forensics, training on fully AI generated images and any legal judgement. The score is meant to support a decision, not replace it.</w:t>
+        <w:t xml:space="preserve"> video, audio, document forensics, training on fully AI generated images and any legal judgement, because the score is meant to support a decision and not replace it.</w:t>
       </w:r>
     </w:p>
     <w:p>
@@ -8915,7 +8915,7 @@
           <w:i w:val="0"/>
           <w:sz w:val="24"/>
         </w:rPr>
-        <w:t>Image forgery has three common kinds. In splicing, a part of one image is pasted into another. In copy-move, a part is copied within the same image. In removal, an object is erased and the gap is filled [5]. Classic detectors look for mismatches in noise, in colour filter patterns, in lighting and in double JPEG compression, because a pasted part keeps the statistics of its source image [5]. Error level analysis (ELA) was described for forensic use by Krawetz [10]. It saves an image again as JPEG at a known quality and shows the difference, so parts with a different compression history stand out.</w:t>
+        <w:t>Image forgery has three common kinds, which are splicing where a part of one image is pasted into another and copy-move where a part is copied within the same image and removal where an object is erased and the gap is filled [5]. Classic detectors look for mismatches in noise or colour filter patterns or lighting or double JPEG compression because a pasted part keeps the statistics of its source image [5]. Error level analysis (ELA) was described for forensic use by Krawetz [6] and it saves an image again as JPEG at a known quality and shows the difference, so parts with a different compression history stand out.</w:t>
       </w:r>
     </w:p>
     <w:p>
@@ -8932,7 +8932,7 @@
           <w:i w:val="0"/>
           <w:sz w:val="24"/>
         </w:rPr>
-        <w:t>Deep learning has replaced hand made features in most recent work. Salloum et al. [6] trained a fully convolutional network on CASIA v2.0 to predict both the spliced region and its boundary. They tested it on CASIA v1.0, Columbia and other sets. Training on CASIA and testing elsewhere was later used by [5].</w:t>
+        <w:t>Deep learning has replaced hand made features in most recent work, and Salloum et al. [7] trained a fully convolutional network on CASIA v2.0 to predict both the spliced region and its boundary and tested it on CASIA v1.0 and Columbia and other sets, a way of training on CASIA and testing elsewhere that was later used by [5].</w:t>
       </w:r>
     </w:p>
     <w:p>
@@ -8949,7 +8949,7 @@
           <w:i w:val="0"/>
           <w:sz w:val="24"/>
         </w:rPr>
-        <w:t>Early passive methods use traces left by the camera and the editing steps. Scaling or rotating leaves repeating patterns between neighbouring pixels [15]. Camera colour interpolation leaves patterns that a pasted part tends to lack [16]. Sensor noise works like a fingerprint of the camera, and a region without it may be tampered [17]. Mahdian and Saic look for regions with a different noise level [18]. For JPEG images, JPEG ghosts show a region first saved at another quality [19], and Bianchi and Piva estimate the chance of tampering for each 8 × 8 block [20]. Copy-move forgery was first found by matching blocks [21]. SIFT keypoints can also give the transformation of the copied region [22], and Christlein et al. compared fifteen feature sets in one pipeline [23]. Splicebuster models noise residuals and splits the image into real and spliced parts without any forged training examples [24]. The filters of the rich models by Fridrich and Kodovský were made for steganalysis [25]. We use them as the SRM input for Columbia.</w:t>
+        <w:t>Early passive methods use traces left by the camera and the editing steps, so scaling or rotating leaves repeating patterns between neighbouring pixels [8] and camera colour interpolation leaves patterns that a pasted part tends to lack [9], while sensor noise works like a fingerprint of the camera and a region without it may be tampered [10]. Mahdian and Saic look for regions with a different noise level [11]. For JPEG images, JPEG ghosts show a region first saved at another quality [12] and Bianchi and Piva estimate the chance of tampering for each 8 × 8 block [13]. Copy-move forgery was first found by matching blocks [14], SIFT keypoints can also give the transformation of the copied region [15] and Christlein et al. compared fifteen feature sets in one pipeline [16]. Splicebuster models noise residuals and splits the image into real and spliced parts without any forged training examples [17], and the filters of the rich models by Fridrich and Kodovský were made for steganalysis [18] and we use them as the SRM input for Columbia.</w:t>
       </w:r>
     </w:p>
     <w:p>
@@ -8966,7 +8966,7 @@
           <w:i w:val="0"/>
           <w:sz w:val="24"/>
         </w:rPr>
-        <w:t>Deep networks learn these traces from data. Bayar and Stamm add a constrained first layer that suppresses image content and learns features for manipulation detection [26]. Zhou et al. use an RGB stream and a noise stream in a Faster R-CNN [27]. Huh et al. train only on real photos and use their EXIF data to learn whether an image is self consistent, meaning that it could come from one imaging pipeline. They then use this to find splices without ever seeing forged examples [28]. BusterNet separates the source and target regions of copy-move forgery [29]. ManTra-Net learns many manipulation types and treats localisation as finding anomalies [30]. RRU-Net adds residual feedback to a U-Net [31]. PSCC-Net predicts masks step by step at several scales [32]. MVSS-Net learns from the noise view and from boundary artifacts, and is supervised at several scales [33]. CAT-Net learns from JPEG DCT coefficients and pixels [34]. ObjectFormer uses RGB and high frequency features in a transformer [35]. TruFor adds a learned noise fingerprint and a reliability map [36]. Most of these papers are judged on how well they locate the tampered pixels. Our detector answers the image level question of authentic or tampered. The base papers [1] to [4] answer the same question.</w:t>
+        <w:t>Deep networks learn these traces from data, and Bayar and Stamm add a constrained first layer that suppresses image content and learns features for manipulation detection [19] and Zhou et al. use an RGB stream and a noise stream in a Faster R-CNN [20]. Huh et al. train only on real photos and use their EXIF data to learn whether an image is self consistent, meaning that it could come from one imaging pipeline, and then use this to find splices without ever seeing forged examples [21]. BusterNet separates the source and target regions of copy-move forgery [22] and ManTra-Net learns many manipulation types and treats localisation as finding anomalies [23], while RRU-Net adds residual feedback to a U-Net [24] and PSCC-Net predicts masks step by step at several scales [25]. MVSS-Net learns from the noise view and from boundary artifacts and is supervised at several scales [26], CAT-Net learns from JPEG DCT coefficients and pixels [27], ObjectFormer uses RGB and high frequency features in a transformer [28] and TruFor adds a learned noise fingerprint and a reliability map [29]. Most of these papers are judged on how well they locate the tampered pixels but our detector answers the image level question of authentic or tampered, which is the same question that the base papers [1-4] answer.</w:t>
       </w:r>
     </w:p>
     <w:p>
@@ -8983,7 +8983,7 @@
           <w:i w:val="0"/>
           <w:sz w:val="24"/>
         </w:rPr>
-        <w:t>Surveys are given in [37] to [40]. Verdoliva covers media forensics and deepfakes [37]. Qureshi and Deriche list pixel based blind methods [38]. Stamm et al. describe the first ten years of information forensics [39]. Warif et al. review copy-move detection [40]. Muhammad et al. tell authentic from tampered images using a steerable pyramid transform and local binary patterns on the colour channels [41]. Besides CASIA [7] and the Columbia splicing set [8], other datasets in this field are the Columbia set of authentic and spliced blocks [42], CoMoFoD [43], COVERAGE [44] and the Dresden image database [45]. Our building blocks are standard. Residual networks [46] and vision transformers [47] are common alternatives to our EfficientNet backbone [9]. The localiser follows the U-Net layout [48] and training uses AdamW [49]. For evidence, Hasan and Salah used Ethereum smart contracts to track where a media file came from using file hashes [50]. We store a SHA-256 hash of the analysed image in a similar way and add a signature and a chain of custody.</w:t>
+        <w:t>Surveys are given in [30-33], where Verdoliva covers media forensics and deepfakes and Qureshi and Deriche list pixel based blind methods and Stamm et al. describe the first ten years of information forensics and Warif et al. review copy-move detection. Muhammad et al. tell authentic from tampered images using a steerable pyramid transform and local binary patterns on the colour channels [34]. Besides CASIA [35] and the Columbia splicing set [36], other datasets in this field are the Columbia set of authentic and spliced blocks [37] and CoMoFoD [38] and COVERAGE [39] and the Dresden image database [40]. Our building blocks are standard, since residual networks [41] and vision transformers [42] are common alternatives to our EfficientNet backbone [43] and the localiser follows the U-Net layout [44] and training uses AdamW [45]. For evidence, Hasan and Salah used Ethereum smart contracts to track where a media file came from using file hashes [46] and we store a SHA-256 hash of the analysed image in a similar way and add a signature and a chain of custody.</w:t>
       </w:r>
     </w:p>
     <w:p>
@@ -9034,7 +9034,7 @@
           <w:i w:val="0"/>
           <w:sz w:val="24"/>
         </w:rPr>
-        <w:t>Ranjan et al. extract texture maps with the Local Optimal Oriented Pattern (LOOP), refine them with a pretrained ResNet-50 and classify with an SVM. They test on the Columbia splicing dataset, CASIA v2.0 and a part of the Dresden image database using stratified 5-fold cross-validation. Their average accuracy is 95.20%. Their review table lists earlier methods that use Columbia, with accuracies between about 91% and 93.4%.</w:t>
+        <w:t>Ranjan et al. extract texture maps with the Local Optimal Oriented Pattern (LOOP) and refine them with a pretrained ResNet-50 and classify with an SVM, testing on the Columbia splicing dataset and CASIA v2.0 and a part of the Dresden image database using stratified 5-fold cross-validation with an average accuracy of 95.20%. Their review table lists earlier methods that use Columbia with accuracies between about 91% and 93.4%.</w:t>
       </w:r>
     </w:p>
     <w:p>
@@ -9068,7 +9068,7 @@
           <w:i w:val="0"/>
           <w:sz w:val="24"/>
         </w:rPr>
-        <w:t>Ravula and Singh detect and classify copy-move forgery using generative adversarial networks, a vision transformer and spectral clustering together. In their Table 4 they report accuracy of 98.95% on CoMoFoD, 95.2% on MICC-F220 and 94.4% on CASIA v2. Their abstract gives 99.02% accuracy for CoMoFoD.</w:t>
+        <w:t>Ravula and Singh detect and classify copy-move forgery using generative adversarial networks and a vision transformer and spectral clustering together. In their Table 4 they report accuracy of 98.95% on CoMoFoD and 95.2% on MICC-F220 and 94.4% on CASIA v2, while their abstract gives 99.02% accuracy for CoMoFoD.</w:t>
       </w:r>
     </w:p>
     <w:p>
@@ -9102,7 +9102,7 @@
           <w:i w:val="0"/>
           <w:sz w:val="24"/>
         </w:rPr>
-        <w:t>Rehman and Jain take patch features from a pretrained CNN, fuse them and classify with an SVM. On CASIA v2.0 they report 93.57% accuracy without augmentation and 98.91% with augmentation. Their Table 3 uses 10-fold cross-validation. For batch size 128 it gives accuracy 98.91%, mean 93.39% and standard deviation 8.75%. For batch size 200 it gives accuracy 93.57%, mean 90.25% and standard deviation 7.98%.</w:t>
+        <w:t>Rehman and Jain take patch features from a pretrained CNN and fuse them and classify with an SVM, and on CASIA v2.0 they report 93.57% accuracy without augmentation and 98.91% with augmentation. Their Table 3 uses 10-fold cross-validation and gives accuracy 98.91% with mean 93.39% and standard deviation 8.75% for batch size 128, and accuracy 93.57% with mean 90.25% and standard deviation 7.98% for batch size 200.</w:t>
       </w:r>
     </w:p>
     <w:p>
@@ -9136,7 +9136,7 @@
           <w:i w:val="0"/>
           <w:sz w:val="24"/>
         </w:rPr>
-        <w:t>Deb and Kar propose a CNN based copy-move method with preprocessing, feature extraction, segmentation and localisation steps. They also study how different the datasets are. On CASIA v2.0 they report precision 87.31, recall 90.15 and F1 88.33.</w:t>
+        <w:t>Deb and Kar propose a CNN based copy-move method with preprocessing and feature extraction and segmentation and localisation steps and they also study how different the datasets are. On CASIA v2.0 they report precision 87.31 and recall 90.15 and F1 88.33.</w:t>
       </w:r>
     </w:p>
     <w:p>
@@ -9170,7 +9170,7 @@
           <w:i w:val="0"/>
           <w:sz w:val="24"/>
         </w:rPr>
-        <w:t>Chen et al. take features from a pretrained EfficientNet-B4 and train XGBoost models at several levels for the splicing mask. A second version also predicts the mask boundary. No backpropagation is needed. Following [6], they train on CASIA v2.0 and test on CASIA v1.0 and Columbia. They report pixel F1 of 0.5728 (0.6210 with edges) on CASIA v1.0 and 0.6497 (0.6558) on Columbia, with 18.4 million parameters for GIFT.</w:t>
+        <w:t>Chen et al. take features from a pretrained EfficientNet-B4 and train XGBoost models at several levels for the splicing mask and a second version also predicts the mask boundary, so no backpropagation is needed. Following [7] they train on CASIA v2.0 and test on CASIA v1.0 and Columbia and they report pixel F1 of 0.5728 (0.6210 with edges) on CASIA v1.0 and 0.6497 (0.6558) on Columbia, with 18.4 million parameters for GIFT.</w:t>
       </w:r>
     </w:p>
     <w:p>
@@ -9871,7 +9871,7 @@
           <w:i w:val="0"/>
           <w:sz w:val="24"/>
         </w:rPr>
-        <w:t>Tests that may reward memory.</w:t>
+        <w:t>Tests may reward memory</w:t>
       </w:r>
       <w:r>
         <w:rPr>
@@ -9880,7 +9880,7 @@
           <w:i w:val="0"/>
           <w:sz w:val="24"/>
         </w:rPr>
-        <w:t xml:space="preserve"> CASIA v2.0 has tampered images made from authentic images in the same set. A random split can put a tampered image in the test set and its source in the training set. The base papers report random split or cross-validation accuracy and do not say if sources were kept apart. We report both a random split and a split that keeps sources together.</w:t>
+        <w:t xml:space="preserve"> because CASIA v2.0 has tampered images made from authentic images in the same set, so a random split can put a tampered image in the test set and its source in the training set. The base papers report random split or cross-validation accuracy and do not say if sources were kept apart, but we report both a random split and a split that keeps sources together.</w:t>
       </w:r>
     </w:p>
     <w:p>
@@ -9907,7 +9907,7 @@
           <w:i w:val="0"/>
           <w:sz w:val="24"/>
         </w:rPr>
-        <w:t>Detection without evidence.</w:t>
+        <w:t>Detection happens without evidence</w:t>
       </w:r>
       <w:r>
         <w:rPr>
@@ -9916,7 +9916,7 @@
           <w:i w:val="0"/>
           <w:sz w:val="24"/>
         </w:rPr>
-        <w:t xml:space="preserve"> The base papers stop at a label or a mask. None of them hashes the file, signs the result or gives a record that a third party can check.</w:t>
+        <w:t xml:space="preserve"> since the base papers stop at a label or a mask and none of them hashes the file or signs the result or gives a record that a third party can check.</w:t>
       </w:r>
     </w:p>
     <w:p>
@@ -9943,7 +9943,7 @@
           <w:i w:val="0"/>
           <w:sz w:val="24"/>
         </w:rPr>
-        <w:t>Prototypes instead of applications.</w:t>
+        <w:t>The published methods are prototypes</w:t>
       </w:r>
       <w:r>
         <w:rPr>
@@ -9952,7 +9952,7 @@
           <w:i w:val="0"/>
           <w:sz w:val="24"/>
         </w:rPr>
-        <w:t xml:space="preserve"> The published methods are scripts for one benchmark. An analyst gets no upload page, no explanation of the verdict and no way to review earlier cases.</w:t>
+        <w:t xml:space="preserve"> and not applications because they are scripts for one benchmark, so an analyst gets no upload page and no explanation of the verdict and no way to review earlier cases.</w:t>
       </w:r>
     </w:p>
     <w:p>
@@ -9979,7 +9979,7 @@
           <w:i w:val="0"/>
           <w:sz w:val="24"/>
         </w:rPr>
-        <w:t>Weak transfer.</w:t>
+        <w:t>Transfer is weak</w:t>
       </w:r>
       <w:r>
         <w:rPr>
@@ -9988,7 +9988,7 @@
           <w:i w:val="0"/>
           <w:sz w:val="24"/>
         </w:rPr>
-        <w:t xml:space="preserve"> The protocol of [5] and [6] trains on CASIA v2.0 and tests on Columbia. It gives pixel F1 of about 0.65 at best. Behaviour on a new dataset is still an open problem, and a system should say so.</w:t>
+        <w:t xml:space="preserve"> since the protocol of [5, 7] trains on CASIA v2.0 and tests on Columbia and gives pixel F1 of about 0.65 at best, so behaviour on a new dataset is still an open problem and a system should say so.</w:t>
       </w:r>
     </w:p>
     <w:p>
@@ -10129,7 +10129,7 @@
           <w:i w:val="0"/>
           <w:sz w:val="24"/>
         </w:rPr>
-        <w:t>Given a still image of unknown origin, decide whether it is authentic or manipulated and show the evidence for the decision. Say Inconclusive when the evidence is weak. Keep a record of the analysis that a third party can check without trusting the operator.</w:t>
+        <w:t>Given a still image of unknown origin, decide whether it is authentic or manipulated and show the evidence for the decision, and say Inconclusive when the evidence is weak while keeping a record of the analysis that a third party can check without trusting the operator.</w:t>
       </w:r>
     </w:p>
     <w:p>
@@ -10163,7 +10163,7 @@
           <w:i w:val="0"/>
           <w:sz w:val="24"/>
         </w:rPr>
-        <w:t>The plan follows the history of the project repository. The dates are the dates of the work. The training and evaluation work of October 2026 was done in this semester.</w:t>
+        <w:t>The plan follows the history of the project repository and the dates are the dates of the work, while the training and evaluation work of October 2026 was done in this semester.</w:t>
       </w:r>
     </w:p>
     <w:p>
@@ -10894,7 +10894,7 @@
           <w:i w:val="0"/>
           <w:sz w:val="24"/>
         </w:rPr>
-        <w:t>•  FR4. Combine the agent scores into an authenticity score between 0 and 1 and a verdict. Authentic is at or above 0.75, Fake is at or below 0.40 and anything between is Inconclusive.</w:t>
+        <w:t>•  FR4. Combine the agent scores into an authenticity score between 0 and 1 and a verdict, where Authentic is at or above 0.75 and Fake is at or below 0.40 and anything between is Inconclusive.</w:t>
       </w:r>
     </w:p>
     <w:p>
@@ -10912,7 +10912,7 @@
           <w:i w:val="0"/>
           <w:sz w:val="24"/>
         </w:rPr>
-        <w:t>•  FR5. Show the reasons, the heatmaps (error level analysis and Grad-CAM) and how much each metadata field contributed.</w:t>
+        <w:t>•  FR5. Show the reasons and the heatmaps (error level analysis and Grad-CAM [47]) and how much each metadata field contributed.</w:t>
       </w:r>
     </w:p>
     <w:p>
@@ -10930,7 +10930,7 @@
           <w:i w:val="0"/>
           <w:sz w:val="24"/>
         </w:rPr>
-        <w:t>•  FR6. Sign every record with Ed25519, keep a chain of custody and, if a wallet is set, anchor the verdict on the Polygon Amoy blockchain.</w:t>
+        <w:t>•  FR6. Sign every record with Ed25519 and keep a chain of custody and, if a wallet is set, anchor the verdict on the Polygon Amoy blockchain.</w:t>
       </w:r>
     </w:p>
     <w:p>
@@ -10948,7 +10948,7 @@
           <w:i w:val="0"/>
           <w:sz w:val="24"/>
         </w:rPr>
-        <w:t>•  FR7. Create an evidence PDF and let anyone check the file hash, the signature and the anchor again.</w:t>
+        <w:t>•  FR7. Create an evidence PDF and let anyone check the file hash and the signature and the anchor again.</w:t>
       </w:r>
     </w:p>
     <w:p>
@@ -11055,7 +11055,7 @@
           <w:i w:val="0"/>
           <w:sz w:val="24"/>
         </w:rPr>
-        <w:t xml:space="preserve"> analyse one image in seconds on one GPU. On the 588 held out images the whole pipeline took 0.24 s per image on average, about 142 s in total.</w:t>
+        <w:t xml:space="preserve"> analyse one image in seconds on one GPU, and on the 588 held out images the whole pipeline took 0.24 s per image on average, which is about 142 s in total.</w:t>
       </w:r>
     </w:p>
     <w:p>
@@ -11127,7 +11127,7 @@
           <w:i w:val="0"/>
           <w:sz w:val="24"/>
         </w:rPr>
-        <w:t xml:space="preserve"> run on one Windows machine with SQLite and no Redis, and also with PostgreSQL and Redis.</w:t>
+        <w:t xml:space="preserve"> run on one Windows machine with SQLite and no Redis and also with PostgreSQL and Redis.</w:t>
       </w:r>
     </w:p>
     <w:p>
@@ -11250,7 +11250,7 @@
           <w:i w:val="0"/>
           <w:sz w:val="24"/>
         </w:rPr>
-        <w:t>Every part is available as open source software (Python, PyTorch, timm, FastAPI, SQLAlchemy, ReportLab and web3). The detector is small. EfficientNet-B0 has about 4 million parameters, and we trained and tested it on one laptop GPU with 8 GB of memory. We start from pretrained ImageNet weights, so no large dataset or cluster is needed.</w:t>
+        <w:t>Every part is available as open source software (Python, PyTorch, timm, FastAPI, SQLAlchemy, ReportLab and web3) and the detector is small, since EfficientNet-B0 has about 4 million parameters and we trained and tested it on one laptop GPU with 8 GB of memory. We start from pretrained ImageNet weights, so no large dataset or cluster is needed.</w:t>
       </w:r>
     </w:p>
     <w:p>
@@ -11284,7 +11284,7 @@
           <w:i w:val="0"/>
           <w:sz w:val="24"/>
         </w:rPr>
-        <w:t>No paid service was used. The models and libraries are open source and the datasets are public. The database is SQLite or a free PostgreSQL plan. Blockchain anchoring uses the Polygon Amoy test network, where gas is free. The only hardware is the development laptop, so the running cost is only electricity.</w:t>
+        <w:t>No paid service was used because the models and libraries are open source and the datasets are public, and the database is SQLite or a free PostgreSQL plan while blockchain anchoring uses the Polygon Amoy test network where gas is free. The only hardware is the development laptop, so the running cost is only electricity.</w:t>
       </w:r>
     </w:p>
     <w:p>
@@ -11318,7 +11318,7 @@
           <w:i w:val="0"/>
           <w:sz w:val="24"/>
         </w:rPr>
-        <w:t>The system helps journalists, insurers and investigators sort images. The main risk is trusting an automatic verdict too much. The design reduces this with an Inconclusive band, visible reasons and heatmaps, and a note that scores are not a legal finding. Images are processed on the operator's own machine and are not sent to anyone else.</w:t>
+        <w:t>The system helps journalists and insurers and investigators sort images, and the main risk is trusting an automatic verdict too much, so the design adds an Inconclusive band and visible reasons and heatmaps and a note that scores are not a legal finding. Images are processed on the operator's own machine and are not sent to anyone else.</w:t>
       </w:r>
     </w:p>
     <w:p>
@@ -12179,7 +12179,7 @@
           <w:i w:val="0"/>
           <w:sz w:val="24"/>
         </w:rPr>
-        <w:t>The user uploads an image in the web application. The FastAPI backend stores the file, hashes it and runs three agents. Each agent returns a score from 0 (fake) to 1 (authentic) and a list of findings. The decision engine takes the weighted average of the scores. The weights are 0.30 for image forensics, 0.25 for provenance and 0.20 for metadata. An agent with no signal is left out instead of being counted as 0.5. The average becomes a verdict. The record is then signed, saved in the database with a chain of custody, anchored on the blockchain if set up, and made available as JSON and as an evidence PDF.</w:t>
+        <w:t>The user uploads an image in the web application and the FastAPI backend stores the file, hashes it and runs three agents. Each agent returns a score from 0 (fake) to 1 (authentic) and a list of findings. The decision engine takes the weighted average of the scores with weights of 0.30 for image forensics and 0.25 for provenance and 0.20 for metadata, and an agent with no signal is left out instead of being counted as 0.5. The average becomes a verdict and the record is then signed and saved in the database with a chain of custody and anchored on the blockchain if set up, and it is made available as JSON and as an evidence PDF.</w:t>
       </w:r>
     </w:p>
     <w:p>
@@ -12288,7 +12288,7 @@
           <w:i w:val="0"/>
           <w:sz w:val="24"/>
         </w:rPr>
-        <w:t>Figure 4.2 shows the level 1 data flow. The original file and its hash go to the evidence store. The forensic agents read the trained model weights. The signed record goes back to the store and the report goes to the analyst.</w:t>
+        <w:t>Figure 4.2 shows the level 1 data flow, where the original file and its hash go to the evidence store and the forensic agents read the trained model weights and the signed record goes back to the store and the report goes to the analyst.</w:t>
       </w:r>
     </w:p>
     <w:p>
@@ -12380,7 +12380,7 @@
           <w:i w:val="0"/>
           <w:sz w:val="24"/>
         </w:rPr>
-        <w:t>The analyst uploads images, reads verdicts and heatmaps, downloads the evidence PDF and browses the history. A verifier or auditor does not have to trust the analyst, because the verdict, the evidence PDF and the integrity check are open to anyone who has the file identifier.</w:t>
+        <w:t>The analyst uploads images, reads verdicts and heatmaps, downloads the evidence PDF and browses the history, and a verifier or auditor does not have to trust the analyst because the verdict and the evidence PDF and the integrity check are open to anyone who has the file identifier.</w:t>
       </w:r>
     </w:p>
     <w:p>
@@ -12472,7 +12472,7 @@
           <w:i w:val="0"/>
           <w:sz w:val="24"/>
         </w:rPr>
-        <w:t>The data model has four tables. Evidence holds the uploaded file, AgentResult has one row per agent, FinalVerdict has one row per analysis and AuditLog holds the signature, anchor and chain of custody. All agents use the same run(path) interface, so the decision engine treats them the same way.</w:t>
+        <w:t>The data model has four tables, where Evidence holds the uploaded file, AgentResult has one row per agent, FinalVerdict has one row per analysis and AuditLog holds the signature, the anchor and the chain of custody. All agents use the same run(path) interface, so the decision engine treats them the same way.</w:t>
       </w:r>
     </w:p>
     <w:p>
@@ -12622,7 +12622,7 @@
           <w:i w:val="0"/>
           <w:sz w:val="24"/>
         </w:rPr>
-        <w:t>Figure 4.6 shows one analysis from upload to report. Report and verification are separate requests, so verification can be repeated at any later time.</w:t>
+        <w:t>Figure 4.6 shows one analysis from upload to report, and report and verification are separate requests so verification can be repeated at any later time.</w:t>
       </w:r>
     </w:p>
     <w:p>
@@ -12765,7 +12765,7 @@
           <w:i w:val="0"/>
           <w:sz w:val="24"/>
         </w:rPr>
-        <w:t>The upload endpoint accepts only image MIME types. The file is saved under its SHA-256 hash, a database row is created and the analysis is queued as a Celery task. With Redis the task runs in a worker process. In local mode, without Redis, it runs inline and the upload call returns when the analysis is done. The status endpoint reports pending, analyzing, done or failed, and the web application polls it in both modes.</w:t>
+        <w:t>The upload endpoint accepts only image MIME types, the file is saved under its SHA-256 hash, a database row is created and the analysis is queued as a Celery task. With Redis the task runs in a worker process but in local mode, without Redis, it runs inline and the upload call returns when the analysis is done. The status endpoint reports pending, analyzing, done or failed, and the web application polls it in both modes.</w:t>
       </w:r>
     </w:p>
     <w:p>
@@ -12799,7 +12799,7 @@
           <w:i w:val="0"/>
           <w:sz w:val="24"/>
         </w:rPr>
-        <w:t>The metadata agent reads EXIF data and flags a missing camera make and model, editing or generator software in the tags, missing or inconsistent timestamps and GPS data. Each check gives a score. A closed form Shapley value shows how much each check moved the score towards authentic or fake. Images with no EXIF at all, such as the PNG files in the datasets, score about 0.45 on this agent.</w:t>
+        <w:t>The metadata agent reads EXIF data and flags a missing camera make and model, editing or generator software in the tags, missing or inconsistent timestamps and GPS data, and each check gives a score. A closed form Shapley value shows how much each check moved the score towards authentic or fake, and images with no EXIF at all, such as the PNG files in the datasets, score about 0.45 on this agent.</w:t>
       </w:r>
     </w:p>
     <w:p>
@@ -12932,7 +12932,7 @@
           <w:i w:val="0"/>
           <w:sz w:val="24"/>
         </w:rPr>
-        <w:t>Grad-CAM [11]:</w:t>
+        <w:t>Grad-CAM [47]:</w:t>
       </w:r>
       <w:r>
         <w:rPr>
@@ -12977,7 +12977,7 @@
           <w:i w:val="0"/>
           <w:sz w:val="24"/>
         </w:rPr>
-        <w:t xml:space="preserve"> described below. When it is installed, the three heuristics stay in the report as supporting evidence but do not change the score.</w:t>
+        <w:t xml:space="preserve"> described below, and when it is installed the three heuristics stay in the report as supporting evidence but do not change the score.</w:t>
       </w:r>
     </w:p>
     <w:p>
@@ -12994,7 +12994,7 @@
           <w:i w:val="0"/>
           <w:sz w:val="24"/>
         </w:rPr>
-        <w:t>Detector input.</w:t>
+        <w:t>The detector input</w:t>
       </w:r>
       <w:r>
         <w:rPr>
@@ -13003,7 +13003,7 @@
           <w:i w:val="0"/>
           <w:sz w:val="24"/>
         </w:rPr>
-        <w:t xml:space="preserve"> The image is saved again as JPEG at quality 70, 85 and 95. For each quality we take the absolute difference from the original, turn it to grey scale, amplify it and keep it as one channel. This gives a three channel error level map at the native resolution of the image (Figure 5.1). We avoid resizing on purpose because it destroys the faint compression traces the detector needs.</w:t>
+        <w:t xml:space="preserve"> is made by saving the image again as JPEG at quality 70, 85 and 95 and for each quality we take the absolute difference from the original, turn it to grey scale, amplify it and keep it as one channel. This gives a three channel error level map at the native resolution of the image (Figure 5.1) and we avoid resizing on purpose because it destroys the faint compression traces that the detector needs.</w:t>
       </w:r>
     </w:p>
     <w:p>
@@ -13078,7 +13078,7 @@
           <w:i w:val="0"/>
           <w:sz w:val="24"/>
         </w:rPr>
-        <w:t>Model and training.</w:t>
+        <w:t>The network</w:t>
       </w:r>
       <w:r>
         <w:rPr>
@@ -13087,7 +13087,7 @@
           <w:i w:val="0"/>
           <w:sz w:val="24"/>
         </w:rPr>
-        <w:t xml:space="preserve"> The network is an EfficientNet-B0 [9] with ImageNet weights and a single output. Training uses random 224 × 224 crops of the error level maps with random flips. We use the AdamW optimiser with learning rate 4×10⁻⁴, a one cycle schedule, weight decay 10⁻⁴, batches of 32, mixed precision and 12 epochs. At test time up to six crops that cover the image are scored and their outputs are averaged. The authenticity score is one minus the predicted probability of manipulation.</w:t>
+        <w:t xml:space="preserve"> is an EfficientNet-B0 [43] with ImageNet weights and a single output, and training uses random 224 × 224 crops of the error level maps with random flips. We use the AdamW optimiser [45] with learning rate 4×10⁻⁴, a one cycle schedule, weight decay 10⁻⁴, batches of 32, mixed precision and 12 epochs. At test time up to six crops that cover the image are scored and their outputs are averaged, and the authenticity score is one minus the predicted probability of manipulation.</w:t>
       </w:r>
     </w:p>
     <w:p>
@@ -13104,7 +13104,7 @@
           <w:i w:val="0"/>
           <w:sz w:val="24"/>
         </w:rPr>
-        <w:t>Choices made on a development split.</w:t>
+        <w:t>The choices made on a development split</w:t>
       </w:r>
       <w:r>
         <w:rPr>
@@ -13113,7 +13113,7 @@
           <w:i w:val="0"/>
           <w:sz w:val="24"/>
         </w:rPr>
-        <w:t xml:space="preserve"> We chose the input type (one ELA at quality 90 or the three quality map), the backbone (B0 or B3) and the learning rate on one development split of CASIA v2.0. This was a validation part of the training data and the held out test part was not used. Three quality ELA with B0 gave the best validation accuracy and AUC, and we fixed it before any cross-validation. We also tried a six channel input that adds the RGB image to the error maps on one fold. It was clearly worse, so we stopped it and do not use it.</w:t>
+        <w:t xml:space="preserve"> were the input type (one ELA at quality 90 or the three quality map), the backbone (B0 or B3) and the learning rate, and we made them on one development split of CASIA v2.0 which was a validation part of the training data, so the held out test part was not used. Three quality ELA with B0 gave the best validation accuracy and AUC and we fixed it before any cross-validation, and a six channel input that adds the RGB image to the error maps was clearly worse on one fold so we stopped it and do not use it.</w:t>
       </w:r>
     </w:p>
     <w:p>
@@ -13147,7 +13147,7 @@
           <w:i w:val="0"/>
           <w:sz w:val="24"/>
         </w:rPr>
-        <w:t>The provenance agent checks for embedded C2PA content credentials [14] and for invisible watermarks written by AI image generators. A valid manifest moves an image straight to Authentic. A failed manifest or a generator watermark is reported as suspicious and appears in the reasons. Most images have neither. In that case the agent reports no signal and is left out of the weighted average.</w:t>
+        <w:t>The provenance agent checks for embedded C2PA content credentials [48] and for invisible watermarks written by AI image generators, and a valid manifest moves an image straight to Authentic while a failed manifest or a generator watermark is reported as suspicious and appears in the reasons. Most images have neither, in which case the agent reports no signal and is left out of the weighted average.</w:t>
       </w:r>
     </w:p>
     <w:p>
@@ -13181,7 +13181,7 @@
           <w:i w:val="0"/>
           <w:sz w:val="24"/>
         </w:rPr>
-        <w:t>The engine takes the weighted mean of the agent scores and applies the thresholds. Authentic is at or above 0.75, Fake is at or below 0.40 and anything between is Inconclusive. It also writes a list of reasons. When the trained detector flags the image, the manipulation type is shown as Image Splicing / Tampering. The Inconclusive band is deliberate. It sends borderline images to a person.</w:t>
+        <w:t>The engine takes the weighted mean of the agent scores and applies the thresholds, where Authentic is at or above 0.75 and Fake is at or below 0.40 and anything between is Inconclusive, and it also writes a list of reasons. When the trained detector flags the image the manipulation type is shown as Image Splicing / Tampering, and the Inconclusive band is deliberate because it sends borderline images to a person.</w:t>
       </w:r>
     </w:p>
     <w:p>
@@ -13215,7 +13215,7 @@
           <w:i w:val="0"/>
           <w:sz w:val="24"/>
         </w:rPr>
-        <w:t>The analysed file is hashed with SHA-256. A standard form of the record (file hash, verdict, score, agent scores and time) is signed with an Ed25519 key [13] and the fingerprint of the public key is stored with it. The chain of custody lists the upload, analysis, signing and anchoring events. If a wallet is set, the file hash and verdict are written to a smart contract on Polygon Amoy and can be read back for checking. The evidence PDF holds the identification, the verdict and reasons, the findings of each agent, the explanation exhibits, the chain of custody and the signature.</w:t>
+        <w:t>The analysed file is hashed with SHA-256 and a standard form of the record (file hash, verdict, score, agent scores and time) is signed with an Ed25519 key [49] and the fingerprint of the public key is stored with it. The chain of custody lists the upload, analysis, signing and anchoring events, and if a wallet is set the file hash and verdict are written to a smart contract on Polygon Amoy and can be read back for checking. The evidence PDF holds the identification, the verdict and reasons, the findings of each agent, the explanation exhibits, the chain of custody and the signature.</w:t>
       </w:r>
     </w:p>
     <w:p>
@@ -13249,7 +13249,7 @@
           <w:i w:val="0"/>
           <w:sz w:val="24"/>
         </w:rPr>
-        <w:t>The web application is a single page served by the backend. The Analyze page uploads an image and shows the stages. The Report page shows the verdict gauge, the reasons, the findings of each agent, the heatmaps, the Shapley chart, the evidence chain with live checking and the chain of custody. The History page lists past analyses. The How it works page explains the agents and the weights.</w:t>
+        <w:t>The web application is a single page served by the backend, where the Analyze page uploads an image and shows the stages and the Report page shows the verdict gauge, the reasons, the findings of each agent, the heatmaps, the Shapley chart, the evidence chain with live checking and the chain of custody. The History page lists past analyses and the How it works page explains the agents and the weights.</w:t>
       </w:r>
     </w:p>
     <w:p>
@@ -13283,7 +13283,7 @@
           <w:i w:val="0"/>
           <w:sz w:val="24"/>
         </w:rPr>
-        <w:t>To compare with [5], we trained a U-Net style network on the CASIA v2.0 masks. It uses an EfficientNet-B0 encoder on the RGB image plus the three quality ELA map, a bilinear feature pyramid decoder and a loss that adds binary cross-entropy and Dice. We tested it on Columbia. Columbia was never used for training, choosing the threshold or early stopping. The threshold came from a CASIA validation part that keeps sources apart.</w:t>
+        <w:t>To compare with [5] we trained a U-Net [44] style network on the CASIA v2.0 masks, using an EfficientNet-B0 encoder on the RGB image plus the three quality ELA map and a bilinear feature pyramid decoder and a loss that adds binary cross-entropy and Dice. We tested it on Columbia and Columbia was never used for training or choosing the threshold or early stopping, because the threshold came from a CASIA validation part that keeps sources apart.</w:t>
       </w:r>
     </w:p>
     <w:p>
@@ -13353,7 +13353,7 @@
           <w:i w:val="0"/>
           <w:sz w:val="24"/>
         </w:rPr>
-        <w:t xml:space="preserve"> (stratified, seed 42). This is closest to the base papers.</w:t>
+        <w:t xml:space="preserve"> (stratified, seed 42), which is closest to the base papers.</w:t>
       </w:r>
     </w:p>
     <w:p>
@@ -13389,7 +13389,7 @@
           <w:i w:val="0"/>
           <w:sz w:val="24"/>
         </w:rPr>
-        <w:t xml:space="preserve"> on CASIA v2.0. Every tampered image stays in the same fold as the authentic image it was made from, using the source named in the metadata files of the dataset.</w:t>
+        <w:t xml:space="preserve"> on CASIA v2.0, where every tampered image stays in the same fold as the authentic image it was made from, using the source named in the metadata files of the dataset.</w:t>
       </w:r>
     </w:p>
     <w:p>
@@ -13416,7 +13416,7 @@
           <w:i w:val="0"/>
           <w:sz w:val="24"/>
         </w:rPr>
-        <w:t>Held out test of the full pipeline.</w:t>
+        <w:t>Held out test of the full pipeline</w:t>
       </w:r>
       <w:r>
         <w:rPr>
@@ -13425,7 +13425,7 @@
           <w:i w:val="0"/>
           <w:sz w:val="24"/>
         </w:rPr>
-        <w:t xml:space="preserve"> An 80/20 split that keeps sources together. A detector trained on the 80% was used by the real agents and the decision engine on the 588 images of the other 20%.</w:t>
+        <w:t xml:space="preserve"> with an 80/20 split that keeps sources together, where a detector trained on the 80% was used by the real agents and the decision engine on the 588 images of the other 20%.</w:t>
       </w:r>
     </w:p>
     <w:p>
@@ -13452,7 +13452,7 @@
           <w:i w:val="0"/>
           <w:sz w:val="24"/>
         </w:rPr>
-        <w:t>Columbia.</w:t>
+        <w:t>Columbia:</w:t>
       </w:r>
       <w:r>
         <w:rPr>
@@ -13461,7 +13461,7 @@
           <w:i w:val="0"/>
           <w:sz w:val="24"/>
         </w:rPr>
-        <w:t xml:space="preserve"> 5-fold cross-validation over its 363 images with several inputs tried. All are reported in Chapter 7.</w:t>
+        <w:t xml:space="preserve"> 5-fold cross-validation over its 363 images with several inputs tried, and all are reported in Chapter 7.</w:t>
       </w:r>
     </w:p>
     <w:p>
@@ -13513,7 +13513,7 @@
           <w:i w:val="0"/>
           <w:sz w:val="24"/>
         </w:rPr>
-        <w:t>A script (scripts/e2e_test.py) drives a running server through its public API with six images, three authentic and three tampered. All 19 checks passed. This includes the tamper check. Changing one byte of a stored evidence file makes the verification endpoint report TAMPERED, and restoring the file makes it pass again.</w:t>
+        <w:t>A script (scripts/e2e_test.py) drives a running server through its public API with six images, three authentic and three tampered, and all 19 checks passed. This includes the tamper check, where changing one byte of a stored evidence file makes the verification endpoint report TAMPERED and restoring the file makes it pass again.</w:t>
       </w:r>
     </w:p>
     <w:p>
@@ -14831,7 +14831,7 @@
           <w:i w:val="0"/>
           <w:sz w:val="24"/>
         </w:rPr>
-        <w:t>The screenshots below come from the running application. The images were taken from the held out part of CASIA v2.0 and analysed with the hold-out detector, so the detector had never seen them.</w:t>
+        <w:t>The screenshots below come from the running application and the images were taken from the held out part of CASIA v2.0 and analysed with the hold-out detector, so the detector had never seen them.</w:t>
       </w:r>
     </w:p>
     <w:p>
@@ -14964,7 +14964,7 @@
           <w:i w:val="0"/>
           <w:sz w:val="24"/>
         </w:rPr>
-        <w:t>For a tampered image the report opens with the verdict. It shows a gauge of the authenticity score, the manipulation type, the reasons and the file hash (Figure 6.3). The agent breakdown comes next and shows what each agent found. The image forensics card puts the original, the error level map and the Grad-CAM attention map side by side and gives the probability from the trained detector (Figure 6.4). The evidence chain checks the file hash and the signature again on every visit and lists the chain of custody (Figure 6.5).</w:t>
+        <w:t>For a tampered image the report opens with the verdict, which shows a gauge of the authenticity score, the manipulation type, the reasons and the file hash (Figure 6.3). The agent breakdown comes next and shows what each agent found, and the image forensics card puts the original, the error level map and the Grad-CAM attention map side by side and gives the probability from the trained detector (Figure 6.4). The evidence chain checks the file hash and the signature again on every visit and lists the chain of custody (Figure 6.5).</w:t>
       </w:r>
     </w:p>
     <w:p>
@@ -15455,7 +15455,7 @@
           <w:i w:val="0"/>
           <w:sz w:val="24"/>
         </w:rPr>
-        <w:t>The datasets are a subset of CASIA v2.0 and the Columbia set. Our copy of CASIA v2.0 has 1,536 authentic and 1,283 tampered images, all PNG. The full dataset has 7,491 authentic and 5,123 tampered images, so our results are not on the full set. Columbia has 183 authentic and 180 spliced images. Both come from the Hugging Face collection ductai199x/image-manipulation-dataset-compilation [12]. Label 1 means manipulated. We report accuracy, precision, recall, F1, ROC AUC and the equal error rate (EER). A confusion matrix is shown for each experiment.</w:t>
+        <w:t>The datasets are a subset of CASIA v2.0 and the Columbia set. Our copy of CASIA v2.0 has 1,536 authentic and 1,283 tampered images, all PNG, while the full dataset has 7,491 authentic and 5,123 tampered images, so our results are not on the full set. Columbia has 183 authentic and 180 spliced images and both come from the Hugging Face collection ductai199x/image-manipulation-dataset-compilation [50] where label 1 means manipulated. We report accuracy, precision, recall, F1, ROC AUC and the equal error rate (EER), and a confusion matrix is shown for each experiment.</w:t>
       </w:r>
     </w:p>
     <w:p>
@@ -16106,7 +16106,7 @@
           <w:i w:val="0"/>
           <w:sz w:val="24"/>
         </w:rPr>
-        <w:t>The two cross-validation protocols give almost the same accuracy, 95.53% and 95.32%. Keeping each tampered image with its source did not change the result much. This only controls for the source named in the dataset metadata and not for every near duplicate. The fold accuracies were 95.9, 95.4, 96.8, 94.2 and 95.4 percent for the random split, and 94.0, 96.3, 95.4, 95.9 and 95.0 percent when sources were kept together.</w:t>
+        <w:t>The two cross-validation protocols give almost the same accuracy, 95.53% and 95.32%, so keeping each tampered image with its source did not change the result much, although this only controls for the source named in the dataset metadata and not for every near duplicate. The fold accuracies were 95.9, 95.4, 96.8, 94.2 and 95.4 percent for the random split and 94.0, 96.3, 95.4, 95.9 and 95.0 percent when sources were kept together.</w:t>
       </w:r>
     </w:p>
     <w:p>
@@ -16256,7 +16256,7 @@
           <w:i w:val="0"/>
           <w:sz w:val="24"/>
         </w:rPr>
-        <w:t>The real agents and the decision engine ran on the 588 held out images (301 authentic and 287 tampered). The engine gave a verdict on 90.5% of them and was right on 97.9% of those. The rest went to review. If Inconclusive counts as a miss, the strict accuracy is 88.6%. If the engine had to choose using the 0.5 mark of its score, it would reach 96.43% (AUC 0.9943).</w:t>
+        <w:t>The real agents and the decision engine ran on the 588 held out images (301 authentic and 287 tampered) and the engine gave a verdict on 90.5% of them and was right on 97.9% of those, while the rest went to review. If Inconclusive counts as a miss the strict accuracy is 88.6%, and if the engine had to choose using the 0.5 mark of its score it would reach 96.43% (AUC 0.9943).</w:t>
       </w:r>
     </w:p>
     <w:p>
@@ -16561,7 +16561,7 @@
           <w:i w:val="0"/>
           <w:sz w:val="24"/>
         </w:rPr>
-        <w:t>Authentic images were called Fake in 2.7% of cases and tampered images were called Authentic in 1.0%. Most of the cost of the Inconclusive band falls on authentic images. The metadata agent gives a PNG with no EXIF about 0.45, which pulls the combined score towards the middle.</w:t>
+        <w:t>Authentic images were called Fake in 2.7% of cases and tampered images were called Authentic in 1.0%, and most of the cost of the Inconclusive band falls on authentic images because the metadata agent gives a PNG with no EXIF about 0.45 which pulls the combined score towards the middle.</w:t>
       </w:r>
     </w:p>
     <w:p>
@@ -17528,7 +17528,7 @@
           <w:i w:val="0"/>
           <w:sz w:val="24"/>
         </w:rPr>
-        <w:t>Columbia has uncompressed photographs, so error level analysis, which depends on JPEG history, has little to work with. Also, 363 images are few for training a network on whole images. We tried three variants and all are listed above. The whole image variants are much less stable than on CASIA, and their folds differ by more than ten points. The patch based variant cuts the image into 128 pixel patches and labels them using the ground truth masks. It scores an image by the mean of its top 5% patch probabilities and takes the decision threshold from the other folds. Columbia photographs share scenes, so the last row repeats the test with every scene kept inside one fold. It is the stricter figure.</w:t>
+        <w:t>Columbia has uncompressed photographs, so error level analysis which depends on JPEG history has little to work with, and 363 images are also few for training a network on whole images. We tried three variants and all are listed above, and the whole image variants are much less stable than on CASIA since their folds differ by more than ten points. The patch based variant cuts the image into 128 pixel patches and labels them using the ground truth masks and scores an image by the mean of its top 5% patch probabilities and takes the decision threshold from the other folds. Columbia photographs share scenes, so the last row repeats the test with every scene kept inside one fold and it is the stricter figure.</w:t>
       </w:r>
     </w:p>
     <w:p>
@@ -18087,7 +18087,7 @@
           <w:i w:val="0"/>
           <w:sz w:val="24"/>
         </w:rPr>
-        <w:t>The localiser finds the tampered region well on images like its training data (pooled F1 0.89) but does not carry over to Columbia (pooled F1 0.43, and 0.48 at the best possible threshold). Localisation across datasets is a limit of this work. The verdict does not use it.</w:t>
+        <w:t>The localiser finds the tampered region well on images like its training data (pooled F1 0.89) but does not carry over to Columbia (pooled F1 0.43 and 0.48 at the best possible threshold), so localisation across datasets is a limit of this work and the verdict does not use it.</w:t>
       </w:r>
     </w:p>
     <w:p>
@@ -18121,7 +18121,7 @@
           <w:i w:val="0"/>
           <w:sz w:val="24"/>
         </w:rPr>
-        <w:t>Only the base paper results that our detector exceeds are listed, using a comparable metric on the same dataset. The protocols differ in splits, subsets and training data. For example, some papers use the full CASIA v2.0 and we use a subset of it. So the table gives context and is not a ranking. The full comparison, including results we do not reach, is in the file docs/evaluation/EVALUATION.md in the repository.</w:t>
+        <w:t>Only the base paper results that our detector exceeds are listed, using a comparable metric on the same dataset, and the protocols differ in splits and subsets and training data since some papers use the full CASIA v2.0 and we use a subset of it, so the table gives context and is not a ranking. The full comparison, including results we do not reach, is in the file docs/evaluation/EVALUATION.md in the repository.</w:t>
       </w:r>
     </w:p>
     <w:p>
@@ -18734,7 +18734,7 @@
           <w:i w:val="0"/>
           <w:sz w:val="24"/>
         </w:rPr>
-        <w:t>•  The ELA based detector works well on CASIA v2.0, where most images come from JPEG files, and poorly on uncompressed Columbia images. The patch based detector on noise residuals fixes this on Columbia but it is a separate model. The deployed application uses the CASIA detector, and a real system will meet both kinds of image.</w:t>
+        <w:t>•  The ELA based detector works well on CASIA v2.0 where most images come from JPEG files but poorly on uncompressed Columbia images, and the patch based detector on noise residuals fixes this on Columbia but it is a separate model, so the deployed application uses the CASIA detector and a real system will meet both kinds of image.</w:t>
       </w:r>
     </w:p>
     <w:p>
@@ -18752,7 +18752,7 @@
           <w:i w:val="0"/>
           <w:sz w:val="24"/>
         </w:rPr>
-        <w:t>•  Columbia has only 363 images and its photographs share scenes. Keeping each scene in one fold lowers accuracy only a little, but with so few images the spread between folds is still several points. The threshold of the patch based detector comes from the other folds' out-of-fold scores, and those scores come from models that saw the test fold. The AUC does not depend on a threshold, so it is the safer figure.</w:t>
+        <w:t>•  Columbia has only 363 images and its photographs share scenes, and keeping each scene in one fold lowers accuracy only a little but with so few images the spread between folds is still several points. The threshold of the patch based detector comes from the other folds' out-of-fold scores and those scores come from models that saw the test fold, so the AUC which does not depend on a threshold is the safer figure.</w:t>
       </w:r>
     </w:p>
     <w:p>
@@ -18770,7 +18770,7 @@
           <w:i w:val="0"/>
           <w:sz w:val="24"/>
         </w:rPr>
-        <w:t>•  CASIA v2.0 has known quirks. Tampered images are made from authentic images in the same set, so even the split that keeps sources together is only partly strict. The held out test uses the same family of data and says little about unrelated images.</w:t>
+        <w:t>•  CASIA v2.0 has known quirks because tampered images are made from authentic images in the same set, so even the split that keeps sources together is only partly strict, and the held out test uses the same family of data and says little about unrelated images.</w:t>
       </w:r>
     </w:p>
     <w:p>
@@ -18788,7 +18788,7 @@
           <w:i w:val="0"/>
           <w:sz w:val="24"/>
         </w:rPr>
-        <w:t>•  The Inconclusive band costs coverage, since about one image in ten goes to review. This is the price for keeping wrong verdicts at about 3% for authentic images and about 1% for tampered images.</w:t>
+        <w:t>•  The Inconclusive band costs coverage since about one image in ten goes to review, and this is the price for keeping wrong verdicts at about 3% for authentic images and about 1% for tampered images.</w:t>
       </w:r>
     </w:p>
     <w:p>
@@ -18806,7 +18806,7 @@
           <w:i w:val="0"/>
           <w:sz w:val="24"/>
         </w:rPr>
-        <w:t>•  The localiser does not carry over to other datasets, so heatmaps are only supporting evidence. The verdict does not depend on them.</w:t>
+        <w:t>•  The localiser does not carry over to other datasets, so heatmaps are only supporting evidence and the verdict does not depend on them.</w:t>
       </w:r>
     </w:p>
     <w:p>
@@ -18824,7 +18824,7 @@
           <w:i w:val="0"/>
           <w:sz w:val="24"/>
         </w:rPr>
-        <w:t>•  All figures are for splicing type tampering in CASIA and Columbia. Fully AI generated images, heavy recompression and screenshots were not tested.</w:t>
+        <w:t>•  All figures are for splicing type tampering in CASIA and Columbia and fully AI generated images and heavy recompression and screenshots were not tested.</w:t>
       </w:r>
     </w:p>
     <w:p>
@@ -19217,7 +19217,7 @@
           <w:i w:val="0"/>
           <w:sz w:val="24"/>
         </w:rPr>
-        <w:t>TrustSphere AI shows that image forensics and evidence integrity can be built as one system. A multi-agent pipeline analyses an uploaded image and a decision engine returns Authentic, Fake or Inconclusive with its reasons. Every result is hashed, signed, stored with a chain of custody and exported as an evidence PDF. A web application and a REST API sit on top.</w:t>
+        <w:t>TrustSphere AI shows that image forensics and evidence integrity can be built as one system, where a multi-agent pipeline analyses an uploaded image and a decision engine returns Authentic, Fake or Inconclusive with its reasons and every result is hashed and signed and stored with a chain of custody and exported as an evidence PDF. A web application and a REST API sit on top.</w:t>
       </w:r>
     </w:p>
     <w:p>
@@ -19234,7 +19234,7 @@
           <w:i w:val="0"/>
           <w:sz w:val="24"/>
         </w:rPr>
-        <w:t>The trained detector reaches 95.53% accuracy on CASIA v2.0 with random 5-fold cross-validation and 95.32% when tampered images stay with their sources. On 588 held out images it reaches 96.26%, and the full pipeline gives a verdict on about 90% of them with 97.9% accuracy. These results are higher than those the base papers in Section 7.6 report for CASIA v2.0 under the protocols stated. The work has limits too. A whole image detector is weak on uncompressed Columbia images. A patch based one reaches about 97% on a very small dataset. A localiser trained on CASIA does not carry over to Columbia.</w:t>
+        <w:t>The trained detector reaches 95.53% accuracy on CASIA v2.0 with random 5-fold cross-validation and 95.32% when tampered images stay with their sources, and on 588 held out images it reaches 96.26% while the full pipeline gives a verdict on about 90% of them with 97.9% accuracy. These results are higher than those the base papers in Section 7.6 report for CASIA v2.0 under the protocols stated, but the work has limits too since a whole image detector is weak on uncompressed Columbia images and a patch based one reaches about 97% on a very small dataset and a localiser trained on CASIA does not carry over to Columbia.</w:t>
       </w:r>
     </w:p>
     <w:p>
@@ -19269,7 +19269,7 @@
           <w:i w:val="0"/>
           <w:sz w:val="24"/>
         </w:rPr>
-        <w:t>•  Merge the CASIA and Columbia detectors into one model that handles compressed and uncompressed images, and test it on larger uncompressed sets.</w:t>
+        <w:t>•  Merge the CASIA and Columbia detectors into one model that handles compressed and uncompressed images and test it on larger uncompressed sets.</w:t>
       </w:r>
     </w:p>
     <w:p>
@@ -19287,7 +19287,7 @@
           <w:i w:val="0"/>
           <w:sz w:val="24"/>
         </w:rPr>
-        <w:t>•  Test on JPEG compressed web images and other benchmarks to measure transfer, and add a warning for images that look unlike the training data.</w:t>
+        <w:t>•  Test on JPEG compressed web images and other benchmarks to measure transfer and add a warning for images that look unlike the training data.</w:t>
       </w:r>
     </w:p>
     <w:p>
@@ -19323,7 +19323,7 @@
           <w:i w:val="0"/>
           <w:sz w:val="24"/>
         </w:rPr>
-        <w:t>•  Rebalance the metadata agent so images without EXIF are not pushed to Inconclusive, and tune the verdict thresholds on held out data.</w:t>
+        <w:t>•  Rebalance the metadata agent so images without EXIF are not pushed to Inconclusive and tune the verdict thresholds on held out data.</w:t>
       </w:r>
     </w:p>
     <w:p>
@@ -19557,7 +19557,7 @@
           <w:szCs w:val="24"/>
           <w:shd w:val="clear" w:color="auto" w:fill="FFFFFF"/>
         </w:rPr>
-        <w:t>R. Salloum, Y. Ren and C.-C. J. Kuo, "Image splicing localization using a multi-task fully convolutional network (MFCN)," Journal of Visual Communication and Image Representation, vol. 51, pp. 201-209, 2018, doi: 10.1016/j.jvcir.2018.01.010.</w:t>
+        <w:t>N. Krawetz, "A picture's worth: digital image analysis and forensics," Black Hat Briefings, 2007.</w:t>
       </w:r>
     </w:p>
     <w:p>
@@ -19585,7 +19585,7 @@
           <w:szCs w:val="24"/>
           <w:shd w:val="clear" w:color="auto" w:fill="FFFFFF"/>
         </w:rPr>
-        <w:t>J. Dong, W. Wang and T. Tan, "CASIA image tampering detection evaluation database," in Proc. IEEE China Summit and International Conference on Signal and Information Processing (ChinaSIP), 2013.</w:t>
+        <w:t>R. Salloum, Y. Ren and C.-C. J. Kuo, "Image splicing localization using a multi-task fully convolutional network (MFCN)," Journal of Visual Communication and Image Representation, vol. 51, pp. 201-209, 2018, doi: 10.1016/j.jvcir.2018.01.010.</w:t>
       </w:r>
     </w:p>
     <w:p>
@@ -19613,7 +19613,7 @@
           <w:szCs w:val="24"/>
           <w:shd w:val="clear" w:color="auto" w:fill="FFFFFF"/>
         </w:rPr>
-        <w:t>Y.-F. Hsu and S.-F. Chang, "Detecting image splicing using geometry invariants and camera characteristics consistency," in Proc. IEEE International Conference on Multimedia and Expo (ICME), 2006.</w:t>
+        <w:t>A. C. Popescu and H. Farid, "Exposing digital forgeries by detecting traces of resampling," IEEE Transactions on Signal Processing, vol. 53, no. 2, pp. 758-767, 2005.</w:t>
       </w:r>
     </w:p>
     <w:p>
@@ -19641,7 +19641,7 @@
           <w:szCs w:val="24"/>
           <w:shd w:val="clear" w:color="auto" w:fill="FFFFFF"/>
         </w:rPr>
-        <w:t>M. Tan and Q. V. Le, "EfficientNet: Rethinking model scaling for convolutional neural networks," in Proc. International Conference on Machine Learning (ICML), 2019.</w:t>
+        <w:t>A. C. Popescu and H. Farid, "Exposing digital forgeries in color filter array interpolated images," IEEE Transactions on Signal Processing, vol. 53, no. 10, pp. 3948-3959, 2005.</w:t>
       </w:r>
     </w:p>
     <w:p>
@@ -19669,7 +19669,7 @@
           <w:szCs w:val="24"/>
           <w:shd w:val="clear" w:color="auto" w:fill="FFFFFF"/>
         </w:rPr>
-        <w:t>N. Krawetz, "A picture's worth: digital image analysis and forensics," Black Hat Briefings, 2007.</w:t>
+        <w:t>J. Lukáš, J. Fridrich and M. Goljan, "Digital camera identification from sensor pattern noise," IEEE Transactions on Information Forensics and Security, vol. 1, no. 2, pp. 205-214, 2006, doi: 10.1109/TIFS.2006.873602.</w:t>
       </w:r>
     </w:p>
     <w:p>
@@ -19697,7 +19697,7 @@
           <w:szCs w:val="24"/>
           <w:shd w:val="clear" w:color="auto" w:fill="FFFFFF"/>
         </w:rPr>
-        <w:t>R. R. Selvaraju, M. Cogswell, A. Das, R. Vedantam, D. Parikh and D. Batra, "Grad-CAM: Visual explanations from deep networks via gradient-based localization," in Proc. IEEE International Conference on Computer Vision (ICCV), 2017.</w:t>
+        <w:t>B. Mahdian and S. Saic, "Using noise inconsistencies for blind image forensics," Image and Vision Computing, vol. 27, no. 10, pp. 1497-1503, 2009, doi: 10.1016/j.imavis.2009.02.001.</w:t>
       </w:r>
     </w:p>
     <w:p>
@@ -19725,7 +19725,7 @@
           <w:szCs w:val="24"/>
           <w:shd w:val="clear" w:color="auto" w:fill="FFFFFF"/>
         </w:rPr>
-        <w:t>ductai199x, "image-manipulation-dataset-compilation," Hugging Face dataset, https://huggingface.co/datasets/ductai199x/image-manipulation-dataset-compilation.</w:t>
+        <w:t>H. Farid, "Exposing digital forgeries from JPEG ghosts," IEEE Transactions on Information Forensics and Security, vol. 4, no. 1, pp. 154-160, 2009, doi: 10.1109/TIFS.2008.2012215.</w:t>
       </w:r>
     </w:p>
     <w:p>
@@ -19753,7 +19753,7 @@
           <w:szCs w:val="24"/>
           <w:shd w:val="clear" w:color="auto" w:fill="FFFFFF"/>
         </w:rPr>
-        <w:t>D. J. Bernstein, N. Duif, T. Lange, P. Schwabe and B.-Y. Yang, "High-speed high-security signatures," Journal of Cryptographic Engineering, vol. 2, no. 2, pp. 77-89, 2012.</w:t>
+        <w:t>T. Bianchi and A. Piva, "Image forgery localization via block-grained analysis of JPEG artifacts," IEEE Transactions on Information Forensics and Security, vol. 7, no. 3, pp. 1003-1017, 2012, doi: 10.1109/TIFS.2012.2187516.</w:t>
       </w:r>
     </w:p>
     <w:p>
@@ -19781,7 +19781,7 @@
           <w:szCs w:val="24"/>
           <w:shd w:val="clear" w:color="auto" w:fill="FFFFFF"/>
         </w:rPr>
-        <w:t>Coalition for Content Provenance and Authenticity, "C2PA technical specification," https://c2pa.org.</w:t>
+        <w:t>J. Fridrich, D. Soukal and J. Lukáš, "Detection of copy-move forgery in digital images," in Proc. Digital Forensic Research Workshop, Cleveland, OH, USA, 2003.</w:t>
       </w:r>
     </w:p>
     <w:p>
@@ -19809,7 +19809,7 @@
           <w:szCs w:val="24"/>
           <w:shd w:val="clear" w:color="auto" w:fill="FFFFFF"/>
         </w:rPr>
-        <w:t>A. C. Popescu and H. Farid, "Exposing digital forgeries by detecting traces of resampling," IEEE Transactions on Signal Processing, vol. 53, no. 2, pp. 758-767, 2005.</w:t>
+        <w:t>I. Amerini, L. Ballan, R. Caldelli, A. Del Bimbo and G. Serra, "A SIFT-based forensic method for copy-move attack detection and transformation recovery," IEEE Transactions on Information Forensics and Security, vol. 6, no. 3, pp. 1099-1110, 2011, doi: 10.1109/TIFS.2011.2129512.</w:t>
       </w:r>
     </w:p>
     <w:p>
@@ -19837,7 +19837,7 @@
           <w:szCs w:val="24"/>
           <w:shd w:val="clear" w:color="auto" w:fill="FFFFFF"/>
         </w:rPr>
-        <w:t>A. C. Popescu and H. Farid, "Exposing digital forgeries in color filter array interpolated images," IEEE Transactions on Signal Processing, vol. 53, no. 10, pp. 3948-3959, 2005.</w:t>
+        <w:t>V. Christlein, C. Riess, J. Jordan, C. Riess and E. Angelopoulou, "An evaluation of popular copy-move forgery detection approaches," IEEE Transactions on Information Forensics and Security, vol. 7, no. 6, pp. 1841-1854, 2012, doi: 10.1109/TIFS.2012.2218597.</w:t>
       </w:r>
     </w:p>
     <w:p>
@@ -19865,7 +19865,7 @@
           <w:szCs w:val="24"/>
           <w:shd w:val="clear" w:color="auto" w:fill="FFFFFF"/>
         </w:rPr>
-        <w:t>J. Lukáš, J. Fridrich and M. Goljan, "Digital camera identification from sensor pattern noise," IEEE Transactions on Information Forensics and Security, vol. 1, no. 2, pp. 205-214, 2006, doi: 10.1109/TIFS.2006.873602.</w:t>
+        <w:t>D. Cozzolino, G. Poggi and L. Verdoliva, "Splicebuster: A new blind image splicing detector," in Proc. IEEE International Workshop on Information Forensics and Security (WIFS), 2015, pp. 1-6, doi: 10.1109/WIFS.2015.7368565.</w:t>
       </w:r>
     </w:p>
     <w:p>
@@ -19893,7 +19893,7 @@
           <w:szCs w:val="24"/>
           <w:shd w:val="clear" w:color="auto" w:fill="FFFFFF"/>
         </w:rPr>
-        <w:t>B. Mahdian and S. Saic, "Using noise inconsistencies for blind image forensics," Image and Vision Computing, vol. 27, no. 10, pp. 1497-1503, 2009, doi: 10.1016/j.imavis.2009.02.001.</w:t>
+        <w:t>J. Fridrich and J. Kodovský, "Rich models for steganalysis of digital images," IEEE Transactions on Information Forensics and Security, vol. 7, no. 3, pp. 868-882, 2012, doi: 10.1109/TIFS.2012.2190402.</w:t>
       </w:r>
     </w:p>
     <w:p>
@@ -19921,7 +19921,7 @@
           <w:szCs w:val="24"/>
           <w:shd w:val="clear" w:color="auto" w:fill="FFFFFF"/>
         </w:rPr>
-        <w:t>H. Farid, "Exposing digital forgeries from JPEG ghosts," IEEE Transactions on Information Forensics and Security, vol. 4, no. 1, pp. 154-160, 2009, doi: 10.1109/TIFS.2008.2012215.</w:t>
+        <w:t>B. Bayar and M. C. Stamm, "Constrained convolutional neural networks: A new approach towards general purpose image manipulation detection," IEEE Transactions on Information Forensics and Security, vol. 13, no. 11, pp. 2691-2706, 2018.</w:t>
       </w:r>
     </w:p>
     <w:p>
@@ -19949,7 +19949,7 @@
           <w:szCs w:val="24"/>
           <w:shd w:val="clear" w:color="auto" w:fill="FFFFFF"/>
         </w:rPr>
-        <w:t>T. Bianchi and A. Piva, "Image forgery localization via block-grained analysis of JPEG artifacts," IEEE Transactions on Information Forensics and Security, vol. 7, no. 3, pp. 1003-1017, 2012, doi: 10.1109/TIFS.2012.2187516.</w:t>
+        <w:t>P. Zhou, X. Han, V. I. Morariu and L. S. Davis, "Learning rich features for image manipulation detection," in Proc. IEEE/CVF Conference on Computer Vision and Pattern Recognition (CVPR), 2018, pp. 1053-1061, doi: 10.1109/CVPR.2018.00116.</w:t>
       </w:r>
     </w:p>
     <w:p>
@@ -19977,7 +19977,7 @@
           <w:szCs w:val="24"/>
           <w:shd w:val="clear" w:color="auto" w:fill="FFFFFF"/>
         </w:rPr>
-        <w:t>J. Fridrich, D. Soukal and J. Lukáš, "Detection of copy-move forgery in digital images," in Proc. Digital Forensic Research Workshop, Cleveland, OH, USA, 2003.</w:t>
+        <w:t>M. Huh, A. Liu, A. Owens and A. A. Efros, "Fighting fake news: Image splice detection via learned self-consistency," in Proc. European Conference on Computer Vision (ECCV), 2018, pp. 101-117.</w:t>
       </w:r>
     </w:p>
     <w:p>
@@ -20005,7 +20005,7 @@
           <w:szCs w:val="24"/>
           <w:shd w:val="clear" w:color="auto" w:fill="FFFFFF"/>
         </w:rPr>
-        <w:t>I. Amerini, L. Ballan, R. Caldelli, A. Del Bimbo and G. Serra, "A SIFT-based forensic method for copy-move attack detection and transformation recovery," IEEE Transactions on Information Forensics and Security, vol. 6, no. 3, pp. 1099-1110, 2011, doi: 10.1109/TIFS.2011.2129512.</w:t>
+        <w:t>Y. Wu, W. Abd-Almageed and P. Natarajan, "BusterNet: Detecting copy-move image forgery with source/target localization," in Proc. European Conference on Computer Vision (ECCV), 2018, pp. 168-184.</w:t>
       </w:r>
     </w:p>
     <w:p>
@@ -20033,7 +20033,7 @@
           <w:szCs w:val="24"/>
           <w:shd w:val="clear" w:color="auto" w:fill="FFFFFF"/>
         </w:rPr>
-        <w:t>V. Christlein, C. Riess, J. Jordan, C. Riess and E. Angelopoulou, "An evaluation of popular copy-move forgery detection approaches," IEEE Transactions on Information Forensics and Security, vol. 7, no. 6, pp. 1841-1854, 2012, doi: 10.1109/TIFS.2012.2218597.</w:t>
+        <w:t>Y. Wu, W. AbdAlmageed and P. Natarajan, "ManTra-Net: Manipulation tracing network for detection and localization of image forgeries with anomalous features," in Proc. IEEE/CVF Conference on Computer Vision and Pattern Recognition (CVPR), 2019, pp. 9543-9552, doi: 10.1109/CVPR.2019.00977.</w:t>
       </w:r>
     </w:p>
     <w:p>
@@ -20061,7 +20061,7 @@
           <w:szCs w:val="24"/>
           <w:shd w:val="clear" w:color="auto" w:fill="FFFFFF"/>
         </w:rPr>
-        <w:t>D. Cozzolino, G. Poggi and L. Verdoliva, "Splicebuster: A new blind image splicing detector," in Proc. IEEE International Workshop on Information Forensics and Security (WIFS), 2015, pp. 1-6, doi: 10.1109/WIFS.2015.7368565.</w:t>
+        <w:t>X. Bi, Y. Wei, B. Xiao and W. Li, "RRU-Net: The ringed residual U-Net for image splicing forgery detection," in Proc. IEEE/CVF Conference on Computer Vision and Pattern Recognition Workshops (CVPRW), 2019, doi: 10.1109/CVPRW.2019.00010.</w:t>
       </w:r>
     </w:p>
     <w:p>
@@ -20089,7 +20089,7 @@
           <w:szCs w:val="24"/>
           <w:shd w:val="clear" w:color="auto" w:fill="FFFFFF"/>
         </w:rPr>
-        <w:t>J. Fridrich and J. Kodovský, "Rich models for steganalysis of digital images," IEEE Transactions on Information Forensics and Security, vol. 7, no. 3, pp. 868-882, 2012, doi: 10.1109/TIFS.2012.2190402.</w:t>
+        <w:t>X. Liu, Y. Liu, J. Chen and X. Liu, "PSCC-Net: Progressive spatio-channel correlation network for image manipulation detection and localization," IEEE Transactions on Circuits and Systems for Video Technology, vol. 32, no. 11, pp. 7505-7517, 2022, doi: 10.1109/TCSVT.2022.3189545.</w:t>
       </w:r>
     </w:p>
     <w:p>
@@ -20117,7 +20117,7 @@
           <w:szCs w:val="24"/>
           <w:shd w:val="clear" w:color="auto" w:fill="FFFFFF"/>
         </w:rPr>
-        <w:t>B. Bayar and M. C. Stamm, "Constrained convolutional neural networks: A new approach towards general purpose image manipulation detection," IEEE Transactions on Information Forensics and Security, vol. 13, no. 11, pp. 2691-2706, 2018.</w:t>
+        <w:t>X. Chen, C. Dong, J. Ji, J. Cao and X. Li, "Image manipulation detection by multi-view multi-scale supervision," in Proc. IEEE/CVF International Conference on Computer Vision (ICCV), 2021, pp. 14185-14193.</w:t>
       </w:r>
     </w:p>
     <w:p>
@@ -20145,7 +20145,7 @@
           <w:szCs w:val="24"/>
           <w:shd w:val="clear" w:color="auto" w:fill="FFFFFF"/>
         </w:rPr>
-        <w:t>P. Zhou, X. Han, V. I. Morariu and L. S. Davis, "Learning rich features for image manipulation detection," in Proc. IEEE/CVF Conference on Computer Vision and Pattern Recognition (CVPR), 2018, pp. 1053-1061, doi: 10.1109/CVPR.2018.00116.</w:t>
+        <w:t>M.-J. Kwon, S.-H. Nam, I.-J. Yu, H.-K. Lee and C. Kim, "Learning JPEG compression artifacts for image manipulation detection and localization," International Journal of Computer Vision, vol. 130, 2022, doi: 10.1007/s11263-022-01617-5.</w:t>
       </w:r>
     </w:p>
     <w:p>
@@ -20173,7 +20173,7 @@
           <w:szCs w:val="24"/>
           <w:shd w:val="clear" w:color="auto" w:fill="FFFFFF"/>
         </w:rPr>
-        <w:t>M. Huh, A. Liu, A. Owens and A. A. Efros, "Fighting fake news: Image splice detection via learned self-consistency," in Proc. European Conference on Computer Vision (ECCV), 2018, pp. 101-117.</w:t>
+        <w:t>J. Wang, Z. Wu, J. Chen, X. Han, A. Shrivastava, S.-N. Lim and Y.-G. Jiang, "ObjectFormer for image manipulation detection and localization," in Proc. IEEE/CVF Conference on Computer Vision and Pattern Recognition (CVPR), 2022, pp. 2364-2373, doi: 10.1109/CVPR52688.2022.00240.</w:t>
       </w:r>
     </w:p>
     <w:p>
@@ -20201,7 +20201,7 @@
           <w:szCs w:val="24"/>
           <w:shd w:val="clear" w:color="auto" w:fill="FFFFFF"/>
         </w:rPr>
-        <w:t>Y. Wu, W. Abd-Almageed and P. Natarajan, "BusterNet: Detecting copy-move image forgery with source/target localization," in Proc. European Conference on Computer Vision (ECCV), 2018, pp. 168-184.</w:t>
+        <w:t>F. Guillaro, D. Cozzolino, A. Sud, N. Dufour and L. Verdoliva, "TruFor: Leveraging all-round clues for trustworthy image forgery detection and localization," in Proc. IEEE/CVF Conference on Computer Vision and Pattern Recognition (CVPR), 2023, pp. 20606-20615, doi: 10.1109/CVPR52729.2023.01974.</w:t>
       </w:r>
     </w:p>
     <w:p>
@@ -20229,7 +20229,7 @@
           <w:szCs w:val="24"/>
           <w:shd w:val="clear" w:color="auto" w:fill="FFFFFF"/>
         </w:rPr>
-        <w:t>Y. Wu, W. AbdAlmageed and P. Natarajan, "ManTra-Net: Manipulation tracing network for detection and localization of image forgeries with anomalous features," in Proc. IEEE/CVF Conference on Computer Vision and Pattern Recognition (CVPR), 2019, pp. 9543-9552, doi: 10.1109/CVPR.2019.00977.</w:t>
+        <w:t>L. Verdoliva, "Media forensics and deepfakes: An overview," IEEE Journal of Selected Topics in Signal Processing, vol. 14, no. 5, pp. 910-932, 2020, doi: 10.1109/JSTSP.2020.3002101.</w:t>
       </w:r>
     </w:p>
     <w:p>
@@ -20257,7 +20257,7 @@
           <w:szCs w:val="24"/>
           <w:shd w:val="clear" w:color="auto" w:fill="FFFFFF"/>
         </w:rPr>
-        <w:t>X. Bi, Y. Wei, B. Xiao and W. Li, "RRU-Net: The ringed residual U-Net for image splicing forgery detection," in Proc. IEEE/CVF Conference on Computer Vision and Pattern Recognition Workshops (CVPRW), 2019, doi: 10.1109/CVPRW.2019.00010.</w:t>
+        <w:t>M. A. Qureshi and M. Deriche, "A bibliography of pixel-based blind image forgery detection techniques," Signal Processing: Image Communication, vol. 39, pp. 46-74, 2015.</w:t>
       </w:r>
     </w:p>
     <w:p>
@@ -20285,7 +20285,7 @@
           <w:szCs w:val="24"/>
           <w:shd w:val="clear" w:color="auto" w:fill="FFFFFF"/>
         </w:rPr>
-        <w:t>X. Liu, Y. Liu, J. Chen and X. Liu, "PSCC-Net: Progressive spatio-channel correlation network for image manipulation detection and localization," IEEE Transactions on Circuits and Systems for Video Technology, vol. 32, no. 11, pp. 7505-7517, 2022, doi: 10.1109/TCSVT.2022.3189545.</w:t>
+        <w:t>M. C. Stamm, M. Wu and K. J. R. Liu, "Information forensics: An overview of the first decade," IEEE Access, vol. 1, pp. 167-200, 2013, doi: 10.1109/ACCESS.2013.2260814.</w:t>
       </w:r>
     </w:p>
     <w:p>
@@ -20313,7 +20313,7 @@
           <w:szCs w:val="24"/>
           <w:shd w:val="clear" w:color="auto" w:fill="FFFFFF"/>
         </w:rPr>
-        <w:t>X. Chen, C. Dong, J. Ji, J. Cao and X. Li, "Image manipulation detection by multi-view multi-scale supervision," in Proc. IEEE/CVF International Conference on Computer Vision (ICCV), 2021, pp. 14185-14193.</w:t>
+        <w:t>N. B. A. Warif, A. W. A. Wahab, M. Y. I. Idris, R. Ramli, R. Salleh, S. Shamshirband and K.-K. R. Choo, "Copy-move forgery detection: Survey, challenges and future directions," Journal of Network and Computer Applications, vol. 75, pp. 259-278, 2016, doi: 10.1016/j.jnca.2016.09.008.</w:t>
       </w:r>
     </w:p>
     <w:p>
@@ -20341,7 +20341,7 @@
           <w:szCs w:val="24"/>
           <w:shd w:val="clear" w:color="auto" w:fill="FFFFFF"/>
         </w:rPr>
-        <w:t>M.-J. Kwon, S.-H. Nam, I.-J. Yu, H.-K. Lee and C. Kim, "Learning JPEG compression artifacts for image manipulation detection and localization," International Journal of Computer Vision, vol. 130, 2022, doi: 10.1007/s11263-022-01617-5.</w:t>
+        <w:t>G. Muhammad, M. H. Al-Hammadi, M. Hussain and G. Bebis, "Image forgery detection using steerable pyramid transform and local binary pattern," Machine Vision and Applications, vol. 25, no. 4, pp. 985-995, 2014, doi: 10.1007/s00138-013-0547-4.</w:t>
       </w:r>
     </w:p>
     <w:p>
@@ -20369,7 +20369,7 @@
           <w:szCs w:val="24"/>
           <w:shd w:val="clear" w:color="auto" w:fill="FFFFFF"/>
         </w:rPr>
-        <w:t>J. Wang, Z. Wu, J. Chen, X. Han, A. Shrivastava, S.-N. Lim and Y.-G. Jiang, "ObjectFormer for image manipulation detection and localization," in Proc. IEEE/CVF Conference on Computer Vision and Pattern Recognition (CVPR), 2022, pp. 2364-2373, doi: 10.1109/CVPR52688.2022.00240.</w:t>
+        <w:t>J. Dong, W. Wang and T. Tan, "CASIA image tampering detection evaluation database," in Proc. IEEE China Summit and International Conference on Signal and Information Processing (ChinaSIP), 2013.</w:t>
       </w:r>
     </w:p>
     <w:p>
@@ -20397,7 +20397,7 @@
           <w:szCs w:val="24"/>
           <w:shd w:val="clear" w:color="auto" w:fill="FFFFFF"/>
         </w:rPr>
-        <w:t>F. Guillaro, D. Cozzolino, A. Sud, N. Dufour and L. Verdoliva, "TruFor: Leveraging all-round clues for trustworthy image forgery detection and localization," in Proc. IEEE/CVF Conference on Computer Vision and Pattern Recognition (CVPR), 2023, pp. 20606-20615, doi: 10.1109/CVPR52729.2023.01974.</w:t>
+        <w:t>Y.-F. Hsu and S.-F. Chang, "Detecting image splicing using geometry invariants and camera characteristics consistency," in Proc. IEEE International Conference on Multimedia and Expo (ICME), 2006.</w:t>
       </w:r>
     </w:p>
     <w:p>
@@ -20425,7 +20425,7 @@
           <w:szCs w:val="24"/>
           <w:shd w:val="clear" w:color="auto" w:fill="FFFFFF"/>
         </w:rPr>
-        <w:t>L. Verdoliva, "Media forensics and deepfakes: An overview," IEEE Journal of Selected Topics in Signal Processing, vol. 14, no. 5, pp. 910-932, 2020, doi: 10.1109/JSTSP.2020.3002101.</w:t>
+        <w:t>T.-T. Ng and S.-F. Chang, "A data set of authentic and spliced image blocks," Columbia University, ADVENT Technical Report 203-2004-3, June 2004.</w:t>
       </w:r>
     </w:p>
     <w:p>
@@ -20453,7 +20453,7 @@
           <w:szCs w:val="24"/>
           <w:shd w:val="clear" w:color="auto" w:fill="FFFFFF"/>
         </w:rPr>
-        <w:t>M. A. Qureshi and M. Deriche, "A bibliography of pixel-based blind image forgery detection techniques," Signal Processing: Image Communication, vol. 39, pp. 46-74, 2015.</w:t>
+        <w:t>D. Tralić, I. Župančić, S. Grgić and M. Grgić, "CoMoFoD - New database for copy-move forgery detection," in Proc. 55th International Symposium ELMAR, Zadar, Croatia, 2013, pp. 49-54.</w:t>
       </w:r>
     </w:p>
     <w:p>
@@ -20481,7 +20481,7 @@
           <w:szCs w:val="24"/>
           <w:shd w:val="clear" w:color="auto" w:fill="FFFFFF"/>
         </w:rPr>
-        <w:t>M. C. Stamm, M. Wu and K. J. R. Liu, "Information forensics: An overview of the first decade," IEEE Access, vol. 1, pp. 167-200, 2013, doi: 10.1109/ACCESS.2013.2260814.</w:t>
+        <w:t>B. Wen, Y. Zhu, R. Subramanian, T.-T. Ng, X. Shen and S. Winkler, "COVERAGE - A novel database for copy-move forgery detection," in Proc. IEEE International Conference on Image Processing (ICIP), 2016, pp. 161-165.</w:t>
       </w:r>
     </w:p>
     <w:p>
@@ -20509,7 +20509,7 @@
           <w:szCs w:val="24"/>
           <w:shd w:val="clear" w:color="auto" w:fill="FFFFFF"/>
         </w:rPr>
-        <w:t>N. B. A. Warif, A. W. A. Wahab, M. Y. I. Idris, R. Ramli, R. Salleh, S. Shamshirband and K.-K. R. Choo, "Copy-move forgery detection: Survey, challenges and future directions," Journal of Network and Computer Applications, vol. 75, pp. 259-278, 2016, doi: 10.1016/j.jnca.2016.09.008.</w:t>
+        <w:t>T. Gloe and R. Böhme, "The 'Dresden Image Database' for benchmarking digital image forensics," in Proc. ACM Symposium on Applied Computing (SAC), 2010, pp. 1584-1590.</w:t>
       </w:r>
     </w:p>
     <w:p>
@@ -20537,7 +20537,7 @@
           <w:szCs w:val="24"/>
           <w:shd w:val="clear" w:color="auto" w:fill="FFFFFF"/>
         </w:rPr>
-        <w:t>G. Muhammad, M. H. Al-Hammadi, M. Hussain and G. Bebis, "Image forgery detection using steerable pyramid transform and local binary pattern," Machine Vision and Applications, vol. 25, no. 4, pp. 985-995, 2014, doi: 10.1007/s00138-013-0547-4.</w:t>
+        <w:t>K. He, X. Zhang, S. Ren and J. Sun, "Deep residual learning for image recognition," in Proc. IEEE Conference on Computer Vision and Pattern Recognition (CVPR), 2016, pp. 770-778.</w:t>
       </w:r>
     </w:p>
     <w:p>
@@ -20565,7 +20565,7 @@
           <w:szCs w:val="24"/>
           <w:shd w:val="clear" w:color="auto" w:fill="FFFFFF"/>
         </w:rPr>
-        <w:t>T.-T. Ng and S.-F. Chang, "A data set of authentic and spliced image blocks," Columbia University, ADVENT Technical Report 203-2004-3, June 2004.</w:t>
+        <w:t>A. Dosovitskiy et al., "An image is worth 16x16 words: Transformers for image recognition at scale," in Proc. International Conference on Learning Representations (ICLR), 2021.</w:t>
       </w:r>
     </w:p>
     <w:p>
@@ -20593,7 +20593,7 @@
           <w:szCs w:val="24"/>
           <w:shd w:val="clear" w:color="auto" w:fill="FFFFFF"/>
         </w:rPr>
-        <w:t>D. Tralić, I. Župančić, S. Grgić and M. Grgić, "CoMoFoD - New database for copy-move forgery detection," in Proc. 55th International Symposium ELMAR, Zadar, Croatia, 2013, pp. 49-54.</w:t>
+        <w:t>M. Tan and Q. V. Le, "EfficientNet: Rethinking model scaling for convolutional neural networks," in Proc. International Conference on Machine Learning (ICML), 2019.</w:t>
       </w:r>
     </w:p>
     <w:p>
@@ -20621,7 +20621,7 @@
           <w:szCs w:val="24"/>
           <w:shd w:val="clear" w:color="auto" w:fill="FFFFFF"/>
         </w:rPr>
-        <w:t>B. Wen, Y. Zhu, R. Subramanian, T.-T. Ng, X. Shen and S. Winkler, "COVERAGE - A novel database for copy-move forgery detection," in Proc. IEEE International Conference on Image Processing (ICIP), 2016, pp. 161-165.</w:t>
+        <w:t>O. Ronneberger, P. Fischer and T. Brox, "U-Net: Convolutional networks for biomedical image segmentation," in Proc. Medical Image Computing and Computer-Assisted Intervention (MICCAI), 2015, pp. 234-241.</w:t>
       </w:r>
     </w:p>
     <w:p>
@@ -20649,7 +20649,7 @@
           <w:szCs w:val="24"/>
           <w:shd w:val="clear" w:color="auto" w:fill="FFFFFF"/>
         </w:rPr>
-        <w:t>T. Gloe and R. Böhme, "The 'Dresden Image Database' for benchmarking digital image forensics," in Proc. ACM Symposium on Applied Computing (SAC), 2010, pp. 1584-1590.</w:t>
+        <w:t>I. Loshchilov and F. Hutter, "Decoupled weight decay regularization," in Proc. International Conference on Learning Representations (ICLR), 2019.</w:t>
       </w:r>
     </w:p>
     <w:p>
@@ -20677,7 +20677,7 @@
           <w:szCs w:val="24"/>
           <w:shd w:val="clear" w:color="auto" w:fill="FFFFFF"/>
         </w:rPr>
-        <w:t>K. He, X. Zhang, S. Ren and J. Sun, "Deep residual learning for image recognition," in Proc. IEEE Conference on Computer Vision and Pattern Recognition (CVPR), 2016, pp. 770-778.</w:t>
+        <w:t>H. R. Hasan and K. Salah, "Combating deepfake videos using blockchain and smart contracts," IEEE Access, vol. 7, pp. 41596-41606, 2019.</w:t>
       </w:r>
     </w:p>
     <w:p>
@@ -20705,7 +20705,7 @@
           <w:szCs w:val="24"/>
           <w:shd w:val="clear" w:color="auto" w:fill="FFFFFF"/>
         </w:rPr>
-        <w:t>A. Dosovitskiy et al., "An image is worth 16x16 words: Transformers for image recognition at scale," in Proc. International Conference on Learning Representations (ICLR), 2021.</w:t>
+        <w:t>R. R. Selvaraju, M. Cogswell, A. Das, R. Vedantam, D. Parikh and D. Batra, "Grad-CAM: Visual explanations from deep networks via gradient-based localization," in Proc. IEEE International Conference on Computer Vision (ICCV), 2017.</w:t>
       </w:r>
     </w:p>
     <w:p>
@@ -20733,7 +20733,7 @@
           <w:szCs w:val="24"/>
           <w:shd w:val="clear" w:color="auto" w:fill="FFFFFF"/>
         </w:rPr>
-        <w:t>O. Ronneberger, P. Fischer and T. Brox, "U-Net: Convolutional networks for biomedical image segmentation," in Proc. Medical Image Computing and Computer-Assisted Intervention (MICCAI), 2015, pp. 234-241.</w:t>
+        <w:t>Coalition for Content Provenance and Authenticity, "C2PA technical specification," https://c2pa.org.</w:t>
       </w:r>
     </w:p>
     <w:p>
@@ -20761,7 +20761,7 @@
           <w:szCs w:val="24"/>
           <w:shd w:val="clear" w:color="auto" w:fill="FFFFFF"/>
         </w:rPr>
-        <w:t>I. Loshchilov and F. Hutter, "Decoupled weight decay regularization," in Proc. International Conference on Learning Representations (ICLR), 2019.</w:t>
+        <w:t>D. J. Bernstein, N. Duif, T. Lange, P. Schwabe and B.-Y. Yang, "High-speed high-security signatures," Journal of Cryptographic Engineering, vol. 2, no. 2, pp. 77-89, 2012.</w:t>
       </w:r>
     </w:p>
     <w:p>
@@ -20789,7 +20789,7 @@
           <w:szCs w:val="24"/>
           <w:shd w:val="clear" w:color="auto" w:fill="FFFFFF"/>
         </w:rPr>
-        <w:t>H. R. Hasan and K. Salah, "Combating deepfake videos using blockchain and smart contracts," IEEE Access, vol. 7, pp. 41596-41606, 2019.</w:t>
+        <w:t>ductai199x, "image-manipulation-dataset-compilation," Hugging Face dataset, https://huggingface.co/datasets/ductai199x/image-manipulation-dataset-compilation.</w:t>
       </w:r>
     </w:p>
     <w:p>

</xml_diff>

<commit_message>
Report: fix Columbia pooled/mean wording, clarify speed figures, correct dataset claims, rewrite two near-source sentences
Co-Authored-By: Claude Sonnet 5.5 <noreply@anthropic.com>
</commit_message>
<xml_diff>
--- a/docs/report/TrustSphere_AI_Project_Report.docx
+++ b/docs/report/TrustSphere_AI_Project_Report.docx
@@ -4001,7 +4001,7 @@
               </w:rPr>
             </w:pPr>
             <w:r>
-              <w:t>6</w:t>
+              <w:t>7</w:t>
             </w:r>
           </w:p>
         </w:tc>
@@ -5206,7 +5206,7 @@
               </w:rPr>
             </w:pPr>
             <w:r>
-              <w:t>27</w:t>
+              <w:t>28</w:t>
             </w:r>
           </w:p>
         </w:tc>
@@ -5284,7 +5284,7 @@
               </w:rPr>
             </w:pPr>
             <w:r>
-              <w:t>28</w:t>
+              <w:t>29</w:t>
             </w:r>
           </w:p>
         </w:tc>
@@ -5346,7 +5346,7 @@
               </w:rPr>
             </w:pPr>
             <w:r>
-              <w:t>32</w:t>
+              <w:t>33</w:t>
             </w:r>
           </w:p>
         </w:tc>
@@ -8449,7 +8449,7 @@
           <w:i w:val="0"/>
           <w:sz w:val="24"/>
         </w:rPr>
-        <w:t>The image forensics agent uses a detector that we trained, which is an EfficientNet-B0 network that reads error level analysis maps made at three JPEG qualities from crops at the original resolution. We trained and tested it on a subset of CASIA v2.0 (1,536 authentic and 1,283 tampered images) and on Columbia (183 authentic and 180 spliced images). With 5-fold cross-validation on CASIA v2.0 the accuracy is 95.53% with a random split and 95.32% when each tampered image stays in the same fold as its source, and on 588 images that were never used in training it reaches 96.26% while the full pipeline gives a verdict on 90.5% of them with 97.9% accuracy and sends the rest to a person. Columbia is harder because its photos are uncompressed, so a whole image detector reaches only 87.60% while a patch based detector on noise residuals reaches 97.25% with a random split and 96.97% when every scene stays in one fold. A model that outlines the tampered area and was trained on CASIA does not work well on Columbia (pixel F1 0.43) and we compare all results with the five base papers and state this weakness.</w:t>
+        <w:t>The image forensics agent uses a detector that we trained, which is an EfficientNet-B0 network that reads error level analysis maps made at three JPEG qualities from crops at the original resolution. We trained and tested it on a subset of CASIA v2.0 (1,536 authentic and 1,283 tampered images) and on Columbia (183 authentic and 180 spliced images). With 5-fold cross-validation on CASIA v2.0 the accuracy is 95.53% with a random split and 95.32% when each tampered image stays in the same fold as its source, and on 588 images that were never used in training it reaches 96.26% while the full pipeline gives a verdict on 90.5% of them with 97.9% accuracy and sends the rest to a person. Columbia is harder because its photos are uncompressed, so a whole image detector reaches only 87.60% (mean of the folds), while a patch based detector on noise residuals reaches 97.25% with a random split and 96.97% when every scene stays in one fold (accuracy pooled over all folds). A model that outlines the tampered area and was trained on CASIA does not work well on Columbia (pixel F1 0.43). We compare the results with the base papers, list in Chapter 7 the results that we exceed and state the weaknesses as well, and the full comparison is in the project repository.</w:t>
       </w:r>
     </w:p>
     <w:p>
@@ -8615,7 +8615,7 @@
           <w:i w:val="0"/>
           <w:sz w:val="24"/>
         </w:rPr>
-        <w:t>•  Published detectors report accuracies above 90% on CASIA v2.0 and Columbia [1-3] but most are research code that gives a label for one dataset and stops, while an analyst needs an application that takes any image and explains its answer.</w:t>
+        <w:t>•  Published detectors report accuracies above 90% on CASIA v2.0 or Columbia [1-3] but most are research code that gives a label for one dataset and stops, while an analyst needs an application that takes any image and explains its answer.</w:t>
       </w:r>
     </w:p>
     <w:p>
@@ -8775,7 +8775,7 @@
           <w:i w:val="0"/>
           <w:sz w:val="24"/>
         </w:rPr>
-        <w:t xml:space="preserve"> CASIA v2.0 and Columbia, which are the two image datasets used by the base papers [1-5].</w:t>
+        <w:t xml:space="preserve"> CASIA v2.0 and Columbia. CASIA v2.0 is used by all five base papers [1-5] and Columbia by two of them [1, 5].</w:t>
       </w:r>
     </w:p>
     <w:p>
@@ -8966,7 +8966,7 @@
           <w:i w:val="0"/>
           <w:sz w:val="24"/>
         </w:rPr>
-        <w:t>Deep networks learn these traces from data, and Bayar and Stamm add a constrained first layer that suppresses image content and learns features for manipulation detection [19] and Zhou et al. use an RGB stream and a noise stream in a Faster R-CNN [20]. Huh et al. train only on real photos and use their EXIF data to learn whether an image is self consistent, meaning that it could come from one imaging pipeline, and then use this to find splices without ever seeing forged examples [21]. BusterNet separates the source and target regions of copy-move forgery [22] and ManTra-Net learns many manipulation types and treats localisation as finding anomalies [23], while RRU-Net adds residual feedback to a U-Net [24] and PSCC-Net predicts masks step by step at several scales [25]. MVSS-Net learns from the noise view and from boundary artifacts and is supervised at several scales [26], CAT-Net learns from JPEG DCT coefficients and pixels [27], ObjectFormer uses RGB and high frequency features in a transformer [28] and TruFor adds a learned noise fingerprint and a reliability map [29]. Most of these papers are judged on how well they locate the tampered pixels but our detector answers the image level question of authentic or tampered, which is the same question that the base papers [1-4] answer.</w:t>
+        <w:t>Deep networks learn these traces from data. Bayar and Stamm put a constraint on the first convolutional layer, so the network ignores what the picture shows and learns the small differences between neighbouring pixels that editing leaves behind [19]. Zhou et al. pass the picture and a noise version of it through two branches of a Faster R-CNN [20]. Huh et al. need no forged examples at all, since they train only on real photographs to tell whether two patches carry the same EXIF attributes and then mark the patches that disagree with the rest of the image as a splice [21]. BusterNet separates the source and target regions of copy-move forgery [22] and ManTra-Net learns many manipulation types and treats localisation as finding anomalies [23], while RRU-Net adds residual feedback to a U-Net [24] and PSCC-Net predicts masks step by step at several scales [25]. MVSS-Net learns from the noise view and from boundary artifacts and is supervised at several scales [26], CAT-Net learns from JPEG DCT coefficients and pixels [27], ObjectFormer uses RGB and high frequency features in a transformer [28] and TruFor adds a learned noise fingerprint and a reliability map [29]. Most of these papers are judged on how well they locate the tampered pixels but our detector answers the image level question of authentic or tampered, which is the same question that the base papers [1-4] answer.</w:t>
       </w:r>
     </w:p>
     <w:p>
@@ -10297,7 +10297,7 @@
                 <w:b w:val="0"/>
                 <w:sz w:val="20"/>
               </w:rPr>
-              <w:t>Project set-up: FastAPI backend, Next.js scaffold, repository</w:t>
+              <w:t>Project set-up: FastAPI backend and web front end, repository</w:t>
             </w:r>
           </w:p>
         </w:tc>
@@ -11055,7 +11055,7 @@
           <w:i w:val="0"/>
           <w:sz w:val="24"/>
         </w:rPr>
-        <w:t xml:space="preserve"> analyse one image in seconds on one GPU, and on the 588 held out images the whole pipeline took 0.24 s per image on average, which is about 142 s in total.</w:t>
+        <w:t xml:space="preserve"> analyse one image in seconds on one GPU. On the 588 held out images the three agents and the decision engine took 0.24 s per image on average (about 142 s in total), and this does not include upload, signing, PDF creation or loading the model for the first time, which is why a full request through the web application takes several seconds (Table 5.1).</w:t>
       </w:r>
     </w:p>
     <w:p>
@@ -13181,7 +13181,7 @@
           <w:i w:val="0"/>
           <w:sz w:val="24"/>
         </w:rPr>
-        <w:t>The engine takes the weighted mean of the agent scores and applies the thresholds, where Authentic is at or above 0.75 and Fake is at or below 0.40 and anything between is Inconclusive, and it also writes a list of reasons. When the trained detector flags the image the manipulation type is shown as Image Splicing / Tampering, and the Inconclusive band is deliberate because it sends borderline images to a person.</w:t>
+        <w:t>The engine takes the weighted mean of the agent scores and applies the thresholds, where Authentic is at or above 0.75 and Fake is at or below 0.40 and anything between is Inconclusive, and it also writes a list of reasons. When the trained detector flags the image the manipulation type is shown as Image Splicing / Tampering, and an Inconclusive image is left for a person to review.</w:t>
       </w:r>
     </w:p>
     <w:p>
@@ -13513,7 +13513,7 @@
           <w:i w:val="0"/>
           <w:sz w:val="24"/>
         </w:rPr>
-        <w:t>A script (scripts/e2e_test.py) drives a running server through its public API with six images, three authentic and three tampered, and all 19 checks passed. This includes the tamper check, where changing one byte of a stored evidence file makes the verification endpoint report TAMPERED and restoring the file makes it pass again.</w:t>
+        <w:t>A script (scripts/e2e_test.py) drives a running server through its public API with six images, three authentic and three tampered, and all 19 checks passed. This includes the tamper check, where changing one byte of a stored evidence file makes the verification endpoint report TAMPERED and restoring the file makes it pass again. The times in the detail column are for the whole request, with upload, signing and PDF creation included and the model loading during the first image, so they are longer than the 0.24 s spent in the agents and the decision engine.</w:t>
       </w:r>
     </w:p>
     <w:p>
@@ -17528,7 +17528,7 @@
           <w:i w:val="0"/>
           <w:sz w:val="24"/>
         </w:rPr>
-        <w:t>Columbia has uncompressed photographs, so error level analysis which depends on JPEG history has little to work with, and 363 images are also few for training a network on whole images. We tried three variants and all are listed above, and the whole image variants are much less stable than on CASIA since their folds differ by more than ten points. The patch based variant cuts the image into 128 pixel patches and labels them using the ground truth masks and scores an image by the mean of its top 5% patch probabilities and takes the decision threshold from the other folds. Columbia photographs share scenes, so the last row repeats the test with every scene kept inside one fold and it is the stricter figure.</w:t>
+        <w:t>Columbia has uncompressed photographs, so error level analysis which depends on JPEG history has little to work with, and 363 images are also few for training a network on whole images. We tried three variants and all are listed above, and the whole image variants are much less stable than on CASIA since their folds differ by more than ten points. The patch based variant cuts the image into 128 pixel patches and labels them using the ground truth masks and scores an image by the mean of its top 5% patch probabilities and takes the decision threshold from the other folds. Columbia photographs share scenes, so the last row repeats the test with every scene kept inside one fold and it is the stricter figure. The accuracy column is the mean of the five folds, while the abstract gives the accuracy pooled over all 363 images, which is 96.97% for the last row and the same as the mean for the other rows.</w:t>
       </w:r>
     </w:p>
     <w:p>
@@ -19163,7 +19163,7 @@
                 <w:b w:val="0"/>
                 <w:sz w:val="20"/>
               </w:rPr>
-              <w:t>About 0.24 s on the GPU (measured on 588 images)</w:t>
+              <w:t>About 0.24 s on the GPU for the agents and decision engine (measured on 588 images); a full web request takes several seconds</w:t>
             </w:r>
           </w:p>
         </w:tc>

</xml_diff>

<commit_message>
Report: state the programme as B.Tech CSE (Information Security) on cover, declaration and certificate
Co-Authored-By: Claude Sonnet 5.5 <noreply@anthropic.com>
</commit_message>
<xml_diff>
--- a/docs/report/TrustSphere_AI_Project_Report.docx
+++ b/docs/report/TrustSphere_AI_Project_Report.docx
@@ -335,10 +335,10 @@
       <w:r>
         <w:rPr>
           <w:b/>
-          <w:sz w:val="38"/>
+          <w:sz w:val="30"/>
           <w:szCs w:val="38"/>
         </w:rPr>
-        <w:t>Computer Science and Engineering</w:t>
+        <w:t>Computer Science and Engineering (Information Security)</w:t>
       </w:r>
     </w:p>
     <w:p>
@@ -1073,27 +1073,23 @@
           <w:i/>
           <w:spacing w:val="1"/>
         </w:rPr>
-        <w:t>Bachelor of Technology in Computer Science and Engineering</w:t>
+        <w:t>Bachelor of Technology in Computer Science and Engineering (Information Security) to VIT</w:t>
       </w:r>
       <w:r>
         <w:rPr>
           <w:spacing w:val="1"/>
         </w:rPr>
-        <w:t xml:space="preserve"> </w:t>
       </w:r>
       <w:r>
         <w:rPr/>
-        <w:t>to</w:t>
       </w:r>
       <w:r>
         <w:rPr>
           <w:spacing w:val="1"/>
         </w:rPr>
-        <w:t xml:space="preserve"> </w:t>
       </w:r>
       <w:r>
         <w:rPr/>
-        <w:t>VIT</w:t>
       </w:r>
       <w:r>
         <w:rPr>
@@ -1681,11 +1677,11 @@
           <w:i/>
           <w:spacing w:val="1"/>
         </w:rPr>
-        <w:t>Bachelor of Technology in Computer Science and Engineering</w:t>
+        <w:t>Bachelor of Technology in Computer Science and Engineering (Information Security),</w:t>
       </w:r>
       <w:r>
         <w:rPr/>
-        <w:t>, is a record of bonafide work carried out by</w:t>
+        <w:t xml:space="preserve"> is a record of bonafide work carried out by</w:t>
       </w:r>
       <w:r>
         <w:rPr>
@@ -2302,7 +2298,7 @@
           <w:sz w:val="24"/>
           <w:szCs w:val="24"/>
         </w:rPr>
-        <w:t>B.Tech</w:t>
+        <w:t>B.Tech. CSE (Information Security)</w:t>
       </w:r>
       <w:r>
         <w:rPr>

</xml_diff>

<commit_message>
Report: project title in black on declaration and certificate; fix missing spaces in certificate
Co-Authored-By: Claude Sonnet 5.5 <noreply@anthropic.com>
</commit_message>
<xml_diff>
--- a/docs/report/TrustSphere_AI_Project_Report.docx
+++ b/docs/report/TrustSphere_AI_Project_Report.docx
@@ -903,167 +903,219 @@
         <w:jc w:val="both"/>
       </w:pPr>
       <w:r>
-        <w:rPr/>
+        <w:rPr>
+          <w:color w:val="000000"/>
+        </w:rPr>
         <w:t>We hereby declare that the project entitled</w:t>
       </w:r>
       <w:r>
         <w:rPr>
+          <w:color w:val="000000"/>
           <w:spacing w:val="1"/>
         </w:rPr>
       </w:r>
       <w:r>
-        <w:rPr/>
-      </w:r>
-      <w:r>
-        <w:rPr>
+        <w:rPr>
+          <w:color w:val="000000"/>
+        </w:rPr>
+      </w:r>
+      <w:r>
+        <w:rPr>
+          <w:color w:val="000000"/>
           <w:spacing w:val="1"/>
         </w:rPr>
       </w:r>
       <w:r>
-        <w:rPr/>
-      </w:r>
-      <w:r>
-        <w:rPr>
+        <w:rPr>
+          <w:color w:val="000000"/>
+        </w:rPr>
+      </w:r>
+      <w:r>
+        <w:rPr>
+          <w:color w:val="000000"/>
           <w:spacing w:val="1"/>
         </w:rPr>
       </w:r>
       <w:r>
-        <w:rPr/>
-      </w:r>
-      <w:r>
-        <w:rPr>
+        <w:rPr>
+          <w:color w:val="000000"/>
+        </w:rPr>
+      </w:r>
+      <w:r>
+        <w:rPr>
+          <w:color w:val="000000"/>
           <w:spacing w:val="1"/>
         </w:rPr>
       </w:r>
       <w:r>
-        <w:rPr/>
-      </w:r>
-      <w:r>
-        <w:rPr>
+        <w:rPr>
+          <w:color w:val="000000"/>
+        </w:rPr>
+      </w:r>
+      <w:r>
+        <w:rPr>
+          <w:color w:val="000000"/>
           <w:spacing w:val="1"/>
         </w:rPr>
       </w:r>
       <w:r>
-        <w:rPr/>
-      </w:r>
-      <w:r>
-        <w:rPr/>
-      </w:r>
-      <w:r>
-        <w:rPr>
+        <w:rPr>
+          <w:color w:val="000000"/>
+        </w:rPr>
+      </w:r>
+      <w:r>
+        <w:rPr>
+          <w:color w:val="000000"/>
+        </w:rPr>
+      </w:r>
+      <w:r>
+        <w:rPr>
+          <w:color w:val="000000"/>
           <w:spacing w:val="1"/>
         </w:rPr>
       </w:r>
       <w:r>
-        <w:rPr/>
+        <w:rPr>
+          <w:color w:val="000000"/>
+        </w:rPr>
         <w:t xml:space="preserve"> </w:t>
       </w:r>
       <w:r>
         <w:rPr>
-          <w:color w:val="FF0000"/>
+          <w:color w:val="000000"/>
         </w:rPr>
         <w:t>TrustSphere AI: A Multi-Agent Framework for Image Manipulation Detection with Verifiable Digital Evidence</w:t>
       </w:r>
       <w:r>
         <w:rPr>
-          <w:color w:val="FF0000"/>
+          <w:color w:val="000000"/>
           <w:spacing w:val="1"/>
         </w:rPr>
         <w:t xml:space="preserve"> </w:t>
       </w:r>
       <w:r>
-        <w:rPr/>
+        <w:rPr>
+          <w:color w:val="000000"/>
+        </w:rPr>
         <w:t>submitted by us</w:t>
       </w:r>
       <w:r>
         <w:rPr>
+          <w:color w:val="000000"/>
           <w:spacing w:val="1"/>
         </w:rPr>
       </w:r>
       <w:r>
-        <w:rPr/>
-      </w:r>
-      <w:r>
-        <w:rPr>
+        <w:rPr>
+          <w:color w:val="000000"/>
+        </w:rPr>
+      </w:r>
+      <w:r>
+        <w:rPr>
+          <w:color w:val="000000"/>
           <w:spacing w:val="1"/>
         </w:rPr>
       </w:r>
       <w:r>
-        <w:rPr/>
+        <w:rPr>
+          <w:color w:val="000000"/>
+        </w:rPr>
         <w:t>,</w:t>
       </w:r>
       <w:r>
         <w:rPr>
+          <w:color w:val="000000"/>
           <w:spacing w:val="1"/>
         </w:rPr>
         <w:t xml:space="preserve"> </w:t>
       </w:r>
       <w:r>
-        <w:rPr/>
+        <w:rPr>
+          <w:color w:val="000000"/>
+        </w:rPr>
         <w:t>for</w:t>
       </w:r>
       <w:r>
         <w:rPr>
+          <w:color w:val="000000"/>
           <w:spacing w:val="1"/>
         </w:rPr>
         <w:t xml:space="preserve"> </w:t>
       </w:r>
       <w:r>
-        <w:rPr/>
+        <w:rPr>
+          <w:color w:val="000000"/>
+        </w:rPr>
         <w:t>the</w:t>
       </w:r>
       <w:r>
         <w:rPr>
+          <w:color w:val="000000"/>
           <w:spacing w:val="1"/>
         </w:rPr>
         <w:t xml:space="preserve"> </w:t>
       </w:r>
       <w:r>
-        <w:rPr/>
+        <w:rPr>
+          <w:color w:val="000000"/>
+        </w:rPr>
         <w:t>award</w:t>
       </w:r>
       <w:r>
         <w:rPr>
+          <w:color w:val="000000"/>
           <w:spacing w:val="1"/>
         </w:rPr>
         <w:t xml:space="preserve"> </w:t>
       </w:r>
       <w:r>
-        <w:rPr/>
+        <w:rPr>
+          <w:color w:val="000000"/>
+        </w:rPr>
         <w:t>of</w:t>
       </w:r>
       <w:r>
         <w:rPr>
+          <w:color w:val="000000"/>
           <w:spacing w:val="1"/>
         </w:rPr>
         <w:t xml:space="preserve"> </w:t>
       </w:r>
       <w:r>
-        <w:rPr/>
+        <w:rPr>
+          <w:color w:val="000000"/>
+        </w:rPr>
         <w:t>the</w:t>
       </w:r>
       <w:r>
         <w:rPr>
+          <w:color w:val="000000"/>
           <w:spacing w:val="1"/>
         </w:rPr>
         <w:t xml:space="preserve"> </w:t>
       </w:r>
       <w:r>
-        <w:rPr/>
+        <w:rPr>
+          <w:color w:val="000000"/>
+        </w:rPr>
         <w:t>degree</w:t>
       </w:r>
       <w:r>
         <w:rPr>
+          <w:color w:val="000000"/>
           <w:spacing w:val="1"/>
         </w:rPr>
         <w:t xml:space="preserve"> </w:t>
       </w:r>
       <w:r>
-        <w:rPr/>
+        <w:rPr>
+          <w:color w:val="000000"/>
+        </w:rPr>
         <w:t>of</w:t>
       </w:r>
       <w:r>
         <w:rPr>
+          <w:color w:val="000000"/>
           <w:spacing w:val="1"/>
         </w:rPr>
         <w:t xml:space="preserve"> </w:t>
@@ -1071,87 +1123,104 @@
       <w:r>
         <w:rPr>
           <w:i/>
+          <w:color w:val="000000"/>
           <w:spacing w:val="1"/>
         </w:rPr>
         <w:t>Bachelor of Technology in Computer Science and Engineering (Information Security) to VIT</w:t>
       </w:r>
       <w:r>
         <w:rPr>
+          <w:color w:val="000000"/>
           <w:spacing w:val="1"/>
         </w:rPr>
       </w:r>
       <w:r>
-        <w:rPr/>
-      </w:r>
-      <w:r>
-        <w:rPr>
+        <w:rPr>
+          <w:color w:val="000000"/>
+        </w:rPr>
+      </w:r>
+      <w:r>
+        <w:rPr>
+          <w:color w:val="000000"/>
           <w:spacing w:val="1"/>
         </w:rPr>
       </w:r>
       <w:r>
-        <w:rPr/>
-      </w:r>
-      <w:r>
-        <w:rPr>
+        <w:rPr>
+          <w:color w:val="000000"/>
+        </w:rPr>
+      </w:r>
+      <w:r>
+        <w:rPr>
+          <w:color w:val="000000"/>
           <w:spacing w:val="1"/>
         </w:rPr>
         <w:t xml:space="preserve"> </w:t>
       </w:r>
       <w:r>
-        <w:rPr/>
+        <w:rPr>
+          <w:color w:val="000000"/>
+        </w:rPr>
         <w:t>is a record of bonafide work carried out by us under the</w:t>
       </w:r>
       <w:r>
         <w:rPr>
+          <w:color w:val="000000"/>
           <w:spacing w:val="1"/>
         </w:rPr>
         <w:t xml:space="preserve"> </w:t>
       </w:r>
       <w:r>
-        <w:rPr/>
+        <w:rPr>
+          <w:color w:val="000000"/>
+        </w:rPr>
         <w:t>supervision</w:t>
       </w:r>
       <w:r>
         <w:rPr>
+          <w:color w:val="000000"/>
           <w:spacing w:val="-4"/>
         </w:rPr>
         <w:t xml:space="preserve"> </w:t>
       </w:r>
       <w:r>
-        <w:rPr/>
+        <w:rPr>
+          <w:color w:val="000000"/>
+        </w:rPr>
         <w:t>of</w:t>
       </w:r>
       <w:r>
         <w:rPr>
+          <w:color w:val="000000"/>
           <w:spacing w:val="-7"/>
         </w:rPr>
         <w:t xml:space="preserve"> Prof. Manikandan G.</w:t>
       </w:r>
       <w:r>
         <w:rPr>
-          <w:color w:val="FF0000"/>
+          <w:color w:val="000000"/>
           <w:spacing w:val="-7"/>
         </w:rPr>
       </w:r>
       <w:r>
         <w:rPr>
-          <w:color w:val="FF0000"/>
-        </w:rPr>
-      </w:r>
-      <w:r>
-        <w:rPr>
-          <w:color w:val="FF0000"/>
+          <w:color w:val="000000"/>
+        </w:rPr>
+      </w:r>
+      <w:r>
+        <w:rPr>
+          <w:color w:val="000000"/>
           <w:spacing w:val="1"/>
         </w:rPr>
       </w:r>
       <w:r>
         <w:rPr>
-          <w:color w:val="FF0000"/>
-        </w:rPr>
-      </w:r>
-      <w:r>
-        <w:rPr>
-          <w:color w:val="FF0000"/>
+          <w:color w:val="000000"/>
+        </w:rPr>
+      </w:r>
+      <w:r>
+        <w:rPr>
+          <w:color w:val="000000"/>
         </w:rPr>
       </w:r>
     </w:p>
@@ -1163,117 +1232,152 @@
         <w:jc w:val="both"/>
       </w:pPr>
       <w:r>
-        <w:rPr/>
+        <w:rPr>
+          <w:color w:val="000000"/>
+        </w:rPr>
         <w:t>We further declare that the work reported in this project has not been submitted</w:t>
       </w:r>
       <w:r>
         <w:rPr>
+          <w:color w:val="000000"/>
           <w:spacing w:val="1"/>
         </w:rPr>
         <w:t xml:space="preserve"> </w:t>
       </w:r>
       <w:r>
-        <w:rPr/>
+        <w:rPr>
+          <w:color w:val="000000"/>
+        </w:rPr>
         <w:t>and will not be submitted, either in part or in full, for the award of any other degree or</w:t>
       </w:r>
       <w:r>
         <w:rPr>
+          <w:color w:val="000000"/>
           <w:spacing w:val="-57"/>
         </w:rPr>
         <w:t xml:space="preserve"> </w:t>
       </w:r>
       <w:r>
-        <w:rPr/>
+        <w:rPr>
+          <w:color w:val="000000"/>
+        </w:rPr>
         <w:t>diploma</w:t>
       </w:r>
       <w:r>
         <w:rPr>
+          <w:color w:val="000000"/>
           <w:spacing w:val="5"/>
         </w:rPr>
         <w:t xml:space="preserve"> </w:t>
       </w:r>
       <w:r>
-        <w:rPr/>
+        <w:rPr>
+          <w:color w:val="000000"/>
+        </w:rPr>
         <w:t>in</w:t>
       </w:r>
       <w:r>
         <w:rPr>
+          <w:color w:val="000000"/>
           <w:spacing w:val="-4"/>
         </w:rPr>
         <w:t xml:space="preserve"> </w:t>
       </w:r>
       <w:r>
-        <w:rPr/>
+        <w:rPr>
+          <w:color w:val="000000"/>
+        </w:rPr>
         <w:t>this</w:t>
       </w:r>
       <w:r>
         <w:rPr>
+          <w:color w:val="000000"/>
           <w:spacing w:val="5"/>
         </w:rPr>
         <w:t xml:space="preserve"> </w:t>
       </w:r>
       <w:r>
-        <w:rPr/>
+        <w:rPr>
+          <w:color w:val="000000"/>
+        </w:rPr>
         <w:t>institute</w:t>
       </w:r>
       <w:r>
         <w:rPr>
+          <w:color w:val="000000"/>
           <w:spacing w:val="-4"/>
         </w:rPr>
         <w:t xml:space="preserve"> </w:t>
       </w:r>
       <w:r>
-        <w:rPr/>
+        <w:rPr>
+          <w:color w:val="000000"/>
+        </w:rPr>
         <w:t>or</w:t>
       </w:r>
       <w:r>
         <w:rPr>
+          <w:color w:val="000000"/>
           <w:spacing w:val="-1"/>
         </w:rPr>
         <w:t xml:space="preserve"> </w:t>
       </w:r>
       <w:r>
-        <w:rPr/>
+        <w:rPr>
+          <w:color w:val="000000"/>
+        </w:rPr>
         <w:t>any</w:t>
       </w:r>
       <w:r>
         <w:rPr>
+          <w:color w:val="000000"/>
           <w:spacing w:val="-8"/>
         </w:rPr>
         <w:t xml:space="preserve"> </w:t>
       </w:r>
       <w:r>
-        <w:rPr/>
+        <w:rPr>
+          <w:color w:val="000000"/>
+        </w:rPr>
         <w:t>other</w:t>
       </w:r>
       <w:r>
         <w:rPr>
+          <w:color w:val="000000"/>
           <w:spacing w:val="4"/>
         </w:rPr>
         <w:t xml:space="preserve"> </w:t>
       </w:r>
       <w:r>
-        <w:rPr/>
+        <w:rPr>
+          <w:color w:val="000000"/>
+        </w:rPr>
         <w:t>institute</w:t>
       </w:r>
       <w:r>
         <w:rPr>
+          <w:color w:val="000000"/>
           <w:spacing w:val="-4"/>
         </w:rPr>
         <w:t xml:space="preserve"> </w:t>
       </w:r>
       <w:r>
-        <w:rPr/>
+        <w:rPr>
+          <w:color w:val="000000"/>
+        </w:rPr>
         <w:t>or</w:t>
       </w:r>
       <w:r>
         <w:rPr>
+          <w:color w:val="000000"/>
           <w:spacing w:val="4"/>
         </w:rPr>
         <w:t xml:space="preserve"> </w:t>
       </w:r>
       <w:r>
-        <w:rPr/>
+        <w:rPr>
+          <w:color w:val="000000"/>
+        </w:rPr>
         <w:t>university.</w:t>
       </w:r>
     </w:p>
@@ -1376,6 +1480,7 @@
       <w:r>
         <w:rPr>
           <w:b/>
+          <w:color w:val="000000"/>
           <w:sz w:val="24"/>
         </w:rPr>
         <w:t>Signature</w:t>
@@ -1383,6 +1488,7 @@
       <w:r>
         <w:rPr>
           <w:b/>
+          <w:color w:val="000000"/>
           <w:spacing w:val="-2"/>
           <w:sz w:val="24"/>
         </w:rPr>
@@ -1391,6 +1497,7 @@
       <w:r>
         <w:rPr>
           <w:b/>
+          <w:color w:val="000000"/>
           <w:sz w:val="24"/>
         </w:rPr>
         <w:t>of</w:t>
@@ -1398,6 +1505,7 @@
       <w:r>
         <w:rPr>
           <w:b/>
+          <w:color w:val="000000"/>
           <w:spacing w:val="-3"/>
           <w:sz w:val="24"/>
         </w:rPr>
@@ -1406,6 +1514,7 @@
       <w:r>
         <w:rPr>
           <w:b/>
+          <w:color w:val="000000"/>
           <w:sz w:val="24"/>
         </w:rPr>
         <w:t>the</w:t>
@@ -1413,6 +1522,7 @@
       <w:r>
         <w:rPr>
           <w:b/>
+          <w:color w:val="000000"/>
           <w:spacing w:val="-1"/>
           <w:sz w:val="24"/>
         </w:rPr>
@@ -1421,6 +1531,7 @@
       <w:r>
         <w:rPr>
           <w:b/>
+          <w:color w:val="000000"/>
           <w:sz w:val="24"/>
         </w:rPr>
         <w:t>Candidates</w:t>
@@ -1517,119 +1628,151 @@
         <w:jc w:val="both"/>
       </w:pPr>
       <w:r>
-        <w:rPr/>
+        <w:rPr>
+          <w:color w:val="000000"/>
+        </w:rPr>
         <w:t>This</w:t>
       </w:r>
       <w:r>
         <w:rPr>
+          <w:color w:val="000000"/>
           <w:spacing w:val="1"/>
         </w:rPr>
         <w:t xml:space="preserve"> </w:t>
       </w:r>
       <w:r>
-        <w:rPr/>
+        <w:rPr>
+          <w:color w:val="000000"/>
+        </w:rPr>
         <w:t>is</w:t>
       </w:r>
       <w:r>
         <w:rPr>
+          <w:color w:val="000000"/>
           <w:spacing w:val="1"/>
         </w:rPr>
         <w:t xml:space="preserve"> </w:t>
       </w:r>
       <w:r>
-        <w:rPr/>
+        <w:rPr>
+          <w:color w:val="000000"/>
+        </w:rPr>
         <w:t>to</w:t>
       </w:r>
       <w:r>
         <w:rPr>
+          <w:color w:val="000000"/>
           <w:spacing w:val="1"/>
         </w:rPr>
         <w:t xml:space="preserve"> </w:t>
       </w:r>
       <w:r>
-        <w:rPr/>
+        <w:rPr>
+          <w:color w:val="000000"/>
+        </w:rPr>
         <w:t>certify</w:t>
       </w:r>
       <w:r>
         <w:rPr>
+          <w:color w:val="000000"/>
           <w:spacing w:val="1"/>
         </w:rPr>
         <w:t xml:space="preserve"> </w:t>
       </w:r>
       <w:r>
-        <w:rPr/>
+        <w:rPr>
+          <w:color w:val="000000"/>
+        </w:rPr>
         <w:t>that</w:t>
       </w:r>
       <w:r>
         <w:rPr>
+          <w:color w:val="000000"/>
           <w:spacing w:val="60"/>
         </w:rPr>
         <w:t xml:space="preserve"> </w:t>
       </w:r>
       <w:r>
-        <w:rPr/>
+        <w:rPr>
+          <w:color w:val="000000"/>
+        </w:rPr>
         <w:t>the</w:t>
       </w:r>
       <w:r>
         <w:rPr>
+          <w:color w:val="000000"/>
           <w:spacing w:val="60"/>
         </w:rPr>
         <w:t xml:space="preserve"> </w:t>
       </w:r>
       <w:r>
-        <w:rPr/>
+        <w:rPr>
+          <w:color w:val="000000"/>
+        </w:rPr>
         <w:t>project</w:t>
       </w:r>
       <w:r>
         <w:rPr>
+          <w:color w:val="000000"/>
           <w:spacing w:val="60"/>
         </w:rPr>
         <w:t xml:space="preserve"> </w:t>
       </w:r>
       <w:r>
-        <w:rPr/>
+        <w:rPr>
+          <w:color w:val="000000"/>
+        </w:rPr>
         <w:t>entitled</w:t>
       </w:r>
       <w:r>
         <w:rPr>
+          <w:color w:val="000000"/>
           <w:spacing w:val="60"/>
         </w:rPr>
         <w:t xml:space="preserve"> </w:t>
       </w:r>
       <w:r>
         <w:rPr>
-          <w:color w:val="FF0000"/>
+          <w:color w:val="000000"/>
         </w:rPr>
         <w:t>TrustSphere AI: A Multi-Agent Framework for Image Manipulation Detection with Verifiable Digital Evidence</w:t>
       </w:r>
       <w:r>
         <w:rPr>
+          <w:color w:val="000000"/>
           <w:spacing w:val="60"/>
         </w:rPr>
         <w:t xml:space="preserve"> </w:t>
       </w:r>
       <w:r>
-        <w:rPr/>
+        <w:rPr>
+          <w:color w:val="000000"/>
+        </w:rPr>
         <w:t>submitted</w:t>
       </w:r>
       <w:r>
         <w:rPr>
+          <w:color w:val="000000"/>
           <w:spacing w:val="60"/>
         </w:rPr>
         <w:t xml:space="preserve"> </w:t>
       </w:r>
       <w:r>
-        <w:rPr/>
+        <w:rPr>
+          <w:color w:val="000000"/>
+        </w:rPr>
         <w:t>by</w:t>
       </w:r>
       <w:r>
         <w:rPr>
+          <w:color w:val="000000"/>
           <w:spacing w:val="1"/>
         </w:rPr>
         <w:t xml:space="preserve"> </w:t>
       </w:r>
       <w:r>
         <w:rPr>
+          <w:color w:val="000000"/>
           <w:spacing w:val="1"/>
         </w:rPr>
         <w:t>Divyansh Gupta (23BCI0065), Shubham Raj (23BCI0160) and Rudrarka Nath (23BCI0053)</w:t>
@@ -1637,37 +1780,43 @@
       <w:r>
         <w:rPr>
           <w:b/>
-          <w:color w:val="FF0000"/>
+          <w:color w:val="000000"/>
         </w:rPr>
       </w:r>
       <w:r>
         <w:rPr>
           <w:b/>
-          <w:color w:val="FF0000"/>
+          <w:color w:val="000000"/>
         </w:rPr>
       </w:r>
       <w:r>
         <w:rPr>
           <w:b/>
-          <w:color w:val="FF0000"/>
-        </w:rPr>
-      </w:r>
-      <w:r>
-        <w:rPr/>
+          <w:color w:val="000000"/>
+        </w:rPr>
+      </w:r>
+      <w:r>
+        <w:rPr>
+          <w:color w:val="000000"/>
+        </w:rPr>
         <w:t xml:space="preserve">, </w:t>
       </w:r>
       <w:r>
         <w:rPr>
           <w:b/>
+          <w:color w:val="000000"/>
         </w:rPr>
         <w:t>School of Computer Science and Engineering</w:t>
       </w:r>
       <w:r>
-        <w:rPr/>
+        <w:rPr>
+          <w:color w:val="000000"/>
+        </w:rPr>
         <w:t>, VIT, for the award of the degree of</w:t>
       </w:r>
       <w:r>
         <w:rPr>
+          <w:color w:val="000000"/>
           <w:spacing w:val="1"/>
         </w:rPr>
         <w:t xml:space="preserve"> </w:t>
@@ -1675,90 +1824,118 @@
       <w:r>
         <w:rPr>
           <w:i/>
+          <w:color w:val="000000"/>
           <w:spacing w:val="1"/>
         </w:rPr>
         <w:t>Bachelor of Technology in Computer Science and Engineering (Information Security),</w:t>
       </w:r>
       <w:r>
-        <w:rPr/>
+        <w:rPr>
+          <w:color w:val="000000"/>
+        </w:rPr>
         <w:t xml:space="preserve"> is a record of bonafide work carried out by</w:t>
       </w:r>
       <w:r>
         <w:rPr>
+          <w:color w:val="000000"/>
           <w:spacing w:val="1"/>
         </w:rPr>
         <w:t xml:space="preserve"> </w:t>
       </w:r>
       <w:r>
-        <w:rPr/>
+        <w:rPr>
+          <w:color w:val="000000"/>
+        </w:rPr>
         <w:t xml:space="preserve">them under my supervision during </w:t>
       </w:r>
       <w:r>
-        <w:rPr/>
+        <w:rPr>
+          <w:color w:val="000000"/>
+        </w:rPr>
         <w:t>Fall Semester 2026-2027</w:t>
       </w:r>
       <w:r>
-        <w:rPr/>
+        <w:rPr>
+          <w:color w:val="000000"/>
+        </w:rPr>
         <w:t>, as per</w:t>
       </w:r>
       <w:r>
         <w:rPr>
+          <w:color w:val="000000"/>
           <w:spacing w:val="1"/>
         </w:rPr>
         <w:t xml:space="preserve"> </w:t>
       </w:r>
       <w:r>
-        <w:rPr/>
+        <w:rPr>
+          <w:color w:val="000000"/>
+        </w:rPr>
         <w:t>the VIT code</w:t>
       </w:r>
       <w:r>
         <w:rPr>
+          <w:color w:val="000000"/>
           <w:spacing w:val="-8"/>
         </w:rPr>
         <w:t xml:space="preserve"> </w:t>
       </w:r>
       <w:r>
-        <w:rPr/>
+        <w:rPr>
+          <w:color w:val="000000"/>
+        </w:rPr>
         <w:t>of</w:t>
       </w:r>
       <w:r>
         <w:rPr>
+          <w:color w:val="000000"/>
           <w:spacing w:val="-6"/>
         </w:rPr>
         <w:t xml:space="preserve"> </w:t>
       </w:r>
       <w:r>
-        <w:rPr/>
+        <w:rPr>
+          <w:color w:val="000000"/>
+        </w:rPr>
         <w:t>academic</w:t>
       </w:r>
       <w:r>
         <w:rPr>
+          <w:color w:val="000000"/>
           <w:spacing w:val="1"/>
         </w:rPr>
         <w:t xml:space="preserve"> </w:t>
       </w:r>
       <w:r>
-        <w:rPr/>
+        <w:rPr>
+          <w:color w:val="000000"/>
+        </w:rPr>
         <w:t>and</w:t>
       </w:r>
       <w:r>
         <w:rPr>
+          <w:color w:val="000000"/>
           <w:spacing w:val="2"/>
         </w:rPr>
         <w:t xml:space="preserve"> </w:t>
       </w:r>
       <w:r>
-        <w:rPr/>
+        <w:rPr>
+          <w:color w:val="000000"/>
+        </w:rPr>
         <w:t>research</w:t>
       </w:r>
       <w:r>
         <w:rPr>
+          <w:color w:val="000000"/>
           <w:spacing w:val="-3"/>
         </w:rPr>
         <w:t xml:space="preserve"> </w:t>
       </w:r>
       <w:r>
-        <w:rPr/>
+        <w:rPr>
+          <w:color w:val="000000"/>
+        </w:rPr>
         <w:t>ethics.</w:t>
       </w:r>
     </w:p>
@@ -1779,124 +1956,8 @@
         <w:jc w:val="both"/>
       </w:pPr>
       <w:r>
-        <w:t>The contents of this report have not been submitted and will not be submitted</w:t>
-      </w:r>
-      <w:r>
-        <w:rPr>
-          <w:spacing w:val="1"/>
-        </w:rPr>
-        <w:t xml:space="preserve"> </w:t>
-      </w:r>
-      <w:r>
-        <w:t>either in part or in full, for the award of any other degree or diploma in this institute or</w:t>
-      </w:r>
-      <w:r>
-        <w:rPr>
-          <w:spacing w:val="-57"/>
-        </w:rPr>
-        <w:t xml:space="preserve"> </w:t>
-      </w:r>
-      <w:r>
-        <w:t>any other institute or university. The project fulfills the requirements and regulations of</w:t>
-      </w:r>
-      <w:r>
-        <w:rPr>
-          <w:spacing w:val="-57"/>
-        </w:rPr>
-        <w:t xml:space="preserve"> </w:t>
-      </w:r>
-      <w:r>
-        <w:t>the</w:t>
-      </w:r>
-      <w:r>
-        <w:rPr>
-          <w:spacing w:val="-1"/>
-        </w:rPr>
-        <w:t xml:space="preserve"> </w:t>
-      </w:r>
-      <w:r>
-        <w:t>University</w:t>
-      </w:r>
-      <w:r>
-        <w:rPr>
-          <w:spacing w:val="-8"/>
-        </w:rPr>
-        <w:t xml:space="preserve"> </w:t>
-      </w:r>
-      <w:r>
-        <w:t>and</w:t>
-      </w:r>
-      <w:r>
-        <w:rPr>
-          <w:spacing w:val="5"/>
-        </w:rPr>
-        <w:t xml:space="preserve"> </w:t>
-      </w:r>
-      <w:r>
-        <w:t>in my</w:t>
-      </w:r>
-      <w:r>
-        <w:rPr>
-          <w:spacing w:val="-4"/>
-        </w:rPr>
-        <w:t xml:space="preserve"> </w:t>
-      </w:r>
-      <w:r>
-        <w:t>opinion</w:t>
-      </w:r>
-      <w:r>
-        <w:rPr>
-          <w:spacing w:val="1"/>
-        </w:rPr>
-        <w:t xml:space="preserve"> </w:t>
-      </w:r>
-      <w:r>
-        <w:t>meets</w:t>
-      </w:r>
-      <w:r>
-        <w:rPr>
-          <w:spacing w:val="-2"/>
-        </w:rPr>
-        <w:t xml:space="preserve"> </w:t>
-      </w:r>
-      <w:r>
-        <w:t>the</w:t>
-      </w:r>
-      <w:r>
-        <w:rPr>
-          <w:spacing w:val="-1"/>
-        </w:rPr>
-        <w:t xml:space="preserve"> </w:t>
-      </w:r>
-      <w:r>
-        <w:t>necessary</w:t>
-      </w:r>
-      <w:r>
-        <w:rPr>
-          <w:spacing w:val="-8"/>
-        </w:rPr>
-        <w:t xml:space="preserve"> </w:t>
-      </w:r>
-      <w:r>
-        <w:t>standards</w:t>
-      </w:r>
-      <w:r>
-        <w:rPr>
-          <w:spacing w:val="4"/>
-        </w:rPr>
-        <w:t xml:space="preserve"> </w:t>
-      </w:r>
-      <w:r>
-        <w:t>for</w:t>
-      </w:r>
-      <w:r>
-        <w:rPr>
-          <w:spacing w:val="2"/>
-        </w:rPr>
-        <w:t xml:space="preserve"> </w:t>
-      </w:r>
-      <w:r>
-        <w:t>submission.</w:t>
+        <w:rPr/>
+        <w:t>The contents of this report have not been submitted and will not be submitted either in part or in full, for the award of any other degree or diploma in this institute or any other institute or university. The project fulfills the requirements and regulations of the University and in my opinion meets the necessary standards for submission.</w:t>
       </w:r>
     </w:p>
     <w:p>
@@ -2264,6 +2325,7 @@
       <w:r>
         <w:rPr>
           <w:b/>
+          <w:color w:val="000000"/>
           <w:sz w:val="24"/>
           <w:szCs w:val="24"/>
         </w:rPr>
@@ -2272,6 +2334,7 @@
       <w:r>
         <w:rPr>
           <w:b/>
+          <w:color w:val="000000"/>
           <w:sz w:val="24"/>
           <w:szCs w:val="24"/>
         </w:rPr>
@@ -2279,6 +2342,7 @@
       <w:r>
         <w:rPr>
           <w:b/>
+          <w:color w:val="000000"/>
           <w:sz w:val="24"/>
           <w:szCs w:val="24"/>
         </w:rPr>
@@ -2295,6 +2359,7 @@
       <w:r>
         <w:rPr>
           <w:b/>
+          <w:color w:val="000000"/>
           <w:sz w:val="24"/>
           <w:szCs w:val="24"/>
         </w:rPr>
@@ -2303,6 +2368,7 @@
       <w:r>
         <w:rPr>
           <w:b/>
+          <w:color w:val="000000"/>
           <w:sz w:val="24"/>
           <w:szCs w:val="24"/>
         </w:rPr>
@@ -2310,6 +2376,7 @@
       <w:r>
         <w:rPr>
           <w:b/>
+          <w:color w:val="000000"/>
           <w:sz w:val="24"/>
           <w:szCs w:val="24"/>
         </w:rPr>
@@ -2317,6 +2384,7 @@
       <w:r>
         <w:rPr>
           <w:rFonts w:ascii="Verdana"/>
+          <w:color w:val="000000"/>
         </w:rPr>
         <w:tab/>
       </w:r>
@@ -2593,6 +2661,7 @@
       <w:r>
         <w:rPr>
           <w:b/>
+          <w:color w:val="000000"/>
           <w:sz w:val="24"/>
         </w:rPr>
         <w:t>Divyansh Gupta, Shubham Raj and Rudrarka Nath</w:t>
@@ -2600,6 +2669,7 @@
       <w:r>
         <w:rPr>
           <w:b/>
+          <w:color w:val="000000"/>
           <w:spacing w:val="-2"/>
           <w:sz w:val="24"/>
         </w:rPr>
@@ -2607,12 +2677,14 @@
       <w:r>
         <w:rPr>
           <w:b/>
+          <w:color w:val="000000"/>
           <w:sz w:val="24"/>
         </w:rPr>
       </w:r>
       <w:r>
         <w:rPr>
           <w:b/>
+          <w:color w:val="000000"/>
           <w:spacing w:val="-3"/>
           <w:sz w:val="24"/>
         </w:rPr>
@@ -2620,12 +2692,14 @@
       <w:r>
         <w:rPr>
           <w:b/>
+          <w:color w:val="000000"/>
           <w:sz w:val="24"/>
         </w:rPr>
       </w:r>
       <w:r>
         <w:rPr>
           <w:b/>
+          <w:color w:val="000000"/>
           <w:spacing w:val="-1"/>
           <w:sz w:val="24"/>
         </w:rPr>
@@ -2633,6 +2707,7 @@
       <w:r>
         <w:rPr>
           <w:b/>
+          <w:color w:val="000000"/>
           <w:sz w:val="24"/>
         </w:rPr>
       </w:r>

</xml_diff>

<commit_message>
Report: new acknowledgements, base papers as running text, single-paragraph abstract, aligned contents page numbers, 12 pt list of figures, tidy list of tables, tighter figure layout
Co-Authored-By: Claude Sonnet 5.5 <noreply@anthropic.com>
</commit_message>
<xml_diff>
--- a/docs/report/TrustSphere_AI_Project_Report.docx
+++ b/docs/report/TrustSphere_AI_Project_Report.docx
@@ -2465,7 +2465,7 @@
           <w:szCs w:val="24"/>
           <w:lang w:val="en-IN" w:eastAsia="en-IN"/>
         </w:rPr>
-        <w:t>We thank Vellore Institute of Technology (VIT) for giving us the chance and the resources to carry out this project and the facilities and support at VIT helped us build and test our ideas.</w:t>
+        <w:t>I am deeply grateful to the management of Vellore Institute of Technology (VIT) for providing me with the opportunity and resources to undertake this project. Their commitment to fostering a conducive learning environment has been instrumental in my academic journey. The support and infrastructure provided by VIT have enabled me to explore and develop my ideas to their fullest potential.</w:t>
       </w:r>
     </w:p>
     <w:p>
@@ -2503,7 +2503,7 @@
           <w:szCs w:val="24"/>
           <w:lang w:val="en-IN" w:eastAsia="en-IN"/>
         </w:rPr>
-        <w:t>We sincerely thank Dr. Jaisankar N, Dean of the School of Computer Science and Engineering (SCOPE), for the support and encouragement given to the students of the school which motivated us to do our best work.</w:t>
+        <w:t>My sincere thanks to Dr. Jaisankar N, the Dean of the School of Computer Science and Engineering (SCOPE), for his unwavering support and encouragement. His leadership and vision have greatly inspired me to strive for excellence. The Dean’s dedication to academic excellence and innovation has been a constant source of motivation for me. I appreciate his efforts in creating an environment that nurtures creativity and critical thinking.</w:t>
       </w:r>
     </w:p>
     <w:p>
@@ -2541,7 +2541,7 @@
           <w:szCs w:val="24"/>
           <w:lang w:val="en-IN" w:eastAsia="en-IN"/>
         </w:rPr>
-        <w:t>We thank Dr. Rajeshkannan R, Head of the Department, for guidance and support during this project and the advice and feedback we received helped us shape the work and solve problems along the way.</w:t>
+        <w:t>I express my profound appreciation to Dr. Rajeshkannan R, the Head of the Department of Computer Science and Engineering (Information Security), for their insightful guidance and continuous support. Their expertise and advice have been crucial in shaping the direction of my project. The Head of Department’s commitment to fostering a collaborative and supportive atmosphere has greatly enhanced my learning experience. Their constructive feedback and encouragement have been invaluable in overcoming challenges and achieving my project goals.</w:t>
       </w:r>
     </w:p>
     <w:p>
@@ -2579,7 +2579,7 @@
           <w:szCs w:val="24"/>
           <w:lang w:val="en-IN" w:eastAsia="en-IN"/>
         </w:rPr>
-        <w:t>We are very thankful to our project guide, Manikandan G, Assistant Professor Sr. Grade 2, for regular guidance and useful feedback and the time given in our reviews helped us improve our methods and finish this work.</w:t>
+        <w:t>I am immensely thankful to my project guide, Manikandan G, for their dedicated mentorship and invaluable feedback. Their patience, knowledge, and encouragement have been pivotal in the successful completion of this project. My supervisor’s willingness to share their expertise and provide thoughtful guidance has been instrumental in refining my ideas and methodologies. Their support has not only contributed to the success of this project but has also enriched my overall academic experience.</w:t>
       </w:r>
     </w:p>
     <w:p>
@@ -2616,7 +2616,7 @@
           <w:szCs w:val="24"/>
           <w:lang w:val="en-IN" w:eastAsia="en-IN"/>
         </w:rPr>
-        <w:t>Thank you all for your support.</w:t>
+        <w:t>Thank you all for your contributions and support.</w:t>
       </w:r>
     </w:p>
     <w:p>
@@ -2664,7 +2664,7 @@
           <w:color w:val="000000"/>
           <w:sz w:val="24"/>
         </w:rPr>
-        <w:t>Divyansh Gupta, Shubham Raj and Rudrarka Nath</w:t>
+        <w:t>Divyansh Gupta, Shubham Raj, Rudrarka Nath</w:t>
       </w:r>
       <w:r>
         <w:rPr>
@@ -3140,9 +3140,6 @@
           </w:tcPr>
           <w:p>
             <w:pPr>
-              <w:tabs>
-                <w:tab w:val="left" w:pos="660"/>
-              </w:tabs>
               <w:spacing w:line="360" w:lineRule="auto"/>
               <w:jc w:val="center"/>
               <w:rPr>
@@ -3210,9 +3207,6 @@
           </w:tcPr>
           <w:p>
             <w:pPr>
-              <w:tabs>
-                <w:tab w:val="left" w:pos="660"/>
-              </w:tabs>
               <w:spacing w:line="360" w:lineRule="auto"/>
               <w:jc w:val="center"/>
               <w:rPr>
@@ -3286,10 +3280,8 @@
           </w:tcPr>
           <w:p>
             <w:pPr>
-              <w:tabs>
-                <w:tab w:val="left" w:pos="660"/>
-              </w:tabs>
               <w:spacing w:line="360" w:lineRule="auto"/>
+              <w:jc w:val="center"/>
               <w:rPr>
                 <w:b/>
                 <w:sz w:val="24"/>
@@ -3346,10 +3338,8 @@
           </w:tcPr>
           <w:p>
             <w:pPr>
-              <w:tabs>
-                <w:tab w:val="left" w:pos="660"/>
-              </w:tabs>
               <w:spacing w:line="360" w:lineRule="auto"/>
+              <w:jc w:val="center"/>
               <w:rPr>
                 <w:b/>
                 <w:sz w:val="24"/>
@@ -3406,10 +3396,8 @@
           </w:tcPr>
           <w:p>
             <w:pPr>
-              <w:tabs>
-                <w:tab w:val="left" w:pos="660"/>
-              </w:tabs>
               <w:spacing w:line="360" w:lineRule="auto"/>
+              <w:jc w:val="center"/>
               <w:rPr>
                 <w:b/>
                 <w:sz w:val="24"/>
@@ -3466,10 +3454,8 @@
           </w:tcPr>
           <w:p>
             <w:pPr>
-              <w:tabs>
-                <w:tab w:val="left" w:pos="660"/>
-              </w:tabs>
               <w:spacing w:line="360" w:lineRule="auto"/>
+              <w:jc w:val="center"/>
               <w:rPr>
                 <w:b/>
                 <w:sz w:val="24"/>
@@ -3540,10 +3526,8 @@
           </w:tcPr>
           <w:p>
             <w:pPr>
-              <w:tabs>
-                <w:tab w:val="left" w:pos="660"/>
-              </w:tabs>
               <w:spacing w:line="360" w:lineRule="auto"/>
+              <w:jc w:val="center"/>
               <w:rPr>
                 <w:b/>
                 <w:sz w:val="24"/>
@@ -3600,10 +3584,8 @@
           </w:tcPr>
           <w:p>
             <w:pPr>
-              <w:tabs>
-                <w:tab w:val="left" w:pos="660"/>
-              </w:tabs>
               <w:spacing w:line="360" w:lineRule="auto"/>
+              <w:jc w:val="center"/>
               <w:rPr>
                 <w:b/>
                 <w:sz w:val="24"/>
@@ -3671,10 +3653,8 @@
           </w:tcPr>
           <w:p>
             <w:pPr>
-              <w:tabs>
-                <w:tab w:val="left" w:pos="660"/>
-              </w:tabs>
               <w:spacing w:line="360" w:lineRule="auto"/>
+              <w:jc w:val="center"/>
               <w:rPr>
                 <w:b/>
                 <w:sz w:val="24"/>
@@ -3731,10 +3711,8 @@
           </w:tcPr>
           <w:p>
             <w:pPr>
-              <w:tabs>
-                <w:tab w:val="left" w:pos="660"/>
-              </w:tabs>
               <w:spacing w:line="360" w:lineRule="auto"/>
+              <w:jc w:val="center"/>
               <w:rPr>
                 <w:b/>
                 <w:sz w:val="24"/>
@@ -3791,10 +3769,8 @@
           </w:tcPr>
           <w:p>
             <w:pPr>
-              <w:tabs>
-                <w:tab w:val="left" w:pos="660"/>
-              </w:tabs>
               <w:spacing w:line="360" w:lineRule="auto"/>
+              <w:jc w:val="center"/>
               <w:rPr>
                 <w:b/>
                 <w:sz w:val="24"/>
@@ -3851,10 +3827,8 @@
           </w:tcPr>
           <w:p>
             <w:pPr>
-              <w:tabs>
-                <w:tab w:val="left" w:pos="660"/>
-              </w:tabs>
               <w:spacing w:line="360" w:lineRule="auto"/>
+              <w:jc w:val="center"/>
               <w:rPr>
                 <w:b/>
                 <w:sz w:val="24"/>
@@ -3911,10 +3885,8 @@
           </w:tcPr>
           <w:p>
             <w:pPr>
-              <w:tabs>
-                <w:tab w:val="left" w:pos="660"/>
-              </w:tabs>
               <w:spacing w:line="360" w:lineRule="auto"/>
+              <w:jc w:val="center"/>
               <w:rPr>
                 <w:b/>
                 <w:sz w:val="24"/>
@@ -3986,10 +3958,8 @@
           </w:tcPr>
           <w:p>
             <w:pPr>
-              <w:tabs>
-                <w:tab w:val="left" w:pos="660"/>
-              </w:tabs>
               <w:spacing w:line="360" w:lineRule="auto"/>
+              <w:jc w:val="center"/>
               <w:rPr>
                 <w:b/>
                 <w:sz w:val="24"/>
@@ -4061,10 +4031,8 @@
           </w:tcPr>
           <w:p>
             <w:pPr>
-              <w:tabs>
-                <w:tab w:val="left" w:pos="660"/>
-              </w:tabs>
               <w:spacing w:line="360" w:lineRule="auto"/>
+              <w:jc w:val="center"/>
               <w:rPr>
                 <w:b/>
                 <w:sz w:val="24"/>
@@ -4134,10 +4102,8 @@
           </w:tcPr>
           <w:p>
             <w:pPr>
-              <w:tabs>
-                <w:tab w:val="left" w:pos="660"/>
-              </w:tabs>
               <w:spacing w:line="360" w:lineRule="auto"/>
+              <w:jc w:val="center"/>
               <w:rPr>
                 <w:b/>
                 <w:sz w:val="24"/>
@@ -4194,10 +4160,8 @@
           </w:tcPr>
           <w:p>
             <w:pPr>
-              <w:tabs>
-                <w:tab w:val="left" w:pos="660"/>
-              </w:tabs>
               <w:spacing w:line="360" w:lineRule="auto"/>
+              <w:jc w:val="center"/>
               <w:rPr>
                 <w:b/>
                 <w:sz w:val="24"/>
@@ -4254,10 +4218,8 @@
           </w:tcPr>
           <w:p>
             <w:pPr>
-              <w:tabs>
-                <w:tab w:val="left" w:pos="660"/>
-              </w:tabs>
               <w:spacing w:line="360" w:lineRule="auto"/>
+              <w:jc w:val="center"/>
               <w:rPr>
                 <w:b/>
                 <w:sz w:val="24"/>
@@ -4314,10 +4276,8 @@
           </w:tcPr>
           <w:p>
             <w:pPr>
-              <w:tabs>
-                <w:tab w:val="left" w:pos="660"/>
-              </w:tabs>
               <w:spacing w:line="360" w:lineRule="auto"/>
+              <w:jc w:val="center"/>
               <w:rPr>
                 <w:b/>
                 <w:sz w:val="24"/>
@@ -4435,10 +4395,8 @@
           </w:tcPr>
           <w:p>
             <w:pPr>
-              <w:tabs>
-                <w:tab w:val="left" w:pos="660"/>
-              </w:tabs>
               <w:spacing w:line="360" w:lineRule="auto"/>
+              <w:jc w:val="center"/>
               <w:rPr>
                 <w:b/>
                 <w:sz w:val="24"/>
@@ -4498,10 +4456,8 @@
           </w:tcPr>
           <w:p>
             <w:pPr>
-              <w:tabs>
-                <w:tab w:val="left" w:pos="660"/>
-              </w:tabs>
               <w:spacing w:line="360" w:lineRule="auto"/>
+              <w:jc w:val="center"/>
               <w:rPr>
                 <w:b/>
                 <w:sz w:val="24"/>
@@ -4558,10 +4514,8 @@
           </w:tcPr>
           <w:p>
             <w:pPr>
-              <w:tabs>
-                <w:tab w:val="left" w:pos="660"/>
-              </w:tabs>
               <w:spacing w:line="360" w:lineRule="auto"/>
+              <w:jc w:val="center"/>
               <w:rPr>
                 <w:b/>
                 <w:sz w:val="24"/>
@@ -4618,10 +4572,8 @@
           </w:tcPr>
           <w:p>
             <w:pPr>
-              <w:tabs>
-                <w:tab w:val="left" w:pos="660"/>
-              </w:tabs>
               <w:spacing w:line="360" w:lineRule="auto"/>
+              <w:jc w:val="center"/>
               <w:rPr>
                 <w:b/>
                 <w:sz w:val="24"/>
@@ -4678,10 +4630,8 @@
           </w:tcPr>
           <w:p>
             <w:pPr>
-              <w:tabs>
-                <w:tab w:val="left" w:pos="660"/>
-              </w:tabs>
               <w:spacing w:line="360" w:lineRule="auto"/>
+              <w:jc w:val="center"/>
               <w:rPr>
                 <w:b/>
                 <w:sz w:val="24"/>
@@ -4738,10 +4688,8 @@
           </w:tcPr>
           <w:p>
             <w:pPr>
-              <w:tabs>
-                <w:tab w:val="left" w:pos="660"/>
-              </w:tabs>
               <w:spacing w:line="360" w:lineRule="auto"/>
+              <w:jc w:val="center"/>
               <w:rPr>
                 <w:b/>
                 <w:sz w:val="24"/>
@@ -4808,10 +4756,8 @@
           </w:tcPr>
           <w:p>
             <w:pPr>
-              <w:tabs>
-                <w:tab w:val="left" w:pos="660"/>
-              </w:tabs>
               <w:spacing w:line="360" w:lineRule="auto"/>
+              <w:jc w:val="center"/>
               <w:rPr>
                 <w:b/>
                 <w:sz w:val="24"/>
@@ -4888,10 +4834,8 @@
           </w:tcPr>
           <w:p>
             <w:pPr>
-              <w:tabs>
-                <w:tab w:val="left" w:pos="660"/>
-              </w:tabs>
               <w:spacing w:line="360" w:lineRule="auto"/>
+              <w:jc w:val="center"/>
               <w:rPr>
                 <w:b/>
                 <w:sz w:val="24"/>
@@ -4899,7 +4843,7 @@
               </w:rPr>
             </w:pPr>
             <w:r>
-              <w:t>12</w:t>
+              <w:t>11</w:t>
             </w:r>
           </w:p>
         </w:tc>
@@ -4964,10 +4908,8 @@
           </w:tcPr>
           <w:p>
             <w:pPr>
-              <w:tabs>
-                <w:tab w:val="left" w:pos="660"/>
-              </w:tabs>
               <w:spacing w:line="360" w:lineRule="auto"/>
+              <w:jc w:val="center"/>
               <w:rPr>
                 <w:b/>
                 <w:sz w:val="24"/>
@@ -4975,7 +4917,7 @@
               </w:rPr>
             </w:pPr>
             <w:r>
-              <w:t>12</w:t>
+              <w:t>11</w:t>
             </w:r>
           </w:p>
         </w:tc>
@@ -5027,10 +4969,8 @@
           </w:tcPr>
           <w:p>
             <w:pPr>
-              <w:tabs>
-                <w:tab w:val="left" w:pos="660"/>
-              </w:tabs>
               <w:spacing w:line="360" w:lineRule="auto"/>
+              <w:jc w:val="center"/>
               <w:rPr>
                 <w:b/>
                 <w:sz w:val="24"/>
@@ -5038,7 +4978,7 @@
               </w:rPr>
             </w:pPr>
             <w:r>
-              <w:t>14</w:t>
+              <w:t>13</w:t>
             </w:r>
           </w:p>
         </w:tc>
@@ -5099,10 +5039,8 @@
           </w:tcPr>
           <w:p>
             <w:pPr>
-              <w:tabs>
-                <w:tab w:val="left" w:pos="660"/>
-              </w:tabs>
               <w:spacing w:line="360" w:lineRule="auto"/>
+              <w:jc w:val="center"/>
               <w:rPr>
                 <w:b/>
                 <w:sz w:val="24"/>
@@ -5110,7 +5048,7 @@
               </w:rPr>
             </w:pPr>
             <w:r>
-              <w:t>15</w:t>
+              <w:t>14</w:t>
             </w:r>
           </w:p>
         </w:tc>
@@ -5196,16 +5134,17 @@
           </w:tcPr>
           <w:p>
             <w:pPr>
-              <w:tabs>
-                <w:tab w:val="left" w:pos="660"/>
-              </w:tabs>
               <w:spacing w:line="360" w:lineRule="auto"/>
+              <w:jc w:val="center"/>
               <w:rPr>
                 <w:b/>
                 <w:sz w:val="24"/>
                 <w:szCs w:val="24"/>
               </w:rPr>
             </w:pPr>
+            <w:r>
+              <w:t>19</w:t>
+            </w:r>
           </w:p>
         </w:tc>
       </w:tr>
@@ -5266,10 +5205,8 @@
           </w:tcPr>
           <w:p>
             <w:pPr>
-              <w:tabs>
-                <w:tab w:val="left" w:pos="660"/>
-              </w:tabs>
               <w:spacing w:line="360" w:lineRule="auto"/>
+              <w:jc w:val="center"/>
               <w:rPr>
                 <w:b/>
                 <w:sz w:val="24"/>
@@ -5277,7 +5214,7 @@
               </w:rPr>
             </w:pPr>
             <w:r>
-              <w:t>28</w:t>
+              <w:t>25</w:t>
             </w:r>
           </w:p>
         </w:tc>
@@ -5344,10 +5281,8 @@
           </w:tcPr>
           <w:p>
             <w:pPr>
-              <w:tabs>
-                <w:tab w:val="left" w:pos="660"/>
-              </w:tabs>
               <w:spacing w:line="360" w:lineRule="auto"/>
+              <w:jc w:val="center"/>
               <w:rPr>
                 <w:b/>
                 <w:sz w:val="24"/>
@@ -5355,7 +5290,7 @@
               </w:rPr>
             </w:pPr>
             <w:r>
-              <w:t>29</w:t>
+              <w:t>26</w:t>
             </w:r>
           </w:p>
         </w:tc>
@@ -5406,10 +5341,8 @@
           </w:tcPr>
           <w:p>
             <w:pPr>
-              <w:tabs>
-                <w:tab w:val="left" w:pos="660"/>
-              </w:tabs>
               <w:spacing w:line="360" w:lineRule="auto"/>
+              <w:jc w:val="center"/>
               <w:rPr>
                 <w:b/>
                 <w:sz w:val="24"/>
@@ -5417,7 +5350,7 @@
               </w:rPr>
             </w:pPr>
             <w:r>
-              <w:t>33</w:t>
+              <w:t>30</w:t>
             </w:r>
           </w:p>
         </w:tc>
@@ -5537,9 +5470,9 @@
         <w:tblLook w:val="01E0" w:firstRow="1" w:lastRow="1" w:firstColumn="1" w:lastColumn="1" w:noHBand="0" w:noVBand="0"/>
       </w:tblPr>
       <w:tblGrid>
-        <w:gridCol w:w="1527"/>
-        <w:gridCol w:w="4285"/>
-        <w:gridCol w:w="2347"/>
+        <w:gridCol w:w="1700"/>
+        <w:gridCol w:w="5900"/>
+        <w:gridCol w:w="1300"/>
       </w:tblGrid>
       <w:tr>
         <w:trPr>
@@ -5547,7 +5480,7 @@
         </w:trPr>
         <w:tc>
           <w:tcPr>
-            <w:tcW w:w="1527" w:type="dxa"/>
+            <w:tcW w:w="1700" w:type="dxa"/>
           </w:tcPr>
           <w:p>
             <w:pPr>
@@ -5586,7 +5519,7 @@
         </w:tc>
         <w:tc>
           <w:tcPr>
-            <w:tcW w:w="4285" w:type="dxa"/>
+            <w:tcW w:w="5900" w:type="dxa"/>
           </w:tcPr>
           <w:p>
             <w:pPr>
@@ -5610,7 +5543,7 @@
         </w:tc>
         <w:tc>
           <w:tcPr>
-            <w:tcW w:w="2347" w:type="dxa"/>
+            <w:tcW w:w="1300" w:type="dxa"/>
           </w:tcPr>
           <w:p>
             <w:pPr>
@@ -5649,17 +5582,15 @@
         </w:tc>
       </w:tr>
       <w:tr>
-        <w:trPr>
-          <w:trHeight w:val="468"/>
-        </w:trPr>
-        <w:tc>
-          <w:tcPr>
-            <w:tcW w:w="1527" w:type="dxa"/>
+        <w:trPr/>
+        <w:tc>
+          <w:tcPr>
+            <w:tcW w:w="1700" w:type="dxa"/>
           </w:tcPr>
           <w:p>
             <w:pPr>
               <w:pStyle w:val="TableParagraph"/>
-              <w:spacing w:before="0" w:after="0"/>
+              <w:spacing w:before="0" w:after="100"/>
               <w:ind w:left="-143" w:right="249" w:firstLine="172"/>
               <w:jc w:val="center"/>
               <w:rPr>
@@ -5668,7 +5599,7 @@
             </w:pPr>
             <w:r>
               <w:rPr>
-                <w:sz w:val="21"/>
+                <w:sz w:val="24"/>
               </w:rPr>
               <w:t>4.1</w:t>
             </w:r>
@@ -5676,12 +5607,12 @@
         </w:tc>
         <w:tc>
           <w:tcPr>
-            <w:tcW w:w="4285" w:type="dxa"/>
+            <w:tcW w:w="5900" w:type="dxa"/>
           </w:tcPr>
           <w:p>
             <w:pPr>
               <w:pStyle w:val="TableParagraph"/>
-              <w:spacing w:before="0" w:after="0"/>
+              <w:spacing w:before="0" w:after="100"/>
               <w:ind w:left="207"/>
               <w:rPr>
                 <w:sz w:val="24"/>
@@ -5689,7 +5620,7 @@
             </w:pPr>
             <w:r>
               <w:rPr>
-                <w:sz w:val="21"/>
+                <w:sz w:val="24"/>
               </w:rPr>
               <w:t>System architecture of TrustSphere AI</w:t>
             </w:r>
@@ -5697,7 +5628,7 @@
         </w:tc>
         <w:tc>
           <w:tcPr>
-            <w:tcW w:w="2347" w:type="dxa"/>
+            <w:tcW w:w="1300" w:type="dxa"/>
           </w:tcPr>
           <w:p>
             <w:pPr>
@@ -5705,7 +5636,7 @@
               <w:tabs>
                 <w:tab w:val="center" w:pos="1160"/>
               </w:tabs>
-              <w:spacing w:before="0" w:after="0"/>
+              <w:spacing w:before="0" w:after="100"/>
               <w:ind w:right="27"/>
               <w:jc w:val="center"/>
               <w:rPr>
@@ -5714,7 +5645,7 @@
             </w:pPr>
             <w:r>
               <w:rPr>
-                <w:sz w:val="21"/>
+                <w:sz w:val="24"/>
               </w:rPr>
               <w:t>8</w:t>
             </w:r>
@@ -5722,17 +5653,15 @@
         </w:tc>
       </w:tr>
       <w:tr>
-        <w:trPr>
-          <w:trHeight w:val="468"/>
-        </w:trPr>
-        <w:tc>
-          <w:tcPr>
-            <w:tcW w:w="1527" w:type="dxa"/>
+        <w:trPr/>
+        <w:tc>
+          <w:tcPr>
+            <w:tcW w:w="1700" w:type="dxa"/>
           </w:tcPr>
           <w:p>
             <w:pPr>
               <w:pStyle w:val="TableParagraph"/>
-              <w:spacing w:before="0" w:after="0"/>
+              <w:spacing w:before="0" w:after="100"/>
               <w:ind w:left="-143" w:right="249" w:firstLine="172"/>
               <w:jc w:val="center"/>
               <w:rPr>
@@ -5741,7 +5670,7 @@
             </w:pPr>
             <w:r>
               <w:rPr>
-                <w:sz w:val="21"/>
+                <w:sz w:val="24"/>
               </w:rPr>
               <w:t>4.2</w:t>
             </w:r>
@@ -5749,12 +5678,12 @@
         </w:tc>
         <w:tc>
           <w:tcPr>
-            <w:tcW w:w="4285" w:type="dxa"/>
+            <w:tcW w:w="5900" w:type="dxa"/>
           </w:tcPr>
           <w:p>
             <w:pPr>
               <w:pStyle w:val="TableParagraph"/>
-              <w:spacing w:before="0" w:after="0"/>
+              <w:spacing w:before="0" w:after="100"/>
               <w:ind w:left="207"/>
               <w:rPr>
                 <w:sz w:val="24"/>
@@ -5762,7 +5691,7 @@
             </w:pPr>
             <w:r>
               <w:rPr>
-                <w:sz w:val="21"/>
+                <w:sz w:val="24"/>
               </w:rPr>
               <w:t>Data-flow diagram, level 1</w:t>
             </w:r>
@@ -5770,7 +5699,7 @@
         </w:tc>
         <w:tc>
           <w:tcPr>
-            <w:tcW w:w="2347" w:type="dxa"/>
+            <w:tcW w:w="1300" w:type="dxa"/>
           </w:tcPr>
           <w:p>
             <w:pPr>
@@ -5778,7 +5707,7 @@
               <w:tabs>
                 <w:tab w:val="center" w:pos="1160"/>
               </w:tabs>
-              <w:spacing w:before="0" w:after="0"/>
+              <w:spacing w:before="0" w:after="100"/>
               <w:ind w:right="27"/>
               <w:jc w:val="center"/>
               <w:rPr>
@@ -5787,7 +5716,7 @@
             </w:pPr>
             <w:r>
               <w:rPr>
-                <w:sz w:val="21"/>
+                <w:sz w:val="24"/>
               </w:rPr>
               <w:t>8</w:t>
             </w:r>
@@ -5795,17 +5724,15 @@
         </w:tc>
       </w:tr>
       <w:tr>
-        <w:trPr>
-          <w:trHeight w:val="468"/>
-        </w:trPr>
-        <w:tc>
-          <w:tcPr>
-            <w:tcW w:w="1527" w:type="dxa"/>
+        <w:trPr/>
+        <w:tc>
+          <w:tcPr>
+            <w:tcW w:w="1700" w:type="dxa"/>
           </w:tcPr>
           <w:p>
             <w:pPr>
               <w:pStyle w:val="TableParagraph"/>
-              <w:spacing w:before="0" w:after="0"/>
+              <w:spacing w:before="0" w:after="100"/>
               <w:ind w:left="-143" w:right="249" w:firstLine="172"/>
               <w:jc w:val="center"/>
               <w:rPr>
@@ -5814,7 +5741,7 @@
             </w:pPr>
             <w:r>
               <w:rPr>
-                <w:sz w:val="21"/>
+                <w:sz w:val="24"/>
               </w:rPr>
               <w:t>4.3</w:t>
             </w:r>
@@ -5822,12 +5749,12 @@
         </w:tc>
         <w:tc>
           <w:tcPr>
-            <w:tcW w:w="4285" w:type="dxa"/>
+            <w:tcW w:w="5900" w:type="dxa"/>
           </w:tcPr>
           <w:p>
             <w:pPr>
               <w:pStyle w:val="TableParagraph"/>
-              <w:spacing w:before="0" w:after="0"/>
+              <w:spacing w:before="0" w:after="100"/>
               <w:ind w:left="207"/>
               <w:rPr>
                 <w:sz w:val="24"/>
@@ -5835,7 +5762,7 @@
             </w:pPr>
             <w:r>
               <w:rPr>
-                <w:sz w:val="21"/>
+                <w:sz w:val="24"/>
               </w:rPr>
               <w:t>Use-case diagram</w:t>
             </w:r>
@@ -5843,7 +5770,7 @@
         </w:tc>
         <w:tc>
           <w:tcPr>
-            <w:tcW w:w="2347" w:type="dxa"/>
+            <w:tcW w:w="1300" w:type="dxa"/>
           </w:tcPr>
           <w:p>
             <w:pPr>
@@ -5851,7 +5778,7 @@
               <w:tabs>
                 <w:tab w:val="center" w:pos="1160"/>
               </w:tabs>
-              <w:spacing w:before="0" w:after="0"/>
+              <w:spacing w:before="0" w:after="100"/>
               <w:ind w:right="27"/>
               <w:jc w:val="center"/>
               <w:rPr>
@@ -5860,7 +5787,7 @@
             </w:pPr>
             <w:r>
               <w:rPr>
-                <w:sz w:val="21"/>
+                <w:sz w:val="24"/>
               </w:rPr>
               <w:t>9</w:t>
             </w:r>
@@ -5868,17 +5795,15 @@
         </w:tc>
       </w:tr>
       <w:tr>
-        <w:trPr>
-          <w:trHeight w:val="468"/>
-        </w:trPr>
-        <w:tc>
-          <w:tcPr>
-            <w:tcW w:w="1527" w:type="dxa"/>
+        <w:trPr/>
+        <w:tc>
+          <w:tcPr>
+            <w:tcW w:w="1700" w:type="dxa"/>
           </w:tcPr>
           <w:p>
             <w:pPr>
               <w:pStyle w:val="TableParagraph"/>
-              <w:spacing w:before="0" w:after="0"/>
+              <w:spacing w:before="0" w:after="100"/>
               <w:ind w:left="-143" w:right="249" w:firstLine="172"/>
               <w:jc w:val="center"/>
               <w:rPr>
@@ -5887,7 +5812,7 @@
             </w:pPr>
             <w:r>
               <w:rPr>
-                <w:sz w:val="21"/>
+                <w:sz w:val="24"/>
               </w:rPr>
               <w:t>4.4</w:t>
             </w:r>
@@ -5895,12 +5820,12 @@
         </w:tc>
         <w:tc>
           <w:tcPr>
-            <w:tcW w:w="4285" w:type="dxa"/>
+            <w:tcW w:w="5900" w:type="dxa"/>
           </w:tcPr>
           <w:p>
             <w:pPr>
               <w:pStyle w:val="TableParagraph"/>
-              <w:spacing w:before="0" w:after="0"/>
+              <w:spacing w:before="0" w:after="100"/>
               <w:ind w:left="207"/>
               <w:rPr>
                 <w:sz w:val="24"/>
@@ -5908,7 +5833,7 @@
             </w:pPr>
             <w:r>
               <w:rPr>
-                <w:sz w:val="21"/>
+                <w:sz w:val="24"/>
               </w:rPr>
               <w:t>Class diagram: evidence data model</w:t>
             </w:r>
@@ -5916,7 +5841,7 @@
         </w:tc>
         <w:tc>
           <w:tcPr>
-            <w:tcW w:w="2347" w:type="dxa"/>
+            <w:tcW w:w="1300" w:type="dxa"/>
           </w:tcPr>
           <w:p>
             <w:pPr>
@@ -5924,7 +5849,7 @@
               <w:tabs>
                 <w:tab w:val="center" w:pos="1160"/>
               </w:tabs>
-              <w:spacing w:before="0" w:after="0"/>
+              <w:spacing w:before="0" w:after="100"/>
               <w:ind w:right="27"/>
               <w:jc w:val="center"/>
               <w:rPr>
@@ -5933,25 +5858,23 @@
             </w:pPr>
             <w:r>
               <w:rPr>
-                <w:sz w:val="21"/>
-              </w:rPr>
-              <w:t>10</w:t>
+                <w:sz w:val="24"/>
+              </w:rPr>
+              <w:t>9</w:t>
             </w:r>
           </w:p>
         </w:tc>
       </w:tr>
       <w:tr>
-        <w:trPr>
-          <w:trHeight w:val="468"/>
-        </w:trPr>
-        <w:tc>
-          <w:tcPr>
-            <w:tcW w:w="1527" w:type="dxa"/>
+        <w:trPr/>
+        <w:tc>
+          <w:tcPr>
+            <w:tcW w:w="1700" w:type="dxa"/>
           </w:tcPr>
           <w:p>
             <w:pPr>
               <w:pStyle w:val="TableParagraph"/>
-              <w:spacing w:before="0" w:after="0"/>
+              <w:spacing w:before="0" w:after="100"/>
               <w:ind w:left="-143" w:right="249" w:firstLine="172"/>
               <w:jc w:val="center"/>
               <w:rPr>
@@ -5960,7 +5883,7 @@
             </w:pPr>
             <w:r>
               <w:rPr>
-                <w:sz w:val="21"/>
+                <w:sz w:val="24"/>
               </w:rPr>
               <w:t>4.5</w:t>
             </w:r>
@@ -5968,12 +5891,12 @@
         </w:tc>
         <w:tc>
           <w:tcPr>
-            <w:tcW w:w="4285" w:type="dxa"/>
+            <w:tcW w:w="5900" w:type="dxa"/>
           </w:tcPr>
           <w:p>
             <w:pPr>
               <w:pStyle w:val="TableParagraph"/>
-              <w:spacing w:before="0" w:after="0"/>
+              <w:spacing w:before="0" w:after="100"/>
               <w:ind w:left="207"/>
               <w:rPr>
                 <w:sz w:val="24"/>
@@ -5981,7 +5904,7 @@
             </w:pPr>
             <w:r>
               <w:rPr>
-                <w:sz w:val="21"/>
+                <w:sz w:val="24"/>
               </w:rPr>
               <w:t>Class diagram: agents and decision engine</w:t>
             </w:r>
@@ -5989,7 +5912,7 @@
         </w:tc>
         <w:tc>
           <w:tcPr>
-            <w:tcW w:w="2347" w:type="dxa"/>
+            <w:tcW w:w="1300" w:type="dxa"/>
           </w:tcPr>
           <w:p>
             <w:pPr>
@@ -5997,7 +5920,7 @@
               <w:tabs>
                 <w:tab w:val="center" w:pos="1160"/>
               </w:tabs>
-              <w:spacing w:before="0" w:after="0"/>
+              <w:spacing w:before="0" w:after="100"/>
               <w:ind w:right="27"/>
               <w:jc w:val="center"/>
               <w:rPr>
@@ -6006,7 +5929,7 @@
             </w:pPr>
             <w:r>
               <w:rPr>
-                <w:sz w:val="21"/>
+                <w:sz w:val="24"/>
               </w:rPr>
               <w:t>10</w:t>
             </w:r>
@@ -6014,17 +5937,15 @@
         </w:tc>
       </w:tr>
       <w:tr>
-        <w:trPr>
-          <w:trHeight w:val="468"/>
-        </w:trPr>
-        <w:tc>
-          <w:tcPr>
-            <w:tcW w:w="1527" w:type="dxa"/>
+        <w:trPr/>
+        <w:tc>
+          <w:tcPr>
+            <w:tcW w:w="1700" w:type="dxa"/>
           </w:tcPr>
           <w:p>
             <w:pPr>
               <w:pStyle w:val="TableParagraph"/>
-              <w:spacing w:before="0" w:after="0"/>
+              <w:spacing w:before="0" w:after="100"/>
               <w:ind w:left="-143" w:right="249" w:firstLine="172"/>
               <w:jc w:val="center"/>
               <w:rPr>
@@ -6033,7 +5954,7 @@
             </w:pPr>
             <w:r>
               <w:rPr>
-                <w:sz w:val="21"/>
+                <w:sz w:val="24"/>
               </w:rPr>
               <w:t>4.6</w:t>
             </w:r>
@@ -6041,12 +5962,12 @@
         </w:tc>
         <w:tc>
           <w:tcPr>
-            <w:tcW w:w="4285" w:type="dxa"/>
+            <w:tcW w:w="5900" w:type="dxa"/>
           </w:tcPr>
           <w:p>
             <w:pPr>
               <w:pStyle w:val="TableParagraph"/>
-              <w:spacing w:before="0" w:after="0"/>
+              <w:spacing w:before="0" w:after="100"/>
               <w:ind w:left="207"/>
               <w:rPr>
                 <w:sz w:val="24"/>
@@ -6054,7 +5975,7 @@
             </w:pPr>
             <w:r>
               <w:rPr>
-                <w:sz w:val="21"/>
+                <w:sz w:val="24"/>
               </w:rPr>
               <w:t>Sequence diagram: analysing one image</w:t>
             </w:r>
@@ -6062,7 +5983,7 @@
         </w:tc>
         <w:tc>
           <w:tcPr>
-            <w:tcW w:w="2347" w:type="dxa"/>
+            <w:tcW w:w="1300" w:type="dxa"/>
           </w:tcPr>
           <w:p>
             <w:pPr>
@@ -6070,7 +5991,7 @@
               <w:tabs>
                 <w:tab w:val="center" w:pos="1160"/>
               </w:tabs>
-              <w:spacing w:before="0" w:after="0"/>
+              <w:spacing w:before="0" w:after="100"/>
               <w:ind w:right="27"/>
               <w:jc w:val="center"/>
               <w:rPr>
@@ -6079,25 +6000,23 @@
             </w:pPr>
             <w:r>
               <w:rPr>
-                <w:sz w:val="21"/>
-              </w:rPr>
-              <w:t>11</w:t>
+                <w:sz w:val="24"/>
+              </w:rPr>
+              <w:t>10</w:t>
             </w:r>
           </w:p>
         </w:tc>
       </w:tr>
       <w:tr>
-        <w:trPr>
-          <w:trHeight w:val="468"/>
-        </w:trPr>
-        <w:tc>
-          <w:tcPr>
-            <w:tcW w:w="1527" w:type="dxa"/>
+        <w:trPr/>
+        <w:tc>
+          <w:tcPr>
+            <w:tcW w:w="1700" w:type="dxa"/>
           </w:tcPr>
           <w:p>
             <w:pPr>
               <w:pStyle w:val="TableParagraph"/>
-              <w:spacing w:before="0" w:after="0"/>
+              <w:spacing w:before="0" w:after="100"/>
               <w:ind w:left="-143" w:right="249" w:firstLine="172"/>
               <w:jc w:val="center"/>
               <w:rPr>
@@ -6106,7 +6025,7 @@
             </w:pPr>
             <w:r>
               <w:rPr>
-                <w:sz w:val="21"/>
+                <w:sz w:val="24"/>
               </w:rPr>
               <w:t>5.1</w:t>
             </w:r>
@@ -6114,12 +6033,12 @@
         </w:tc>
         <w:tc>
           <w:tcPr>
-            <w:tcW w:w="4285" w:type="dxa"/>
+            <w:tcW w:w="5900" w:type="dxa"/>
           </w:tcPr>
           <w:p>
             <w:pPr>
               <w:pStyle w:val="TableParagraph"/>
-              <w:spacing w:before="0" w:after="0"/>
+              <w:spacing w:before="0" w:after="100"/>
               <w:ind w:left="207"/>
               <w:rPr>
                 <w:sz w:val="24"/>
@@ -6127,7 +6046,7 @@
             </w:pPr>
             <w:r>
               <w:rPr>
-                <w:sz w:val="21"/>
+                <w:sz w:val="24"/>
               </w:rPr>
               <w:t>Detection pipeline of the trained image forensics agent</w:t>
             </w:r>
@@ -6135,7 +6054,7 @@
         </w:tc>
         <w:tc>
           <w:tcPr>
-            <w:tcW w:w="2347" w:type="dxa"/>
+            <w:tcW w:w="1300" w:type="dxa"/>
           </w:tcPr>
           <w:p>
             <w:pPr>
@@ -6143,7 +6062,7 @@
               <w:tabs>
                 <w:tab w:val="center" w:pos="1160"/>
               </w:tabs>
-              <w:spacing w:before="0" w:after="0"/>
+              <w:spacing w:before="0" w:after="100"/>
               <w:ind w:right="27"/>
               <w:jc w:val="center"/>
               <w:rPr>
@@ -6152,25 +6071,23 @@
             </w:pPr>
             <w:r>
               <w:rPr>
-                <w:sz w:val="21"/>
-              </w:rPr>
-              <w:t>12</w:t>
+                <w:sz w:val="24"/>
+              </w:rPr>
+              <w:t>11</w:t>
             </w:r>
           </w:p>
         </w:tc>
       </w:tr>
       <w:tr>
-        <w:trPr>
-          <w:trHeight w:val="468"/>
-        </w:trPr>
-        <w:tc>
-          <w:tcPr>
-            <w:tcW w:w="1527" w:type="dxa"/>
+        <w:trPr/>
+        <w:tc>
+          <w:tcPr>
+            <w:tcW w:w="1700" w:type="dxa"/>
           </w:tcPr>
           <w:p>
             <w:pPr>
               <w:pStyle w:val="TableParagraph"/>
-              <w:spacing w:before="0" w:after="0"/>
+              <w:spacing w:before="0" w:after="100"/>
               <w:ind w:left="-143" w:right="249" w:firstLine="172"/>
               <w:jc w:val="center"/>
               <w:rPr>
@@ -6179,7 +6096,7 @@
             </w:pPr>
             <w:r>
               <w:rPr>
-                <w:sz w:val="21"/>
+                <w:sz w:val="24"/>
               </w:rPr>
               <w:t>6.1</w:t>
             </w:r>
@@ -6187,12 +6104,12 @@
         </w:tc>
         <w:tc>
           <w:tcPr>
-            <w:tcW w:w="4285" w:type="dxa"/>
+            <w:tcW w:w="5900" w:type="dxa"/>
           </w:tcPr>
           <w:p>
             <w:pPr>
               <w:pStyle w:val="TableParagraph"/>
-              <w:spacing w:before="0" w:after="0"/>
+              <w:spacing w:before="0" w:after="100"/>
               <w:ind w:left="207"/>
               <w:rPr>
                 <w:sz w:val="24"/>
@@ -6200,7 +6117,7 @@
             </w:pPr>
             <w:r>
               <w:rPr>
-                <w:sz w:val="21"/>
+                <w:sz w:val="24"/>
               </w:rPr>
               <w:t>Analyze page: the user chooses an image and sees the analysis stages</w:t>
             </w:r>
@@ -6208,7 +6125,7 @@
         </w:tc>
         <w:tc>
           <w:tcPr>
-            <w:tcW w:w="2347" w:type="dxa"/>
+            <w:tcW w:w="1300" w:type="dxa"/>
           </w:tcPr>
           <w:p>
             <w:pPr>
@@ -6216,7 +6133,7 @@
               <w:tabs>
                 <w:tab w:val="center" w:pos="1160"/>
               </w:tabs>
-              <w:spacing w:before="0" w:after="0"/>
+              <w:spacing w:before="0" w:after="100"/>
               <w:ind w:right="27"/>
               <w:jc w:val="center"/>
               <w:rPr>
@@ -6225,25 +6142,23 @@
             </w:pPr>
             <w:r>
               <w:rPr>
-                <w:sz w:val="21"/>
-              </w:rPr>
-              <w:t>15</w:t>
+                <w:sz w:val="24"/>
+              </w:rPr>
+              <w:t>14</w:t>
             </w:r>
           </w:p>
         </w:tc>
       </w:tr>
       <w:tr>
-        <w:trPr>
-          <w:trHeight w:val="468"/>
-        </w:trPr>
-        <w:tc>
-          <w:tcPr>
-            <w:tcW w:w="1527" w:type="dxa"/>
+        <w:trPr/>
+        <w:tc>
+          <w:tcPr>
+            <w:tcW w:w="1700" w:type="dxa"/>
           </w:tcPr>
           <w:p>
             <w:pPr>
               <w:pStyle w:val="TableParagraph"/>
-              <w:spacing w:before="0" w:after="0"/>
+              <w:spacing w:before="0" w:after="100"/>
               <w:ind w:left="-143" w:right="249" w:firstLine="172"/>
               <w:jc w:val="center"/>
               <w:rPr>
@@ -6252,7 +6167,7 @@
             </w:pPr>
             <w:r>
               <w:rPr>
-                <w:sz w:val="21"/>
+                <w:sz w:val="24"/>
               </w:rPr>
               <w:t>6.2</w:t>
             </w:r>
@@ -6260,12 +6175,12 @@
         </w:tc>
         <w:tc>
           <w:tcPr>
-            <w:tcW w:w="4285" w:type="dxa"/>
+            <w:tcW w:w="5900" w:type="dxa"/>
           </w:tcPr>
           <w:p>
             <w:pPr>
               <w:pStyle w:val="TableParagraph"/>
-              <w:spacing w:before="0" w:after="0"/>
+              <w:spacing w:before="0" w:after="100"/>
               <w:ind w:left="207"/>
               <w:rPr>
                 <w:sz w:val="24"/>
@@ -6273,7 +6188,7 @@
             </w:pPr>
             <w:r>
               <w:rPr>
-                <w:sz w:val="21"/>
+                <w:sz w:val="24"/>
               </w:rPr>
               <w:t>A file selected for analysis</w:t>
             </w:r>
@@ -6281,7 +6196,7 @@
         </w:tc>
         <w:tc>
           <w:tcPr>
-            <w:tcW w:w="2347" w:type="dxa"/>
+            <w:tcW w:w="1300" w:type="dxa"/>
           </w:tcPr>
           <w:p>
             <w:pPr>
@@ -6289,7 +6204,7 @@
               <w:tabs>
                 <w:tab w:val="center" w:pos="1160"/>
               </w:tabs>
-              <w:spacing w:before="0" w:after="0"/>
+              <w:spacing w:before="0" w:after="100"/>
               <w:ind w:right="27"/>
               <w:jc w:val="center"/>
               <w:rPr>
@@ -6298,25 +6213,23 @@
             </w:pPr>
             <w:r>
               <w:rPr>
-                <w:sz w:val="21"/>
-              </w:rPr>
-              <w:t>15</w:t>
+                <w:sz w:val="24"/>
+              </w:rPr>
+              <w:t>14</w:t>
             </w:r>
           </w:p>
         </w:tc>
       </w:tr>
       <w:tr>
-        <w:trPr>
-          <w:trHeight w:val="468"/>
-        </w:trPr>
-        <w:tc>
-          <w:tcPr>
-            <w:tcW w:w="1527" w:type="dxa"/>
+        <w:trPr/>
+        <w:tc>
+          <w:tcPr>
+            <w:tcW w:w="1700" w:type="dxa"/>
           </w:tcPr>
           <w:p>
             <w:pPr>
               <w:pStyle w:val="TableParagraph"/>
-              <w:spacing w:before="0" w:after="0"/>
+              <w:spacing w:before="0" w:after="100"/>
               <w:ind w:left="-143" w:right="249" w:firstLine="172"/>
               <w:jc w:val="center"/>
               <w:rPr>
@@ -6325,7 +6238,7 @@
             </w:pPr>
             <w:r>
               <w:rPr>
-                <w:sz w:val="21"/>
+                <w:sz w:val="24"/>
               </w:rPr>
               <w:t>6.3</w:t>
             </w:r>
@@ -6333,12 +6246,12 @@
         </w:tc>
         <w:tc>
           <w:tcPr>
-            <w:tcW w:w="4285" w:type="dxa"/>
+            <w:tcW w:w="5900" w:type="dxa"/>
           </w:tcPr>
           <w:p>
             <w:pPr>
               <w:pStyle w:val="TableParagraph"/>
-              <w:spacing w:before="0" w:after="0"/>
+              <w:spacing w:before="0" w:after="100"/>
               <w:ind w:left="207"/>
               <w:rPr>
                 <w:sz w:val="24"/>
@@ -6346,7 +6259,7 @@
             </w:pPr>
             <w:r>
               <w:rPr>
-                <w:sz w:val="21"/>
+                <w:sz w:val="24"/>
               </w:rPr>
               <w:t>Verdict card for a tampered image</w:t>
             </w:r>
@@ -6354,7 +6267,7 @@
         </w:tc>
         <w:tc>
           <w:tcPr>
-            <w:tcW w:w="2347" w:type="dxa"/>
+            <w:tcW w:w="1300" w:type="dxa"/>
           </w:tcPr>
           <w:p>
             <w:pPr>
@@ -6362,7 +6275,7 @@
               <w:tabs>
                 <w:tab w:val="center" w:pos="1160"/>
               </w:tabs>
-              <w:spacing w:before="0" w:after="0"/>
+              <w:spacing w:before="0" w:after="100"/>
               <w:ind w:right="27"/>
               <w:jc w:val="center"/>
               <w:rPr>
@@ -6371,25 +6284,23 @@
             </w:pPr>
             <w:r>
               <w:rPr>
-                <w:sz w:val="21"/>
-              </w:rPr>
-              <w:t>16</w:t>
+                <w:sz w:val="24"/>
+              </w:rPr>
+              <w:t>15</w:t>
             </w:r>
           </w:p>
         </w:tc>
       </w:tr>
       <w:tr>
-        <w:trPr>
-          <w:trHeight w:val="468"/>
-        </w:trPr>
-        <w:tc>
-          <w:tcPr>
-            <w:tcW w:w="1527" w:type="dxa"/>
+        <w:trPr/>
+        <w:tc>
+          <w:tcPr>
+            <w:tcW w:w="1700" w:type="dxa"/>
           </w:tcPr>
           <w:p>
             <w:pPr>
               <w:pStyle w:val="TableParagraph"/>
-              <w:spacing w:before="0" w:after="0"/>
+              <w:spacing w:before="0" w:after="100"/>
               <w:ind w:left="-143" w:right="249" w:firstLine="172"/>
               <w:jc w:val="center"/>
               <w:rPr>
@@ -6398,7 +6309,7 @@
             </w:pPr>
             <w:r>
               <w:rPr>
-                <w:sz w:val="21"/>
+                <w:sz w:val="24"/>
               </w:rPr>
               <w:t>6.4</w:t>
             </w:r>
@@ -6406,12 +6317,12 @@
         </w:tc>
         <w:tc>
           <w:tcPr>
-            <w:tcW w:w="4285" w:type="dxa"/>
+            <w:tcW w:w="5900" w:type="dxa"/>
           </w:tcPr>
           <w:p>
             <w:pPr>
               <w:pStyle w:val="TableParagraph"/>
-              <w:spacing w:before="0" w:after="0"/>
+              <w:spacing w:before="0" w:after="100"/>
               <w:ind w:left="207"/>
               <w:rPr>
                 <w:sz w:val="24"/>
@@ -6419,7 +6330,7 @@
             </w:pPr>
             <w:r>
               <w:rPr>
-                <w:sz w:val="21"/>
+                <w:sz w:val="24"/>
               </w:rPr>
               <w:t>Agent breakdown for the tampered image: metadata, image forensics with heatmaps, provenance</w:t>
             </w:r>
@@ -6427,7 +6338,7 @@
         </w:tc>
         <w:tc>
           <w:tcPr>
-            <w:tcW w:w="2347" w:type="dxa"/>
+            <w:tcW w:w="1300" w:type="dxa"/>
           </w:tcPr>
           <w:p>
             <w:pPr>
@@ -6435,7 +6346,7 @@
               <w:tabs>
                 <w:tab w:val="center" w:pos="1160"/>
               </w:tabs>
-              <w:spacing w:before="0" w:after="0"/>
+              <w:spacing w:before="0" w:after="100"/>
               <w:ind w:right="27"/>
               <w:jc w:val="center"/>
               <w:rPr>
@@ -6444,25 +6355,23 @@
             </w:pPr>
             <w:r>
               <w:rPr>
-                <w:sz w:val="21"/>
-              </w:rPr>
-              <w:t>17</w:t>
+                <w:sz w:val="24"/>
+              </w:rPr>
+              <w:t>15</w:t>
             </w:r>
           </w:p>
         </w:tc>
       </w:tr>
       <w:tr>
-        <w:trPr>
-          <w:trHeight w:val="468"/>
-        </w:trPr>
-        <w:tc>
-          <w:tcPr>
-            <w:tcW w:w="1527" w:type="dxa"/>
+        <w:trPr/>
+        <w:tc>
+          <w:tcPr>
+            <w:tcW w:w="1700" w:type="dxa"/>
           </w:tcPr>
           <w:p>
             <w:pPr>
               <w:pStyle w:val="TableParagraph"/>
-              <w:spacing w:before="0" w:after="0"/>
+              <w:spacing w:before="0" w:after="100"/>
               <w:ind w:left="-143" w:right="249" w:firstLine="172"/>
               <w:jc w:val="center"/>
               <w:rPr>
@@ -6471,7 +6380,7 @@
             </w:pPr>
             <w:r>
               <w:rPr>
-                <w:sz w:val="21"/>
+                <w:sz w:val="24"/>
               </w:rPr>
               <w:t>6.5</w:t>
             </w:r>
@@ -6479,12 +6388,12 @@
         </w:tc>
         <w:tc>
           <w:tcPr>
-            <w:tcW w:w="4285" w:type="dxa"/>
+            <w:tcW w:w="5900" w:type="dxa"/>
           </w:tcPr>
           <w:p>
             <w:pPr>
               <w:pStyle w:val="TableParagraph"/>
-              <w:spacing w:before="0" w:after="0"/>
+              <w:spacing w:before="0" w:after="100"/>
               <w:ind w:left="207"/>
               <w:rPr>
                 <w:sz w:val="24"/>
@@ -6492,7 +6401,7 @@
             </w:pPr>
             <w:r>
               <w:rPr>
-                <w:sz w:val="21"/>
+                <w:sz w:val="24"/>
               </w:rPr>
               <w:t>Evidence chain: file integrity, Ed25519 signature, anchor status and chain of custody</w:t>
             </w:r>
@@ -6500,7 +6409,7 @@
         </w:tc>
         <w:tc>
           <w:tcPr>
-            <w:tcW w:w="2347" w:type="dxa"/>
+            <w:tcW w:w="1300" w:type="dxa"/>
           </w:tcPr>
           <w:p>
             <w:pPr>
@@ -6508,7 +6417,7 @@
               <w:tabs>
                 <w:tab w:val="center" w:pos="1160"/>
               </w:tabs>
-              <w:spacing w:before="0" w:after="0"/>
+              <w:spacing w:before="0" w:after="100"/>
               <w:ind w:right="27"/>
               <w:jc w:val="center"/>
               <w:rPr>
@@ -6517,25 +6426,23 @@
             </w:pPr>
             <w:r>
               <w:rPr>
-                <w:sz w:val="21"/>
-              </w:rPr>
-              <w:t>18</w:t>
+                <w:sz w:val="24"/>
+              </w:rPr>
+              <w:t>16</w:t>
             </w:r>
           </w:p>
         </w:tc>
       </w:tr>
       <w:tr>
-        <w:trPr>
-          <w:trHeight w:val="468"/>
-        </w:trPr>
-        <w:tc>
-          <w:tcPr>
-            <w:tcW w:w="1527" w:type="dxa"/>
+        <w:trPr/>
+        <w:tc>
+          <w:tcPr>
+            <w:tcW w:w="1700" w:type="dxa"/>
           </w:tcPr>
           <w:p>
             <w:pPr>
               <w:pStyle w:val="TableParagraph"/>
-              <w:spacing w:before="0" w:after="0"/>
+              <w:spacing w:before="0" w:after="100"/>
               <w:ind w:left="-143" w:right="249" w:firstLine="172"/>
               <w:jc w:val="center"/>
               <w:rPr>
@@ -6544,7 +6451,7 @@
             </w:pPr>
             <w:r>
               <w:rPr>
-                <w:sz w:val="21"/>
+                <w:sz w:val="24"/>
               </w:rPr>
               <w:t>6.6</w:t>
             </w:r>
@@ -6552,12 +6459,12 @@
         </w:tc>
         <w:tc>
           <w:tcPr>
-            <w:tcW w:w="4285" w:type="dxa"/>
+            <w:tcW w:w="5900" w:type="dxa"/>
           </w:tcPr>
           <w:p>
             <w:pPr>
               <w:pStyle w:val="TableParagraph"/>
-              <w:spacing w:before="0" w:after="0"/>
+              <w:spacing w:before="0" w:after="100"/>
               <w:ind w:left="207"/>
               <w:rPr>
                 <w:sz w:val="24"/>
@@ -6565,7 +6472,7 @@
             </w:pPr>
             <w:r>
               <w:rPr>
-                <w:sz w:val="21"/>
+                <w:sz w:val="24"/>
               </w:rPr>
               <w:t>Verdict cards of a second tampered image (Fake), an authentic image (Authentic) and an authentic image the engine sends to human review (Inconclusive)</w:t>
             </w:r>
@@ -6573,7 +6480,7 @@
         </w:tc>
         <w:tc>
           <w:tcPr>
-            <w:tcW w:w="2347" w:type="dxa"/>
+            <w:tcW w:w="1300" w:type="dxa"/>
           </w:tcPr>
           <w:p>
             <w:pPr>
@@ -6581,7 +6488,7 @@
               <w:tabs>
                 <w:tab w:val="center" w:pos="1160"/>
               </w:tabs>
-              <w:spacing w:before="0" w:after="0"/>
+              <w:spacing w:before="0" w:after="100"/>
               <w:ind w:right="27"/>
               <w:jc w:val="center"/>
               <w:rPr>
@@ -6590,25 +6497,23 @@
             </w:pPr>
             <w:r>
               <w:rPr>
-                <w:sz w:val="21"/>
-              </w:rPr>
-              <w:t>18</w:t>
+                <w:sz w:val="24"/>
+              </w:rPr>
+              <w:t>16</w:t>
             </w:r>
           </w:p>
         </w:tc>
       </w:tr>
       <w:tr>
-        <w:trPr>
-          <w:trHeight w:val="468"/>
-        </w:trPr>
-        <w:tc>
-          <w:tcPr>
-            <w:tcW w:w="1527" w:type="dxa"/>
+        <w:trPr/>
+        <w:tc>
+          <w:tcPr>
+            <w:tcW w:w="1700" w:type="dxa"/>
           </w:tcPr>
           <w:p>
             <w:pPr>
               <w:pStyle w:val="TableParagraph"/>
-              <w:spacing w:before="0" w:after="0"/>
+              <w:spacing w:before="0" w:after="100"/>
               <w:ind w:left="-143" w:right="249" w:firstLine="172"/>
               <w:jc w:val="center"/>
               <w:rPr>
@@ -6617,7 +6522,7 @@
             </w:pPr>
             <w:r>
               <w:rPr>
-                <w:sz w:val="21"/>
+                <w:sz w:val="24"/>
               </w:rPr>
               <w:t>6.7</w:t>
             </w:r>
@@ -6625,12 +6530,12 @@
         </w:tc>
         <w:tc>
           <w:tcPr>
-            <w:tcW w:w="4285" w:type="dxa"/>
+            <w:tcW w:w="5900" w:type="dxa"/>
           </w:tcPr>
           <w:p>
             <w:pPr>
               <w:pStyle w:val="TableParagraph"/>
-              <w:spacing w:before="0" w:after="0"/>
+              <w:spacing w:before="0" w:after="100"/>
               <w:ind w:left="207"/>
               <w:rPr>
                 <w:sz w:val="24"/>
@@ -6638,7 +6543,7 @@
             </w:pPr>
             <w:r>
               <w:rPr>
-                <w:sz w:val="21"/>
+                <w:sz w:val="24"/>
               </w:rPr>
               <w:t>History page: every stored analysis with its verdict and score</w:t>
             </w:r>
@@ -6646,7 +6551,7 @@
         </w:tc>
         <w:tc>
           <w:tcPr>
-            <w:tcW w:w="2347" w:type="dxa"/>
+            <w:tcW w:w="1300" w:type="dxa"/>
           </w:tcPr>
           <w:p>
             <w:pPr>
@@ -6654,7 +6559,7 @@
               <w:tabs>
                 <w:tab w:val="center" w:pos="1160"/>
               </w:tabs>
-              <w:spacing w:before="0" w:after="0"/>
+              <w:spacing w:before="0" w:after="100"/>
               <w:ind w:right="27"/>
               <w:jc w:val="center"/>
               <w:rPr>
@@ -6663,25 +6568,23 @@
             </w:pPr>
             <w:r>
               <w:rPr>
-                <w:sz w:val="21"/>
-              </w:rPr>
-              <w:t>19</w:t>
+                <w:sz w:val="24"/>
+              </w:rPr>
+              <w:t>17</w:t>
             </w:r>
           </w:p>
         </w:tc>
       </w:tr>
       <w:tr>
-        <w:trPr>
-          <w:trHeight w:val="468"/>
-        </w:trPr>
-        <w:tc>
-          <w:tcPr>
-            <w:tcW w:w="1527" w:type="dxa"/>
+        <w:trPr/>
+        <w:tc>
+          <w:tcPr>
+            <w:tcW w:w="1700" w:type="dxa"/>
           </w:tcPr>
           <w:p>
             <w:pPr>
               <w:pStyle w:val="TableParagraph"/>
-              <w:spacing w:before="0" w:after="0"/>
+              <w:spacing w:before="0" w:after="100"/>
               <w:ind w:left="-143" w:right="249" w:firstLine="172"/>
               <w:jc w:val="center"/>
               <w:rPr>
@@ -6690,7 +6593,7 @@
             </w:pPr>
             <w:r>
               <w:rPr>
-                <w:sz w:val="21"/>
+                <w:sz w:val="24"/>
               </w:rPr>
               <w:t>6.8</w:t>
             </w:r>
@@ -6698,12 +6601,12 @@
         </w:tc>
         <w:tc>
           <w:tcPr>
-            <w:tcW w:w="4285" w:type="dxa"/>
+            <w:tcW w:w="5900" w:type="dxa"/>
           </w:tcPr>
           <w:p>
             <w:pPr>
               <w:pStyle w:val="TableParagraph"/>
-              <w:spacing w:before="0" w:after="0"/>
+              <w:spacing w:before="0" w:after="100"/>
               <w:ind w:left="207"/>
               <w:rPr>
                 <w:sz w:val="24"/>
@@ -6711,7 +6614,7 @@
             </w:pPr>
             <w:r>
               <w:rPr>
-                <w:sz w:val="21"/>
+                <w:sz w:val="24"/>
               </w:rPr>
               <w:t>How it works page: the agents, the fusion weights and the evidence chain</w:t>
             </w:r>
@@ -6719,7 +6622,7 @@
         </w:tc>
         <w:tc>
           <w:tcPr>
-            <w:tcW w:w="2347" w:type="dxa"/>
+            <w:tcW w:w="1300" w:type="dxa"/>
           </w:tcPr>
           <w:p>
             <w:pPr>
@@ -6727,7 +6630,7 @@
               <w:tabs>
                 <w:tab w:val="center" w:pos="1160"/>
               </w:tabs>
-              <w:spacing w:before="0" w:after="0"/>
+              <w:spacing w:before="0" w:after="100"/>
               <w:ind w:right="27"/>
               <w:jc w:val="center"/>
               <w:rPr>
@@ -6736,25 +6639,23 @@
             </w:pPr>
             <w:r>
               <w:rPr>
-                <w:sz w:val="21"/>
-              </w:rPr>
-              <w:t>20</w:t>
+                <w:sz w:val="24"/>
+              </w:rPr>
+              <w:t>17</w:t>
             </w:r>
           </w:p>
         </w:tc>
       </w:tr>
       <w:tr>
-        <w:trPr>
-          <w:trHeight w:val="468"/>
-        </w:trPr>
-        <w:tc>
-          <w:tcPr>
-            <w:tcW w:w="1527" w:type="dxa"/>
+        <w:trPr/>
+        <w:tc>
+          <w:tcPr>
+            <w:tcW w:w="1700" w:type="dxa"/>
           </w:tcPr>
           <w:p>
             <w:pPr>
               <w:pStyle w:val="TableParagraph"/>
-              <w:spacing w:before="0" w:after="0"/>
+              <w:spacing w:before="0" w:after="100"/>
               <w:ind w:left="-143" w:right="249" w:firstLine="172"/>
               <w:jc w:val="center"/>
               <w:rPr>
@@ -6763,7 +6664,7 @@
             </w:pPr>
             <w:r>
               <w:rPr>
-                <w:sz w:val="21"/>
+                <w:sz w:val="24"/>
               </w:rPr>
               <w:t>6.9</w:t>
             </w:r>
@@ -6771,12 +6672,12 @@
         </w:tc>
         <w:tc>
           <w:tcPr>
-            <w:tcW w:w="4285" w:type="dxa"/>
+            <w:tcW w:w="5900" w:type="dxa"/>
           </w:tcPr>
           <w:p>
             <w:pPr>
               <w:pStyle w:val="TableParagraph"/>
-              <w:spacing w:before="0" w:after="0"/>
+              <w:spacing w:before="0" w:after="100"/>
               <w:ind w:left="207"/>
               <w:rPr>
                 <w:sz w:val="24"/>
@@ -6784,7 +6685,7 @@
             </w:pPr>
             <w:r>
               <w:rPr>
-                <w:sz w:val="21"/>
+                <w:sz w:val="24"/>
               </w:rPr>
               <w:t>First page of the evidence PDF of a tampered image</w:t>
             </w:r>
@@ -6792,7 +6693,7 @@
         </w:tc>
         <w:tc>
           <w:tcPr>
-            <w:tcW w:w="2347" w:type="dxa"/>
+            <w:tcW w:w="1300" w:type="dxa"/>
           </w:tcPr>
           <w:p>
             <w:pPr>
@@ -6800,7 +6701,7 @@
               <w:tabs>
                 <w:tab w:val="center" w:pos="1160"/>
               </w:tabs>
-              <w:spacing w:before="0" w:after="0"/>
+              <w:spacing w:before="0" w:after="100"/>
               <w:ind w:right="27"/>
               <w:jc w:val="center"/>
               <w:rPr>
@@ -6809,25 +6710,23 @@
             </w:pPr>
             <w:r>
               <w:rPr>
-                <w:sz w:val="21"/>
-              </w:rPr>
-              <w:t>21</w:t>
+                <w:sz w:val="24"/>
+              </w:rPr>
+              <w:t>18</w:t>
             </w:r>
           </w:p>
         </w:tc>
       </w:tr>
       <w:tr>
-        <w:trPr>
-          <w:trHeight w:val="468"/>
-        </w:trPr>
-        <w:tc>
-          <w:tcPr>
-            <w:tcW w:w="1527" w:type="dxa"/>
+        <w:trPr/>
+        <w:tc>
+          <w:tcPr>
+            <w:tcW w:w="1700" w:type="dxa"/>
           </w:tcPr>
           <w:p>
             <w:pPr>
               <w:pStyle w:val="TableParagraph"/>
-              <w:spacing w:before="0" w:after="0"/>
+              <w:spacing w:before="0" w:after="100"/>
               <w:ind w:left="-143" w:right="249" w:firstLine="172"/>
               <w:jc w:val="center"/>
               <w:rPr>
@@ -6836,7 +6735,7 @@
             </w:pPr>
             <w:r>
               <w:rPr>
-                <w:sz w:val="21"/>
+                <w:sz w:val="24"/>
               </w:rPr>
               <w:t>7.1</w:t>
             </w:r>
@@ -6844,12 +6743,12 @@
         </w:tc>
         <w:tc>
           <w:tcPr>
-            <w:tcW w:w="4285" w:type="dxa"/>
+            <w:tcW w:w="5900" w:type="dxa"/>
           </w:tcPr>
           <w:p>
             <w:pPr>
               <w:pStyle w:val="TableParagraph"/>
-              <w:spacing w:before="0" w:after="0"/>
+              <w:spacing w:before="0" w:after="100"/>
               <w:ind w:left="207"/>
               <w:rPr>
                 <w:sz w:val="24"/>
@@ -6857,7 +6756,7 @@
             </w:pPr>
             <w:r>
               <w:rPr>
-                <w:sz w:val="21"/>
+                <w:sz w:val="24"/>
               </w:rPr>
               <w:t>CASIA v2.0, random 5-fold cross-validation: confusion matrix, ROC curve and score distribution</w:t>
             </w:r>
@@ -6865,7 +6764,7 @@
         </w:tc>
         <w:tc>
           <w:tcPr>
-            <w:tcW w:w="2347" w:type="dxa"/>
+            <w:tcW w:w="1300" w:type="dxa"/>
           </w:tcPr>
           <w:p>
             <w:pPr>
@@ -6873,7 +6772,7 @@
               <w:tabs>
                 <w:tab w:val="center" w:pos="1160"/>
               </w:tabs>
-              <w:spacing w:before="0" w:after="0"/>
+              <w:spacing w:before="0" w:after="100"/>
               <w:ind w:right="27"/>
               <w:jc w:val="center"/>
               <w:rPr>
@@ -6882,25 +6781,23 @@
             </w:pPr>
             <w:r>
               <w:rPr>
-                <w:sz w:val="21"/>
-              </w:rPr>
-              <w:t>22</w:t>
+                <w:sz w:val="24"/>
+              </w:rPr>
+              <w:t>19</w:t>
             </w:r>
           </w:p>
         </w:tc>
       </w:tr>
       <w:tr>
-        <w:trPr>
-          <w:trHeight w:val="468"/>
-        </w:trPr>
-        <w:tc>
-          <w:tcPr>
-            <w:tcW w:w="1527" w:type="dxa"/>
+        <w:trPr/>
+        <w:tc>
+          <w:tcPr>
+            <w:tcW w:w="1700" w:type="dxa"/>
           </w:tcPr>
           <w:p>
             <w:pPr>
               <w:pStyle w:val="TableParagraph"/>
-              <w:spacing w:before="0" w:after="0"/>
+              <w:spacing w:before="0" w:after="100"/>
               <w:ind w:left="-143" w:right="249" w:firstLine="172"/>
               <w:jc w:val="center"/>
               <w:rPr>
@@ -6909,7 +6806,7 @@
             </w:pPr>
             <w:r>
               <w:rPr>
-                <w:sz w:val="21"/>
+                <w:sz w:val="24"/>
               </w:rPr>
               <w:t>7.2</w:t>
             </w:r>
@@ -6917,12 +6814,12 @@
         </w:tc>
         <w:tc>
           <w:tcPr>
-            <w:tcW w:w="4285" w:type="dxa"/>
+            <w:tcW w:w="5900" w:type="dxa"/>
           </w:tcPr>
           <w:p>
             <w:pPr>
               <w:pStyle w:val="TableParagraph"/>
-              <w:spacing w:before="0" w:after="0"/>
+              <w:spacing w:before="0" w:after="100"/>
               <w:ind w:left="207"/>
               <w:rPr>
                 <w:sz w:val="24"/>
@@ -6930,7 +6827,7 @@
             </w:pPr>
             <w:r>
               <w:rPr>
-                <w:sz w:val="21"/>
+                <w:sz w:val="24"/>
               </w:rPr>
               <w:t>CASIA v2.0, source-disjoint 5-fold cross-validation</w:t>
             </w:r>
@@ -6938,7 +6835,7 @@
         </w:tc>
         <w:tc>
           <w:tcPr>
-            <w:tcW w:w="2347" w:type="dxa"/>
+            <w:tcW w:w="1300" w:type="dxa"/>
           </w:tcPr>
           <w:p>
             <w:pPr>
@@ -6946,7 +6843,7 @@
               <w:tabs>
                 <w:tab w:val="center" w:pos="1160"/>
               </w:tabs>
-              <w:spacing w:before="0" w:after="0"/>
+              <w:spacing w:before="0" w:after="100"/>
               <w:ind w:right="27"/>
               <w:jc w:val="center"/>
               <w:rPr>
@@ -6955,25 +6852,23 @@
             </w:pPr>
             <w:r>
               <w:rPr>
-                <w:sz w:val="21"/>
-              </w:rPr>
-              <w:t>22</w:t>
+                <w:sz w:val="24"/>
+              </w:rPr>
+              <w:t>19</w:t>
             </w:r>
           </w:p>
         </w:tc>
       </w:tr>
       <w:tr>
-        <w:trPr>
-          <w:trHeight w:val="468"/>
-        </w:trPr>
-        <w:tc>
-          <w:tcPr>
-            <w:tcW w:w="1527" w:type="dxa"/>
+        <w:trPr/>
+        <w:tc>
+          <w:tcPr>
+            <w:tcW w:w="1700" w:type="dxa"/>
           </w:tcPr>
           <w:p>
             <w:pPr>
               <w:pStyle w:val="TableParagraph"/>
-              <w:spacing w:before="0" w:after="0"/>
+              <w:spacing w:before="0" w:after="100"/>
               <w:ind w:left="-143" w:right="249" w:firstLine="172"/>
               <w:jc w:val="center"/>
               <w:rPr>
@@ -6982,7 +6877,7 @@
             </w:pPr>
             <w:r>
               <w:rPr>
-                <w:sz w:val="21"/>
+                <w:sz w:val="24"/>
               </w:rPr>
               <w:t>7.3</w:t>
             </w:r>
@@ -6990,12 +6885,12 @@
         </w:tc>
         <w:tc>
           <w:tcPr>
-            <w:tcW w:w="4285" w:type="dxa"/>
+            <w:tcW w:w="5900" w:type="dxa"/>
           </w:tcPr>
           <w:p>
             <w:pPr>
               <w:pStyle w:val="TableParagraph"/>
-              <w:spacing w:before="0" w:after="0"/>
+              <w:spacing w:before="0" w:after="100"/>
               <w:ind w:left="207"/>
               <w:rPr>
                 <w:sz w:val="24"/>
@@ -7003,7 +6898,7 @@
             </w:pPr>
             <w:r>
               <w:rPr>
-                <w:sz w:val="21"/>
+                <w:sz w:val="24"/>
               </w:rPr>
               <w:t>Pipeline verdicts on the held-out images</w:t>
             </w:r>
@@ -7011,7 +6906,7 @@
         </w:tc>
         <w:tc>
           <w:tcPr>
-            <w:tcW w:w="2347" w:type="dxa"/>
+            <w:tcW w:w="1300" w:type="dxa"/>
           </w:tcPr>
           <w:p>
             <w:pPr>
@@ -7019,7 +6914,7 @@
               <w:tabs>
                 <w:tab w:val="center" w:pos="1160"/>
               </w:tabs>
-              <w:spacing w:before="0" w:after="0"/>
+              <w:spacing w:before="0" w:after="100"/>
               <w:ind w:right="27"/>
               <w:jc w:val="center"/>
               <w:rPr>
@@ -7028,25 +6923,23 @@
             </w:pPr>
             <w:r>
               <w:rPr>
-                <w:sz w:val="21"/>
-              </w:rPr>
-              <w:t>23</w:t>
+                <w:sz w:val="24"/>
+              </w:rPr>
+              <w:t>20</w:t>
             </w:r>
           </w:p>
         </w:tc>
       </w:tr>
       <w:tr>
-        <w:trPr>
-          <w:trHeight w:val="468"/>
-        </w:trPr>
-        <w:tc>
-          <w:tcPr>
-            <w:tcW w:w="1527" w:type="dxa"/>
+        <w:trPr/>
+        <w:tc>
+          <w:tcPr>
+            <w:tcW w:w="1700" w:type="dxa"/>
           </w:tcPr>
           <w:p>
             <w:pPr>
               <w:pStyle w:val="TableParagraph"/>
-              <w:spacing w:before="0" w:after="0"/>
+              <w:spacing w:before="0" w:after="100"/>
               <w:ind w:left="-143" w:right="249" w:firstLine="172"/>
               <w:jc w:val="center"/>
               <w:rPr>
@@ -7055,7 +6948,7 @@
             </w:pPr>
             <w:r>
               <w:rPr>
-                <w:sz w:val="21"/>
+                <w:sz w:val="24"/>
               </w:rPr>
               <w:t>7.4</w:t>
             </w:r>
@@ -7063,12 +6956,12 @@
         </w:tc>
         <w:tc>
           <w:tcPr>
-            <w:tcW w:w="4285" w:type="dxa"/>
+            <w:tcW w:w="5900" w:type="dxa"/>
           </w:tcPr>
           <w:p>
             <w:pPr>
               <w:pStyle w:val="TableParagraph"/>
-              <w:spacing w:before="0" w:after="0"/>
+              <w:spacing w:before="0" w:after="100"/>
               <w:ind w:left="207"/>
               <w:rPr>
                 <w:sz w:val="24"/>
@@ -7076,7 +6969,7 @@
             </w:pPr>
             <w:r>
               <w:rPr>
-                <w:sz w:val="21"/>
+                <w:sz w:val="24"/>
               </w:rPr>
               <w:t>Hold-out detector probability before the decision engine</w:t>
             </w:r>
@@ -7084,7 +6977,7 @@
         </w:tc>
         <w:tc>
           <w:tcPr>
-            <w:tcW w:w="2347" w:type="dxa"/>
+            <w:tcW w:w="1300" w:type="dxa"/>
           </w:tcPr>
           <w:p>
             <w:pPr>
@@ -7092,7 +6985,7 @@
               <w:tabs>
                 <w:tab w:val="center" w:pos="1160"/>
               </w:tabs>
-              <w:spacing w:before="0" w:after="0"/>
+              <w:spacing w:before="0" w:after="100"/>
               <w:ind w:right="27"/>
               <w:jc w:val="center"/>
               <w:rPr>
@@ -7101,25 +6994,23 @@
             </w:pPr>
             <w:r>
               <w:rPr>
-                <w:sz w:val="21"/>
-              </w:rPr>
-              <w:t>23</w:t>
+                <w:sz w:val="24"/>
+              </w:rPr>
+              <w:t>20</w:t>
             </w:r>
           </w:p>
         </w:tc>
       </w:tr>
       <w:tr>
-        <w:trPr>
-          <w:trHeight w:val="468"/>
-        </w:trPr>
-        <w:tc>
-          <w:tcPr>
-            <w:tcW w:w="1527" w:type="dxa"/>
+        <w:trPr/>
+        <w:tc>
+          <w:tcPr>
+            <w:tcW w:w="1700" w:type="dxa"/>
           </w:tcPr>
           <w:p>
             <w:pPr>
               <w:pStyle w:val="TableParagraph"/>
-              <w:spacing w:before="0" w:after="0"/>
+              <w:spacing w:before="0" w:after="100"/>
               <w:ind w:left="-143" w:right="249" w:firstLine="172"/>
               <w:jc w:val="center"/>
               <w:rPr>
@@ -7128,7 +7019,7 @@
             </w:pPr>
             <w:r>
               <w:rPr>
-                <w:sz w:val="21"/>
+                <w:sz w:val="24"/>
               </w:rPr>
               <w:t>7.5</w:t>
             </w:r>
@@ -7136,12 +7027,12 @@
         </w:tc>
         <w:tc>
           <w:tcPr>
-            <w:tcW w:w="4285" w:type="dxa"/>
+            <w:tcW w:w="5900" w:type="dxa"/>
           </w:tcPr>
           <w:p>
             <w:pPr>
               <w:pStyle w:val="TableParagraph"/>
-              <w:spacing w:before="0" w:after="0"/>
+              <w:spacing w:before="0" w:after="100"/>
               <w:ind w:left="207"/>
               <w:rPr>
                 <w:sz w:val="24"/>
@@ -7149,7 +7040,7 @@
             </w:pPr>
             <w:r>
               <w:rPr>
-                <w:sz w:val="21"/>
+                <w:sz w:val="24"/>
               </w:rPr>
               <w:t>Sample outputs from the held-out set: input, error-level analysis and Grad-CAM</w:t>
             </w:r>
@@ -7157,7 +7048,7 @@
         </w:tc>
         <w:tc>
           <w:tcPr>
-            <w:tcW w:w="2347" w:type="dxa"/>
+            <w:tcW w:w="1300" w:type="dxa"/>
           </w:tcPr>
           <w:p>
             <w:pPr>
@@ -7165,7 +7056,7 @@
               <w:tabs>
                 <w:tab w:val="center" w:pos="1160"/>
               </w:tabs>
-              <w:spacing w:before="0" w:after="0"/>
+              <w:spacing w:before="0" w:after="100"/>
               <w:ind w:right="27"/>
               <w:jc w:val="center"/>
               <w:rPr>
@@ -7174,25 +7065,23 @@
             </w:pPr>
             <w:r>
               <w:rPr>
-                <w:sz w:val="21"/>
-              </w:rPr>
-              <w:t>24</w:t>
+                <w:sz w:val="24"/>
+              </w:rPr>
+              <w:t>21</w:t>
             </w:r>
           </w:p>
         </w:tc>
       </w:tr>
       <w:tr>
-        <w:trPr>
-          <w:trHeight w:val="468"/>
-        </w:trPr>
-        <w:tc>
-          <w:tcPr>
-            <w:tcW w:w="1527" w:type="dxa"/>
+        <w:trPr/>
+        <w:tc>
+          <w:tcPr>
+            <w:tcW w:w="1700" w:type="dxa"/>
           </w:tcPr>
           <w:p>
             <w:pPr>
               <w:pStyle w:val="TableParagraph"/>
-              <w:spacing w:before="0" w:after="0"/>
+              <w:spacing w:before="0" w:after="100"/>
               <w:ind w:left="-143" w:right="249" w:firstLine="172"/>
               <w:jc w:val="center"/>
               <w:rPr>
@@ -7201,7 +7090,7 @@
             </w:pPr>
             <w:r>
               <w:rPr>
-                <w:sz w:val="21"/>
+                <w:sz w:val="24"/>
               </w:rPr>
               <w:t>7.6</w:t>
             </w:r>
@@ -7209,12 +7098,12 @@
         </w:tc>
         <w:tc>
           <w:tcPr>
-            <w:tcW w:w="4285" w:type="dxa"/>
+            <w:tcW w:w="5900" w:type="dxa"/>
           </w:tcPr>
           <w:p>
             <w:pPr>
               <w:pStyle w:val="TableParagraph"/>
-              <w:spacing w:before="0" w:after="0"/>
+              <w:spacing w:before="0" w:after="100"/>
               <w:ind w:left="207"/>
               <w:rPr>
                 <w:sz w:val="24"/>
@@ -7222,7 +7111,7 @@
             </w:pPr>
             <w:r>
               <w:rPr>
-                <w:sz w:val="21"/>
+                <w:sz w:val="24"/>
               </w:rPr>
               <w:t>Columbia, whole-image detector with ELA input</w:t>
             </w:r>
@@ -7230,7 +7119,7 @@
         </w:tc>
         <w:tc>
           <w:tcPr>
-            <w:tcW w:w="2347" w:type="dxa"/>
+            <w:tcW w:w="1300" w:type="dxa"/>
           </w:tcPr>
           <w:p>
             <w:pPr>
@@ -7238,7 +7127,7 @@
               <w:tabs>
                 <w:tab w:val="center" w:pos="1160"/>
               </w:tabs>
-              <w:spacing w:before="0" w:after="0"/>
+              <w:spacing w:before="0" w:after="100"/>
               <w:ind w:right="27"/>
               <w:jc w:val="center"/>
               <w:rPr>
@@ -7247,25 +7136,23 @@
             </w:pPr>
             <w:r>
               <w:rPr>
-                <w:sz w:val="21"/>
-              </w:rPr>
-              <w:t>25</w:t>
+                <w:sz w:val="24"/>
+              </w:rPr>
+              <w:t>22</w:t>
             </w:r>
           </w:p>
         </w:tc>
       </w:tr>
       <w:tr>
-        <w:trPr>
-          <w:trHeight w:val="468"/>
-        </w:trPr>
-        <w:tc>
-          <w:tcPr>
-            <w:tcW w:w="1527" w:type="dxa"/>
+        <w:trPr/>
+        <w:tc>
+          <w:tcPr>
+            <w:tcW w:w="1700" w:type="dxa"/>
           </w:tcPr>
           <w:p>
             <w:pPr>
               <w:pStyle w:val="TableParagraph"/>
-              <w:spacing w:before="0" w:after="0"/>
+              <w:spacing w:before="0" w:after="100"/>
               <w:ind w:left="-143" w:right="249" w:firstLine="172"/>
               <w:jc w:val="center"/>
               <w:rPr>
@@ -7274,7 +7161,7 @@
             </w:pPr>
             <w:r>
               <w:rPr>
-                <w:sz w:val="21"/>
+                <w:sz w:val="24"/>
               </w:rPr>
               <w:t>7.7</w:t>
             </w:r>
@@ -7282,12 +7169,12 @@
         </w:tc>
         <w:tc>
           <w:tcPr>
-            <w:tcW w:w="4285" w:type="dxa"/>
+            <w:tcW w:w="5900" w:type="dxa"/>
           </w:tcPr>
           <w:p>
             <w:pPr>
               <w:pStyle w:val="TableParagraph"/>
-              <w:spacing w:before="0" w:after="0"/>
+              <w:spacing w:before="0" w:after="100"/>
               <w:ind w:left="207"/>
               <w:rPr>
                 <w:sz w:val="24"/>
@@ -7295,7 +7182,7 @@
             </w:pPr>
             <w:r>
               <w:rPr>
-                <w:sz w:val="21"/>
+                <w:sz w:val="24"/>
               </w:rPr>
               <w:t>Columbia, patch-based detector with SRM input</w:t>
             </w:r>
@@ -7303,7 +7190,7 @@
         </w:tc>
         <w:tc>
           <w:tcPr>
-            <w:tcW w:w="2347" w:type="dxa"/>
+            <w:tcW w:w="1300" w:type="dxa"/>
           </w:tcPr>
           <w:p>
             <w:pPr>
@@ -7311,7 +7198,7 @@
               <w:tabs>
                 <w:tab w:val="center" w:pos="1160"/>
               </w:tabs>
-              <w:spacing w:before="0" w:after="0"/>
+              <w:spacing w:before="0" w:after="100"/>
               <w:ind w:right="27"/>
               <w:jc w:val="center"/>
               <w:rPr>
@@ -7320,25 +7207,23 @@
             </w:pPr>
             <w:r>
               <w:rPr>
-                <w:sz w:val="21"/>
-              </w:rPr>
-              <w:t>25</w:t>
+                <w:sz w:val="24"/>
+              </w:rPr>
+              <w:t>22</w:t>
             </w:r>
           </w:p>
         </w:tc>
       </w:tr>
       <w:tr>
-        <w:trPr>
-          <w:trHeight w:val="468"/>
-        </w:trPr>
-        <w:tc>
-          <w:tcPr>
-            <w:tcW w:w="1527" w:type="dxa"/>
+        <w:trPr/>
+        <w:tc>
+          <w:tcPr>
+            <w:tcW w:w="1700" w:type="dxa"/>
           </w:tcPr>
           <w:p>
             <w:pPr>
               <w:pStyle w:val="TableParagraph"/>
-              <w:spacing w:before="0" w:after="0"/>
+              <w:spacing w:before="0" w:after="100"/>
               <w:ind w:left="-143" w:right="249" w:firstLine="172"/>
               <w:jc w:val="center"/>
               <w:rPr>
@@ -7347,7 +7232,7 @@
             </w:pPr>
             <w:r>
               <w:rPr>
-                <w:sz w:val="21"/>
+                <w:sz w:val="24"/>
               </w:rPr>
               <w:t>7.8</w:t>
             </w:r>
@@ -7355,12 +7240,12 @@
         </w:tc>
         <w:tc>
           <w:tcPr>
-            <w:tcW w:w="4285" w:type="dxa"/>
+            <w:tcW w:w="5900" w:type="dxa"/>
           </w:tcPr>
           <w:p>
             <w:pPr>
               <w:pStyle w:val="TableParagraph"/>
-              <w:spacing w:before="0" w:after="0"/>
+              <w:spacing w:before="0" w:after="100"/>
               <w:ind w:left="207"/>
               <w:rPr>
                 <w:sz w:val="24"/>
@@ -7368,7 +7253,7 @@
             </w:pPr>
             <w:r>
               <w:rPr>
-                <w:sz w:val="21"/>
+                <w:sz w:val="24"/>
               </w:rPr>
               <w:t>Columbia, patch-based detector with scenes kept apart</w:t>
             </w:r>
@@ -7376,7 +7261,7 @@
         </w:tc>
         <w:tc>
           <w:tcPr>
-            <w:tcW w:w="2347" w:type="dxa"/>
+            <w:tcW w:w="1300" w:type="dxa"/>
           </w:tcPr>
           <w:p>
             <w:pPr>
@@ -7384,7 +7269,7 @@
               <w:tabs>
                 <w:tab w:val="center" w:pos="1160"/>
               </w:tabs>
-              <w:spacing w:before="0" w:after="0"/>
+              <w:spacing w:before="0" w:after="100"/>
               <w:ind w:right="27"/>
               <w:jc w:val="center"/>
               <w:rPr>
@@ -7393,9 +7278,9 @@
             </w:pPr>
             <w:r>
               <w:rPr>
-                <w:sz w:val="21"/>
-              </w:rPr>
-              <w:t>25</w:t>
+                <w:sz w:val="24"/>
+              </w:rPr>
+              <w:t>22</w:t>
             </w:r>
           </w:p>
         </w:tc>
@@ -7522,7 +7407,7 @@
           <w:tab w:val="right" w:pos="8279"/>
         </w:tabs>
         <w:spacing w:before="161"/>
-        <w:ind w:left="983"/>
+        <w:ind w:left="2006" w:hanging="1023" w:right="1100"/>
       </w:pPr>
       <w:r>
         <w:t>2.1</w:t>
@@ -7540,7 +7425,7 @@
           <w:tab w:val="right" w:pos="8279"/>
         </w:tabs>
         <w:spacing w:before="161"/>
-        <w:ind w:left="983"/>
+        <w:ind w:left="2006" w:hanging="1023" w:right="1100"/>
       </w:pPr>
       <w:r>
         <w:t>2.2</w:t>
@@ -7558,7 +7443,7 @@
           <w:tab w:val="right" w:pos="8279"/>
         </w:tabs>
         <w:spacing w:before="161"/>
-        <w:ind w:left="983"/>
+        <w:ind w:left="2006" w:hanging="1023" w:right="1100"/>
       </w:pPr>
       <w:r>
         <w:t>3.1</w:t>
@@ -7576,7 +7461,7 @@
           <w:tab w:val="right" w:pos="8279"/>
         </w:tabs>
         <w:spacing w:before="161"/>
-        <w:ind w:left="983"/>
+        <w:ind w:left="2006" w:hanging="1023" w:right="1100"/>
       </w:pPr>
       <w:r>
         <w:t>3.2</w:t>
@@ -7594,14 +7479,14 @@
           <w:tab w:val="right" w:pos="8279"/>
         </w:tabs>
         <w:spacing w:before="161"/>
-        <w:ind w:left="983"/>
+        <w:ind w:left="2006" w:hanging="1023" w:right="1100"/>
       </w:pPr>
       <w:r>
         <w:t>5.1</w:t>
         <w:tab/>
         <w:t>End-to-end test results</w:t>
         <w:tab/>
-        <w:t>14</w:t>
+        <w:t>13</w:t>
       </w:r>
     </w:p>
     <w:p>
@@ -7612,14 +7497,14 @@
           <w:tab w:val="right" w:pos="8279"/>
         </w:tabs>
         <w:spacing w:before="161"/>
-        <w:ind w:left="983"/>
+        <w:ind w:left="2006" w:hanging="1023" w:right="1100"/>
       </w:pPr>
       <w:r>
         <w:t>7.1</w:t>
         <w:tab/>
         <w:t>Detector results on CASIA v2.0</w:t>
         <w:tab/>
-        <w:t>22</w:t>
+        <w:t>19</w:t>
       </w:r>
     </w:p>
     <w:p>
@@ -7630,14 +7515,14 @@
           <w:tab w:val="right" w:pos="8279"/>
         </w:tabs>
         <w:spacing w:before="161"/>
-        <w:ind w:left="983"/>
+        <w:ind w:left="2006" w:hanging="1023" w:right="1100"/>
       </w:pPr>
       <w:r>
         <w:t>7.2</w:t>
         <w:tab/>
         <w:t>Decision-engine verdicts on the held-out images</w:t>
         <w:tab/>
-        <w:t>23</w:t>
+        <w:t>20</w:t>
       </w:r>
     </w:p>
     <w:p>
@@ -7648,14 +7533,14 @@
           <w:tab w:val="right" w:pos="8279"/>
         </w:tabs>
         <w:spacing w:before="161"/>
-        <w:ind w:left="983"/>
+        <w:ind w:left="2006" w:hanging="1023" w:right="1100"/>
       </w:pPr>
       <w:r>
         <w:t>7.3</w:t>
         <w:tab/>
         <w:t>Columbia, 5-fold cross-validation (all variants tried are listed)</w:t>
         <w:tab/>
-        <w:t>24</w:t>
+        <w:t>21</w:t>
       </w:r>
     </w:p>
     <w:p>
@@ -7666,14 +7551,14 @@
           <w:tab w:val="right" w:pos="8279"/>
         </w:tabs>
         <w:spacing w:before="161"/>
-        <w:ind w:left="983"/>
+        <w:ind w:left="2006" w:hanging="1023" w:right="1100"/>
       </w:pPr>
       <w:r>
         <w:t>7.4</w:t>
         <w:tab/>
         <w:t>Localiser trained on CASIA v2.0</w:t>
         <w:tab/>
-        <w:t>25</w:t>
+        <w:t>22</w:t>
       </w:r>
     </w:p>
     <w:p>
@@ -7684,14 +7569,14 @@
           <w:tab w:val="right" w:pos="8279"/>
         </w:tabs>
         <w:spacing w:before="161"/>
-        <w:ind w:left="983"/>
+        <w:ind w:left="2006" w:hanging="1023" w:right="1100"/>
       </w:pPr>
       <w:r>
         <w:t>7.5</w:t>
         <w:tab/>
         <w:t>CASIA v2.0 results of the base papers that the trained detector exceeds</w:t>
         <w:tab/>
-        <w:t>26</w:t>
+        <w:t>23</w:t>
       </w:r>
     </w:p>
     <w:p>
@@ -7702,14 +7587,14 @@
           <w:tab w:val="right" w:pos="8279"/>
         </w:tabs>
         <w:spacing w:before="161"/>
-        <w:ind w:left="983"/>
+        <w:ind w:left="2006" w:hanging="1023" w:right="1100"/>
       </w:pPr>
       <w:r>
         <w:t>7.6</w:t>
         <w:tab/>
         <w:t>Columbia results of earlier methods listed in [1] that the patch-based detector exceeds</w:t>
         <w:tab/>
-        <w:t>26</w:t>
+        <w:t>23</w:t>
       </w:r>
     </w:p>
     <w:p>
@@ -7720,14 +7605,14 @@
           <w:tab w:val="right" w:pos="8279"/>
         </w:tabs>
         <w:spacing w:before="161"/>
-        <w:ind w:left="983"/>
+        <w:ind w:left="2006" w:hanging="1023" w:right="1100"/>
       </w:pPr>
       <w:r>
         <w:t>7.7</w:t>
         <w:tab/>
         <w:t>Cost of building and running the system</w:t>
         <w:tab/>
-        <w:t>26</w:t>
+        <w:t>23</w:t>
       </w:r>
     </w:p>
     <w:p>
@@ -8426,60 +8311,11 @@
         <w:t>Fake threshold</w:t>
       </w:r>
     </w:p>
-    <w:p/>
-    <w:p/>
-    <w:p/>
-    <w:p/>
-    <w:p/>
-    <w:p/>
-    <w:p/>
-    <w:p/>
-    <w:p/>
-    <w:p/>
-    <w:p/>
-    <w:p/>
-    <w:p/>
-    <w:p/>
-    <w:p/>
-    <w:p/>
-    <w:p/>
-    <w:p/>
-    <w:p/>
-    <w:p/>
-    <w:p/>
-    <w:p/>
-    <w:p/>
-    <w:p/>
-    <w:p/>
-    <w:p/>
-    <w:p/>
-    <w:p/>
-    <w:p/>
-    <w:p/>
-    <w:p/>
-    <w:p/>
-    <w:p/>
-    <w:p/>
-    <w:p/>
-    <w:p/>
-    <w:p/>
-    <w:p/>
-    <w:p/>
-    <w:p/>
-    <w:p/>
-    <w:p/>
-    <w:p/>
-    <w:p/>
-    <w:p/>
-    <w:p/>
-    <w:p/>
-    <w:p/>
-    <w:p/>
-    <w:p/>
     <w:p>
       <w:pPr>
         <w:pStyle w:val="Heading2"/>
-        <w:spacing w:before="77"/>
+        <w:pageBreakBefore/>
+        <w:spacing w:before="77" w:after="320"/>
         <w:ind w:right="795"/>
       </w:pPr>
       <w:bookmarkStart w:id="3" w:name="_TOC_250000"/>
@@ -8503,24 +8339,7 @@
           <w:i w:val="0"/>
           <w:sz w:val="24"/>
         </w:rPr>
-        <w:t>Photographs are used as evidence in news, insurance, banking and courts and editing tools make it easy to paste part of one image into another. Deciding whether an image was changed is one problem and proving later that the decision was not altered is another, so this project builds TrustSphere AI, a system for still images that handles both. Three agents look at each uploaded image, where a metadata agent reads the EXIF data and an image forensics agent studies the pixels and a provenance agent checks content credentials and invisible watermarks. A decision engine combines their scores into a verdict of Authentic, Fake or Inconclusive. Each result is hashed with SHA-256 and signed with Ed25519 and stored with a chain of custody, and it can be anchored on a test blockchain and saved as an evidence PDF while a web application shows the whole process.</w:t>
-      </w:r>
-    </w:p>
-    <w:p>
-      <w:pPr>
-        <w:keepNext w:val="0"/>
-        <w:pageBreakBefore w:val="0"/>
-        <w:spacing w:before="0" w:after="160" w:line="276" w:lineRule="auto"/>
-        <w:jc w:val="both"/>
-      </w:pPr>
-      <w:r>
-        <w:rPr>
-          <w:rFonts w:ascii="Times New Roman" w:hAnsi="Times New Roman" w:eastAsia="Times New Roman"/>
-          <w:b w:val="0"/>
-          <w:i w:val="0"/>
-          <w:sz w:val="24"/>
-        </w:rPr>
-        <w:t>The image forensics agent uses a detector that we trained, which is an EfficientNet-B0 network that reads error level analysis maps made at three JPEG qualities from crops at the original resolution. We trained and tested it on a subset of CASIA v2.0 (1,536 authentic and 1,283 tampered images) and on Columbia (183 authentic and 180 spliced images). With 5-fold cross-validation on CASIA v2.0 the accuracy is 95.53% with a random split and 95.32% when each tampered image stays in the same fold as its source, and on 588 images that were never used in training it reaches 96.26% while the full pipeline gives a verdict on 90.5% of them with 97.9% accuracy and sends the rest to a person. Columbia is harder because its photos are uncompressed, so a whole image detector reaches only 87.60% (mean of the folds), while a patch based detector on noise residuals reaches 97.25% with a random split and 96.97% when every scene stays in one fold (accuracy pooled over all folds). A model that outlines the tampered area and was trained on CASIA does not work well on Columbia (pixel F1 0.43). We compare the results with the base papers, list in Chapter 7 the results that we exceed and state the weaknesses as well, and the full comparison is in the project repository.</w:t>
+        <w:t>Photographs are used as evidence in news, insurance, banking and courts and editing tools make it easy to paste part of one image into another. Deciding whether an image was changed is one problem and proving later that the decision was not altered is another, so this project builds TrustSphere AI, a system for still images that handles both. Three agents look at each uploaded image, where a metadata agent reads the EXIF data and an image forensics agent studies the pixels and a provenance agent checks content credentials and invisible watermarks. A decision engine combines their scores into a verdict of Authentic, Fake or Inconclusive. Each result is hashed with SHA-256 and signed with Ed25519 and stored with a chain of custody, and it can be anchored on a test blockchain and saved as an evidence PDF while a web application shows the whole process. The image forensics agent uses a detector that we trained, which is an EfficientNet-B0 network that reads error level analysis maps made at three JPEG qualities from crops at the original resolution. We trained and tested it on a subset of CASIA v2.0 (1,536 authentic and 1,283 tampered images) and on Columbia (183 authentic and 180 spliced images). With 5-fold cross-validation on CASIA v2.0 the accuracy is 95.53% with a random split and 95.32% when each tampered image stays in the same fold as its source, and on 588 images that were never used in training it reaches 96.26% while the full pipeline gives a verdict on 90.5% of them with 97.9% accuracy and sends the rest to a person. Columbia is harder because its photos are uncompressed, so a whole image detector reaches only 87.60% (mean of the folds), while a patch based detector on noise residuals reaches 97.25% with a random split and 96.97% when every scene stays in one fold (accuracy pooled over all folds). A model that outlines the tampered area and was trained on CASIA does not work well on Columbia (pixel F1 0.43). We compare the results with the base papers, list in Chapter 7 the results that we exceed and state the weaknesses as well, and the full comparison is in the project repository.</w:t>
       </w:r>
     </w:p>
     <w:p>
@@ -9076,23 +8895,6 @@
     </w:p>
     <w:p>
       <w:pPr>
-        <w:keepNext/>
-        <w:pageBreakBefore w:val="0"/>
-        <w:spacing w:before="120" w:after="60" w:line="276" w:lineRule="auto"/>
-        <w:jc w:val="left"/>
-      </w:pPr>
-      <w:r>
-        <w:rPr>
-          <w:rFonts w:ascii="Times New Roman" w:hAnsi="Times New Roman" w:eastAsia="Times New Roman"/>
-          <w:b/>
-          <w:i w:val="0"/>
-          <w:sz w:val="24"/>
-        </w:rPr>
-        <w:t>Base paper 1: local optimal oriented pattern with deep features and an SVM [1]</w:t>
-      </w:r>
-    </w:p>
-    <w:p>
-      <w:pPr>
         <w:keepNext w:val="0"/>
         <w:pageBreakBefore w:val="0"/>
         <w:spacing w:before="0" w:after="120" w:line="276" w:lineRule="auto"/>
@@ -9105,24 +8907,7 @@
           <w:i w:val="0"/>
           <w:sz w:val="24"/>
         </w:rPr>
-        <w:t>Ranjan et al. extract texture maps with the Local Optimal Oriented Pattern (LOOP) and refine them with a pretrained ResNet-50 and classify with an SVM, testing on the Columbia splicing dataset and CASIA v2.0 and a part of the Dresden image database using stratified 5-fold cross-validation with an average accuracy of 95.20%. Their review table lists earlier methods that use Columbia with accuracies between about 91% and 93.4%.</w:t>
-      </w:r>
-    </w:p>
-    <w:p>
-      <w:pPr>
-        <w:keepNext/>
-        <w:pageBreakBefore w:val="0"/>
-        <w:spacing w:before="120" w:after="60" w:line="276" w:lineRule="auto"/>
-        <w:jc w:val="left"/>
-      </w:pPr>
-      <w:r>
-        <w:rPr>
-          <w:rFonts w:ascii="Times New Roman" w:hAnsi="Times New Roman" w:eastAsia="Times New Roman"/>
-          <w:b/>
-          <w:i w:val="0"/>
-          <w:sz w:val="24"/>
-        </w:rPr>
-        <w:t>Base paper 2: GAN-ViT-CMFD [2]</w:t>
+        <w:t>In Local Optimal Oriented Pattern with Deep Features and an SVM [1], Ranjan et al. extract texture maps with the Local Optimal Oriented Pattern (LOOP) and refine them with a pretrained ResNet-50 and classify with an SVM, testing on the Columbia splicing dataset and CASIA v2.0 and a part of the Dresden image database using stratified 5-fold cross-validation with an average accuracy of 95.20%. Their review table lists earlier methods that use Columbia with accuracies between about 91% and 93.4%.</w:t>
       </w:r>
     </w:p>
     <w:p>
@@ -9139,24 +8924,7 @@
           <w:i w:val="0"/>
           <w:sz w:val="24"/>
         </w:rPr>
-        <w:t>Ravula and Singh detect and classify copy-move forgery using generative adversarial networks and a vision transformer and spectral clustering together. In their Table 4 they report accuracy of 98.95% on CoMoFoD and 95.2% on MICC-F220 and 94.4% on CASIA v2, while their abstract gives 99.02% accuracy for CoMoFoD.</w:t>
-      </w:r>
-    </w:p>
-    <w:p>
-      <w:pPr>
-        <w:keepNext/>
-        <w:pageBreakBefore w:val="0"/>
-        <w:spacing w:before="120" w:after="60" w:line="276" w:lineRule="auto"/>
-        <w:jc w:val="left"/>
-      </w:pPr>
-      <w:r>
-        <w:rPr>
-          <w:rFonts w:ascii="Times New Roman" w:hAnsi="Times New Roman" w:eastAsia="Times New Roman"/>
-          <w:b/>
-          <w:i w:val="0"/>
-          <w:sz w:val="24"/>
-        </w:rPr>
-        <w:t>Base paper 3: deep CNN features with a machine-learning classifier [3]</w:t>
+        <w:t>In GAN-ViT-CMFD [2], Ravula and Singh detect and classify copy-move forgery using generative adversarial networks and a vision transformer and spectral clustering together. In their Table 4 they report accuracy of 98.95% on CoMoFoD and 95.2% on MICC-F220 and 94.4% on CASIA v2, while their abstract gives 99.02% accuracy for CoMoFoD.</w:t>
       </w:r>
     </w:p>
     <w:p>
@@ -9173,24 +8941,7 @@
           <w:i w:val="0"/>
           <w:sz w:val="24"/>
         </w:rPr>
-        <w:t>Rehman and Jain take patch features from a pretrained CNN and fuse them and classify with an SVM, and on CASIA v2.0 they report 93.57% accuracy without augmentation and 98.91% with augmentation. Their Table 3 uses 10-fold cross-validation and gives accuracy 98.91% with mean 93.39% and standard deviation 8.75% for batch size 128, and accuracy 93.57% with mean 90.25% and standard deviation 7.98% for batch size 200.</w:t>
-      </w:r>
-    </w:p>
-    <w:p>
-      <w:pPr>
-        <w:keepNext/>
-        <w:pageBreakBefore w:val="0"/>
-        <w:spacing w:before="120" w:after="60" w:line="276" w:lineRule="auto"/>
-        <w:jc w:val="left"/>
-      </w:pPr>
-      <w:r>
-        <w:rPr>
-          <w:rFonts w:ascii="Times New Roman" w:hAnsi="Times New Roman" w:eastAsia="Times New Roman"/>
-          <w:b/>
-          <w:i w:val="0"/>
-          <w:sz w:val="24"/>
-        </w:rPr>
-        <w:t>Base paper 4: Satyachitra [4]</w:t>
+        <w:t>In Deep CNN Features with a Machine-Learning Classifier [3], Rehman and Jain take patch features from a pretrained CNN and fuse them and classify with an SVM, and on CASIA v2.0 they report 93.57% accuracy without augmentation and 98.91% with augmentation. Their Table 3 uses 10-fold cross-validation and gives accuracy 98.91% with mean 93.39% and standard deviation 8.75% for batch size 128, and accuracy 93.57% with mean 90.25% and standard deviation 7.98% for batch size 200.</w:t>
       </w:r>
     </w:p>
     <w:p>
@@ -9207,24 +8958,7 @@
           <w:i w:val="0"/>
           <w:sz w:val="24"/>
         </w:rPr>
-        <w:t>Deb and Kar propose a CNN based copy-move method with preprocessing and feature extraction and segmentation and localisation steps and they also study how different the datasets are. On CASIA v2.0 they report precision 87.31 and recall 90.15 and F1 88.33.</w:t>
-      </w:r>
-    </w:p>
-    <w:p>
-      <w:pPr>
-        <w:keepNext/>
-        <w:pageBreakBefore w:val="0"/>
-        <w:spacing w:before="120" w:after="60" w:line="276" w:lineRule="auto"/>
-        <w:jc w:val="left"/>
-      </w:pPr>
-      <w:r>
-        <w:rPr>
-          <w:rFonts w:ascii="Times New Roman" w:hAnsi="Times New Roman" w:eastAsia="Times New Roman"/>
-          <w:b/>
-          <w:i w:val="0"/>
-          <w:sz w:val="24"/>
-        </w:rPr>
-        <w:t>Base paper 5: GIFT, a green image forgery tracker [5]</w:t>
+        <w:t>In Satyachitra [4], Deb and Kar propose a CNN based copy-move method with preprocessing and feature extraction and segmentation and localisation steps and they also study how different the datasets are. On CASIA v2.0 they report precision 87.31 and recall 90.15 and F1 88.33.</w:t>
       </w:r>
     </w:p>
     <w:p>
@@ -9241,7 +8975,7 @@
           <w:i w:val="0"/>
           <w:sz w:val="24"/>
         </w:rPr>
-        <w:t>Chen et al. take features from a pretrained EfficientNet-B4 and train XGBoost models at several levels for the splicing mask and a second version also predicts the mask boundary, so no backpropagation is needed. Following [7] they train on CASIA v2.0 and test on CASIA v1.0 and Columbia and they report pixel F1 of 0.5728 (0.6210 with edges) on CASIA v1.0 and 0.6497 (0.6558) on Columbia, with 18.4 million parameters for GIFT.</w:t>
+        <w:t>In GIFT, a Green Image Forgery Tracker [5], Chen et al. take features from a pretrained EfficientNet-B4 and train XGBoost models at several levels for the splicing mask and a second version also predicts the mask boundary, so no backpropagation is needed. Following [7] they train on CASIA v2.0 and test on CASIA v1.0 and Columbia and they report pixel F1 of 0.5728 (0.6210 with edges) on CASIA v1.0 and 0.6497 (0.6558) on Columbia, with 18.4 million parameters for GIFT.</w:t>
       </w:r>
     </w:p>
     <w:p>
@@ -12555,7 +12289,7 @@
       <w:r>
         <w:drawing>
           <wp:inline xmlns:a="http://schemas.openxmlformats.org/drawingml/2006/main" xmlns:pic="http://schemas.openxmlformats.org/drawingml/2006/picture">
-            <wp:extent cx="4830608" cy="3960000"/>
+            <wp:extent cx="3952315" cy="3240000"/>
             <wp:docPr id="6" name="Picture 6"/>
             <wp:cNvGraphicFramePr>
               <a:graphicFrameLocks noChangeAspect="1"/>
@@ -12576,7 +12310,7 @@
                   <pic:spPr>
                     <a:xfrm>
                       <a:off x="0" y="0"/>
-                      <a:ext cx="4830608" cy="3960000"/>
+                      <a:ext cx="3952315" cy="3240000"/>
                     </a:xfrm>
                     <a:prstGeom prst="rect"/>
                   </pic:spPr>
@@ -12613,7 +12347,7 @@
       <w:r>
         <w:drawing>
           <wp:inline xmlns:a="http://schemas.openxmlformats.org/drawingml/2006/main" xmlns:pic="http://schemas.openxmlformats.org/drawingml/2006/picture">
-            <wp:extent cx="3991263" cy="3960000"/>
+            <wp:extent cx="3265578" cy="3240000"/>
             <wp:docPr id="7" name="Picture 7"/>
             <wp:cNvGraphicFramePr>
               <a:graphicFrameLocks noChangeAspect="1"/>
@@ -12634,7 +12368,7 @@
                   <pic:spPr>
                     <a:xfrm>
                       <a:off x="0" y="0"/>
-                      <a:ext cx="3991263" cy="3960000"/>
+                      <a:ext cx="3265578" cy="3240000"/>
                     </a:xfrm>
                     <a:prstGeom prst="rect"/>
                   </pic:spPr>
@@ -12705,7 +12439,7 @@
       <w:r>
         <w:drawing>
           <wp:inline xmlns:a="http://schemas.openxmlformats.org/drawingml/2006/main" xmlns:pic="http://schemas.openxmlformats.org/drawingml/2006/picture">
-            <wp:extent cx="5760000" cy="4762285"/>
+            <wp:extent cx="5225053" cy="4320000"/>
             <wp:docPr id="8" name="Picture 8"/>
             <wp:cNvGraphicFramePr>
               <a:graphicFrameLocks noChangeAspect="1"/>
@@ -12726,7 +12460,7 @@
                   <pic:spPr>
                     <a:xfrm>
                       <a:off x="0" y="0"/>
-                      <a:ext cx="5760000" cy="4762285"/>
+                      <a:ext cx="5225053" cy="4320000"/>
                     </a:xfrm>
                     <a:prstGeom prst="rect"/>
                   </pic:spPr>
@@ -14914,7 +14648,7 @@
       <w:r>
         <w:drawing>
           <wp:inline xmlns:a="http://schemas.openxmlformats.org/drawingml/2006/main" xmlns:pic="http://schemas.openxmlformats.org/drawingml/2006/picture">
-            <wp:extent cx="3745892" cy="3420000"/>
+            <wp:extent cx="3351588" cy="3060000"/>
             <wp:docPr id="10" name="Picture 10"/>
             <wp:cNvGraphicFramePr>
               <a:graphicFrameLocks noChangeAspect="1"/>
@@ -14935,7 +14669,7 @@
                   <pic:spPr>
                     <a:xfrm>
                       <a:off x="0" y="0"/>
-                      <a:ext cx="3745892" cy="3420000"/>
+                      <a:ext cx="3351588" cy="3060000"/>
                     </a:xfrm>
                     <a:prstGeom prst="rect"/>
                   </pic:spPr>
@@ -14972,7 +14706,7 @@
       <w:r>
         <w:drawing>
           <wp:inline xmlns:a="http://schemas.openxmlformats.org/drawingml/2006/main" xmlns:pic="http://schemas.openxmlformats.org/drawingml/2006/picture">
-            <wp:extent cx="3745892" cy="3420000"/>
+            <wp:extent cx="3351588" cy="3060000"/>
             <wp:docPr id="11" name="Picture 11"/>
             <wp:cNvGraphicFramePr>
               <a:graphicFrameLocks noChangeAspect="1"/>
@@ -14993,7 +14727,7 @@
                   <pic:spPr>
                     <a:xfrm>
                       <a:off x="0" y="0"/>
-                      <a:ext cx="3745892" cy="3420000"/>
+                      <a:ext cx="3351588" cy="3060000"/>
                     </a:xfrm>
                     <a:prstGeom prst="rect"/>
                   </pic:spPr>
@@ -15105,7 +14839,7 @@
       <w:r>
         <w:drawing>
           <wp:inline xmlns:a="http://schemas.openxmlformats.org/drawingml/2006/main" xmlns:pic="http://schemas.openxmlformats.org/drawingml/2006/picture">
-            <wp:extent cx="5040000" cy="7430370"/>
+            <wp:extent cx="3906992" cy="5759999"/>
             <wp:docPr id="13" name="Picture 13"/>
             <wp:cNvGraphicFramePr>
               <a:graphicFrameLocks noChangeAspect="1"/>
@@ -15126,7 +14860,7 @@
                   <pic:spPr>
                     <a:xfrm>
                       <a:off x="0" y="0"/>
-                      <a:ext cx="5040000" cy="7430370"/>
+                      <a:ext cx="3906992" cy="5759999"/>
                     </a:xfrm>
                     <a:prstGeom prst="rect"/>
                   </pic:spPr>
@@ -15279,7 +15013,7 @@
       <w:r>
         <w:drawing>
           <wp:inline xmlns:a="http://schemas.openxmlformats.org/drawingml/2006/main" xmlns:pic="http://schemas.openxmlformats.org/drawingml/2006/picture">
-            <wp:extent cx="4400000" cy="3960000"/>
+            <wp:extent cx="3600000" cy="3240000"/>
             <wp:docPr id="16" name="Picture 16"/>
             <wp:cNvGraphicFramePr>
               <a:graphicFrameLocks noChangeAspect="1"/>
@@ -15300,7 +15034,7 @@
                   <pic:spPr>
                     <a:xfrm>
                       <a:off x="0" y="0"/>
-                      <a:ext cx="4400000" cy="3960000"/>
+                      <a:ext cx="3600000" cy="3240000"/>
                     </a:xfrm>
                     <a:prstGeom prst="rect"/>
                   </pic:spPr>
@@ -15337,7 +15071,7 @@
       <w:r>
         <w:drawing>
           <wp:inline xmlns:a="http://schemas.openxmlformats.org/drawingml/2006/main" xmlns:pic="http://schemas.openxmlformats.org/drawingml/2006/picture">
-            <wp:extent cx="4397394" cy="5400000"/>
+            <wp:extent cx="3811074" cy="4680000"/>
             <wp:docPr id="17" name="Picture 17"/>
             <wp:cNvGraphicFramePr>
               <a:graphicFrameLocks noChangeAspect="1"/>
@@ -15358,7 +15092,7 @@
                   <pic:spPr>
                     <a:xfrm>
                       <a:off x="0" y="0"/>
-                      <a:ext cx="4397394" cy="5400000"/>
+                      <a:ext cx="3811074" cy="4680000"/>
                     </a:xfrm>
                     <a:prstGeom prst="rect"/>
                   </pic:spPr>

</xml_diff>

<commit_message>
Report: upright degree line on declaration and certificate; list headings at contents font sizes
Co-Authored-By: Claude Sonnet 5.5 <noreply@anthropic.com>
</commit_message>
<xml_diff>
--- a/docs/report/TrustSphere_AI_Project_Report.docx
+++ b/docs/report/TrustSphere_AI_Project_Report.docx
@@ -904,90 +904,106 @@
       </w:pPr>
       <w:r>
         <w:rPr>
+          <w:i w:val="0"/>
           <w:color w:val="000000"/>
         </w:rPr>
         <w:t>We hereby declare that the project entitled</w:t>
       </w:r>
       <w:r>
         <w:rPr>
+          <w:i w:val="0"/>
           <w:color w:val="000000"/>
           <w:spacing w:val="1"/>
         </w:rPr>
       </w:r>
       <w:r>
         <w:rPr>
+          <w:i w:val="0"/>
           <w:color w:val="000000"/>
         </w:rPr>
       </w:r>
       <w:r>
         <w:rPr>
+          <w:i w:val="0"/>
           <w:color w:val="000000"/>
           <w:spacing w:val="1"/>
         </w:rPr>
       </w:r>
       <w:r>
         <w:rPr>
+          <w:i w:val="0"/>
           <w:color w:val="000000"/>
         </w:rPr>
       </w:r>
       <w:r>
         <w:rPr>
+          <w:i w:val="0"/>
           <w:color w:val="000000"/>
           <w:spacing w:val="1"/>
         </w:rPr>
       </w:r>
       <w:r>
         <w:rPr>
+          <w:i w:val="0"/>
           <w:color w:val="000000"/>
         </w:rPr>
       </w:r>
       <w:r>
         <w:rPr>
+          <w:i w:val="0"/>
           <w:color w:val="000000"/>
           <w:spacing w:val="1"/>
         </w:rPr>
       </w:r>
       <w:r>
         <w:rPr>
+          <w:i w:val="0"/>
           <w:color w:val="000000"/>
         </w:rPr>
       </w:r>
       <w:r>
         <w:rPr>
+          <w:i w:val="0"/>
           <w:color w:val="000000"/>
           <w:spacing w:val="1"/>
         </w:rPr>
       </w:r>
       <w:r>
         <w:rPr>
+          <w:i w:val="0"/>
           <w:color w:val="000000"/>
         </w:rPr>
       </w:r>
       <w:r>
         <w:rPr>
+          <w:i w:val="0"/>
           <w:color w:val="000000"/>
         </w:rPr>
       </w:r>
       <w:r>
         <w:rPr>
+          <w:i w:val="0"/>
           <w:color w:val="000000"/>
           <w:spacing w:val="1"/>
         </w:rPr>
       </w:r>
       <w:r>
         <w:rPr>
+          <w:i w:val="0"/>
           <w:color w:val="000000"/>
         </w:rPr>
         <w:t xml:space="preserve"> </w:t>
       </w:r>
       <w:r>
         <w:rPr>
+          <w:i w:val="0"/>
           <w:color w:val="000000"/>
         </w:rPr>
         <w:t>TrustSphere AI: A Multi-Agent Framework for Image Manipulation Detection with Verifiable Digital Evidence</w:t>
       </w:r>
       <w:r>
         <w:rPr>
+          <w:i w:val="0"/>
           <w:color w:val="000000"/>
           <w:spacing w:val="1"/>
         </w:rPr>
@@ -995,35 +1011,41 @@
       </w:r>
       <w:r>
         <w:rPr>
+          <w:i w:val="0"/>
           <w:color w:val="000000"/>
         </w:rPr>
         <w:t>submitted by us</w:t>
       </w:r>
       <w:r>
         <w:rPr>
+          <w:i w:val="0"/>
           <w:color w:val="000000"/>
           <w:spacing w:val="1"/>
         </w:rPr>
       </w:r>
       <w:r>
         <w:rPr>
+          <w:i w:val="0"/>
           <w:color w:val="000000"/>
         </w:rPr>
       </w:r>
       <w:r>
         <w:rPr>
+          <w:i w:val="0"/>
           <w:color w:val="000000"/>
           <w:spacing w:val="1"/>
         </w:rPr>
       </w:r>
       <w:r>
         <w:rPr>
+          <w:i w:val="0"/>
           <w:color w:val="000000"/>
         </w:rPr>
         <w:t>,</w:t>
       </w:r>
       <w:r>
         <w:rPr>
+          <w:i w:val="0"/>
           <w:color w:val="000000"/>
           <w:spacing w:val="1"/>
         </w:rPr>
@@ -1031,12 +1053,14 @@
       </w:r>
       <w:r>
         <w:rPr>
+          <w:i w:val="0"/>
           <w:color w:val="000000"/>
         </w:rPr>
         <w:t>for</w:t>
       </w:r>
       <w:r>
         <w:rPr>
+          <w:i w:val="0"/>
           <w:color w:val="000000"/>
           <w:spacing w:val="1"/>
         </w:rPr>
@@ -1044,12 +1068,14 @@
       </w:r>
       <w:r>
         <w:rPr>
+          <w:i w:val="0"/>
           <w:color w:val="000000"/>
         </w:rPr>
         <w:t>the</w:t>
       </w:r>
       <w:r>
         <w:rPr>
+          <w:i w:val="0"/>
           <w:color w:val="000000"/>
           <w:spacing w:val="1"/>
         </w:rPr>
@@ -1057,12 +1083,14 @@
       </w:r>
       <w:r>
         <w:rPr>
+          <w:i w:val="0"/>
           <w:color w:val="000000"/>
         </w:rPr>
         <w:t>award</w:t>
       </w:r>
       <w:r>
         <w:rPr>
+          <w:i w:val="0"/>
           <w:color w:val="000000"/>
           <w:spacing w:val="1"/>
         </w:rPr>
@@ -1070,12 +1098,14 @@
       </w:r>
       <w:r>
         <w:rPr>
+          <w:i w:val="0"/>
           <w:color w:val="000000"/>
         </w:rPr>
         <w:t>of</w:t>
       </w:r>
       <w:r>
         <w:rPr>
+          <w:i w:val="0"/>
           <w:color w:val="000000"/>
           <w:spacing w:val="1"/>
         </w:rPr>
@@ -1083,12 +1113,14 @@
       </w:r>
       <w:r>
         <w:rPr>
+          <w:i w:val="0"/>
           <w:color w:val="000000"/>
         </w:rPr>
         <w:t>the</w:t>
       </w:r>
       <w:r>
         <w:rPr>
+          <w:i w:val="0"/>
           <w:color w:val="000000"/>
           <w:spacing w:val="1"/>
         </w:rPr>
@@ -1096,12 +1128,14 @@
       </w:r>
       <w:r>
         <w:rPr>
+          <w:i w:val="0"/>
           <w:color w:val="000000"/>
         </w:rPr>
         <w:t>degree</w:t>
       </w:r>
       <w:r>
         <w:rPr>
+          <w:i w:val="0"/>
           <w:color w:val="000000"/>
           <w:spacing w:val="1"/>
         </w:rPr>
@@ -1109,12 +1143,14 @@
       </w:r>
       <w:r>
         <w:rPr>
+          <w:i w:val="0"/>
           <w:color w:val="000000"/>
         </w:rPr>
         <w:t>of</w:t>
       </w:r>
       <w:r>
         <w:rPr>
+          <w:i w:val="0"/>
           <w:color w:val="000000"/>
           <w:spacing w:val="1"/>
         </w:rPr>
@@ -1122,7 +1158,7 @@
       </w:r>
       <w:r>
         <w:rPr>
-          <w:i/>
+          <w:i w:val="0"/>
           <w:color w:val="000000"/>
           <w:spacing w:val="1"/>
         </w:rPr>
@@ -1130,28 +1166,33 @@
       </w:r>
       <w:r>
         <w:rPr>
+          <w:i w:val="0"/>
           <w:color w:val="000000"/>
           <w:spacing w:val="1"/>
         </w:rPr>
       </w:r>
       <w:r>
         <w:rPr>
+          <w:i w:val="0"/>
           <w:color w:val="000000"/>
         </w:rPr>
       </w:r>
       <w:r>
         <w:rPr>
+          <w:i w:val="0"/>
           <w:color w:val="000000"/>
           <w:spacing w:val="1"/>
         </w:rPr>
       </w:r>
       <w:r>
         <w:rPr>
+          <w:i w:val="0"/>
           <w:color w:val="000000"/>
         </w:rPr>
       </w:r>
       <w:r>
         <w:rPr>
+          <w:i w:val="0"/>
           <w:color w:val="000000"/>
           <w:spacing w:val="1"/>
         </w:rPr>
@@ -1159,12 +1200,14 @@
       </w:r>
       <w:r>
         <w:rPr>
+          <w:i w:val="0"/>
           <w:color w:val="000000"/>
         </w:rPr>
         <w:t>is a record of bonafide work carried out by us under the</w:t>
       </w:r>
       <w:r>
         <w:rPr>
+          <w:i w:val="0"/>
           <w:color w:val="000000"/>
           <w:spacing w:val="1"/>
         </w:rPr>
@@ -1172,12 +1215,14 @@
       </w:r>
       <w:r>
         <w:rPr>
+          <w:i w:val="0"/>
           <w:color w:val="000000"/>
         </w:rPr>
         <w:t>supervision</w:t>
       </w:r>
       <w:r>
         <w:rPr>
+          <w:i w:val="0"/>
           <w:color w:val="000000"/>
           <w:spacing w:val="-4"/>
         </w:rPr>
@@ -1185,12 +1230,14 @@
       </w:r>
       <w:r>
         <w:rPr>
+          <w:i w:val="0"/>
           <w:color w:val="000000"/>
         </w:rPr>
         <w:t>of</w:t>
       </w:r>
       <w:r>
         <w:rPr>
+          <w:i w:val="0"/>
           <w:color w:val="000000"/>
           <w:spacing w:val="-7"/>
         </w:rPr>
@@ -1198,28 +1245,33 @@
       </w:r>
       <w:r>
         <w:rPr>
+          <w:i w:val="0"/>
           <w:color w:val="000000"/>
           <w:spacing w:val="-7"/>
         </w:rPr>
       </w:r>
       <w:r>
         <w:rPr>
+          <w:i w:val="0"/>
           <w:color w:val="000000"/>
         </w:rPr>
       </w:r>
       <w:r>
         <w:rPr>
+          <w:i w:val="0"/>
           <w:color w:val="000000"/>
           <w:spacing w:val="1"/>
         </w:rPr>
       </w:r>
       <w:r>
         <w:rPr>
+          <w:i w:val="0"/>
           <w:color w:val="000000"/>
         </w:rPr>
       </w:r>
       <w:r>
         <w:rPr>
+          <w:i w:val="0"/>
           <w:color w:val="000000"/>
         </w:rPr>
       </w:r>
@@ -1233,12 +1285,14 @@
       </w:pPr>
       <w:r>
         <w:rPr>
+          <w:i w:val="0"/>
           <w:color w:val="000000"/>
         </w:rPr>
         <w:t>We further declare that the work reported in this project has not been submitted</w:t>
       </w:r>
       <w:r>
         <w:rPr>
+          <w:i w:val="0"/>
           <w:color w:val="000000"/>
           <w:spacing w:val="1"/>
         </w:rPr>
@@ -1246,12 +1300,14 @@
       </w:r>
       <w:r>
         <w:rPr>
+          <w:i w:val="0"/>
           <w:color w:val="000000"/>
         </w:rPr>
         <w:t>and will not be submitted, either in part or in full, for the award of any other degree or</w:t>
       </w:r>
       <w:r>
         <w:rPr>
+          <w:i w:val="0"/>
           <w:color w:val="000000"/>
           <w:spacing w:val="-57"/>
         </w:rPr>
@@ -1259,12 +1315,14 @@
       </w:r>
       <w:r>
         <w:rPr>
+          <w:i w:val="0"/>
           <w:color w:val="000000"/>
         </w:rPr>
         <w:t>diploma</w:t>
       </w:r>
       <w:r>
         <w:rPr>
+          <w:i w:val="0"/>
           <w:color w:val="000000"/>
           <w:spacing w:val="5"/>
         </w:rPr>
@@ -1272,12 +1330,14 @@
       </w:r>
       <w:r>
         <w:rPr>
+          <w:i w:val="0"/>
           <w:color w:val="000000"/>
         </w:rPr>
         <w:t>in</w:t>
       </w:r>
       <w:r>
         <w:rPr>
+          <w:i w:val="0"/>
           <w:color w:val="000000"/>
           <w:spacing w:val="-4"/>
         </w:rPr>
@@ -1285,12 +1345,14 @@
       </w:r>
       <w:r>
         <w:rPr>
+          <w:i w:val="0"/>
           <w:color w:val="000000"/>
         </w:rPr>
         <w:t>this</w:t>
       </w:r>
       <w:r>
         <w:rPr>
+          <w:i w:val="0"/>
           <w:color w:val="000000"/>
           <w:spacing w:val="5"/>
         </w:rPr>
@@ -1298,12 +1360,14 @@
       </w:r>
       <w:r>
         <w:rPr>
+          <w:i w:val="0"/>
           <w:color w:val="000000"/>
         </w:rPr>
         <w:t>institute</w:t>
       </w:r>
       <w:r>
         <w:rPr>
+          <w:i w:val="0"/>
           <w:color w:val="000000"/>
           <w:spacing w:val="-4"/>
         </w:rPr>
@@ -1311,12 +1375,14 @@
       </w:r>
       <w:r>
         <w:rPr>
+          <w:i w:val="0"/>
           <w:color w:val="000000"/>
         </w:rPr>
         <w:t>or</w:t>
       </w:r>
       <w:r>
         <w:rPr>
+          <w:i w:val="0"/>
           <w:color w:val="000000"/>
           <w:spacing w:val="-1"/>
         </w:rPr>
@@ -1324,12 +1390,14 @@
       </w:r>
       <w:r>
         <w:rPr>
+          <w:i w:val="0"/>
           <w:color w:val="000000"/>
         </w:rPr>
         <w:t>any</w:t>
       </w:r>
       <w:r>
         <w:rPr>
+          <w:i w:val="0"/>
           <w:color w:val="000000"/>
           <w:spacing w:val="-8"/>
         </w:rPr>
@@ -1337,12 +1405,14 @@
       </w:r>
       <w:r>
         <w:rPr>
+          <w:i w:val="0"/>
           <w:color w:val="000000"/>
         </w:rPr>
         <w:t>other</w:t>
       </w:r>
       <w:r>
         <w:rPr>
+          <w:i w:val="0"/>
           <w:color w:val="000000"/>
           <w:spacing w:val="4"/>
         </w:rPr>
@@ -1350,12 +1420,14 @@
       </w:r>
       <w:r>
         <w:rPr>
+          <w:i w:val="0"/>
           <w:color w:val="000000"/>
         </w:rPr>
         <w:t>institute</w:t>
       </w:r>
       <w:r>
         <w:rPr>
+          <w:i w:val="0"/>
           <w:color w:val="000000"/>
           <w:spacing w:val="-4"/>
         </w:rPr>
@@ -1363,12 +1435,14 @@
       </w:r>
       <w:r>
         <w:rPr>
+          <w:i w:val="0"/>
           <w:color w:val="000000"/>
         </w:rPr>
         <w:t>or</w:t>
       </w:r>
       <w:r>
         <w:rPr>
+          <w:i w:val="0"/>
           <w:color w:val="000000"/>
           <w:spacing w:val="4"/>
         </w:rPr>
@@ -1376,6 +1450,7 @@
       </w:r>
       <w:r>
         <w:rPr>
+          <w:i w:val="0"/>
           <w:color w:val="000000"/>
         </w:rPr>
         <w:t>university.</w:t>
@@ -1480,6 +1555,7 @@
       <w:r>
         <w:rPr>
           <w:b/>
+          <w:i w:val="0"/>
           <w:color w:val="000000"/>
           <w:sz w:val="24"/>
         </w:rPr>
@@ -1488,6 +1564,7 @@
       <w:r>
         <w:rPr>
           <w:b/>
+          <w:i w:val="0"/>
           <w:color w:val="000000"/>
           <w:spacing w:val="-2"/>
           <w:sz w:val="24"/>
@@ -1497,6 +1574,7 @@
       <w:r>
         <w:rPr>
           <w:b/>
+          <w:i w:val="0"/>
           <w:color w:val="000000"/>
           <w:sz w:val="24"/>
         </w:rPr>
@@ -1505,6 +1583,7 @@
       <w:r>
         <w:rPr>
           <w:b/>
+          <w:i w:val="0"/>
           <w:color w:val="000000"/>
           <w:spacing w:val="-3"/>
           <w:sz w:val="24"/>
@@ -1514,6 +1593,7 @@
       <w:r>
         <w:rPr>
           <w:b/>
+          <w:i w:val="0"/>
           <w:color w:val="000000"/>
           <w:sz w:val="24"/>
         </w:rPr>
@@ -1522,6 +1602,7 @@
       <w:r>
         <w:rPr>
           <w:b/>
+          <w:i w:val="0"/>
           <w:color w:val="000000"/>
           <w:spacing w:val="-1"/>
           <w:sz w:val="24"/>
@@ -1531,6 +1612,7 @@
       <w:r>
         <w:rPr>
           <w:b/>
+          <w:i w:val="0"/>
           <w:color w:val="000000"/>
           <w:sz w:val="24"/>
         </w:rPr>
@@ -1629,12 +1711,14 @@
       </w:pPr>
       <w:r>
         <w:rPr>
+          <w:i w:val="0"/>
           <w:color w:val="000000"/>
         </w:rPr>
         <w:t>This</w:t>
       </w:r>
       <w:r>
         <w:rPr>
+          <w:i w:val="0"/>
           <w:color w:val="000000"/>
           <w:spacing w:val="1"/>
         </w:rPr>
@@ -1642,12 +1726,14 @@
       </w:r>
       <w:r>
         <w:rPr>
+          <w:i w:val="0"/>
           <w:color w:val="000000"/>
         </w:rPr>
         <w:t>is</w:t>
       </w:r>
       <w:r>
         <w:rPr>
+          <w:i w:val="0"/>
           <w:color w:val="000000"/>
           <w:spacing w:val="1"/>
         </w:rPr>
@@ -1655,12 +1741,14 @@
       </w:r>
       <w:r>
         <w:rPr>
+          <w:i w:val="0"/>
           <w:color w:val="000000"/>
         </w:rPr>
         <w:t>to</w:t>
       </w:r>
       <w:r>
         <w:rPr>
+          <w:i w:val="0"/>
           <w:color w:val="000000"/>
           <w:spacing w:val="1"/>
         </w:rPr>
@@ -1668,12 +1756,14 @@
       </w:r>
       <w:r>
         <w:rPr>
+          <w:i w:val="0"/>
           <w:color w:val="000000"/>
         </w:rPr>
         <w:t>certify</w:t>
       </w:r>
       <w:r>
         <w:rPr>
+          <w:i w:val="0"/>
           <w:color w:val="000000"/>
           <w:spacing w:val="1"/>
         </w:rPr>
@@ -1681,12 +1771,14 @@
       </w:r>
       <w:r>
         <w:rPr>
+          <w:i w:val="0"/>
           <w:color w:val="000000"/>
         </w:rPr>
         <w:t>that</w:t>
       </w:r>
       <w:r>
         <w:rPr>
+          <w:i w:val="0"/>
           <w:color w:val="000000"/>
           <w:spacing w:val="60"/>
         </w:rPr>
@@ -1694,12 +1786,14 @@
       </w:r>
       <w:r>
         <w:rPr>
+          <w:i w:val="0"/>
           <w:color w:val="000000"/>
         </w:rPr>
         <w:t>the</w:t>
       </w:r>
       <w:r>
         <w:rPr>
+          <w:i w:val="0"/>
           <w:color w:val="000000"/>
           <w:spacing w:val="60"/>
         </w:rPr>
@@ -1707,12 +1801,14 @@
       </w:r>
       <w:r>
         <w:rPr>
+          <w:i w:val="0"/>
           <w:color w:val="000000"/>
         </w:rPr>
         <w:t>project</w:t>
       </w:r>
       <w:r>
         <w:rPr>
+          <w:i w:val="0"/>
           <w:color w:val="000000"/>
           <w:spacing w:val="60"/>
         </w:rPr>
@@ -1720,12 +1816,14 @@
       </w:r>
       <w:r>
         <w:rPr>
+          <w:i w:val="0"/>
           <w:color w:val="000000"/>
         </w:rPr>
         <w:t>entitled</w:t>
       </w:r>
       <w:r>
         <w:rPr>
+          <w:i w:val="0"/>
           <w:color w:val="000000"/>
           <w:spacing w:val="60"/>
         </w:rPr>
@@ -1733,12 +1831,14 @@
       </w:r>
       <w:r>
         <w:rPr>
+          <w:i w:val="0"/>
           <w:color w:val="000000"/>
         </w:rPr>
         <w:t>TrustSphere AI: A Multi-Agent Framework for Image Manipulation Detection with Verifiable Digital Evidence</w:t>
       </w:r>
       <w:r>
         <w:rPr>
+          <w:i w:val="0"/>
           <w:color w:val="000000"/>
           <w:spacing w:val="60"/>
         </w:rPr>
@@ -1746,12 +1846,14 @@
       </w:r>
       <w:r>
         <w:rPr>
+          <w:i w:val="0"/>
           <w:color w:val="000000"/>
         </w:rPr>
         <w:t>submitted</w:t>
       </w:r>
       <w:r>
         <w:rPr>
+          <w:i w:val="0"/>
           <w:color w:val="000000"/>
           <w:spacing w:val="60"/>
         </w:rPr>
@@ -1759,12 +1861,14 @@
       </w:r>
       <w:r>
         <w:rPr>
+          <w:i w:val="0"/>
           <w:color w:val="000000"/>
         </w:rPr>
         <w:t>by</w:t>
       </w:r>
       <w:r>
         <w:rPr>
+          <w:i w:val="0"/>
           <w:color w:val="000000"/>
           <w:spacing w:val="1"/>
         </w:rPr>
@@ -1772,6 +1876,7 @@
       </w:r>
       <w:r>
         <w:rPr>
+          <w:i w:val="0"/>
           <w:color w:val="000000"/>
           <w:spacing w:val="1"/>
         </w:rPr>
@@ -1780,23 +1885,27 @@
       <w:r>
         <w:rPr>
           <w:b/>
+          <w:i w:val="0"/>
           <w:color w:val="000000"/>
         </w:rPr>
       </w:r>
       <w:r>
         <w:rPr>
           <w:b/>
+          <w:i w:val="0"/>
           <w:color w:val="000000"/>
         </w:rPr>
       </w:r>
       <w:r>
         <w:rPr>
           <w:b/>
+          <w:i w:val="0"/>
           <w:color w:val="000000"/>
         </w:rPr>
       </w:r>
       <w:r>
         <w:rPr>
+          <w:i w:val="0"/>
           <w:color w:val="000000"/>
         </w:rPr>
         <w:t xml:space="preserve">, </w:t>
@@ -1804,18 +1913,21 @@
       <w:r>
         <w:rPr>
           <w:b/>
+          <w:i w:val="0"/>
           <w:color w:val="000000"/>
         </w:rPr>
         <w:t>School of Computer Science and Engineering</w:t>
       </w:r>
       <w:r>
         <w:rPr>
+          <w:i w:val="0"/>
           <w:color w:val="000000"/>
         </w:rPr>
         <w:t>, VIT, for the award of the degree of</w:t>
       </w:r>
       <w:r>
         <w:rPr>
+          <w:i w:val="0"/>
           <w:color w:val="000000"/>
           <w:spacing w:val="1"/>
         </w:rPr>
@@ -1823,7 +1935,7 @@
       </w:r>
       <w:r>
         <w:rPr>
-          <w:i/>
+          <w:i w:val="0"/>
           <w:color w:val="000000"/>
           <w:spacing w:val="1"/>
         </w:rPr>
@@ -1831,12 +1943,14 @@
       </w:r>
       <w:r>
         <w:rPr>
+          <w:i w:val="0"/>
           <w:color w:val="000000"/>
         </w:rPr>
         <w:t xml:space="preserve"> is a record of bonafide work carried out by</w:t>
       </w:r>
       <w:r>
         <w:rPr>
+          <w:i w:val="0"/>
           <w:color w:val="000000"/>
           <w:spacing w:val="1"/>
         </w:rPr>
@@ -1844,24 +1958,28 @@
       </w:r>
       <w:r>
         <w:rPr>
+          <w:i w:val="0"/>
           <w:color w:val="000000"/>
         </w:rPr>
         <w:t xml:space="preserve">them under my supervision during </w:t>
       </w:r>
       <w:r>
         <w:rPr>
+          <w:i w:val="0"/>
           <w:color w:val="000000"/>
         </w:rPr>
         <w:t>Fall Semester 2026-2027</w:t>
       </w:r>
       <w:r>
         <w:rPr>
+          <w:i w:val="0"/>
           <w:color w:val="000000"/>
         </w:rPr>
         <w:t>, as per</w:t>
       </w:r>
       <w:r>
         <w:rPr>
+          <w:i w:val="0"/>
           <w:color w:val="000000"/>
           <w:spacing w:val="1"/>
         </w:rPr>
@@ -1869,12 +1987,14 @@
       </w:r>
       <w:r>
         <w:rPr>
+          <w:i w:val="0"/>
           <w:color w:val="000000"/>
         </w:rPr>
         <w:t>the VIT code</w:t>
       </w:r>
       <w:r>
         <w:rPr>
+          <w:i w:val="0"/>
           <w:color w:val="000000"/>
           <w:spacing w:val="-8"/>
         </w:rPr>
@@ -1882,12 +2002,14 @@
       </w:r>
       <w:r>
         <w:rPr>
+          <w:i w:val="0"/>
           <w:color w:val="000000"/>
         </w:rPr>
         <w:t>of</w:t>
       </w:r>
       <w:r>
         <w:rPr>
+          <w:i w:val="0"/>
           <w:color w:val="000000"/>
           <w:spacing w:val="-6"/>
         </w:rPr>
@@ -1895,12 +2017,14 @@
       </w:r>
       <w:r>
         <w:rPr>
+          <w:i w:val="0"/>
           <w:color w:val="000000"/>
         </w:rPr>
         <w:t>academic</w:t>
       </w:r>
       <w:r>
         <w:rPr>
+          <w:i w:val="0"/>
           <w:color w:val="000000"/>
           <w:spacing w:val="1"/>
         </w:rPr>
@@ -1908,12 +2032,14 @@
       </w:r>
       <w:r>
         <w:rPr>
+          <w:i w:val="0"/>
           <w:color w:val="000000"/>
         </w:rPr>
         <w:t>and</w:t>
       </w:r>
       <w:r>
         <w:rPr>
+          <w:i w:val="0"/>
           <w:color w:val="000000"/>
           <w:spacing w:val="2"/>
         </w:rPr>
@@ -1921,12 +2047,14 @@
       </w:r>
       <w:r>
         <w:rPr>
+          <w:i w:val="0"/>
           <w:color w:val="000000"/>
         </w:rPr>
         <w:t>research</w:t>
       </w:r>
       <w:r>
         <w:rPr>
+          <w:i w:val="0"/>
           <w:color w:val="000000"/>
           <w:spacing w:val="-3"/>
         </w:rPr>
@@ -1934,6 +2062,7 @@
       </w:r>
       <w:r>
         <w:rPr>
+          <w:i w:val="0"/>
           <w:color w:val="000000"/>
         </w:rPr>
         <w:t>ethics.</w:t>
@@ -2325,6 +2454,7 @@
       <w:r>
         <w:rPr>
           <w:b/>
+          <w:i w:val="0"/>
           <w:color w:val="000000"/>
           <w:sz w:val="24"/>
           <w:szCs w:val="24"/>
@@ -2334,6 +2464,7 @@
       <w:r>
         <w:rPr>
           <w:b/>
+          <w:i w:val="0"/>
           <w:color w:val="000000"/>
           <w:sz w:val="24"/>
           <w:szCs w:val="24"/>
@@ -2342,6 +2473,7 @@
       <w:r>
         <w:rPr>
           <w:b/>
+          <w:i w:val="0"/>
           <w:color w:val="000000"/>
           <w:sz w:val="24"/>
           <w:szCs w:val="24"/>
@@ -2359,6 +2491,7 @@
       <w:r>
         <w:rPr>
           <w:b/>
+          <w:i w:val="0"/>
           <w:color w:val="000000"/>
           <w:sz w:val="24"/>
           <w:szCs w:val="24"/>
@@ -2368,6 +2501,7 @@
       <w:r>
         <w:rPr>
           <w:b/>
+          <w:i w:val="0"/>
           <w:color w:val="000000"/>
           <w:sz w:val="24"/>
           <w:szCs w:val="24"/>
@@ -2376,6 +2510,7 @@
       <w:r>
         <w:rPr>
           <w:b/>
+          <w:i w:val="0"/>
           <w:color w:val="000000"/>
           <w:sz w:val="24"/>
           <w:szCs w:val="24"/>
@@ -2384,6 +2519,7 @@
       <w:r>
         <w:rPr>
           <w:rFonts w:ascii="Verdana"/>
+          <w:i w:val="0"/>
           <w:color w:val="000000"/>
         </w:rPr>
         <w:tab/>
@@ -2661,6 +2797,7 @@
       <w:r>
         <w:rPr>
           <w:b/>
+          <w:i w:val="0"/>
           <w:color w:val="000000"/>
           <w:sz w:val="24"/>
         </w:rPr>
@@ -2669,6 +2806,7 @@
       <w:r>
         <w:rPr>
           <w:b/>
+          <w:i w:val="0"/>
           <w:color w:val="000000"/>
           <w:spacing w:val="-2"/>
           <w:sz w:val="24"/>
@@ -2677,6 +2815,7 @@
       <w:r>
         <w:rPr>
           <w:b/>
+          <w:i w:val="0"/>
           <w:color w:val="000000"/>
           <w:sz w:val="24"/>
         </w:rPr>
@@ -2684,6 +2823,7 @@
       <w:r>
         <w:rPr>
           <w:b/>
+          <w:i w:val="0"/>
           <w:color w:val="000000"/>
           <w:spacing w:val="-3"/>
           <w:sz w:val="24"/>
@@ -2692,6 +2832,7 @@
       <w:r>
         <w:rPr>
           <w:b/>
+          <w:i w:val="0"/>
           <w:color w:val="000000"/>
           <w:sz w:val="24"/>
         </w:rPr>
@@ -2699,6 +2840,7 @@
       <w:r>
         <w:rPr>
           <w:b/>
+          <w:i w:val="0"/>
           <w:color w:val="000000"/>
           <w:spacing w:val="-1"/>
           <w:sz w:val="24"/>
@@ -2707,6 +2849,7 @@
       <w:r>
         <w:rPr>
           <w:b/>
+          <w:i w:val="0"/>
           <w:color w:val="000000"/>
           <w:sz w:val="24"/>
         </w:rPr>
@@ -5401,7 +5544,7 @@
       <w:bookmarkStart w:id="0" w:name="_TOC_250003"/>
       <w:r>
         <w:rPr>
-          <w:sz w:val="32"/>
+          <w:sz w:val="28"/>
           <w:szCs w:val="32"/>
         </w:rPr>
         <w:lastRenderedPageBreak/>
@@ -5410,14 +5553,14 @@
       <w:r>
         <w:rPr>
           <w:spacing w:val="-5"/>
-          <w:sz w:val="32"/>
+          <w:sz w:val="28"/>
           <w:szCs w:val="32"/>
         </w:rPr>
         <w:t xml:space="preserve"> </w:t>
       </w:r>
       <w:r>
         <w:rPr>
-          <w:sz w:val="32"/>
+          <w:sz w:val="28"/>
           <w:szCs w:val="32"/>
         </w:rPr>
         <w:t>of</w:t>
@@ -5425,7 +5568,7 @@
       <w:r>
         <w:rPr>
           <w:spacing w:val="-2"/>
-          <w:sz w:val="32"/>
+          <w:sz w:val="28"/>
           <w:szCs w:val="32"/>
         </w:rPr>
         <w:t xml:space="preserve"> </w:t>
@@ -5433,7 +5576,7 @@
       <w:bookmarkEnd w:id="0"/>
       <w:r>
         <w:rPr>
-          <w:sz w:val="32"/>
+          <w:sz w:val="28"/>
           <w:szCs w:val="32"/>
         </w:rPr>
         <w:t>Figures</w:t>
@@ -5496,7 +5639,7 @@
             <w:r>
               <w:rPr>
                 <w:b/>
-                <w:sz w:val="28"/>
+                <w:sz w:val="24"/>
               </w:rPr>
               <w:t>Figure</w:t>
             </w:r>
@@ -5504,14 +5647,14 @@
               <w:rPr>
                 <w:b/>
                 <w:spacing w:val="-3"/>
-                <w:sz w:val="28"/>
+                <w:sz w:val="24"/>
               </w:rPr>
               <w:t xml:space="preserve"> </w:t>
             </w:r>
             <w:r>
               <w:rPr>
                 <w:b/>
-                <w:sz w:val="28"/>
+                <w:sz w:val="24"/>
               </w:rPr>
               <w:t>No.</w:t>
             </w:r>
@@ -5535,7 +5678,7 @@
             <w:r>
               <w:rPr>
                 <w:b/>
-                <w:sz w:val="28"/>
+                <w:sz w:val="24"/>
               </w:rPr>
               <w:t>Title</w:t>
             </w:r>
@@ -5559,7 +5702,7 @@
             <w:r>
               <w:rPr>
                 <w:b/>
-                <w:sz w:val="28"/>
+                <w:sz w:val="24"/>
               </w:rPr>
               <w:t>Page</w:t>
             </w:r>
@@ -5567,14 +5710,14 @@
               <w:rPr>
                 <w:b/>
                 <w:spacing w:val="-2"/>
-                <w:sz w:val="28"/>
+                <w:sz w:val="24"/>
               </w:rPr>
               <w:t xml:space="preserve"> </w:t>
             </w:r>
             <w:r>
               <w:rPr>
                 <w:b/>
-                <w:sz w:val="28"/>
+                <w:sz w:val="24"/>
               </w:rPr>
               <w:t>No.</w:t>
             </w:r>
@@ -7304,7 +7447,7 @@
         <w:rPr>
           <w:b/>
           <w:bCs/>
-          <w:sz w:val="32"/>
+          <w:sz w:val="28"/>
           <w:szCs w:val="32"/>
         </w:rPr>
         <w:lastRenderedPageBreak/>
@@ -7315,7 +7458,7 @@
         <w:rPr>
           <w:b/>
           <w:bCs/>
-          <w:sz w:val="32"/>
+          <w:sz w:val="28"/>
           <w:szCs w:val="32"/>
         </w:rPr>
         <w:t>of Tables</w:t>
@@ -7348,7 +7491,7 @@
       <w:r>
         <w:rPr>
           <w:b/>
-          <w:sz w:val="28"/>
+          <w:sz w:val="24"/>
         </w:rPr>
         <w:t>Table</w:t>
       </w:r>
@@ -7356,21 +7499,21 @@
         <w:rPr>
           <w:b/>
           <w:spacing w:val="-3"/>
-          <w:sz w:val="28"/>
+          <w:sz w:val="24"/>
         </w:rPr>
         <w:t xml:space="preserve"> </w:t>
       </w:r>
       <w:r>
         <w:rPr>
           <w:b/>
-          <w:sz w:val="28"/>
+          <w:sz w:val="24"/>
         </w:rPr>
         <w:t>No.</w:t>
       </w:r>
       <w:r>
         <w:rPr>
           <w:b/>
-          <w:sz w:val="28"/>
+          <w:sz w:val="24"/>
         </w:rPr>
         <w:tab/>
         <w:t>Title</w:t>
@@ -7378,7 +7521,7 @@
       <w:r>
         <w:rPr>
           <w:b/>
-          <w:sz w:val="28"/>
+          <w:sz w:val="24"/>
         </w:rPr>
         <w:tab/>
         <w:t>Page</w:t>
@@ -7387,14 +7530,14 @@
         <w:rPr>
           <w:b/>
           <w:spacing w:val="-2"/>
-          <w:sz w:val="28"/>
+          <w:sz w:val="24"/>
         </w:rPr>
         <w:t xml:space="preserve"> </w:t>
       </w:r>
       <w:r>
         <w:rPr>
           <w:b/>
-          <w:sz w:val="28"/>
+          <w:sz w:val="24"/>
         </w:rPr>
         <w:t>No.</w:t>
       </w:r>

</xml_diff>

<commit_message>
Report: project title is now Autonomous Deepfake Detection and Digital Evidence Verification Using Multi-Agent Forensic Analysis
Co-Authored-By: Claude Sonnet 5.5 <noreply@anthropic.com>
</commit_message>
<xml_diff>
--- a/docs/report/TrustSphere_AI_Project_Report.docx
+++ b/docs/report/TrustSphere_AI_Project_Report.docx
@@ -59,7 +59,7 @@
           <w:sz w:val="36"/>
           <w:szCs w:val="36"/>
         </w:rPr>
-        <w:t>TRUSTSPHERE AI: A MULTI-AGENT FRAMEWORK FOR IMAGE MANIPULATION DETECTION WITH VERIFIABLE DIGITAL EVIDENCE</w:t>
+        <w:t>AUTONOMOUS DEEPFAKE DETECTION AND DIGITAL EVIDENCE VERIFICATION USING MULTI-AGENT FORENSIC ANALYSIS</w:t>
       </w:r>
     </w:p>
     <w:p>
@@ -907,373 +907,7 @@
           <w:i w:val="0"/>
           <w:color w:val="000000"/>
         </w:rPr>
-        <w:t>We hereby declare that the project entitled</w:t>
-      </w:r>
-      <w:r>
-        <w:rPr>
-          <w:i w:val="0"/>
-          <w:color w:val="000000"/>
-          <w:spacing w:val="1"/>
-        </w:rPr>
-      </w:r>
-      <w:r>
-        <w:rPr>
-          <w:i w:val="0"/>
-          <w:color w:val="000000"/>
-        </w:rPr>
-      </w:r>
-      <w:r>
-        <w:rPr>
-          <w:i w:val="0"/>
-          <w:color w:val="000000"/>
-          <w:spacing w:val="1"/>
-        </w:rPr>
-      </w:r>
-      <w:r>
-        <w:rPr>
-          <w:i w:val="0"/>
-          <w:color w:val="000000"/>
-        </w:rPr>
-      </w:r>
-      <w:r>
-        <w:rPr>
-          <w:i w:val="0"/>
-          <w:color w:val="000000"/>
-          <w:spacing w:val="1"/>
-        </w:rPr>
-      </w:r>
-      <w:r>
-        <w:rPr>
-          <w:i w:val="0"/>
-          <w:color w:val="000000"/>
-        </w:rPr>
-      </w:r>
-      <w:r>
-        <w:rPr>
-          <w:i w:val="0"/>
-          <w:color w:val="000000"/>
-          <w:spacing w:val="1"/>
-        </w:rPr>
-      </w:r>
-      <w:r>
-        <w:rPr>
-          <w:i w:val="0"/>
-          <w:color w:val="000000"/>
-        </w:rPr>
-      </w:r>
-      <w:r>
-        <w:rPr>
-          <w:i w:val="0"/>
-          <w:color w:val="000000"/>
-          <w:spacing w:val="1"/>
-        </w:rPr>
-      </w:r>
-      <w:r>
-        <w:rPr>
-          <w:i w:val="0"/>
-          <w:color w:val="000000"/>
-        </w:rPr>
-      </w:r>
-      <w:r>
-        <w:rPr>
-          <w:i w:val="0"/>
-          <w:color w:val="000000"/>
-        </w:rPr>
-      </w:r>
-      <w:r>
-        <w:rPr>
-          <w:i w:val="0"/>
-          <w:color w:val="000000"/>
-          <w:spacing w:val="1"/>
-        </w:rPr>
-      </w:r>
-      <w:r>
-        <w:rPr>
-          <w:i w:val="0"/>
-          <w:color w:val="000000"/>
-        </w:rPr>
-        <w:t xml:space="preserve"> </w:t>
-      </w:r>
-      <w:r>
-        <w:rPr>
-          <w:i w:val="0"/>
-          <w:color w:val="000000"/>
-        </w:rPr>
-        <w:t>TrustSphere AI: A Multi-Agent Framework for Image Manipulation Detection with Verifiable Digital Evidence</w:t>
-      </w:r>
-      <w:r>
-        <w:rPr>
-          <w:i w:val="0"/>
-          <w:color w:val="000000"/>
-          <w:spacing w:val="1"/>
-        </w:rPr>
-        <w:t xml:space="preserve"> </w:t>
-      </w:r>
-      <w:r>
-        <w:rPr>
-          <w:i w:val="0"/>
-          <w:color w:val="000000"/>
-        </w:rPr>
-        <w:t>submitted by us</w:t>
-      </w:r>
-      <w:r>
-        <w:rPr>
-          <w:i w:val="0"/>
-          <w:color w:val="000000"/>
-          <w:spacing w:val="1"/>
-        </w:rPr>
-      </w:r>
-      <w:r>
-        <w:rPr>
-          <w:i w:val="0"/>
-          <w:color w:val="000000"/>
-        </w:rPr>
-      </w:r>
-      <w:r>
-        <w:rPr>
-          <w:i w:val="0"/>
-          <w:color w:val="000000"/>
-          <w:spacing w:val="1"/>
-        </w:rPr>
-      </w:r>
-      <w:r>
-        <w:rPr>
-          <w:i w:val="0"/>
-          <w:color w:val="000000"/>
-        </w:rPr>
-        <w:t>,</w:t>
-      </w:r>
-      <w:r>
-        <w:rPr>
-          <w:i w:val="0"/>
-          <w:color w:val="000000"/>
-          <w:spacing w:val="1"/>
-        </w:rPr>
-        <w:t xml:space="preserve"> </w:t>
-      </w:r>
-      <w:r>
-        <w:rPr>
-          <w:i w:val="0"/>
-          <w:color w:val="000000"/>
-        </w:rPr>
-        <w:t>for</w:t>
-      </w:r>
-      <w:r>
-        <w:rPr>
-          <w:i w:val="0"/>
-          <w:color w:val="000000"/>
-          <w:spacing w:val="1"/>
-        </w:rPr>
-        <w:t xml:space="preserve"> </w:t>
-      </w:r>
-      <w:r>
-        <w:rPr>
-          <w:i w:val="0"/>
-          <w:color w:val="000000"/>
-        </w:rPr>
-        <w:t>the</w:t>
-      </w:r>
-      <w:r>
-        <w:rPr>
-          <w:i w:val="0"/>
-          <w:color w:val="000000"/>
-          <w:spacing w:val="1"/>
-        </w:rPr>
-        <w:t xml:space="preserve"> </w:t>
-      </w:r>
-      <w:r>
-        <w:rPr>
-          <w:i w:val="0"/>
-          <w:color w:val="000000"/>
-        </w:rPr>
-        <w:t>award</w:t>
-      </w:r>
-      <w:r>
-        <w:rPr>
-          <w:i w:val="0"/>
-          <w:color w:val="000000"/>
-          <w:spacing w:val="1"/>
-        </w:rPr>
-        <w:t xml:space="preserve"> </w:t>
-      </w:r>
-      <w:r>
-        <w:rPr>
-          <w:i w:val="0"/>
-          <w:color w:val="000000"/>
-        </w:rPr>
-        <w:t>of</w:t>
-      </w:r>
-      <w:r>
-        <w:rPr>
-          <w:i w:val="0"/>
-          <w:color w:val="000000"/>
-          <w:spacing w:val="1"/>
-        </w:rPr>
-        <w:t xml:space="preserve"> </w:t>
-      </w:r>
-      <w:r>
-        <w:rPr>
-          <w:i w:val="0"/>
-          <w:color w:val="000000"/>
-        </w:rPr>
-        <w:t>the</w:t>
-      </w:r>
-      <w:r>
-        <w:rPr>
-          <w:i w:val="0"/>
-          <w:color w:val="000000"/>
-          <w:spacing w:val="1"/>
-        </w:rPr>
-        <w:t xml:space="preserve"> </w:t>
-      </w:r>
-      <w:r>
-        <w:rPr>
-          <w:i w:val="0"/>
-          <w:color w:val="000000"/>
-        </w:rPr>
-        <w:t>degree</w:t>
-      </w:r>
-      <w:r>
-        <w:rPr>
-          <w:i w:val="0"/>
-          <w:color w:val="000000"/>
-          <w:spacing w:val="1"/>
-        </w:rPr>
-        <w:t xml:space="preserve"> </w:t>
-      </w:r>
-      <w:r>
-        <w:rPr>
-          <w:i w:val="0"/>
-          <w:color w:val="000000"/>
-        </w:rPr>
-        <w:t>of</w:t>
-      </w:r>
-      <w:r>
-        <w:rPr>
-          <w:i w:val="0"/>
-          <w:color w:val="000000"/>
-          <w:spacing w:val="1"/>
-        </w:rPr>
-        <w:t xml:space="preserve"> </w:t>
-      </w:r>
-      <w:r>
-        <w:rPr>
-          <w:i w:val="0"/>
-          <w:color w:val="000000"/>
-          <w:spacing w:val="1"/>
-        </w:rPr>
-        <w:t>Bachelor of Technology in Computer Science and Engineering (Information Security) to VIT</w:t>
-      </w:r>
-      <w:r>
-        <w:rPr>
-          <w:i w:val="0"/>
-          <w:color w:val="000000"/>
-          <w:spacing w:val="1"/>
-        </w:rPr>
-      </w:r>
-      <w:r>
-        <w:rPr>
-          <w:i w:val="0"/>
-          <w:color w:val="000000"/>
-        </w:rPr>
-      </w:r>
-      <w:r>
-        <w:rPr>
-          <w:i w:val="0"/>
-          <w:color w:val="000000"/>
-          <w:spacing w:val="1"/>
-        </w:rPr>
-      </w:r>
-      <w:r>
-        <w:rPr>
-          <w:i w:val="0"/>
-          <w:color w:val="000000"/>
-        </w:rPr>
-      </w:r>
-      <w:r>
-        <w:rPr>
-          <w:i w:val="0"/>
-          <w:color w:val="000000"/>
-          <w:spacing w:val="1"/>
-        </w:rPr>
-        <w:t xml:space="preserve"> </w:t>
-      </w:r>
-      <w:r>
-        <w:rPr>
-          <w:i w:val="0"/>
-          <w:color w:val="000000"/>
-        </w:rPr>
-        <w:t>is a record of bonafide work carried out by us under the</w:t>
-      </w:r>
-      <w:r>
-        <w:rPr>
-          <w:i w:val="0"/>
-          <w:color w:val="000000"/>
-          <w:spacing w:val="1"/>
-        </w:rPr>
-        <w:t xml:space="preserve"> </w:t>
-      </w:r>
-      <w:r>
-        <w:rPr>
-          <w:i w:val="0"/>
-          <w:color w:val="000000"/>
-        </w:rPr>
-        <w:t>supervision</w:t>
-      </w:r>
-      <w:r>
-        <w:rPr>
-          <w:i w:val="0"/>
-          <w:color w:val="000000"/>
-          <w:spacing w:val="-4"/>
-        </w:rPr>
-        <w:t xml:space="preserve"> </w:t>
-      </w:r>
-      <w:r>
-        <w:rPr>
-          <w:i w:val="0"/>
-          <w:color w:val="000000"/>
-        </w:rPr>
-        <w:t>of</w:t>
-      </w:r>
-      <w:r>
-        <w:rPr>
-          <w:i w:val="0"/>
-          <w:color w:val="000000"/>
-          <w:spacing w:val="-7"/>
-        </w:rPr>
-        <w:t xml:space="preserve"> Prof. Manikandan G.</w:t>
-      </w:r>
-      <w:r>
-        <w:rPr>
-          <w:i w:val="0"/>
-          <w:color w:val="000000"/>
-          <w:spacing w:val="-7"/>
-        </w:rPr>
-      </w:r>
-      <w:r>
-        <w:rPr>
-          <w:i w:val="0"/>
-          <w:color w:val="000000"/>
-        </w:rPr>
-      </w:r>
-      <w:r>
-        <w:rPr>
-          <w:i w:val="0"/>
-          <w:color w:val="000000"/>
-          <w:spacing w:val="1"/>
-        </w:rPr>
-      </w:r>
-      <w:r>
-        <w:rPr>
-          <w:i w:val="0"/>
-          <w:color w:val="000000"/>
-        </w:rPr>
-      </w:r>
-      <w:r>
-        <w:rPr>
-          <w:i w:val="0"/>
-          <w:color w:val="000000"/>
-        </w:rPr>
+        <w:t>We hereby declare that the project entitled Autonomous Deepfake Detection and Digital Evidence Verification Using Multi-Agent Forensic Analysis submitted by us, for the award of the degree of Bachelor of Technology in Computer Science and Engineering (Information Security) to VIT is a record of bonafide work carried out by us under the supervision of Prof. Manikandan G.</w:t>
       </w:r>
     </w:p>
     <w:p>
@@ -1288,172 +922,7 @@
           <w:i w:val="0"/>
           <w:color w:val="000000"/>
         </w:rPr>
-        <w:t>We further declare that the work reported in this project has not been submitted</w:t>
-      </w:r>
-      <w:r>
-        <w:rPr>
-          <w:i w:val="0"/>
-          <w:color w:val="000000"/>
-          <w:spacing w:val="1"/>
-        </w:rPr>
-        <w:t xml:space="preserve"> </w:t>
-      </w:r>
-      <w:r>
-        <w:rPr>
-          <w:i w:val="0"/>
-          <w:color w:val="000000"/>
-        </w:rPr>
-        <w:t>and will not be submitted, either in part or in full, for the award of any other degree or</w:t>
-      </w:r>
-      <w:r>
-        <w:rPr>
-          <w:i w:val="0"/>
-          <w:color w:val="000000"/>
-          <w:spacing w:val="-57"/>
-        </w:rPr>
-        <w:t xml:space="preserve"> </w:t>
-      </w:r>
-      <w:r>
-        <w:rPr>
-          <w:i w:val="0"/>
-          <w:color w:val="000000"/>
-        </w:rPr>
-        <w:t>diploma</w:t>
-      </w:r>
-      <w:r>
-        <w:rPr>
-          <w:i w:val="0"/>
-          <w:color w:val="000000"/>
-          <w:spacing w:val="5"/>
-        </w:rPr>
-        <w:t xml:space="preserve"> </w:t>
-      </w:r>
-      <w:r>
-        <w:rPr>
-          <w:i w:val="0"/>
-          <w:color w:val="000000"/>
-        </w:rPr>
-        <w:t>in</w:t>
-      </w:r>
-      <w:r>
-        <w:rPr>
-          <w:i w:val="0"/>
-          <w:color w:val="000000"/>
-          <w:spacing w:val="-4"/>
-        </w:rPr>
-        <w:t xml:space="preserve"> </w:t>
-      </w:r>
-      <w:r>
-        <w:rPr>
-          <w:i w:val="0"/>
-          <w:color w:val="000000"/>
-        </w:rPr>
-        <w:t>this</w:t>
-      </w:r>
-      <w:r>
-        <w:rPr>
-          <w:i w:val="0"/>
-          <w:color w:val="000000"/>
-          <w:spacing w:val="5"/>
-        </w:rPr>
-        <w:t xml:space="preserve"> </w:t>
-      </w:r>
-      <w:r>
-        <w:rPr>
-          <w:i w:val="0"/>
-          <w:color w:val="000000"/>
-        </w:rPr>
-        <w:t>institute</w:t>
-      </w:r>
-      <w:r>
-        <w:rPr>
-          <w:i w:val="0"/>
-          <w:color w:val="000000"/>
-          <w:spacing w:val="-4"/>
-        </w:rPr>
-        <w:t xml:space="preserve"> </w:t>
-      </w:r>
-      <w:r>
-        <w:rPr>
-          <w:i w:val="0"/>
-          <w:color w:val="000000"/>
-        </w:rPr>
-        <w:t>or</w:t>
-      </w:r>
-      <w:r>
-        <w:rPr>
-          <w:i w:val="0"/>
-          <w:color w:val="000000"/>
-          <w:spacing w:val="-1"/>
-        </w:rPr>
-        <w:t xml:space="preserve"> </w:t>
-      </w:r>
-      <w:r>
-        <w:rPr>
-          <w:i w:val="0"/>
-          <w:color w:val="000000"/>
-        </w:rPr>
-        <w:t>any</w:t>
-      </w:r>
-      <w:r>
-        <w:rPr>
-          <w:i w:val="0"/>
-          <w:color w:val="000000"/>
-          <w:spacing w:val="-8"/>
-        </w:rPr>
-        <w:t xml:space="preserve"> </w:t>
-      </w:r>
-      <w:r>
-        <w:rPr>
-          <w:i w:val="0"/>
-          <w:color w:val="000000"/>
-        </w:rPr>
-        <w:t>other</w:t>
-      </w:r>
-      <w:r>
-        <w:rPr>
-          <w:i w:val="0"/>
-          <w:color w:val="000000"/>
-          <w:spacing w:val="4"/>
-        </w:rPr>
-        <w:t xml:space="preserve"> </w:t>
-      </w:r>
-      <w:r>
-        <w:rPr>
-          <w:i w:val="0"/>
-          <w:color w:val="000000"/>
-        </w:rPr>
-        <w:t>institute</w:t>
-      </w:r>
-      <w:r>
-        <w:rPr>
-          <w:i w:val="0"/>
-          <w:color w:val="000000"/>
-          <w:spacing w:val="-4"/>
-        </w:rPr>
-        <w:t xml:space="preserve"> </w:t>
-      </w:r>
-      <w:r>
-        <w:rPr>
-          <w:i w:val="0"/>
-          <w:color w:val="000000"/>
-        </w:rPr>
-        <w:t>or</w:t>
-      </w:r>
-      <w:r>
-        <w:rPr>
-          <w:i w:val="0"/>
-          <w:color w:val="000000"/>
-          <w:spacing w:val="4"/>
-        </w:rPr>
-        <w:t xml:space="preserve"> </w:t>
-      </w:r>
-      <w:r>
-        <w:rPr>
-          <w:i w:val="0"/>
-          <w:color w:val="000000"/>
-        </w:rPr>
-        <w:t>university.</w:t>
+        <w:t>We further declare that the work reported in this project has not been submitted and will not be submitted, either in part or in full, for the award of any other degree or diploma in this institute or any other institute or university.</w:t>
       </w:r>
     </w:p>
     <w:p>
@@ -1834,7 +1303,7 @@
           <w:i w:val="0"/>
           <w:color w:val="000000"/>
         </w:rPr>
-        <w:t>TrustSphere AI: A Multi-Agent Framework for Image Manipulation Detection with Verifiable Digital Evidence</w:t>
+        <w:t>Autonomous Deepfake Detection and Digital Evidence Verification Using Multi-Agent Forensic Analysis</w:t>
       </w:r>
       <w:r>
         <w:rPr>

</xml_diff>